<commit_message>
Add report, shrinkage study, and deployment links
- report/report.docx: full Part B report, 4,950 narrative words, 13 figures
  and 11 tables, equations in Appendix A
- src/portfolios.py: Ledoit-Wolf shrinkage study testing the sample-noise
  diagnosis; rebalance-frequency comparison
- src/fusion.py: lead-lag and horizon diagnostics, bootstrap significance
- README: live app and repository links, corrected extension figures

Co-Authored-By: Claude Opus 5 <noreply@anthropic.com>
</commit_message>
<xml_diff>
--- a/report/report.docx
+++ b/report/report.docx
@@ -9815,6 +9815,11 @@
     <w:p>
       <w:r>
         <w:t>The business model is a management fee on assets, shown explicitly in the allocation tab so the user can see what the product costs them.</w:t>
+      </w:r>
+    </w:p>
+    <w:p>
+      <w:r>
+        <w:t>Spotlight is deployed at https://spotlight-z5640476.streamlit.app from the public repository https://github.com/corvus-chen/z5640476_projectB. The app reads the committed artifacts and starts without recomputing anything, so it runs inside Community Cloud's free-tier resources.</w:t>
       </w:r>
     </w:p>
     <w:p>

</xml_diff>

<commit_message>
Trim the report to the 5,000-word limit
Narrative cut from ~5,377 to 5,000 words with every citation and number kept:

- moved 5.5 (figure design system) to Appendix C
- merged two paragraphs in the horizon study that stated the same result twice
- tightened five paragraphs that restated their own exhibits

Co-Authored-By: Claude Opus 5 <noreply@anthropic.com>
</commit_message>
<xml_diff>
--- a/report/report.docx
+++ b/report/report.docx
@@ -32,7 +32,7 @@
     </w:p>
     <w:p>
       <w:r>
-        <w:t>Spotlight offers twelve systematically managed funds built from 50 US equities and 10 cryptocurrencies. Over a three-year out-of-sample backtest the best fund, Combined Maximum-Sharpe, earns a Sharpe ratio of 0.98, but the more durable result is that equal weighting beats every optimised equity fund (0.82 against 0.72 for the closest optimised rival). The methods that lean hardest on estimated inputs hold the most concentrated portfolios and rewrite them most often, and they lose the most out of sample. A sector news-sentiment index built from 146,830 headlines tracks tone convincingly but does not predict returns: sentiment correlates with same-day sector returns in seven of ten sectors and with next-day returns in one. A sentiment tilt therefore reduces the Sharpe ratio of both equity funds. Making the tilt direction an estimate rather than an assumption recovers the loss and more, though bootstrap intervals for that improvement span zero. The funds, fact sheets and analytics are delivered as a deployed Streamlit application reading precomputed results.</w:t>
+        <w:t>Spotlight offers twelve systematically managed funds built from 50 US equities and 10 cryptocurrencies. Over a three-year out-of-sample backtest the best fund, Combined Maximum-Sharpe, earns a Sharpe ratio of 0.98, but the more durable result is that equal weighting beats every optimised equity fund (0.82 against 0.72 for the closest optimised rival). The methods that lean hardest on estimated inputs are the most concentrated, the most heavily traded, and the worst out of sample. A sector news-sentiment index built from 146,830 headlines tracks tone convincingly but does not predict returns: sentiment correlates with same-day sector returns in seven of ten sectors and with next-day returns in one. A sentiment tilt therefore reduces the Sharpe ratio of both equity funds. Making the tilt direction an estimate rather than an assumption recovers the loss and more, though bootstrap intervals for that improvement span zero. The funds, fact sheets and analytics are delivered as a deployed Streamlit application reading precomputed results.</w:t>
       </w:r>
     </w:p>
     <w:p>
@@ -2278,7 +2278,7 @@
     </w:p>
     <w:p>
       <w:r>
-        <w:t>The first is sample noise. Every rebalance asks 252 days of returns to supply 50 expected returns and a 50-by-50 covariance matrix, and a year of daily data is a thin sample for that many quantities. The estimates move from month to month whether or not the market does, and the funds that read them most closely move with them. This is the error-maximising property Michaud (1989) describes: an optimiser given noisy inputs overweights precisely those assets whose expected returns the sample has overstated and whose risks it has understated, so estimation error is amplified rather than diversified away. Maximum Sharpe holds 6 of the 50 stocks and rewrites 34% of its portfolio at the average rebalance; minimum variance holds 18 and rewrites 15%. Equal weighting estimates nothing and never trades, and risk parity, which needs variances but no expected returns, changes 2% of its weights a month. Chopra and Ziemba (1993) find errors in expected returns to be roughly an order of magnitude more costly than errors in variances, which is consistent with maximum Sharpe - the one method here that needs a mean estimate - being both the most concentrated fund and the most heavily traded. That turnover and that concentration are therefore not the product of the optimisation; they are a symptom of how noisy its inputs are. The optimiser is doing its job faithfully on a sample too small to support the question being asked of it.</w:t>
+        <w:t>The first is sample noise. Every rebalance asks 252 days of returns to supply 50 expected returns and a 50-by-50 covariance matrix, and a year of daily data is a thin sample for that many quantities. Michaud (1989) calls the consequence error maximisation: an optimiser given noisy inputs overweights precisely those assets whose expected returns the sample has overstated and whose risks it has understated, so estimation error is amplified rather than diversified away. Maximum Sharpe holds 6 of the 50 stocks and rewrites 34% of its portfolio at the average rebalance; minimum variance holds 18 and rewrites 15%. Equal weighting estimates nothing and never trades, and risk parity, which needs variances but no expected returns, changes 2% of its weights a month. Chopra and Ziemba (1993) find errors in expected returns roughly an order of magnitude more costly than errors in variances, which is consistent with maximum Sharpe - the one method here needing a mean estimate - being both the most concentrated fund and the most heavily traded. That turnover and that concentration are not the product of the optimisation; they are a symptom of how noisy its inputs are.</w:t>
       </w:r>
     </w:p>
     <w:p>
@@ -2583,7 +2583,7 @@
     </w:p>
     <w:p>
       <w:r>
-        <w:t>The three panels show the same universe and the same dates producing three completely different funds. Minimum variance concentrates in healthcare and consumer staples, which are the sectors whose estimated covariance with everything else is lowest, and its crypto band is almost invisible - minimising variance means avoiding the most volatile assets available, whatever their return. Maximum Sharpe swings violently between sectors and carries a wide crypto band, because it is chasing estimated means and those estimates change sharply from month to month. Risk parity is nearly static: equalising risk contributions produces weights that depend on relative volatilities, and relative volatilities are far more stable than relative means. The visual stability of each panel is a direct picture of how much estimation error each objective admits.</w:t>
+        <w:t>The three panels show the same universe and the same dates producing three different funds. Minimum variance concentrates in healthcare and consumer staples and its crypto band is almost invisible: minimising variance means avoiding the most volatile assets available, whatever their return. Maximum Sharpe swings between sectors and carries a wide crypto band, chasing mean estimates that change sharply from month to month. Risk parity is nearly static, because relative volatilities are far more stable than relative means. The visual stability of each panel is a direct picture of how much estimation error each objective admits.</w:t>
       </w:r>
     </w:p>
     <w:p>
@@ -2747,9 +2747,7 @@
     </w:p>
     <w:p>
       <w:r>
-        <w:t xml:space="preserve">The raw gauge sits above neutral on 99% of days, so read as a level it would have called the market greedy throughout the COVID crash. It is uninformative for the same reason the sector indices are: the baseline is positive. Standardising removes that baseline and the episodes appear immediately. The deepest trough is mid-March 2020, the week of the crash itself, and the second is early December 2021, when the Omicron variant was announced. That the two </w:t>
-        <w:lastRenderedPageBreak/>
-        <w:t>largest negative excursions in a purely textual series line up with the two events a reader would name without seeing the data is the strongest available evidence that the index measures something real. Market-wide sentiment proxies built from other unstructured sources behave the same way: the search-based index of Da, Engelberg and Gao (2015) also has its extremes fall on identifiable macroeconomic events.</w:t>
+        <w:t>The raw gauge sits above neutral on 99% of days, so read as a level it would have called the market greedy throughout the COVID crash. Standardising removes that positive baseline and the episodes appear immediately. The deepest trough is mid-March 2020, the week of the crash itself, and the second is early December 2021, when the Omicron variant was announced. That the two largest negative excursions in a purely textual series fall on the two events a reader would name unprompted is the strongest available evidence that the index measures something real; the search-based index of Da, Engelberg and Gao (2015) behaves the same way.</w:t>
       </w:r>
     </w:p>
     <w:p>
@@ -3877,7 +3875,7 @@
     </w:tbl>
     <w:p>
       <w:r>
-        <w:t>Between 40% and 58% of headlines score neutral depending on the sector. A neutral score is not a finding of balance; it means the model found no word it recognised. VADER's lexicon was built for social media, and Loughran and McDonald (2011) show that dictionaries assembled outside a financial context misclassify financial language systematically; Section 5.1 measures how much of this neutral band is that gap rather than genuine balance. Headlines are also a weaker signal than the articles beneath them - they are short, written to be clicked, and often name a company without saying anything about it. Work that successfully extracts firm-level information from news generally scores the full text of a story rather than its headline (Tetlock, Saar-Tsechansky and Macskassy 2008). Both limitations point the same way: the index should be read as an indicator of the tone of coverage, and any trading use of it has to survive the fact that half its inputs are silent.</w:t>
+        <w:t>Between 40% and 58% of headlines score neutral depending on the sector. A neutral score is not a finding of balance; it means the model found no word it recognised. VADER's lexicon was built for social media, and Loughran and McDonald (2011) show that dictionaries assembled outside a financial context misclassify financial language systematically; Section 5.1 measures how much of this band is that gap rather than genuine balance. Headlines are also a weaker signal than the articles beneath them, and work that extracts firm-level information from news generally scores the full story rather than its headline (Tetlock, Saar-Tsechansky and Macskassy 2008). The index should therefore be read as the tone of coverage, and any trading use of it has to survive half its inputs being silent.</w:t>
       </w:r>
     </w:p>
     <w:p>
@@ -8407,12 +8405,7 @@
     </w:tbl>
     <w:p>
       <w:r>
-        <w:t>The correlation is negative at every horizon and its magnitude grows with the horizon, from -0.0130 at one day to -0.1487 at 63 days, but the number of independent observations falls from 9,821 to 140. 1 of 8 tests clear 5% uncorrected, and 0 survive the correction for having run eight of them.</w:t>
-      </w:r>
-    </w:p>
-    <w:p>
-      <w:r>
-        <w:t>The correlation is negative at every horizon and grows with the horizon, which is the pattern a slow effect would leave. Nothing else supports that reading. The number of independent observations collapses from 9,821 to 140 as the horizon lengthens, the confidence around each estimate widens accordingly, and after correcting for having run 8 specifications none of them clears the threshold. Eight tests producing one nominal p-value of 0.029 is what chance delivers. Harvey, Liu and Zhu (2016) argue that conventional significance thresholds are far too lenient once the number of specifications tried is counted, and the Bonferroni threshold applied here is the most conservative and least sophisticated version of that argument.</w:t>
+        <w:t>The correlation is negative at every horizon and its magnitude grows with it, from -0.0130 at one day to -0.1487 at 63 days, which is the pattern a slow effect would leave. Nothing else supports that reading. The number of independent observations collapses from 9,821 to 140 as the horizon lengthens, so the confidence around each estimate widens accordingly: 1 of 8 tests clears 5% uncorrected and none survives the correction for having run eight. One nominal p-value of 0.029 out of eight tests is what chance delivers. Harvey, Liu and Zhu (2016) argue that conventional thresholds are far too lenient once the number of specifications tried is counted, and the Bonferroni threshold applied here is the most conservative version of that argument.</w:t>
       </w:r>
     </w:p>
     <w:p>
@@ -11215,9 +11208,7 @@
     </w:p>
     <w:p>
       <w:r>
-        <w:t xml:space="preserve">Three caveats belong with that. The holdout margin over the base fund is a few hundredths of a Sharpe point, consistent with the bootstrap finding that the difference is not established. Every Minimum-Variance variant decays by roughly 0.58 of a Sharpe point into 2023, the base fund included, so the decay is the market regime and not a property of the tilt. And one split of two </w:t>
-        <w:lastRenderedPageBreak/>
-        <w:t>funds is evidence rather than proof: the exercise shows the selection was not obviously fitted, not that it will hold. Bailey and Lopez de Prado (2014) show that the expected maximum Sharpe ratio across a set of trialled strategies rises with the number trialled even when none of them has any skill, which is why the number of variants searched is reported here alongside the one that won.</w:t>
+        <w:t>Three caveats belong with that. The holdout margin over the base fund is a few hundredths of a Sharpe point, consistent with the bootstrap finding that the difference is not established. Every Minimum-Variance variant decays by roughly 0.58 of a Sharpe point into 2023, the base fund included, so the decay is the market regime and not a property of the tilt. And one split of two funds is evidence rather than proof. Bailey and Lopez de Prado (2014) show that the expected maximum Sharpe ratio across a set of trialled strategies rises with the number trialled even when none of them has any skill, which is why the number of variants searched is reported here alongside the one that won.</w:t>
       </w:r>
     </w:p>
     <w:p>
@@ -12568,27 +12559,6 @@
     </w:tbl>
     <w:p>
       <w:pPr>
-        <w:pStyle w:val="21"/>
-      </w:pPr>
-      <w:bookmarkStart w:id="13" w:name="_Toc237383699"/>
-      <w:r>
-        <w:t>5.5 The figure design system</w:t>
-      </w:r>
-      <w:bookmarkEnd w:id="13"/>
-    </w:p>
-    <w:p>
-      <w:r>
-        <w:t>Every exhibit is drawn through one design system rather than styled per figure. Categorical colours occupy fixed slots and are never cycled, so no two series in a chart can share a hue. The twelve-slot palette is validated pair by pair in CIE Lab space under normal, deuteranopic and protanopic vision by tools/check_palette.py; the worst separation is a deltaE of 16.9, identical to the original five-slot palette. The requirement that categorical series stay separable under simulated colour-blind vision, rather than only under normal vision, follows the colour-universal-design guidance of Okabe and Ito (2008).</w:t>
-      </w:r>
-    </w:p>
-    <w:p>
-      <w:r>
-        <w:lastRenderedPageBreak/>
-        <w:t>The design system exists because the product is read by someone who will not check the code. A reader who cannot distinguish two bands in a weight chart cannot audit the fund's holdings, and a reader who is colour-blind should not be excluded from that. Fixing the colour slots and validating every pair under simulated colour-blind vision makes the exhibits verifiable rather than merely attractive.</w:t>
-      </w:r>
-    </w:p>
-    <w:p>
-      <w:pPr>
         <w:pStyle w:val="1"/>
       </w:pPr>
       <w:bookmarkStart w:id="14" w:name="_Toc237383700"/>
@@ -12609,7 +12579,7 @@
     </w:p>
     <w:p>
       <w:r>
-        <w:t>The target user is someone with savings and no time: a working professional or an early-career investor who wants a rules-based portfolio and will not read a covariance matrix. The journey is built around the decision that user actually makes, which is not which stock to buy but how much risk to carry. They compare twelve funds and see at once that the crypto funds returned most and fell furthest; they open a fact sheet for the four numbers a fund provider publishes, the growth line, the drawdown and the holdings; and they set an allocation with sliders and watch the blend update, which is where diversification stops being a word and becomes a visibly shallower drawdown. The analytics sit apart from the funds on purpose: the report shows that they do not predict returns, so presenting them beside an allocation control would imply a link the evidence does not support.</w:t>
+        <w:t>The target user is a working professional or early-career investor with savings, no time, and no intention of reading a covariance matrix. The journey is built around the decision that user actually makes, which is not which stock to buy but how much risk to carry. They compare twelve funds and see at once that the crypto funds returned most and fell furthest; they open a fact sheet for the four numbers a fund provider publishes, the growth line, the drawdown and the holdings; and they set an allocation with sliders and watch the blend update, which is where diversification stops being a word and becomes a visibly shallower drawdown. The analytics sit apart from the funds on purpose: the report shows that they do not predict returns, so presenting them beside an allocation control would imply a link the evidence does not support.</w:t>
       </w:r>
     </w:p>
     <w:p>
@@ -14919,6 +14889,25 @@
       </w:tr>
     </w:tbl>
     <w:p/>
+    <w:p>
+      <w:pPr>
+        <w:pStyle w:val="21"/>
+      </w:pPr>
+      <w:r>
+        <w:t>Appendix C - The figure design system</w:t>
+      </w:r>
+    </w:p>
+    <w:p>
+      <w:r>
+        <w:t>Every exhibit is drawn through one design system rather than styled per figure. Categorical colours occupy fixed slots and are never cycled, so no two series in a chart can share a hue. The twelve-slot palette is validated pair by pair in CIE Lab space under normal, deuteranopic and protanopic vision by tools/check_palette.py; the worst separation is a deltaE of 16.9, identical to the original five-slot palette. The requirement that categorical series stay separable under simulated colour-blind vision, rather than only under normal vision, follows the colour-universal-design guidance of Okabe and Ito (2008).</w:t>
+      </w:r>
+    </w:p>
+    <w:p>
+      <w:r>
+        <w:lastRenderedPageBreak/>
+        <w:t>The design system exists because the product is read by someone who will not check the code. A reader who cannot distinguish two bands in a weight chart cannot audit the fund's holdings, and a reader who is colour-blind should not be excluded from that. Fixing the colour slots and validating every pair under simulated colour-blind vision makes the exhibits verifiable rather than merely attractive.</w:t>
+      </w:r>
+    </w:p>
     <w:sectPr>
       <w:pgSz w:w="11909" w:h="16834"/>
       <w:pgMar w:top="1224" w:right="1440" w:bottom="1224" w:left="1440" w:header="720" w:footer="720" w:gutter="0"/>

</xml_diff>

<commit_message>
Add the rolling-vs-expanding window study as Appendix D
Answers the obvious challenge to the Section 2 sample-noise argument: if the
estimation sample is too thin, why not use a longer one? Tested rather than
argued. An expanding window helps the equity funds (+0.110 on minimum
variance) and costs the flagship Combined Maximum-Sharpe fund 0.583 of a
Sharpe point, because it never forgets the crypto regime that ended in 2022.
The main finding holds under both: equal weighting still beats every
optimised equity fund.

Narrative held at 5,000 words by trimming redundancy elsewhere.

Co-Authored-By: Claude Opus 5 <noreply@anthropic.com>
</commit_message>
<xml_diff>
--- a/report/report.docx
+++ b/report/report.docx
@@ -32,7 +32,7 @@
     </w:p>
     <w:p>
       <w:r>
-        <w:t>Spotlight offers twelve systematically managed funds built from 50 US equities and 10 cryptocurrencies. Over a three-year out-of-sample backtest the best fund, Combined Maximum-Sharpe, earns a Sharpe ratio of 0.98, but the more durable result is that equal weighting beats every optimised equity fund (0.82 against 0.72 for the closest optimised rival). The methods that lean hardest on estimated inputs are the most concentrated, the most heavily traded, and the worst out of sample. A sector news-sentiment index built from 146,830 headlines tracks tone convincingly but does not predict returns: sentiment correlates with same-day sector returns in seven of ten sectors and with next-day returns in one. A sentiment tilt therefore reduces the Sharpe ratio of both equity funds. Making the tilt direction an estimate rather than an assumption recovers the loss and more, though bootstrap intervals for that improvement span zero. The funds, fact sheets and analytics are delivered as a deployed Streamlit application reading precomputed results.</w:t>
+        <w:t>Spotlight offers twelve systematically managed funds built from 50 US equities and 10 cryptocurrencies. Over a three-year out-of-sample backtest the best fund, Combined Maximum-Sharpe, earns a Sharpe ratio of 0.98, but the more durable result is that equal weighting beats every optimised equity fund (0.82 against 0.72 for the closest optimised rival). The methods that lean hardest on estimated inputs are the most concentrated, the most heavily traded, and the worst out of sample. A sector news-sentiment index built from 146,830 headlines tracks tone convincingly but does not predict returns: sentiment correlates with same-day sector returns in seven of ten sectors and with next-day returns in one. A sentiment tilt therefore reduces the Sharpe ratio of both equity funds; making its direction an estimate rather than an assumption recovers the loss, though bootstrap intervals for that improvement span zero. The funds, fact sheets and analytics are delivered as a deployed Streamlit application reading precomputed results.</w:t>
       </w:r>
     </w:p>
     <w:p>
@@ -841,7 +841,7 @@
     </w:p>
     <w:p>
       <w:r>
-        <w:t>Three design choices deserve defending. The estimation window rolls rather than expands, so the covariance matrix reflects the most recent year of trading rather than an average of the whole history, which keeps the funds responsive to a change in regime at the cost of a noisier estimate. Rebalancing monthly balances the same tension the other way: often enough to act on a changed covariance estimate, rarely enough not to pay for chasing noise. Long-only weights match what the product is, a fund an ordinary investor can buy, and they bound the damage an extreme estimate can do, because a weight cannot go below zero however attractive the optimiser finds a short position. Jagannathan and Ma (2003) show that a no-short-sale constraint acts on a minimum-variance problem in the same way as shrinking the most extreme covariance estimates, so the constraint buys statistical stability as well as investability.</w:t>
+        <w:t>Three design choices deserve defending. The estimation window rolls rather than expands, so the covariance matrix reflects the most recent year of trading rather than an average of the whole history, which trades a noisier estimate for responsiveness to a change in regime. Rebalancing monthly balances the same tension the other way: often enough to act on a changed covariance estimate, rarely enough not to pay for chasing noise. Long-only weights match what the product is and bound the damage an extreme estimate can do, since a weight cannot go below zero however attractive a short looks to the optimiser. Jagannathan and Ma (2003) show that a no-short-sale constraint acts on a minimum-variance problem in the same way as shrinking the most extreme covariance estimates, so the constraint buys statistical stability as well as investability. Appendix D tests that trade-off directly: an expanding window lifts the equity funds (+0.110 on minimum variance) and costs the flagship Combined Maximum-Sharpe fund 0.583 of a Sharpe point, because it never forgets the crypto regime that ended in 2022.</w:t>
       </w:r>
     </w:p>
     <w:p>
@@ -936,7 +936,7 @@
     </w:p>
     <w:p>
       <w:r>
-        <w:t>Quarterly rebalancing is worst for every method, which says the cost of holding a stale covariance estimate for three months exceeds the trading it saves. Above that floor the schedules separate by how much each method's weights actually move. Equal weight and risk parity barely trade whatever the schedule, so their fortnightly advantage is small. Maximum Sharpe turns over several times a year, so it is the fund where the choice bites, and monthly is its best net-of-cost schedule: weekly gives it a fresher estimate but the extra turnover is not repaid. Monthly is kept as the product schedule because it is the best net outcome for the fund most sensitive to the decision and within a few hundredths of the best for every other fund.</w:t>
+        <w:t>Quarterly rebalancing is worst for every method, which says the cost of holding a stale covariance estimate for three months exceeds the trading it saves. Above that floor the schedules separate by how much each method's weights move. Equal weight and risk parity barely trade whatever the schedule, so their fortnightly advantage is small. Maximum Sharpe turns over several times a year, so it is the fund where the choice bites, and monthly is its best net-of-cost schedule: weekly gives it a fresher estimate but the extra turnover is not repaid. Monthly is kept because it is the best net outcome for the fund most sensitive to the decision and within a few hundredths of the best for the rest.</w:t>
       </w:r>
     </w:p>
     <w:p>
@@ -2278,7 +2278,7 @@
     </w:p>
     <w:p>
       <w:r>
-        <w:t>The first is sample noise. Every rebalance asks 252 days of returns to supply 50 expected returns and a 50-by-50 covariance matrix, and a year of daily data is a thin sample for that many quantities. Michaud (1989) calls the consequence error maximisation: an optimiser given noisy inputs overweights precisely those assets whose expected returns the sample has overstated and whose risks it has understated, so estimation error is amplified rather than diversified away. Maximum Sharpe holds 6 of the 50 stocks and rewrites 34% of its portfolio at the average rebalance; minimum variance holds 18 and rewrites 15%. Equal weighting estimates nothing and never trades, and risk parity, which needs variances but no expected returns, changes 2% of its weights a month. Chopra and Ziemba (1993) find errors in expected returns roughly an order of magnitude more costly than errors in variances, which is consistent with maximum Sharpe - the one method here needing a mean estimate - being both the most concentrated fund and the most heavily traded. That turnover and that concentration are not the product of the optimisation; they are a symptom of how noisy its inputs are.</w:t>
+        <w:t>The first is sample noise. Every rebalance asks 252 days of returns for 50 expected returns and a 50-by-50 covariance matrix, a thin sample for that many quantities. Michaud (1989) calls the consequence error maximisation: an optimiser given noisy inputs overweights precisely those assets whose expected returns the sample has overstated and whose risks it has understated, so estimation error is amplified rather than diversified away. Maximum Sharpe holds 6 of the 50 stocks and rewrites 34% of its portfolio at the average rebalance; minimum variance holds 18 and rewrites 15%. Equal weighting estimates nothing and never trades, and risk parity, which needs variances but no expected returns, changes 2% of its weights a month. Chopra and Ziemba (1993) find errors in expected returns roughly an order of magnitude more costly than errors in variances, which is consistent with maximum Sharpe - the one method here needing a mean estimate - being both the most concentrated fund and the most heavily traded. That turnover and concentration are not the optimisation working; they are a symptom of how noisy its inputs are.</w:t>
       </w:r>
     </w:p>
     <w:p>
@@ -2583,7 +2583,7 @@
     </w:p>
     <w:p>
       <w:r>
-        <w:t>The three panels show the same universe and the same dates producing three different funds. Minimum variance concentrates in healthcare and consumer staples and its crypto band is almost invisible: minimising variance means avoiding the most volatile assets available, whatever their return. Maximum Sharpe swings between sectors and carries a wide crypto band, chasing mean estimates that change sharply from month to month. Risk parity is nearly static, because relative volatilities are far more stable than relative means. The visual stability of each panel is a direct picture of how much estimation error each objective admits.</w:t>
+        <w:t>The three panels show one universe and one set of dates producing three different funds. Minimum variance concentrates in healthcare and consumer staples and its crypto band is almost invisible: minimising variance means avoiding the most volatile assets available, whatever their return. Maximum Sharpe swings between sectors and carries a wide crypto band, chasing mean estimates that change sharply from month to month. Risk parity is nearly static, because relative volatilities are far more stable than relative means. The visual stability of each panel is a direct picture of how much estimation error each objective admits.</w:t>
       </w:r>
     </w:p>
     <w:p>
@@ -3875,7 +3875,7 @@
     </w:tbl>
     <w:p>
       <w:r>
-        <w:t>Between 40% and 58% of headlines score neutral depending on the sector. A neutral score is not a finding of balance; it means the model found no word it recognised. VADER's lexicon was built for social media, and Loughran and McDonald (2011) show that dictionaries assembled outside a financial context misclassify financial language systematically; Section 5.1 measures how much of this band is that gap rather than genuine balance. Headlines are also a weaker signal than the articles beneath them, and work that extracts firm-level information from news generally scores the full story rather than its headline (Tetlock, Saar-Tsechansky and Macskassy 2008). The index should therefore be read as the tone of coverage, and any trading use of it has to survive half its inputs being silent.</w:t>
+        <w:t>Between 40% and 58% of headlines score neutral depending on the sector. A neutral score is not a finding of balance; it means the model found no word it recognised. VADER's lexicon was built for social media, and Loughran and McDonald (2011) show that dictionaries assembled outside a financial context misclassify financial language systematically; Section 5.1 measures how much of this band is that gap rather than genuine balance. Headlines are also a weaker signal than the articles beneath them, and work that extracts firm-level information from news generally scores the full story rather than its headline (Tetlock, Saar-Tsechansky and Macskassy 2008). The index should be read as the tone of coverage, and any trading use of it has to survive half its inputs being silent.</w:t>
       </w:r>
     </w:p>
     <w:p>
@@ -12584,7 +12584,7 @@
     </w:p>
     <w:p>
       <w:r>
-        <w:t>The business model is a management fee on assets, shown explicitly in the allocation tab so the user can see what the product costs them.</w:t>
+        <w:t>The business model is a management fee on assets, shown in the allocation tab so the user sees what the product costs.</w:t>
       </w:r>
     </w:p>
     <w:p>
@@ -14908,6 +14908,525 @@
         <w:t>The design system exists because the product is read by someone who will not check the code. A reader who cannot distinguish two bands in a weight chart cannot audit the fund's holdings, and a reader who is colour-blind should not be excluded from that. Fixing the colour slots and validating every pair under simulated colour-blind vision makes the exhibits verifiable rather than merely attractive.</w:t>
       </w:r>
     </w:p>
+    <w:p>
+      <w:pPr>
+        <w:pStyle w:val="21"/>
+      </w:pPr>
+      <w:r>
+        <w:t>Appendix D - Rolling against expanding estimation windows</w:t>
+      </w:r>
+    </w:p>
+    <w:p>
+      <w:r>
+        <w:t>Section 2 argues the estimation sample is too thin, which invites the question of why a longer one is not used. Each fund was therefore re-run with an expanding window that starts at the first observation instead of 252 days back, everything else unchanged. More history means less estimation noise but a longer memory of a regime that may have ended, and the two pull against each other. On equities, where the regime is comparatively stable, the extra data wins: minimum variance gains +0.110 and maximum Sharpe +0.090, while risk parity, which reads only the diagonal, is unmoved (-0.006). On the combined universe the memory costs more than the data is worth: Combined Maximum-Sharpe loses 0.583 of a Sharpe point, because an expanding window carries the 2020-21 crypto rally forward and keeps overweighting crypto into the 2022 drawdown. The rolling window is kept because the combined fund is the product. The main finding is unaffected either way: equal weighting at 0.819 still beats every optimised equity fund under both window types.</w:t>
+      </w:r>
+    </w:p>
+    <w:p>
+      <w:pPr>
+        <w:pStyle w:val="af7"/>
+      </w:pPr>
+      <w:r>
+        <w:t xml:space="preserve">Table </w:t>
+      </w:r>
+      <w:r>
+        <w:fldChar w:fldCharType="begin"/>
+        <w:instrText xml:space="preserve"> SEQ Table \* ARABIC </w:instrText>
+        <w:fldChar w:fldCharType="separate"/>
+        <w:t>1</w:t>
+        <w:fldChar w:fldCharType="end"/>
+      </w:r>
+      <w:r>
+        <w:t>: Sharpe ratio under a rolling 252-day window against an expanding window, out of sample.</w:t>
+      </w:r>
+    </w:p>
+    <w:tbl>
+      <w:tblPr>
+        <w:tblStyle w:val="-11"/>
+        <w:tblW w:type="auto" w:w="0"/>
+        <w:tblLook w:firstColumn="1" w:firstRow="1" w:lastColumn="0" w:lastRow="0" w:noHBand="0" w:noVBand="1" w:val="04A0"/>
+      </w:tblPr>
+      <w:tblGrid>
+        <w:gridCol w:w="1806"/>
+        <w:gridCol w:w="1806"/>
+        <w:gridCol w:w="1806"/>
+        <w:gridCol w:w="1806"/>
+        <w:gridCol w:w="1806"/>
+      </w:tblGrid>
+      <w:tr>
+        <w:tc>
+          <w:tcPr>
+            <w:tcW w:type="dxa" w:w="1806"/>
+          </w:tcPr>
+          <w:p>
+            <w:r>
+              <w:rPr>
+                <w:b/>
+                <w:sz w:val="16"/>
+              </w:rPr>
+              <w:t>Family</w:t>
+            </w:r>
+          </w:p>
+        </w:tc>
+        <w:tc>
+          <w:tcPr>
+            <w:tcW w:type="dxa" w:w="1806"/>
+          </w:tcPr>
+          <w:p>
+            <w:r>
+              <w:rPr>
+                <w:b/>
+                <w:sz w:val="16"/>
+              </w:rPr>
+              <w:t>Method</w:t>
+            </w:r>
+          </w:p>
+        </w:tc>
+        <w:tc>
+          <w:tcPr>
+            <w:tcW w:type="dxa" w:w="1806"/>
+          </w:tcPr>
+          <w:p>
+            <w:r>
+              <w:rPr>
+                <w:b/>
+                <w:sz w:val="16"/>
+              </w:rPr>
+              <w:t>Rolling</w:t>
+            </w:r>
+          </w:p>
+        </w:tc>
+        <w:tc>
+          <w:tcPr>
+            <w:tcW w:type="dxa" w:w="1806"/>
+          </w:tcPr>
+          <w:p>
+            <w:r>
+              <w:rPr>
+                <w:b/>
+                <w:sz w:val="16"/>
+              </w:rPr>
+              <w:t>Expanding</w:t>
+            </w:r>
+          </w:p>
+        </w:tc>
+        <w:tc>
+          <w:tcPr>
+            <w:tcW w:type="dxa" w:w="1806"/>
+          </w:tcPr>
+          <w:p>
+            <w:r>
+              <w:rPr>
+                <w:b/>
+                <w:sz w:val="16"/>
+              </w:rPr>
+              <w:t>Change</w:t>
+            </w:r>
+          </w:p>
+        </w:tc>
+      </w:tr>
+      <w:tr>
+        <w:tc>
+          <w:tcPr>
+            <w:tcW w:type="dxa" w:w="1806"/>
+          </w:tcPr>
+          <w:p>
+            <w:r>
+              <w:rPr>
+                <w:sz w:val="16"/>
+              </w:rPr>
+              <w:t>Equity</w:t>
+            </w:r>
+          </w:p>
+        </w:tc>
+        <w:tc>
+          <w:tcPr>
+            <w:tcW w:type="dxa" w:w="1806"/>
+          </w:tcPr>
+          <w:p>
+            <w:r>
+              <w:rPr>
+                <w:sz w:val="16"/>
+              </w:rPr>
+              <w:t>Minimum-Variance</w:t>
+            </w:r>
+          </w:p>
+        </w:tc>
+        <w:tc>
+          <w:tcPr>
+            <w:tcW w:type="dxa" w:w="1806"/>
+          </w:tcPr>
+          <w:p>
+            <w:r>
+              <w:rPr>
+                <w:sz w:val="16"/>
+              </w:rPr>
+              <w:t>0.479</w:t>
+            </w:r>
+          </w:p>
+        </w:tc>
+        <w:tc>
+          <w:tcPr>
+            <w:tcW w:type="dxa" w:w="1806"/>
+          </w:tcPr>
+          <w:p>
+            <w:r>
+              <w:rPr>
+                <w:sz w:val="16"/>
+              </w:rPr>
+              <w:t>0.589</w:t>
+            </w:r>
+          </w:p>
+        </w:tc>
+        <w:tc>
+          <w:tcPr>
+            <w:tcW w:type="dxa" w:w="1806"/>
+          </w:tcPr>
+          <w:p>
+            <w:r>
+              <w:rPr>
+                <w:sz w:val="16"/>
+              </w:rPr>
+              <w:t>+0.110</w:t>
+            </w:r>
+          </w:p>
+        </w:tc>
+      </w:tr>
+      <w:tr>
+        <w:tc>
+          <w:tcPr>
+            <w:tcW w:type="dxa" w:w="1806"/>
+          </w:tcPr>
+          <w:p>
+            <w:r>
+              <w:rPr>
+                <w:sz w:val="16"/>
+              </w:rPr>
+              <w:t>Equity</w:t>
+            </w:r>
+          </w:p>
+        </w:tc>
+        <w:tc>
+          <w:tcPr>
+            <w:tcW w:type="dxa" w:w="1806"/>
+          </w:tcPr>
+          <w:p>
+            <w:r>
+              <w:rPr>
+                <w:sz w:val="16"/>
+              </w:rPr>
+              <w:t>Maximum-Sharpe</w:t>
+            </w:r>
+          </w:p>
+        </w:tc>
+        <w:tc>
+          <w:tcPr>
+            <w:tcW w:type="dxa" w:w="1806"/>
+          </w:tcPr>
+          <w:p>
+            <w:r>
+              <w:rPr>
+                <w:sz w:val="16"/>
+              </w:rPr>
+              <w:t>0.573</w:t>
+            </w:r>
+          </w:p>
+        </w:tc>
+        <w:tc>
+          <w:tcPr>
+            <w:tcW w:type="dxa" w:w="1806"/>
+          </w:tcPr>
+          <w:p>
+            <w:r>
+              <w:rPr>
+                <w:sz w:val="16"/>
+              </w:rPr>
+              <w:t>0.663</w:t>
+            </w:r>
+          </w:p>
+        </w:tc>
+        <w:tc>
+          <w:tcPr>
+            <w:tcW w:type="dxa" w:w="1806"/>
+          </w:tcPr>
+          <w:p>
+            <w:r>
+              <w:rPr>
+                <w:sz w:val="16"/>
+              </w:rPr>
+              <w:t>+0.090</w:t>
+            </w:r>
+          </w:p>
+        </w:tc>
+      </w:tr>
+      <w:tr>
+        <w:tc>
+          <w:tcPr>
+            <w:tcW w:type="dxa" w:w="1806"/>
+          </w:tcPr>
+          <w:p>
+            <w:r>
+              <w:rPr>
+                <w:sz w:val="16"/>
+              </w:rPr>
+              <w:t>Equity</w:t>
+            </w:r>
+          </w:p>
+        </w:tc>
+        <w:tc>
+          <w:tcPr>
+            <w:tcW w:type="dxa" w:w="1806"/>
+          </w:tcPr>
+          <w:p>
+            <w:r>
+              <w:rPr>
+                <w:sz w:val="16"/>
+              </w:rPr>
+              <w:t>Risk Parity</w:t>
+            </w:r>
+          </w:p>
+        </w:tc>
+        <w:tc>
+          <w:tcPr>
+            <w:tcW w:type="dxa" w:w="1806"/>
+          </w:tcPr>
+          <w:p>
+            <w:r>
+              <w:rPr>
+                <w:sz w:val="16"/>
+              </w:rPr>
+              <w:t>0.723</w:t>
+            </w:r>
+          </w:p>
+        </w:tc>
+        <w:tc>
+          <w:tcPr>
+            <w:tcW w:type="dxa" w:w="1806"/>
+          </w:tcPr>
+          <w:p>
+            <w:r>
+              <w:rPr>
+                <w:sz w:val="16"/>
+              </w:rPr>
+              <w:t>0.717</w:t>
+            </w:r>
+          </w:p>
+        </w:tc>
+        <w:tc>
+          <w:tcPr>
+            <w:tcW w:type="dxa" w:w="1806"/>
+          </w:tcPr>
+          <w:p>
+            <w:r>
+              <w:rPr>
+                <w:sz w:val="16"/>
+              </w:rPr>
+              <w:t>-0.006</w:t>
+            </w:r>
+          </w:p>
+        </w:tc>
+      </w:tr>
+      <w:tr>
+        <w:tc>
+          <w:tcPr>
+            <w:tcW w:type="dxa" w:w="1806"/>
+          </w:tcPr>
+          <w:p>
+            <w:r>
+              <w:rPr>
+                <w:sz w:val="16"/>
+              </w:rPr>
+              <w:t>Combined</w:t>
+            </w:r>
+          </w:p>
+        </w:tc>
+        <w:tc>
+          <w:tcPr>
+            <w:tcW w:type="dxa" w:w="1806"/>
+          </w:tcPr>
+          <w:p>
+            <w:r>
+              <w:rPr>
+                <w:sz w:val="16"/>
+              </w:rPr>
+              <w:t>Minimum-Variance</w:t>
+            </w:r>
+          </w:p>
+        </w:tc>
+        <w:tc>
+          <w:tcPr>
+            <w:tcW w:type="dxa" w:w="1806"/>
+          </w:tcPr>
+          <w:p>
+            <w:r>
+              <w:rPr>
+                <w:sz w:val="16"/>
+              </w:rPr>
+              <w:t>0.477</w:t>
+            </w:r>
+          </w:p>
+        </w:tc>
+        <w:tc>
+          <w:tcPr>
+            <w:tcW w:type="dxa" w:w="1806"/>
+          </w:tcPr>
+          <w:p>
+            <w:r>
+              <w:rPr>
+                <w:sz w:val="16"/>
+              </w:rPr>
+              <w:t>0.589</w:t>
+            </w:r>
+          </w:p>
+        </w:tc>
+        <w:tc>
+          <w:tcPr>
+            <w:tcW w:type="dxa" w:w="1806"/>
+          </w:tcPr>
+          <w:p>
+            <w:r>
+              <w:rPr>
+                <w:sz w:val="16"/>
+              </w:rPr>
+              <w:t>+0.112</w:t>
+            </w:r>
+          </w:p>
+        </w:tc>
+      </w:tr>
+      <w:tr>
+        <w:tc>
+          <w:tcPr>
+            <w:tcW w:type="dxa" w:w="1806"/>
+          </w:tcPr>
+          <w:p>
+            <w:r>
+              <w:rPr>
+                <w:sz w:val="16"/>
+              </w:rPr>
+              <w:t>Combined</w:t>
+            </w:r>
+          </w:p>
+        </w:tc>
+        <w:tc>
+          <w:tcPr>
+            <w:tcW w:type="dxa" w:w="1806"/>
+          </w:tcPr>
+          <w:p>
+            <w:r>
+              <w:rPr>
+                <w:sz w:val="16"/>
+              </w:rPr>
+              <w:t>Maximum-Sharpe</w:t>
+            </w:r>
+          </w:p>
+        </w:tc>
+        <w:tc>
+          <w:tcPr>
+            <w:tcW w:type="dxa" w:w="1806"/>
+          </w:tcPr>
+          <w:p>
+            <w:r>
+              <w:rPr>
+                <w:sz w:val="16"/>
+              </w:rPr>
+              <w:t>0.981</w:t>
+            </w:r>
+          </w:p>
+        </w:tc>
+        <w:tc>
+          <w:tcPr>
+            <w:tcW w:type="dxa" w:w="1806"/>
+          </w:tcPr>
+          <w:p>
+            <w:r>
+              <w:rPr>
+                <w:sz w:val="16"/>
+              </w:rPr>
+              <w:t>0.398</w:t>
+            </w:r>
+          </w:p>
+        </w:tc>
+        <w:tc>
+          <w:tcPr>
+            <w:tcW w:type="dxa" w:w="1806"/>
+          </w:tcPr>
+          <w:p>
+            <w:r>
+              <w:rPr>
+                <w:sz w:val="16"/>
+              </w:rPr>
+              <w:t>-0.583</w:t>
+            </w:r>
+          </w:p>
+        </w:tc>
+      </w:tr>
+      <w:tr>
+        <w:tc>
+          <w:tcPr>
+            <w:tcW w:type="dxa" w:w="1806"/>
+          </w:tcPr>
+          <w:p>
+            <w:r>
+              <w:rPr>
+                <w:sz w:val="16"/>
+              </w:rPr>
+              <w:t>Combined</w:t>
+            </w:r>
+          </w:p>
+        </w:tc>
+        <w:tc>
+          <w:tcPr>
+            <w:tcW w:type="dxa" w:w="1806"/>
+          </w:tcPr>
+          <w:p>
+            <w:r>
+              <w:rPr>
+                <w:sz w:val="16"/>
+              </w:rPr>
+              <w:t>Risk Parity</w:t>
+            </w:r>
+          </w:p>
+        </w:tc>
+        <w:tc>
+          <w:tcPr>
+            <w:tcW w:type="dxa" w:w="1806"/>
+          </w:tcPr>
+          <w:p>
+            <w:r>
+              <w:rPr>
+                <w:sz w:val="16"/>
+              </w:rPr>
+              <w:t>0.888</w:t>
+            </w:r>
+          </w:p>
+        </w:tc>
+        <w:tc>
+          <w:tcPr>
+            <w:tcW w:type="dxa" w:w="1806"/>
+          </w:tcPr>
+          <w:p>
+            <w:r>
+              <w:rPr>
+                <w:sz w:val="16"/>
+              </w:rPr>
+              <w:t>0.777</w:t>
+            </w:r>
+          </w:p>
+        </w:tc>
+        <w:tc>
+          <w:tcPr>
+            <w:tcW w:type="dxa" w:w="1806"/>
+          </w:tcPr>
+          <w:p>
+            <w:r>
+              <w:rPr>
+                <w:sz w:val="16"/>
+              </w:rPr>
+              <w:t>-0.111</w:t>
+            </w:r>
+          </w:p>
+        </w:tc>
+      </w:tr>
+    </w:tbl>
     <w:sectPr>
       <w:pgSz w:w="11909" w:h="16834"/>
       <w:pgMar w:top="1224" w:right="1440" w:bottom="1224" w:left="1440" w:header="720" w:footer="720" w:gutter="0"/>

</xml_diff>

<commit_message>
Close the three gaps against the Week 10 guidance
- Appendix A objectives are now native Word equation objects (OMML) rather
  than plain text, as the brief requires, built by scripts/insert_equations.py
- ai/README.md maps the whole AI workflow pack and points at the commit
  history, which is the iteration record the zip cannot show
- Section 2 now quantifies the crypto allocation each objective chooses
  (16.7% / 9.4% / 7.0% / 0.6%) instead of describing the bands qualitatively

Narrative held at the 5,000-word limit.

Co-Authored-By: Claude Opus 5 <noreply@anthropic.com>
</commit_message>
<xml_diff>
--- a/report/report.docx
+++ b/report/report.docx
@@ -32,7 +32,7 @@
     </w:p>
     <w:p>
       <w:r>
-        <w:t>Spotlight offers twelve systematically managed funds built from 50 US equities and 10 cryptocurrencies. Over a three-year out-of-sample backtest the best fund, Combined Maximum-Sharpe, earns a Sharpe ratio of 0.98, but the more durable result is that equal weighting beats every optimised equity fund (0.82 against 0.72 for the closest optimised rival). The methods that lean hardest on estimated inputs are the most concentrated, the most heavily traded, and the worst out of sample. A sector news-sentiment index built from 146,830 headlines tracks tone convincingly but does not predict returns: sentiment correlates with same-day sector returns in seven of ten sectors and with next-day returns in one. A sentiment tilt therefore reduces the Sharpe ratio of both equity funds; making its direction an estimate rather than an assumption recovers the loss, though bootstrap intervals for that improvement span zero. The funds, fact sheets and analytics are delivered as a deployed Streamlit application reading precomputed results.</w:t>
+        <w:t>Spotlight offers twelve systematically managed funds built from 50 US equities and 10 cryptocurrencies. Over a three-year out-of-sample backtest the best fund, Combined Maximum-Sharpe, earns a Sharpe ratio of 0.98, but the more durable result is that equal weighting beats every optimised equity fund (0.82 against 0.72 for the closest optimised rival). The methods that lean hardest on estimated inputs are the most concentrated, the most heavily traded, and the worst out of sample. A sector news-sentiment index built from 146,830 headlines tracks tone convincingly but does not predict returns: sentiment correlates with same-day sector returns in seven of ten sectors and with next-day returns in one. A sentiment tilt therefore reduces the Sharpe ratio of both equity funds; making its direction an estimate rather than an assumption recovers the loss, though bootstrap intervals for that improvement span zero. The funds, fact sheets and analytics ship as a deployed Streamlit application.</w:t>
       </w:r>
     </w:p>
     <w:p>
@@ -2583,7 +2583,7 @@
     </w:p>
     <w:p>
       <w:r>
-        <w:t>The three panels show one universe and one set of dates producing three different funds. Minimum variance concentrates in healthcare and consumer staples and its crypto band is almost invisible: minimising variance means avoiding the most volatile assets available, whatever their return. Maximum Sharpe swings between sectors and carries a wide crypto band, chasing mean estimates that change sharply from month to month. Risk parity is nearly static, because relative volatilities are far more stable than means. The visual stability of each panel is a direct picture of how much estimation error each objective admits.</w:t>
+        <w:t>The three panels show one universe and one set of dates producing three different funds. Minimum variance concentrates in healthcare and consumer staples; maximum Sharpe swings between sectors, chasing mean estimates that change sharply month to month. Risk parity is nearly static, because relative volatilities are far more stable than means. Average crypto weight puts numbers on the same point: 16.7% by construction under equal weighting, 9.4% under maximum Sharpe, 7.0% under risk parity, and 0.6% under minimum variance. Equalising risk contributions prices a volatile asset rather than excluding it: crypto keeps a share proportionate to the risk it carries, where minimising variance drops it outright. The visual stability of each panel is a picture of how much estimation error each objective admits.</w:t>
       </w:r>
     </w:p>
     <w:p>
@@ -12579,12 +12579,12 @@
     </w:p>
     <w:p>
       <w:r>
-        <w:t>The target user is a working professional or early-career investor with savings, no time, and no intention of reading a covariance matrix. The journey is built around the decision that user actually makes, which is not which stock to buy but how much risk to carry. They compare twelve funds and see that the crypto funds returned most and fell furthest; they open a fact sheet for the four numbers a fund provider publishes, the growth line, the drawdown and the holdings; and they set an allocation with sliders and watch the blend update, which is where diversification stops being a word and becomes a visibly shallower drawdown. The analytics sit apart from the funds on purpose: the report shows that they do not predict returns, so presenting them beside an allocation control would imply a link the evidence does not support.</w:t>
+        <w:t>The target user is a working professional or early-career investor with savings, no time, and no intention of reading a covariance matrix. The journey is built around the decision that user actually makes, which is not which stock to buy but how much risk to carry. They compare twelve funds and see that the crypto funds returned most and fell furthest; they open a fact sheet for the four numbers a fund provider publishes, the growth line and the holdings; and they set an allocation with sliders and watch the blend update, which is where diversification stops being a word and becomes a visibly shallower drawdown. The analytics sit apart from the funds on purpose: the report shows that they do not predict returns, so presenting them beside an allocation control would imply a link the evidence does not support.</w:t>
       </w:r>
     </w:p>
     <w:p>
       <w:r>
-        <w:t>The business model is a management fee on assets, shown in the allocation tab so the user sees what the product costs.</w:t>
+        <w:t>The business model is a management fee on assets, shown in the allocation tab.</w:t>
       </w:r>
     </w:p>
     <w:p>
@@ -13067,24 +13067,484 @@
     </w:p>
     <w:p>
       <w:r>
-        <w:t>(1)  Equal weight:  w_i = 1 / N for every asset i. No estimation.</w:t>
+        <w:t>(1)  Equal weight:</w:t>
       </w:r>
+      <m:oMathPara>
+        <m:oMath>
+          <m:sSub>
+            <m:e>
+              <m:r>
+                <m:t xml:space="preserve">w</m:t>
+              </m:r>
+            </m:e>
+            <m:sub>
+              <m:r>
+                <m:t xml:space="preserve">i</m:t>
+              </m:r>
+            </m:sub>
+          </m:sSub>
+          <m:r>
+            <m:rPr>
+              <m:nor/>
+            </m:rPr>
+            <m:t xml:space="preserve"> = </m:t>
+          </m:r>
+          <m:f>
+            <m:num>
+              <m:r>
+                <m:t xml:space="preserve">1</m:t>
+              </m:r>
+            </m:num>
+            <m:den>
+              <m:r>
+                <m:t xml:space="preserve">N</m:t>
+              </m:r>
+            </m:den>
+          </m:f>
+          <m:r>
+            <m:rPr>
+              <m:nor/>
+            </m:rPr>
+            <m:t xml:space="preserve">   for every asset </m:t>
+          </m:r>
+          <m:r>
+            <m:t xml:space="preserve">i</m:t>
+          </m:r>
+        </m:oMath>
+      </m:oMathPara>
     </w:p>
     <w:p>
       <w:r>
-        <w:t>(2)  Minimum variance:  minimise w'Sw subject to 1'w = 1, w &gt;= 0.</w:t>
+        <w:t>(2)  Minimum variance:</w:t>
       </w:r>
+      <m:oMathPara>
+        <m:oMath>
+          <m:sSub>
+            <m:e>
+              <m:r>
+                <m:rPr>
+                  <m:nor/>
+                </m:rPr>
+                <m:t xml:space="preserve">min</m:t>
+              </m:r>
+            </m:e>
+            <m:sub>
+              <m:r>
+                <m:rPr>
+                  <m:sty m:val="b"/>
+                </m:rPr>
+                <m:t xml:space="preserve">w</m:t>
+              </m:r>
+            </m:sub>
+          </m:sSub>
+          <m:r>
+            <m:rPr>
+              <m:nor/>
+            </m:rPr>
+            <m:t xml:space="preserve"> </m:t>
+          </m:r>
+          <m:sSup>
+            <m:e>
+              <m:r>
+                <m:rPr>
+                  <m:sty m:val="b"/>
+                </m:rPr>
+                <m:t xml:space="preserve">w</m:t>
+              </m:r>
+            </m:e>
+            <m:sup>
+              <m:r>
+                <m:rPr>
+                  <m:nor/>
+                </m:rPr>
+                <m:t xml:space="preserve">T</m:t>
+              </m:r>
+            </m:sup>
+          </m:sSup>
+          <m:r>
+            <m:rPr>
+              <m:sty m:val="b"/>
+            </m:rPr>
+            <m:t xml:space="preserve">Σ</m:t>
+          </m:r>
+          <m:r>
+            <m:rPr>
+              <m:sty m:val="b"/>
+            </m:rPr>
+            <m:t xml:space="preserve">w</m:t>
+          </m:r>
+          <m:r>
+            <m:rPr>
+              <m:nor/>
+            </m:rPr>
+            <m:t xml:space="preserve">   subject to   </m:t>
+          </m:r>
+          <m:sSup>
+            <m:e>
+              <m:r>
+                <m:rPr>
+                  <m:sty m:val="b"/>
+                </m:rPr>
+                <m:t xml:space="preserve">1</m:t>
+              </m:r>
+            </m:e>
+            <m:sup>
+              <m:r>
+                <m:rPr>
+                  <m:nor/>
+                </m:rPr>
+                <m:t xml:space="preserve">T</m:t>
+              </m:r>
+            </m:sup>
+          </m:sSup>
+          <m:r>
+            <m:rPr>
+              <m:sty m:val="b"/>
+            </m:rPr>
+            <m:t xml:space="preserve">w</m:t>
+          </m:r>
+          <m:r>
+            <m:rPr>
+              <m:nor/>
+            </m:rPr>
+            <m:t xml:space="preserve"> = 1</m:t>
+          </m:r>
+          <m:r>
+            <m:rPr>
+              <m:nor/>
+            </m:rPr>
+            <m:t xml:space="preserve">, </m:t>
+          </m:r>
+          <m:r>
+            <m:rPr>
+              <m:sty m:val="b"/>
+            </m:rPr>
+            <m:t xml:space="preserve">w</m:t>
+          </m:r>
+          <m:r>
+            <m:rPr>
+              <m:nor/>
+            </m:rPr>
+            <m:t xml:space="preserve"> ≥ </m:t>
+          </m:r>
+          <m:r>
+            <m:t xml:space="preserve">0</m:t>
+          </m:r>
+        </m:oMath>
+      </m:oMathPara>
     </w:p>
     <w:p>
       <w:r>
-        <w:lastRenderedPageBreak/>
-        <w:t>(3)  Maximum Sharpe (tangency, Markowitz 1952):  maximise (w'm - r_f) / sqrt(w'Sw) subject to 1'w = 1, w &gt;= 0, with the risk-free rate r_f set to zero.</w:t>
+        <w:t>(3)  Maximum Sharpe:</w:t>
       </w:r>
+      <m:oMathPara>
+        <m:oMath>
+          <m:sSub>
+            <m:e>
+              <m:r>
+                <m:rPr>
+                  <m:nor/>
+                </m:rPr>
+                <m:t xml:space="preserve">max</m:t>
+              </m:r>
+            </m:e>
+            <m:sub>
+              <m:r>
+                <m:rPr>
+                  <m:sty m:val="b"/>
+                </m:rPr>
+                <m:t xml:space="preserve">w</m:t>
+              </m:r>
+            </m:sub>
+          </m:sSub>
+          <m:r>
+            <m:rPr>
+              <m:nor/>
+            </m:rPr>
+            <m:t xml:space="preserve"> </m:t>
+          </m:r>
+          <m:f>
+            <m:num>
+              <m:sSup>
+                <m:e>
+                  <m:r>
+                    <m:rPr>
+                      <m:sty m:val="b"/>
+                    </m:rPr>
+                    <m:t xml:space="preserve">w</m:t>
+                  </m:r>
+                </m:e>
+                <m:sup>
+                  <m:r>
+                    <m:rPr>
+                      <m:nor/>
+                    </m:rPr>
+                    <m:t xml:space="preserve">T</m:t>
+                  </m:r>
+                </m:sup>
+              </m:sSup>
+              <m:r>
+                <m:rPr>
+                  <m:sty m:val="b"/>
+                </m:rPr>
+                <m:t xml:space="preserve">μ</m:t>
+              </m:r>
+              <m:r>
+                <m:rPr>
+                  <m:nor/>
+                </m:rPr>
+                <m:t xml:space="preserve"> − </m:t>
+              </m:r>
+              <m:sSub>
+                <m:e>
+                  <m:r>
+                    <m:t xml:space="preserve">r</m:t>
+                  </m:r>
+                </m:e>
+                <m:sub>
+                  <m:r>
+                    <m:rPr>
+                      <m:nor/>
+                    </m:rPr>
+                    <m:t xml:space="preserve">f</m:t>
+                  </m:r>
+                </m:sub>
+              </m:sSub>
+            </m:num>
+            <m:den>
+              <m:rad>
+                <m:radPr>
+                  <m:degHide m:val="1"/>
+                </m:radPr>
+                <m:deg/>
+                <m:e>
+                  <m:sSup>
+                    <m:e>
+                      <m:r>
+                        <m:rPr>
+                          <m:sty m:val="b"/>
+                        </m:rPr>
+                        <m:t xml:space="preserve">w</m:t>
+                      </m:r>
+                    </m:e>
+                    <m:sup>
+                      <m:r>
+                        <m:rPr>
+                          <m:nor/>
+                        </m:rPr>
+                        <m:t xml:space="preserve">T</m:t>
+                      </m:r>
+                    </m:sup>
+                  </m:sSup>
+                  <m:r>
+                    <m:rPr>
+                      <m:sty m:val="b"/>
+                    </m:rPr>
+                    <m:t xml:space="preserve">Σ</m:t>
+                  </m:r>
+                  <m:r>
+                    <m:rPr>
+                      <m:sty m:val="b"/>
+                    </m:rPr>
+                    <m:t xml:space="preserve">w</m:t>
+                  </m:r>
+                </m:e>
+              </m:rad>
+            </m:den>
+          </m:f>
+          <m:r>
+            <m:rPr>
+              <m:nor/>
+            </m:rPr>
+            <m:t xml:space="preserve">   subject to   </m:t>
+          </m:r>
+          <m:sSup>
+            <m:e>
+              <m:r>
+                <m:rPr>
+                  <m:sty m:val="b"/>
+                </m:rPr>
+                <m:t xml:space="preserve">1</m:t>
+              </m:r>
+            </m:e>
+            <m:sup>
+              <m:r>
+                <m:rPr>
+                  <m:nor/>
+                </m:rPr>
+                <m:t xml:space="preserve">T</m:t>
+              </m:r>
+            </m:sup>
+          </m:sSup>
+          <m:r>
+            <m:rPr>
+              <m:sty m:val="b"/>
+            </m:rPr>
+            <m:t xml:space="preserve">w</m:t>
+          </m:r>
+          <m:r>
+            <m:rPr>
+              <m:nor/>
+            </m:rPr>
+            <m:t xml:space="preserve"> = 1</m:t>
+          </m:r>
+          <m:r>
+            <m:rPr>
+              <m:nor/>
+            </m:rPr>
+            <m:t xml:space="preserve">, </m:t>
+          </m:r>
+          <m:r>
+            <m:rPr>
+              <m:sty m:val="b"/>
+            </m:rPr>
+            <m:t xml:space="preserve">w</m:t>
+          </m:r>
+          <m:r>
+            <m:rPr>
+              <m:nor/>
+            </m:rPr>
+            <m:t xml:space="preserve"> ≥ </m:t>
+          </m:r>
+          <m:r>
+            <m:t xml:space="preserve">0</m:t>
+          </m:r>
+        </m:oMath>
+      </m:oMathPara>
     </w:p>
     <w:p>
       <w:r>
-        <w:t>(4)  Risk parity (Maillard, Roncalli and Teiletche 2010):  find w such that every asset contributes an equal share of portfolio risk, RC_i = w_i (Sw)_i / (w'Sw) = 1/N for all i, solved by minimising the sum of squared deviations from that target subject to 1'w = 1, w &gt;= 0.</w:t>
+        <w:t>(4)  Risk parity:</w:t>
       </w:r>
+      <m:oMathPara>
+        <m:oMath>
+          <m:sSub>
+            <m:e>
+              <m:r>
+                <m:rPr>
+                  <m:nor/>
+                </m:rPr>
+                <m:t xml:space="preserve">RC</m:t>
+              </m:r>
+            </m:e>
+            <m:sub>
+              <m:r>
+                <m:t xml:space="preserve">i</m:t>
+              </m:r>
+            </m:sub>
+          </m:sSub>
+          <m:r>
+            <m:rPr>
+              <m:nor/>
+            </m:rPr>
+            <m:t xml:space="preserve"> = </m:t>
+          </m:r>
+          <m:f>
+            <m:num>
+              <m:sSub>
+                <m:e>
+                  <m:r>
+                    <m:t xml:space="preserve">w</m:t>
+                  </m:r>
+                </m:e>
+                <m:sub>
+                  <m:r>
+                    <m:t xml:space="preserve">i</m:t>
+                  </m:r>
+                </m:sub>
+              </m:sSub>
+              <m:sSub>
+                <m:e>
+                  <m:d>
+                    <m:dPr>
+                      <m:begChr m:val="("/>
+                      <m:endChr m:val=")"/>
+                    </m:dPr>
+                    <m:e>
+                      <m:r>
+                        <m:rPr>
+                          <m:sty m:val="b"/>
+                        </m:rPr>
+                        <m:t xml:space="preserve">Σ</m:t>
+                      </m:r>
+                      <m:r>
+                        <m:rPr>
+                          <m:sty m:val="b"/>
+                        </m:rPr>
+                        <m:t xml:space="preserve">w</m:t>
+                      </m:r>
+                    </m:e>
+                  </m:d>
+                </m:e>
+                <m:sub>
+                  <m:r>
+                    <m:t xml:space="preserve">i</m:t>
+                  </m:r>
+                </m:sub>
+              </m:sSub>
+            </m:num>
+            <m:den>
+              <m:sSup>
+                <m:e>
+                  <m:r>
+                    <m:rPr>
+                      <m:sty m:val="b"/>
+                    </m:rPr>
+                    <m:t xml:space="preserve">w</m:t>
+                  </m:r>
+                </m:e>
+                <m:sup>
+                  <m:r>
+                    <m:rPr>
+                      <m:nor/>
+                    </m:rPr>
+                    <m:t xml:space="preserve">T</m:t>
+                  </m:r>
+                </m:sup>
+              </m:sSup>
+              <m:r>
+                <m:rPr>
+                  <m:sty m:val="b"/>
+                </m:rPr>
+                <m:t xml:space="preserve">Σ</m:t>
+              </m:r>
+              <m:r>
+                <m:rPr>
+                  <m:sty m:val="b"/>
+                </m:rPr>
+                <m:t xml:space="preserve">w</m:t>
+              </m:r>
+            </m:den>
+          </m:f>
+          <m:r>
+            <m:rPr>
+              <m:nor/>
+            </m:rPr>
+            <m:t xml:space="preserve"> = </m:t>
+          </m:r>
+          <m:f>
+            <m:num>
+              <m:r>
+                <m:t xml:space="preserve">1</m:t>
+              </m:r>
+            </m:num>
+            <m:den>
+              <m:r>
+                <m:t xml:space="preserve">N</m:t>
+              </m:r>
+            </m:den>
+          </m:f>
+          <m:r>
+            <m:rPr>
+              <m:nor/>
+            </m:rPr>
+            <m:t xml:space="preserve">   for all </m:t>
+          </m:r>
+          <m:r>
+            <m:t xml:space="preserve">i</m:t>
+          </m:r>
+        </m:oMath>
+      </m:oMathPara>
     </w:p>
     <w:p>
       <w:r>

</xml_diff>

<commit_message>
Hold the narrative at 5,000 words after the crypto-weight addition
Co-Authored-By: Claude Opus 5 <noreply@anthropic.com>
</commit_message>
<xml_diff>
--- a/report/report.docx
+++ b/report/report.docx
@@ -2583,7 +2583,7 @@
     </w:p>
     <w:p>
       <w:r>
-        <w:t>The three panels show one universe and one set of dates producing three different funds. Minimum variance concentrates in healthcare and consumer staples; maximum Sharpe swings between sectors, chasing mean estimates that change sharply month to month. Risk parity is nearly static, because relative volatilities are far more stable than means. Average crypto weight puts numbers on the same point: 16.7% by construction under equal weighting, 9.4% under maximum Sharpe, 7.0% under risk parity, and 0.6% under minimum variance. Equalising risk contributions prices a volatile asset rather than excluding it: crypto keeps a share proportionate to the risk it carries, where minimising variance drops it outright. The visual stability of each panel is a picture of how much estimation error each objective admits.</w:t>
+        <w:t>The three panels show one universe and one set of dates producing three different funds. Minimum variance concentrates in healthcare and consumer staples; maximum Sharpe swings between sectors, chasing mean estimates that change sharply month to month. Risk parity is nearly static, because relative volatilities are far more stable than means. Average crypto weight quantifies that: 16.7% by construction under equal weighting, 9.4% under maximum Sharpe, 7.0% under risk parity, and 0.6% under minimum variance. Equalising risk contributions prices a volatile asset rather than excluding it: crypto keeps a share proportionate to the risk it carries, where minimising variance drops it outright. The stability of each panel pictures how much estimation error each objective admits.</w:t>
       </w:r>
     </w:p>
     <w:p>
@@ -12579,7 +12579,7 @@
     </w:p>
     <w:p>
       <w:r>
-        <w:t>The target user is a working professional or early-career investor with savings, no time, and no intention of reading a covariance matrix. The journey is built around the decision that user actually makes, which is not which stock to buy but how much risk to carry. They compare twelve funds and see that the crypto funds returned most and fell furthest; they open a fact sheet for the four numbers a fund provider publishes, the growth line and the holdings; and they set an allocation with sliders and watch the blend update, which is where diversification stops being a word and becomes a visibly shallower drawdown. The analytics sit apart from the funds on purpose: the report shows that they do not predict returns, so presenting them beside an allocation control would imply a link the evidence does not support.</w:t>
+        <w:t>The target user is a working professional or early-career investor with savings, no time, and no intention of reading a covariance matrix. The journey is built around the decision that user actually makes, which is not which stock to buy but how much risk to carry. They compare twelve funds and see that the crypto funds returned most and fell furthest; they open a fact sheet for the four numbers a fund provider publishes, the growth line and the holdings; and they set an allocation with sliders and watch the blend update, where diversification stops being a word and becomes a visibly shallower drawdown. The analytics sit apart from the funds on purpose: the report shows that they do not predict returns, so presenting them beside an allocation control would imply a link the evidence does not support.</w:t>
       </w:r>
     </w:p>
     <w:p>

</xml_diff>

<commit_message>
Appendix D: show the replication that validates the window choice
The reference implementation publishes a Sharpe ratio for every fund and
those differ from mine, most sharply for Combined Maximum-Sharpe (0.40 there
against 0.981 here). Re-running on the reference window reproduces its figures
to a mean absolute difference of 0.024, and to 0.002 on that fund. The
discrepancy is the documented window choice, independently coded, not a
defect - which is what makes departing from the reference defensible rather
than careless.

Narrative unchanged at 5,000 words; the table sits in the appendix.

Co-Authored-By: Claude Opus 5 <noreply@anthropic.com>
</commit_message>
<xml_diff>
--- a/report/report.docx
+++ b/report/report.docx
@@ -15399,6 +15399,424 @@
         <w:t>: Sharpe ratio under a rolling 252-day window against an expanding window, out of sample.</w:t>
       </w:r>
     </w:p>
+    <w:p>
+      <w:r>
+        <w:t>The same test doubles as a check that this backtest is correctly implemented. The course's reference project estimates on an expanding window and publishes a Sharpe ratio for every fund, and those figures differ from the ones in Section 2 - most sharply for Combined Maximum-Sharpe, 0.40 there against 0.981 here. A gap that size would normally indicate an error. Re-running these funds on the reference window instead reproduces its numbers to a mean absolute difference of 0.024, and to 0.002 on the fund where the headline figures diverge most. Equal weighting, which uses no estimation window at all, lands at 0.761 against its 0.76. The whole discrepancy is the window choice documented above, independently coded, and not a defect.</w:t>
+      </w:r>
+    </w:p>
+    <w:p>
+      <w:pPr>
+        <w:pStyle w:val="af7"/>
+      </w:pPr>
+      <w:r>
+        <w:t xml:space="preserve">Table </w:t>
+      </w:r>
+      <w:r>
+        <w:fldChar w:fldCharType="begin"/>
+        <w:instrText xml:space="preserve"> SEQ Table \* ARABIC </w:instrText>
+        <w:fldChar w:fldCharType="separate"/>
+        <w:t>1</w:t>
+        <w:fldChar w:fldCharType="end"/>
+      </w:r>
+      <w:r>
+        <w:t>: These funds on an expanding window against the Sharpe ratios published by the course reference implementation.</w:t>
+      </w:r>
+    </w:p>
+    <w:tbl>
+      <w:tblPr>
+        <w:tblStyle w:val="-11"/>
+        <w:tblW w:type="auto" w:w="0"/>
+        <w:tblLook w:firstColumn="1" w:firstRow="1" w:lastColumn="0" w:lastRow="0" w:noHBand="0" w:noVBand="1" w:val="04A0"/>
+      </w:tblPr>
+      <w:tblGrid>
+        <w:gridCol w:w="2257"/>
+        <w:gridCol w:w="2257"/>
+        <w:gridCol w:w="2257"/>
+        <w:gridCol w:w="2257"/>
+      </w:tblGrid>
+      <w:tr>
+        <w:tc>
+          <w:tcPr>
+            <w:tcW w:type="dxa" w:w="2257"/>
+          </w:tcPr>
+          <w:p>
+            <w:r>
+              <w:rPr>
+                <w:b/>
+                <w:sz w:val="16"/>
+              </w:rPr>
+              <w:t>Fund</w:t>
+            </w:r>
+          </w:p>
+        </w:tc>
+        <w:tc>
+          <w:tcPr>
+            <w:tcW w:type="dxa" w:w="2257"/>
+          </w:tcPr>
+          <w:p>
+            <w:r>
+              <w:rPr>
+                <w:b/>
+                <w:sz w:val="16"/>
+              </w:rPr>
+              <w:t>Reference</w:t>
+            </w:r>
+          </w:p>
+        </w:tc>
+        <w:tc>
+          <w:tcPr>
+            <w:tcW w:type="dxa" w:w="2257"/>
+          </w:tcPr>
+          <w:p>
+            <w:r>
+              <w:rPr>
+                <w:b/>
+                <w:sz w:val="16"/>
+              </w:rPr>
+              <w:t>This project, expanding</w:t>
+            </w:r>
+          </w:p>
+        </w:tc>
+        <w:tc>
+          <w:tcPr>
+            <w:tcW w:type="dxa" w:w="2257"/>
+          </w:tcPr>
+          <w:p>
+            <w:r>
+              <w:rPr>
+                <w:b/>
+                <w:sz w:val="16"/>
+              </w:rPr>
+              <w:t>Difference</w:t>
+            </w:r>
+          </w:p>
+        </w:tc>
+      </w:tr>
+      <w:tr>
+        <w:tc>
+          <w:tcPr>
+            <w:tcW w:type="dxa" w:w="2257"/>
+          </w:tcPr>
+          <w:p>
+            <w:r>
+              <w:rPr>
+                <w:sz w:val="16"/>
+              </w:rPr>
+              <w:t>Combined Maximum-Sharpe</w:t>
+            </w:r>
+          </w:p>
+        </w:tc>
+        <w:tc>
+          <w:tcPr>
+            <w:tcW w:type="dxa" w:w="2257"/>
+          </w:tcPr>
+          <w:p>
+            <w:r>
+              <w:rPr>
+                <w:sz w:val="16"/>
+              </w:rPr>
+              <w:t>0.40</w:t>
+            </w:r>
+          </w:p>
+        </w:tc>
+        <w:tc>
+          <w:tcPr>
+            <w:tcW w:type="dxa" w:w="2257"/>
+          </w:tcPr>
+          <w:p>
+            <w:r>
+              <w:rPr>
+                <w:sz w:val="16"/>
+              </w:rPr>
+              <w:t>0.398</w:t>
+            </w:r>
+          </w:p>
+        </w:tc>
+        <w:tc>
+          <w:tcPr>
+            <w:tcW w:type="dxa" w:w="2257"/>
+          </w:tcPr>
+          <w:p>
+            <w:r>
+              <w:rPr>
+                <w:sz w:val="16"/>
+              </w:rPr>
+              <w:t>0.002</w:t>
+            </w:r>
+          </w:p>
+        </w:tc>
+      </w:tr>
+      <w:tr>
+        <w:tc>
+          <w:tcPr>
+            <w:tcW w:type="dxa" w:w="2257"/>
+          </w:tcPr>
+          <w:p>
+            <w:r>
+              <w:rPr>
+                <w:sz w:val="16"/>
+              </w:rPr>
+              <w:t>Combined Risk Parity</w:t>
+            </w:r>
+          </w:p>
+        </w:tc>
+        <w:tc>
+          <w:tcPr>
+            <w:tcW w:type="dxa" w:w="2257"/>
+          </w:tcPr>
+          <w:p>
+            <w:r>
+              <w:rPr>
+                <w:sz w:val="16"/>
+              </w:rPr>
+              <w:t>0.78</w:t>
+            </w:r>
+          </w:p>
+        </w:tc>
+        <w:tc>
+          <w:tcPr>
+            <w:tcW w:type="dxa" w:w="2257"/>
+          </w:tcPr>
+          <w:p>
+            <w:r>
+              <w:rPr>
+                <w:sz w:val="16"/>
+              </w:rPr>
+              <w:t>0.777</w:t>
+            </w:r>
+          </w:p>
+        </w:tc>
+        <w:tc>
+          <w:tcPr>
+            <w:tcW w:type="dxa" w:w="2257"/>
+          </w:tcPr>
+          <w:p>
+            <w:r>
+              <w:rPr>
+                <w:sz w:val="16"/>
+              </w:rPr>
+              <w:t>0.003</w:t>
+            </w:r>
+          </w:p>
+        </w:tc>
+      </w:tr>
+      <w:tr>
+        <w:tc>
+          <w:tcPr>
+            <w:tcW w:type="dxa" w:w="2257"/>
+          </w:tcPr>
+          <w:p>
+            <w:r>
+              <w:rPr>
+                <w:sz w:val="16"/>
+              </w:rPr>
+              <w:t>Combined Minimum-Variance</w:t>
+            </w:r>
+          </w:p>
+        </w:tc>
+        <w:tc>
+          <w:tcPr>
+            <w:tcW w:type="dxa" w:w="2257"/>
+          </w:tcPr>
+          <w:p>
+            <w:r>
+              <w:rPr>
+                <w:sz w:val="16"/>
+              </w:rPr>
+              <w:t>0.61</w:t>
+            </w:r>
+          </w:p>
+        </w:tc>
+        <w:tc>
+          <w:tcPr>
+            <w:tcW w:type="dxa" w:w="2257"/>
+          </w:tcPr>
+          <w:p>
+            <w:r>
+              <w:rPr>
+                <w:sz w:val="16"/>
+              </w:rPr>
+              <w:t>0.589</w:t>
+            </w:r>
+          </w:p>
+        </w:tc>
+        <w:tc>
+          <w:tcPr>
+            <w:tcW w:type="dxa" w:w="2257"/>
+          </w:tcPr>
+          <w:p>
+            <w:r>
+              <w:rPr>
+                <w:sz w:val="16"/>
+              </w:rPr>
+              <w:t>0.021</w:t>
+            </w:r>
+          </w:p>
+        </w:tc>
+      </w:tr>
+      <w:tr>
+        <w:tc>
+          <w:tcPr>
+            <w:tcW w:type="dxa" w:w="2257"/>
+          </w:tcPr>
+          <w:p>
+            <w:r>
+              <w:rPr>
+                <w:sz w:val="16"/>
+              </w:rPr>
+              <w:t>Equity Minimum-Variance</w:t>
+            </w:r>
+          </w:p>
+        </w:tc>
+        <w:tc>
+          <w:tcPr>
+            <w:tcW w:type="dxa" w:w="2257"/>
+          </w:tcPr>
+          <w:p>
+            <w:r>
+              <w:rPr>
+                <w:sz w:val="16"/>
+              </w:rPr>
+              <w:t>0.62</w:t>
+            </w:r>
+          </w:p>
+        </w:tc>
+        <w:tc>
+          <w:tcPr>
+            <w:tcW w:type="dxa" w:w="2257"/>
+          </w:tcPr>
+          <w:p>
+            <w:r>
+              <w:rPr>
+                <w:sz w:val="16"/>
+              </w:rPr>
+              <w:t>0.589</w:t>
+            </w:r>
+          </w:p>
+        </w:tc>
+        <w:tc>
+          <w:tcPr>
+            <w:tcW w:type="dxa" w:w="2257"/>
+          </w:tcPr>
+          <w:p>
+            <w:r>
+              <w:rPr>
+                <w:sz w:val="16"/>
+              </w:rPr>
+              <w:t>0.031</w:t>
+            </w:r>
+          </w:p>
+        </w:tc>
+      </w:tr>
+      <w:tr>
+        <w:tc>
+          <w:tcPr>
+            <w:tcW w:type="dxa" w:w="2257"/>
+          </w:tcPr>
+          <w:p>
+            <w:r>
+              <w:rPr>
+                <w:sz w:val="16"/>
+              </w:rPr>
+              <w:t>Equity Risk Parity</w:t>
+            </w:r>
+          </w:p>
+        </w:tc>
+        <w:tc>
+          <w:tcPr>
+            <w:tcW w:type="dxa" w:w="2257"/>
+          </w:tcPr>
+          <w:p>
+            <w:r>
+              <w:rPr>
+                <w:sz w:val="16"/>
+              </w:rPr>
+              <w:t>0.75</w:t>
+            </w:r>
+          </w:p>
+        </w:tc>
+        <w:tc>
+          <w:tcPr>
+            <w:tcW w:type="dxa" w:w="2257"/>
+          </w:tcPr>
+          <w:p>
+            <w:r>
+              <w:rPr>
+                <w:sz w:val="16"/>
+              </w:rPr>
+              <w:t>0.717</w:t>
+            </w:r>
+          </w:p>
+        </w:tc>
+        <w:tc>
+          <w:tcPr>
+            <w:tcW w:type="dxa" w:w="2257"/>
+          </w:tcPr>
+          <w:p>
+            <w:r>
+              <w:rPr>
+                <w:sz w:val="16"/>
+              </w:rPr>
+              <w:t>0.033</w:t>
+            </w:r>
+          </w:p>
+        </w:tc>
+      </w:tr>
+      <w:tr>
+        <w:tc>
+          <w:tcPr>
+            <w:tcW w:type="dxa" w:w="2257"/>
+          </w:tcPr>
+          <w:p>
+            <w:r>
+              <w:rPr>
+                <w:sz w:val="16"/>
+              </w:rPr>
+              <w:t>Equity Maximum-Sharpe</w:t>
+            </w:r>
+          </w:p>
+        </w:tc>
+        <w:tc>
+          <w:tcPr>
+            <w:tcW w:type="dxa" w:w="2257"/>
+          </w:tcPr>
+          <w:p>
+            <w:r>
+              <w:rPr>
+                <w:sz w:val="16"/>
+              </w:rPr>
+              <w:t>0.72</w:t>
+            </w:r>
+          </w:p>
+        </w:tc>
+        <w:tc>
+          <w:tcPr>
+            <w:tcW w:type="dxa" w:w="2257"/>
+          </w:tcPr>
+          <w:p>
+            <w:r>
+              <w:rPr>
+                <w:sz w:val="16"/>
+              </w:rPr>
+              <w:t>0.663</w:t>
+            </w:r>
+          </w:p>
+        </w:tc>
+        <w:tc>
+          <w:tcPr>
+            <w:tcW w:type="dxa" w:w="2257"/>
+          </w:tcPr>
+          <w:p>
+            <w:r>
+              <w:rPr>
+                <w:sz w:val="16"/>
+              </w:rPr>
+              <w:t>0.057</w:t>
+            </w:r>
+          </w:p>
+        </w:tc>
+      </w:tr>
+    </w:tbl>
     <w:tbl>
       <w:tblPr>
         <w:tblStyle w:val="-11"/>

</xml_diff>

<commit_message>
Fix table placement in Appendix D
Both tables had collected at the end of the section, because new content was
inserted after the last PARAGRAPH and tables are not paragraphs. Each table
now sits directly under its own caption.

Co-Authored-By: Claude Opus 5 <noreply@anthropic.com>
</commit_message>
<xml_diff>
--- a/report/report.docx
+++ b/report/report.docx
@@ -15399,6 +15399,494 @@
         <w:t>: Sharpe ratio under a rolling 252-day window against an expanding window, out of sample.</w:t>
       </w:r>
     </w:p>
+    <w:tbl>
+      <w:tblPr>
+        <w:tblStyle w:val="-11"/>
+        <w:tblW w:type="auto" w:w="0"/>
+        <w:tblLook w:firstColumn="1" w:firstRow="1" w:lastColumn="0" w:lastRow="0" w:noHBand="0" w:noVBand="1" w:val="04A0"/>
+      </w:tblPr>
+      <w:tblGrid>
+        <w:gridCol w:w="1806"/>
+        <w:gridCol w:w="1806"/>
+        <w:gridCol w:w="1806"/>
+        <w:gridCol w:w="1806"/>
+        <w:gridCol w:w="1806"/>
+      </w:tblGrid>
+      <w:tr>
+        <w:tc>
+          <w:tcPr>
+            <w:tcW w:type="dxa" w:w="1806"/>
+          </w:tcPr>
+          <w:p>
+            <w:r>
+              <w:rPr>
+                <w:b/>
+                <w:sz w:val="16"/>
+              </w:rPr>
+              <w:t>Family</w:t>
+            </w:r>
+          </w:p>
+        </w:tc>
+        <w:tc>
+          <w:tcPr>
+            <w:tcW w:type="dxa" w:w="1806"/>
+          </w:tcPr>
+          <w:p>
+            <w:r>
+              <w:rPr>
+                <w:b/>
+                <w:sz w:val="16"/>
+              </w:rPr>
+              <w:t>Method</w:t>
+            </w:r>
+          </w:p>
+        </w:tc>
+        <w:tc>
+          <w:tcPr>
+            <w:tcW w:type="dxa" w:w="1806"/>
+          </w:tcPr>
+          <w:p>
+            <w:r>
+              <w:rPr>
+                <w:b/>
+                <w:sz w:val="16"/>
+              </w:rPr>
+              <w:t>Rolling</w:t>
+            </w:r>
+          </w:p>
+        </w:tc>
+        <w:tc>
+          <w:tcPr>
+            <w:tcW w:type="dxa" w:w="1806"/>
+          </w:tcPr>
+          <w:p>
+            <w:r>
+              <w:rPr>
+                <w:b/>
+                <w:sz w:val="16"/>
+              </w:rPr>
+              <w:t>Expanding</w:t>
+            </w:r>
+          </w:p>
+        </w:tc>
+        <w:tc>
+          <w:tcPr>
+            <w:tcW w:type="dxa" w:w="1806"/>
+          </w:tcPr>
+          <w:p>
+            <w:r>
+              <w:rPr>
+                <w:b/>
+                <w:sz w:val="16"/>
+              </w:rPr>
+              <w:t>Change</w:t>
+            </w:r>
+          </w:p>
+        </w:tc>
+      </w:tr>
+      <w:tr>
+        <w:tc>
+          <w:tcPr>
+            <w:tcW w:type="dxa" w:w="1806"/>
+          </w:tcPr>
+          <w:p>
+            <w:r>
+              <w:rPr>
+                <w:sz w:val="16"/>
+              </w:rPr>
+              <w:t>Equity</w:t>
+            </w:r>
+          </w:p>
+        </w:tc>
+        <w:tc>
+          <w:tcPr>
+            <w:tcW w:type="dxa" w:w="1806"/>
+          </w:tcPr>
+          <w:p>
+            <w:r>
+              <w:rPr>
+                <w:sz w:val="16"/>
+              </w:rPr>
+              <w:t>Minimum-Variance</w:t>
+            </w:r>
+          </w:p>
+        </w:tc>
+        <w:tc>
+          <w:tcPr>
+            <w:tcW w:type="dxa" w:w="1806"/>
+          </w:tcPr>
+          <w:p>
+            <w:r>
+              <w:rPr>
+                <w:sz w:val="16"/>
+              </w:rPr>
+              <w:t>0.479</w:t>
+            </w:r>
+          </w:p>
+        </w:tc>
+        <w:tc>
+          <w:tcPr>
+            <w:tcW w:type="dxa" w:w="1806"/>
+          </w:tcPr>
+          <w:p>
+            <w:r>
+              <w:rPr>
+                <w:sz w:val="16"/>
+              </w:rPr>
+              <w:t>0.589</w:t>
+            </w:r>
+          </w:p>
+        </w:tc>
+        <w:tc>
+          <w:tcPr>
+            <w:tcW w:type="dxa" w:w="1806"/>
+          </w:tcPr>
+          <w:p>
+            <w:r>
+              <w:rPr>
+                <w:sz w:val="16"/>
+              </w:rPr>
+              <w:t>+0.110</w:t>
+            </w:r>
+          </w:p>
+        </w:tc>
+      </w:tr>
+      <w:tr>
+        <w:tc>
+          <w:tcPr>
+            <w:tcW w:type="dxa" w:w="1806"/>
+          </w:tcPr>
+          <w:p>
+            <w:r>
+              <w:rPr>
+                <w:sz w:val="16"/>
+              </w:rPr>
+              <w:t>Equity</w:t>
+            </w:r>
+          </w:p>
+        </w:tc>
+        <w:tc>
+          <w:tcPr>
+            <w:tcW w:type="dxa" w:w="1806"/>
+          </w:tcPr>
+          <w:p>
+            <w:r>
+              <w:rPr>
+                <w:sz w:val="16"/>
+              </w:rPr>
+              <w:t>Maximum-Sharpe</w:t>
+            </w:r>
+          </w:p>
+        </w:tc>
+        <w:tc>
+          <w:tcPr>
+            <w:tcW w:type="dxa" w:w="1806"/>
+          </w:tcPr>
+          <w:p>
+            <w:r>
+              <w:rPr>
+                <w:sz w:val="16"/>
+              </w:rPr>
+              <w:t>0.573</w:t>
+            </w:r>
+          </w:p>
+        </w:tc>
+        <w:tc>
+          <w:tcPr>
+            <w:tcW w:type="dxa" w:w="1806"/>
+          </w:tcPr>
+          <w:p>
+            <w:r>
+              <w:rPr>
+                <w:sz w:val="16"/>
+              </w:rPr>
+              <w:t>0.663</w:t>
+            </w:r>
+          </w:p>
+        </w:tc>
+        <w:tc>
+          <w:tcPr>
+            <w:tcW w:type="dxa" w:w="1806"/>
+          </w:tcPr>
+          <w:p>
+            <w:r>
+              <w:rPr>
+                <w:sz w:val="16"/>
+              </w:rPr>
+              <w:t>+0.090</w:t>
+            </w:r>
+          </w:p>
+        </w:tc>
+      </w:tr>
+      <w:tr>
+        <w:tc>
+          <w:tcPr>
+            <w:tcW w:type="dxa" w:w="1806"/>
+          </w:tcPr>
+          <w:p>
+            <w:r>
+              <w:rPr>
+                <w:sz w:val="16"/>
+              </w:rPr>
+              <w:t>Equity</w:t>
+            </w:r>
+          </w:p>
+        </w:tc>
+        <w:tc>
+          <w:tcPr>
+            <w:tcW w:type="dxa" w:w="1806"/>
+          </w:tcPr>
+          <w:p>
+            <w:r>
+              <w:rPr>
+                <w:sz w:val="16"/>
+              </w:rPr>
+              <w:t>Risk Parity</w:t>
+            </w:r>
+          </w:p>
+        </w:tc>
+        <w:tc>
+          <w:tcPr>
+            <w:tcW w:type="dxa" w:w="1806"/>
+          </w:tcPr>
+          <w:p>
+            <w:r>
+              <w:rPr>
+                <w:sz w:val="16"/>
+              </w:rPr>
+              <w:t>0.723</w:t>
+            </w:r>
+          </w:p>
+        </w:tc>
+        <w:tc>
+          <w:tcPr>
+            <w:tcW w:type="dxa" w:w="1806"/>
+          </w:tcPr>
+          <w:p>
+            <w:r>
+              <w:rPr>
+                <w:sz w:val="16"/>
+              </w:rPr>
+              <w:t>0.717</w:t>
+            </w:r>
+          </w:p>
+        </w:tc>
+        <w:tc>
+          <w:tcPr>
+            <w:tcW w:type="dxa" w:w="1806"/>
+          </w:tcPr>
+          <w:p>
+            <w:r>
+              <w:rPr>
+                <w:sz w:val="16"/>
+              </w:rPr>
+              <w:t>-0.006</w:t>
+            </w:r>
+          </w:p>
+        </w:tc>
+      </w:tr>
+      <w:tr>
+        <w:tc>
+          <w:tcPr>
+            <w:tcW w:type="dxa" w:w="1806"/>
+          </w:tcPr>
+          <w:p>
+            <w:r>
+              <w:rPr>
+                <w:sz w:val="16"/>
+              </w:rPr>
+              <w:t>Combined</w:t>
+            </w:r>
+          </w:p>
+        </w:tc>
+        <w:tc>
+          <w:tcPr>
+            <w:tcW w:type="dxa" w:w="1806"/>
+          </w:tcPr>
+          <w:p>
+            <w:r>
+              <w:rPr>
+                <w:sz w:val="16"/>
+              </w:rPr>
+              <w:t>Minimum-Variance</w:t>
+            </w:r>
+          </w:p>
+        </w:tc>
+        <w:tc>
+          <w:tcPr>
+            <w:tcW w:type="dxa" w:w="1806"/>
+          </w:tcPr>
+          <w:p>
+            <w:r>
+              <w:rPr>
+                <w:sz w:val="16"/>
+              </w:rPr>
+              <w:t>0.477</w:t>
+            </w:r>
+          </w:p>
+        </w:tc>
+        <w:tc>
+          <w:tcPr>
+            <w:tcW w:type="dxa" w:w="1806"/>
+          </w:tcPr>
+          <w:p>
+            <w:r>
+              <w:rPr>
+                <w:sz w:val="16"/>
+              </w:rPr>
+              <w:t>0.589</w:t>
+            </w:r>
+          </w:p>
+        </w:tc>
+        <w:tc>
+          <w:tcPr>
+            <w:tcW w:type="dxa" w:w="1806"/>
+          </w:tcPr>
+          <w:p>
+            <w:r>
+              <w:rPr>
+                <w:sz w:val="16"/>
+              </w:rPr>
+              <w:t>+0.112</w:t>
+            </w:r>
+          </w:p>
+        </w:tc>
+      </w:tr>
+      <w:tr>
+        <w:tc>
+          <w:tcPr>
+            <w:tcW w:type="dxa" w:w="1806"/>
+          </w:tcPr>
+          <w:p>
+            <w:r>
+              <w:rPr>
+                <w:sz w:val="16"/>
+              </w:rPr>
+              <w:t>Combined</w:t>
+            </w:r>
+          </w:p>
+        </w:tc>
+        <w:tc>
+          <w:tcPr>
+            <w:tcW w:type="dxa" w:w="1806"/>
+          </w:tcPr>
+          <w:p>
+            <w:r>
+              <w:rPr>
+                <w:sz w:val="16"/>
+              </w:rPr>
+              <w:t>Maximum-Sharpe</w:t>
+            </w:r>
+          </w:p>
+        </w:tc>
+        <w:tc>
+          <w:tcPr>
+            <w:tcW w:type="dxa" w:w="1806"/>
+          </w:tcPr>
+          <w:p>
+            <w:r>
+              <w:rPr>
+                <w:sz w:val="16"/>
+              </w:rPr>
+              <w:t>0.981</w:t>
+            </w:r>
+          </w:p>
+        </w:tc>
+        <w:tc>
+          <w:tcPr>
+            <w:tcW w:type="dxa" w:w="1806"/>
+          </w:tcPr>
+          <w:p>
+            <w:r>
+              <w:rPr>
+                <w:sz w:val="16"/>
+              </w:rPr>
+              <w:t>0.398</w:t>
+            </w:r>
+          </w:p>
+        </w:tc>
+        <w:tc>
+          <w:tcPr>
+            <w:tcW w:type="dxa" w:w="1806"/>
+          </w:tcPr>
+          <w:p>
+            <w:r>
+              <w:rPr>
+                <w:sz w:val="16"/>
+              </w:rPr>
+              <w:t>-0.583</w:t>
+            </w:r>
+          </w:p>
+        </w:tc>
+      </w:tr>
+      <w:tr>
+        <w:tc>
+          <w:tcPr>
+            <w:tcW w:type="dxa" w:w="1806"/>
+          </w:tcPr>
+          <w:p>
+            <w:r>
+              <w:rPr>
+                <w:sz w:val="16"/>
+              </w:rPr>
+              <w:t>Combined</w:t>
+            </w:r>
+          </w:p>
+        </w:tc>
+        <w:tc>
+          <w:tcPr>
+            <w:tcW w:type="dxa" w:w="1806"/>
+          </w:tcPr>
+          <w:p>
+            <w:r>
+              <w:rPr>
+                <w:sz w:val="16"/>
+              </w:rPr>
+              <w:t>Risk Parity</w:t>
+            </w:r>
+          </w:p>
+        </w:tc>
+        <w:tc>
+          <w:tcPr>
+            <w:tcW w:type="dxa" w:w="1806"/>
+          </w:tcPr>
+          <w:p>
+            <w:r>
+              <w:rPr>
+                <w:sz w:val="16"/>
+              </w:rPr>
+              <w:t>0.888</w:t>
+            </w:r>
+          </w:p>
+        </w:tc>
+        <w:tc>
+          <w:tcPr>
+            <w:tcW w:type="dxa" w:w="1806"/>
+          </w:tcPr>
+          <w:p>
+            <w:r>
+              <w:rPr>
+                <w:sz w:val="16"/>
+              </w:rPr>
+              <w:t>0.777</w:t>
+            </w:r>
+          </w:p>
+        </w:tc>
+        <w:tc>
+          <w:tcPr>
+            <w:tcW w:type="dxa" w:w="1806"/>
+          </w:tcPr>
+          <w:p>
+            <w:r>
+              <w:rPr>
+                <w:sz w:val="16"/>
+              </w:rPr>
+              <w:t>-0.111</w:t>
+            </w:r>
+          </w:p>
+        </w:tc>
+      </w:tr>
+    </w:tbl>
     <w:p>
       <w:r>
         <w:t>The same test doubles as a check that this backtest is correctly implemented. The course's reference project estimates on an expanding window and publishes a Sharpe ratio for every fund, and those figures differ from the ones in Section 2 - most sharply for Combined Maximum-Sharpe, 0.40 there against 0.981 here. A gap that size would normally indicate an error. Re-running these funds on the reference window instead reproduces its numbers to a mean absolute difference of 0.024, and to 0.002 on the fund where the headline figures diverge most. Equal weighting, which uses no estimation window at all, lands at 0.761 against its 0.76. The whole discrepancy is the window choice documented above, independently coded, and not a defect.</w:t>
@@ -15812,494 +16300,6 @@
                 <w:sz w:val="16"/>
               </w:rPr>
               <w:t>0.057</w:t>
-            </w:r>
-          </w:p>
-        </w:tc>
-      </w:tr>
-    </w:tbl>
-    <w:tbl>
-      <w:tblPr>
-        <w:tblStyle w:val="-11"/>
-        <w:tblW w:type="auto" w:w="0"/>
-        <w:tblLook w:firstColumn="1" w:firstRow="1" w:lastColumn="0" w:lastRow="0" w:noHBand="0" w:noVBand="1" w:val="04A0"/>
-      </w:tblPr>
-      <w:tblGrid>
-        <w:gridCol w:w="1806"/>
-        <w:gridCol w:w="1806"/>
-        <w:gridCol w:w="1806"/>
-        <w:gridCol w:w="1806"/>
-        <w:gridCol w:w="1806"/>
-      </w:tblGrid>
-      <w:tr>
-        <w:tc>
-          <w:tcPr>
-            <w:tcW w:type="dxa" w:w="1806"/>
-          </w:tcPr>
-          <w:p>
-            <w:r>
-              <w:rPr>
-                <w:b/>
-                <w:sz w:val="16"/>
-              </w:rPr>
-              <w:t>Family</w:t>
-            </w:r>
-          </w:p>
-        </w:tc>
-        <w:tc>
-          <w:tcPr>
-            <w:tcW w:type="dxa" w:w="1806"/>
-          </w:tcPr>
-          <w:p>
-            <w:r>
-              <w:rPr>
-                <w:b/>
-                <w:sz w:val="16"/>
-              </w:rPr>
-              <w:t>Method</w:t>
-            </w:r>
-          </w:p>
-        </w:tc>
-        <w:tc>
-          <w:tcPr>
-            <w:tcW w:type="dxa" w:w="1806"/>
-          </w:tcPr>
-          <w:p>
-            <w:r>
-              <w:rPr>
-                <w:b/>
-                <w:sz w:val="16"/>
-              </w:rPr>
-              <w:t>Rolling</w:t>
-            </w:r>
-          </w:p>
-        </w:tc>
-        <w:tc>
-          <w:tcPr>
-            <w:tcW w:type="dxa" w:w="1806"/>
-          </w:tcPr>
-          <w:p>
-            <w:r>
-              <w:rPr>
-                <w:b/>
-                <w:sz w:val="16"/>
-              </w:rPr>
-              <w:t>Expanding</w:t>
-            </w:r>
-          </w:p>
-        </w:tc>
-        <w:tc>
-          <w:tcPr>
-            <w:tcW w:type="dxa" w:w="1806"/>
-          </w:tcPr>
-          <w:p>
-            <w:r>
-              <w:rPr>
-                <w:b/>
-                <w:sz w:val="16"/>
-              </w:rPr>
-              <w:t>Change</w:t>
-            </w:r>
-          </w:p>
-        </w:tc>
-      </w:tr>
-      <w:tr>
-        <w:tc>
-          <w:tcPr>
-            <w:tcW w:type="dxa" w:w="1806"/>
-          </w:tcPr>
-          <w:p>
-            <w:r>
-              <w:rPr>
-                <w:sz w:val="16"/>
-              </w:rPr>
-              <w:t>Equity</w:t>
-            </w:r>
-          </w:p>
-        </w:tc>
-        <w:tc>
-          <w:tcPr>
-            <w:tcW w:type="dxa" w:w="1806"/>
-          </w:tcPr>
-          <w:p>
-            <w:r>
-              <w:rPr>
-                <w:sz w:val="16"/>
-              </w:rPr>
-              <w:t>Minimum-Variance</w:t>
-            </w:r>
-          </w:p>
-        </w:tc>
-        <w:tc>
-          <w:tcPr>
-            <w:tcW w:type="dxa" w:w="1806"/>
-          </w:tcPr>
-          <w:p>
-            <w:r>
-              <w:rPr>
-                <w:sz w:val="16"/>
-              </w:rPr>
-              <w:t>0.479</w:t>
-            </w:r>
-          </w:p>
-        </w:tc>
-        <w:tc>
-          <w:tcPr>
-            <w:tcW w:type="dxa" w:w="1806"/>
-          </w:tcPr>
-          <w:p>
-            <w:r>
-              <w:rPr>
-                <w:sz w:val="16"/>
-              </w:rPr>
-              <w:t>0.589</w:t>
-            </w:r>
-          </w:p>
-        </w:tc>
-        <w:tc>
-          <w:tcPr>
-            <w:tcW w:type="dxa" w:w="1806"/>
-          </w:tcPr>
-          <w:p>
-            <w:r>
-              <w:rPr>
-                <w:sz w:val="16"/>
-              </w:rPr>
-              <w:t>+0.110</w:t>
-            </w:r>
-          </w:p>
-        </w:tc>
-      </w:tr>
-      <w:tr>
-        <w:tc>
-          <w:tcPr>
-            <w:tcW w:type="dxa" w:w="1806"/>
-          </w:tcPr>
-          <w:p>
-            <w:r>
-              <w:rPr>
-                <w:sz w:val="16"/>
-              </w:rPr>
-              <w:t>Equity</w:t>
-            </w:r>
-          </w:p>
-        </w:tc>
-        <w:tc>
-          <w:tcPr>
-            <w:tcW w:type="dxa" w:w="1806"/>
-          </w:tcPr>
-          <w:p>
-            <w:r>
-              <w:rPr>
-                <w:sz w:val="16"/>
-              </w:rPr>
-              <w:t>Maximum-Sharpe</w:t>
-            </w:r>
-          </w:p>
-        </w:tc>
-        <w:tc>
-          <w:tcPr>
-            <w:tcW w:type="dxa" w:w="1806"/>
-          </w:tcPr>
-          <w:p>
-            <w:r>
-              <w:rPr>
-                <w:sz w:val="16"/>
-              </w:rPr>
-              <w:t>0.573</w:t>
-            </w:r>
-          </w:p>
-        </w:tc>
-        <w:tc>
-          <w:tcPr>
-            <w:tcW w:type="dxa" w:w="1806"/>
-          </w:tcPr>
-          <w:p>
-            <w:r>
-              <w:rPr>
-                <w:sz w:val="16"/>
-              </w:rPr>
-              <w:t>0.663</w:t>
-            </w:r>
-          </w:p>
-        </w:tc>
-        <w:tc>
-          <w:tcPr>
-            <w:tcW w:type="dxa" w:w="1806"/>
-          </w:tcPr>
-          <w:p>
-            <w:r>
-              <w:rPr>
-                <w:sz w:val="16"/>
-              </w:rPr>
-              <w:t>+0.090</w:t>
-            </w:r>
-          </w:p>
-        </w:tc>
-      </w:tr>
-      <w:tr>
-        <w:tc>
-          <w:tcPr>
-            <w:tcW w:type="dxa" w:w="1806"/>
-          </w:tcPr>
-          <w:p>
-            <w:r>
-              <w:rPr>
-                <w:sz w:val="16"/>
-              </w:rPr>
-              <w:t>Equity</w:t>
-            </w:r>
-          </w:p>
-        </w:tc>
-        <w:tc>
-          <w:tcPr>
-            <w:tcW w:type="dxa" w:w="1806"/>
-          </w:tcPr>
-          <w:p>
-            <w:r>
-              <w:rPr>
-                <w:sz w:val="16"/>
-              </w:rPr>
-              <w:t>Risk Parity</w:t>
-            </w:r>
-          </w:p>
-        </w:tc>
-        <w:tc>
-          <w:tcPr>
-            <w:tcW w:type="dxa" w:w="1806"/>
-          </w:tcPr>
-          <w:p>
-            <w:r>
-              <w:rPr>
-                <w:sz w:val="16"/>
-              </w:rPr>
-              <w:t>0.723</w:t>
-            </w:r>
-          </w:p>
-        </w:tc>
-        <w:tc>
-          <w:tcPr>
-            <w:tcW w:type="dxa" w:w="1806"/>
-          </w:tcPr>
-          <w:p>
-            <w:r>
-              <w:rPr>
-                <w:sz w:val="16"/>
-              </w:rPr>
-              <w:t>0.717</w:t>
-            </w:r>
-          </w:p>
-        </w:tc>
-        <w:tc>
-          <w:tcPr>
-            <w:tcW w:type="dxa" w:w="1806"/>
-          </w:tcPr>
-          <w:p>
-            <w:r>
-              <w:rPr>
-                <w:sz w:val="16"/>
-              </w:rPr>
-              <w:t>-0.006</w:t>
-            </w:r>
-          </w:p>
-        </w:tc>
-      </w:tr>
-      <w:tr>
-        <w:tc>
-          <w:tcPr>
-            <w:tcW w:type="dxa" w:w="1806"/>
-          </w:tcPr>
-          <w:p>
-            <w:r>
-              <w:rPr>
-                <w:sz w:val="16"/>
-              </w:rPr>
-              <w:t>Combined</w:t>
-            </w:r>
-          </w:p>
-        </w:tc>
-        <w:tc>
-          <w:tcPr>
-            <w:tcW w:type="dxa" w:w="1806"/>
-          </w:tcPr>
-          <w:p>
-            <w:r>
-              <w:rPr>
-                <w:sz w:val="16"/>
-              </w:rPr>
-              <w:t>Minimum-Variance</w:t>
-            </w:r>
-          </w:p>
-        </w:tc>
-        <w:tc>
-          <w:tcPr>
-            <w:tcW w:type="dxa" w:w="1806"/>
-          </w:tcPr>
-          <w:p>
-            <w:r>
-              <w:rPr>
-                <w:sz w:val="16"/>
-              </w:rPr>
-              <w:t>0.477</w:t>
-            </w:r>
-          </w:p>
-        </w:tc>
-        <w:tc>
-          <w:tcPr>
-            <w:tcW w:type="dxa" w:w="1806"/>
-          </w:tcPr>
-          <w:p>
-            <w:r>
-              <w:rPr>
-                <w:sz w:val="16"/>
-              </w:rPr>
-              <w:t>0.589</w:t>
-            </w:r>
-          </w:p>
-        </w:tc>
-        <w:tc>
-          <w:tcPr>
-            <w:tcW w:type="dxa" w:w="1806"/>
-          </w:tcPr>
-          <w:p>
-            <w:r>
-              <w:rPr>
-                <w:sz w:val="16"/>
-              </w:rPr>
-              <w:t>+0.112</w:t>
-            </w:r>
-          </w:p>
-        </w:tc>
-      </w:tr>
-      <w:tr>
-        <w:tc>
-          <w:tcPr>
-            <w:tcW w:type="dxa" w:w="1806"/>
-          </w:tcPr>
-          <w:p>
-            <w:r>
-              <w:rPr>
-                <w:sz w:val="16"/>
-              </w:rPr>
-              <w:t>Combined</w:t>
-            </w:r>
-          </w:p>
-        </w:tc>
-        <w:tc>
-          <w:tcPr>
-            <w:tcW w:type="dxa" w:w="1806"/>
-          </w:tcPr>
-          <w:p>
-            <w:r>
-              <w:rPr>
-                <w:sz w:val="16"/>
-              </w:rPr>
-              <w:t>Maximum-Sharpe</w:t>
-            </w:r>
-          </w:p>
-        </w:tc>
-        <w:tc>
-          <w:tcPr>
-            <w:tcW w:type="dxa" w:w="1806"/>
-          </w:tcPr>
-          <w:p>
-            <w:r>
-              <w:rPr>
-                <w:sz w:val="16"/>
-              </w:rPr>
-              <w:t>0.981</w:t>
-            </w:r>
-          </w:p>
-        </w:tc>
-        <w:tc>
-          <w:tcPr>
-            <w:tcW w:type="dxa" w:w="1806"/>
-          </w:tcPr>
-          <w:p>
-            <w:r>
-              <w:rPr>
-                <w:sz w:val="16"/>
-              </w:rPr>
-              <w:t>0.398</w:t>
-            </w:r>
-          </w:p>
-        </w:tc>
-        <w:tc>
-          <w:tcPr>
-            <w:tcW w:type="dxa" w:w="1806"/>
-          </w:tcPr>
-          <w:p>
-            <w:r>
-              <w:rPr>
-                <w:sz w:val="16"/>
-              </w:rPr>
-              <w:t>-0.583</w:t>
-            </w:r>
-          </w:p>
-        </w:tc>
-      </w:tr>
-      <w:tr>
-        <w:tc>
-          <w:tcPr>
-            <w:tcW w:type="dxa" w:w="1806"/>
-          </w:tcPr>
-          <w:p>
-            <w:r>
-              <w:rPr>
-                <w:sz w:val="16"/>
-              </w:rPr>
-              <w:t>Combined</w:t>
-            </w:r>
-          </w:p>
-        </w:tc>
-        <w:tc>
-          <w:tcPr>
-            <w:tcW w:type="dxa" w:w="1806"/>
-          </w:tcPr>
-          <w:p>
-            <w:r>
-              <w:rPr>
-                <w:sz w:val="16"/>
-              </w:rPr>
-              <w:t>Risk Parity</w:t>
-            </w:r>
-          </w:p>
-        </w:tc>
-        <w:tc>
-          <w:tcPr>
-            <w:tcW w:type="dxa" w:w="1806"/>
-          </w:tcPr>
-          <w:p>
-            <w:r>
-              <w:rPr>
-                <w:sz w:val="16"/>
-              </w:rPr>
-              <w:t>0.888</w:t>
-            </w:r>
-          </w:p>
-        </w:tc>
-        <w:tc>
-          <w:tcPr>
-            <w:tcW w:type="dxa" w:w="1806"/>
-          </w:tcPr>
-          <w:p>
-            <w:r>
-              <w:rPr>
-                <w:sz w:val="16"/>
-              </w:rPr>
-              <w:t>0.777</w:t>
-            </w:r>
-          </w:p>
-        </w:tc>
-        <w:tc>
-          <w:tcPr>
-            <w:tcW w:type="dxa" w:w="1806"/>
-          </w:tcPr>
-          <w:p>
-            <w:r>
-              <w:rPr>
-                <w:sz w:val="16"/>
-              </w:rPr>
-              <w:t>-0.111</w:t>
             </w:r>
           </w:p>
         </w:tc>

</xml_diff>

<commit_message>
Section 7 rewritten to my own positions
The three recommendations and the reflection now say what I think rather than
what the assistant drafted, and each recommendation rejects the safer-looking
alternative:

- offer the adaptive tilt as a labelled option sized to the evidence, not as
  the default and not withheld entirely
- pick no default fund at all; make the user choose after seeing the drawdown
- hold a firm's evidence to a higher bar than my own money

The reflection carries the judgments recorded across the AI logs: the working
order that caught problems at the design stage, the contrarian explanation
that fitted all my evidence because it had never been tested against a rival,
and the finding that every serious error was a failure of verification rather
than of finance.

Narrative held at the limit by trimming restatement elsewhere.

Co-Authored-By: Claude Opus 5 <noreply@anthropic.com>
</commit_message>
<xml_diff>
--- a/report/report.docx
+++ b/report/report.docx
@@ -24,7 +24,7 @@
       <w:pPr>
         <w:pStyle w:val="1"/>
       </w:pPr>
-      <w:bookmarkStart w:id="0" w:name="_Toc237383686"/>
+      <w:bookmarkStart w:id="0" w:name="_Toc237443220"/>
       <w:r>
         <w:t>Abstract</w:t>
       </w:r>
@@ -32,14 +32,14 @@
     </w:p>
     <w:p>
       <w:r>
-        <w:t>Spotlight offers twelve systematically managed funds built from 50 US equities and 10 cryptocurrencies. Over a three-year out-of-sample backtest the best fund, Combined Maximum-Sharpe, earns a Sharpe ratio of 0.98, but the more durable result is that equal weighting beats every optimised equity fund (0.82 against 0.72 for the closest optimised rival). The methods that lean hardest on estimated inputs are the most concentrated, the most heavily traded, and the worst out of sample. A sector news-sentiment index built from 146,830 headlines tracks tone convincingly but does not predict returns: sentiment correlates with same-day sector returns in seven of ten sectors and with next-day returns in one. A sentiment tilt therefore reduces the Sharpe ratio of both equity funds; making its direction an estimate rather than an assumption recovers the loss, though bootstrap intervals for that improvement span zero. The funds, fact sheets and analytics ship as a deployed Streamlit application.</w:t>
+        <w:t>Spotlight offers twelve systematic funds built from 50 US equities and 10 cryptocurrencies. Over a three-year out-of-sample backtest the best fund, Combined Maximum-Sharpe, earns a Sharpe ratio of 0.98, but the more durable result is that equal weighting beats every optimised equity fund (0.82 against 0.72 for the closest optimised rival). The methods that lean hardest on estimated inputs are the most concentrated, the most heavily traded, and the worst out of sample. A sector news-sentiment index built from 146,830 headlines tracks tone convincingly but does not predict returns: sentiment correlates with same-day sector returns in seven of ten sectors and with next-day returns in one. A sentiment tilt therefore reduces the Sharpe ratio of both equity funds; making its direction an estimate rather than an assumption recovers the loss, though bootstrap intervals for that improvement span zero. The funds, fact sheets and analytics ship as a deployed Streamlit application.</w:t>
       </w:r>
     </w:p>
     <w:p>
       <w:pPr>
         <w:pStyle w:val="1"/>
       </w:pPr>
-      <w:bookmarkStart w:id="1" w:name="_Toc237383687"/>
+      <w:bookmarkStart w:id="1" w:name="_Toc237443221"/>
       <w:r>
         <w:t>Contents</w:t>
       </w:r>
@@ -62,10 +62,14 @@
       </w:pPr>
       <w:r>
         <w:fldChar w:fldCharType="begin"/>
+      </w:r>
+      <w:r>
         <w:instrText xml:space="preserve"> TOC \o "1-2" \h \z \u </w:instrText>
+      </w:r>
+      <w:r>
         <w:fldChar w:fldCharType="separate"/>
       </w:r>
-      <w:hyperlink w:anchor="_Toc237383686" w:history="1">
+      <w:hyperlink w:anchor="_Toc237443220" w:history="1">
         <w:r>
           <w:rPr>
             <w:rStyle w:val="aff9"/>
@@ -79,10 +83,46 @@
             <w:webHidden/>
           </w:rPr>
           <w:tab/>
+        </w:r>
+        <w:r>
+          <w:rPr>
+            <w:noProof/>
+            <w:webHidden/>
+          </w:rPr>
           <w:fldChar w:fldCharType="begin"/>
-          <w:instrText xml:space="preserve"> PAGEREF _Toc237383686 \h </w:instrText>
+        </w:r>
+        <w:r>
+          <w:rPr>
+            <w:noProof/>
+            <w:webHidden/>
+          </w:rPr>
+          <w:instrText xml:space="preserve"> PAGEREF _Toc237443220 \h </w:instrText>
+        </w:r>
+        <w:r>
+          <w:rPr>
+            <w:noProof/>
+            <w:webHidden/>
+          </w:rPr>
+        </w:r>
+        <w:r>
+          <w:rPr>
+            <w:noProof/>
+            <w:webHidden/>
+          </w:rPr>
           <w:fldChar w:fldCharType="separate"/>
+        </w:r>
+        <w:r>
+          <w:rPr>
+            <w:noProof/>
+            <w:webHidden/>
+          </w:rPr>
           <w:t>1</w:t>
+        </w:r>
+        <w:r>
+          <w:rPr>
+            <w:noProof/>
+            <w:webHidden/>
+          </w:rPr>
           <w:fldChar w:fldCharType="end"/>
         </w:r>
       </w:hyperlink>
@@ -102,7 +142,7 @@
           <w14:ligatures w14:val="standardContextual"/>
         </w:rPr>
       </w:pPr>
-      <w:hyperlink w:anchor="_Toc237383687" w:history="1">
+      <w:hyperlink w:anchor="_Toc237443221" w:history="1">
         <w:r>
           <w:rPr>
             <w:rStyle w:val="aff9"/>
@@ -116,10 +156,46 @@
             <w:webHidden/>
           </w:rPr>
           <w:tab/>
+        </w:r>
+        <w:r>
+          <w:rPr>
+            <w:noProof/>
+            <w:webHidden/>
+          </w:rPr>
           <w:fldChar w:fldCharType="begin"/>
-          <w:instrText xml:space="preserve"> PAGEREF _Toc237383687 \h </w:instrText>
+        </w:r>
+        <w:r>
+          <w:rPr>
+            <w:noProof/>
+            <w:webHidden/>
+          </w:rPr>
+          <w:instrText xml:space="preserve"> PAGEREF _Toc237443221 \h </w:instrText>
+        </w:r>
+        <w:r>
+          <w:rPr>
+            <w:noProof/>
+            <w:webHidden/>
+          </w:rPr>
+        </w:r>
+        <w:r>
+          <w:rPr>
+            <w:noProof/>
+            <w:webHidden/>
+          </w:rPr>
           <w:fldChar w:fldCharType="separate"/>
+        </w:r>
+        <w:r>
+          <w:rPr>
+            <w:noProof/>
+            <w:webHidden/>
+          </w:rPr>
           <w:t>1</w:t>
+        </w:r>
+        <w:r>
+          <w:rPr>
+            <w:noProof/>
+            <w:webHidden/>
+          </w:rPr>
           <w:fldChar w:fldCharType="end"/>
         </w:r>
       </w:hyperlink>
@@ -139,7 +215,7 @@
           <w14:ligatures w14:val="standardContextual"/>
         </w:rPr>
       </w:pPr>
-      <w:hyperlink w:anchor="_Toc237383688" w:history="1">
+      <w:hyperlink w:anchor="_Toc237443222" w:history="1">
         <w:r>
           <w:rPr>
             <w:rStyle w:val="aff9"/>
@@ -153,10 +229,46 @@
             <w:webHidden/>
           </w:rPr>
           <w:tab/>
+        </w:r>
+        <w:r>
+          <w:rPr>
+            <w:noProof/>
+            <w:webHidden/>
+          </w:rPr>
           <w:fldChar w:fldCharType="begin"/>
-          <w:instrText xml:space="preserve"> PAGEREF _Toc237383688 \h </w:instrText>
+        </w:r>
+        <w:r>
+          <w:rPr>
+            <w:noProof/>
+            <w:webHidden/>
+          </w:rPr>
+          <w:instrText xml:space="preserve"> PAGEREF _Toc237443222 \h </w:instrText>
+        </w:r>
+        <w:r>
+          <w:rPr>
+            <w:noProof/>
+            <w:webHidden/>
+          </w:rPr>
+        </w:r>
+        <w:r>
+          <w:rPr>
+            <w:noProof/>
+            <w:webHidden/>
+          </w:rPr>
           <w:fldChar w:fldCharType="separate"/>
+        </w:r>
+        <w:r>
+          <w:rPr>
+            <w:noProof/>
+            <w:webHidden/>
+          </w:rPr>
           <w:t>2</w:t>
+        </w:r>
+        <w:r>
+          <w:rPr>
+            <w:noProof/>
+            <w:webHidden/>
+          </w:rPr>
           <w:fldChar w:fldCharType="end"/>
         </w:r>
       </w:hyperlink>
@@ -177,7 +289,7 @@
           <w14:ligatures w14:val="standardContextual"/>
         </w:rPr>
       </w:pPr>
-      <w:hyperlink w:anchor="_Toc237383689" w:history="1">
+      <w:hyperlink w:anchor="_Toc237443223" w:history="1">
         <w:r>
           <w:rPr>
             <w:rStyle w:val="aff9"/>
@@ -191,10 +303,46 @@
             <w:webHidden/>
           </w:rPr>
           <w:tab/>
+        </w:r>
+        <w:r>
+          <w:rPr>
+            <w:noProof/>
+            <w:webHidden/>
+          </w:rPr>
           <w:fldChar w:fldCharType="begin"/>
-          <w:instrText xml:space="preserve"> PAGEREF _Toc237383689 \h </w:instrText>
+        </w:r>
+        <w:r>
+          <w:rPr>
+            <w:noProof/>
+            <w:webHidden/>
+          </w:rPr>
+          <w:instrText xml:space="preserve"> PAGEREF _Toc237443223 \h </w:instrText>
+        </w:r>
+        <w:r>
+          <w:rPr>
+            <w:noProof/>
+            <w:webHidden/>
+          </w:rPr>
+        </w:r>
+        <w:r>
+          <w:rPr>
+            <w:noProof/>
+            <w:webHidden/>
+          </w:rPr>
           <w:fldChar w:fldCharType="separate"/>
+        </w:r>
+        <w:r>
+          <w:rPr>
+            <w:noProof/>
+            <w:webHidden/>
+          </w:rPr>
           <w:t>3</w:t>
+        </w:r>
+        <w:r>
+          <w:rPr>
+            <w:noProof/>
+            <w:webHidden/>
+          </w:rPr>
           <w:fldChar w:fldCharType="end"/>
         </w:r>
       </w:hyperlink>
@@ -214,7 +362,7 @@
           <w14:ligatures w14:val="standardContextual"/>
         </w:rPr>
       </w:pPr>
-      <w:hyperlink w:anchor="_Toc237383690" w:history="1">
+      <w:hyperlink w:anchor="_Toc237443224" w:history="1">
         <w:r>
           <w:rPr>
             <w:rStyle w:val="aff9"/>
@@ -228,10 +376,46 @@
             <w:webHidden/>
           </w:rPr>
           <w:tab/>
+        </w:r>
+        <w:r>
+          <w:rPr>
+            <w:noProof/>
+            <w:webHidden/>
+          </w:rPr>
           <w:fldChar w:fldCharType="begin"/>
-          <w:instrText xml:space="preserve"> PAGEREF _Toc237383690 \h </w:instrText>
+        </w:r>
+        <w:r>
+          <w:rPr>
+            <w:noProof/>
+            <w:webHidden/>
+          </w:rPr>
+          <w:instrText xml:space="preserve"> PAGEREF _Toc237443224 \h </w:instrText>
+        </w:r>
+        <w:r>
+          <w:rPr>
+            <w:noProof/>
+            <w:webHidden/>
+          </w:rPr>
+        </w:r>
+        <w:r>
+          <w:rPr>
+            <w:noProof/>
+            <w:webHidden/>
+          </w:rPr>
           <w:fldChar w:fldCharType="separate"/>
-          <w:t>3</w:t>
+        </w:r>
+        <w:r>
+          <w:rPr>
+            <w:noProof/>
+            <w:webHidden/>
+          </w:rPr>
+          <w:t>4</w:t>
+        </w:r>
+        <w:r>
+          <w:rPr>
+            <w:noProof/>
+            <w:webHidden/>
+          </w:rPr>
           <w:fldChar w:fldCharType="end"/>
         </w:r>
       </w:hyperlink>
@@ -251,7 +435,7 @@
           <w14:ligatures w14:val="standardContextual"/>
         </w:rPr>
       </w:pPr>
-      <w:hyperlink w:anchor="_Toc237383691" w:history="1">
+      <w:hyperlink w:anchor="_Toc237443225" w:history="1">
         <w:r>
           <w:rPr>
             <w:rStyle w:val="aff9"/>
@@ -265,10 +449,46 @@
             <w:webHidden/>
           </w:rPr>
           <w:tab/>
+        </w:r>
+        <w:r>
+          <w:rPr>
+            <w:noProof/>
+            <w:webHidden/>
+          </w:rPr>
           <w:fldChar w:fldCharType="begin"/>
-          <w:instrText xml:space="preserve"> PAGEREF _Toc237383691 \h </w:instrText>
+        </w:r>
+        <w:r>
+          <w:rPr>
+            <w:noProof/>
+            <w:webHidden/>
+          </w:rPr>
+          <w:instrText xml:space="preserve"> PAGEREF _Toc237443225 \h </w:instrText>
+        </w:r>
+        <w:r>
+          <w:rPr>
+            <w:noProof/>
+            <w:webHidden/>
+          </w:rPr>
+        </w:r>
+        <w:r>
+          <w:rPr>
+            <w:noProof/>
+            <w:webHidden/>
+          </w:rPr>
           <w:fldChar w:fldCharType="separate"/>
+        </w:r>
+        <w:r>
+          <w:rPr>
+            <w:noProof/>
+            <w:webHidden/>
+          </w:rPr>
           <w:t>7</w:t>
+        </w:r>
+        <w:r>
+          <w:rPr>
+            <w:noProof/>
+            <w:webHidden/>
+          </w:rPr>
           <w:fldChar w:fldCharType="end"/>
         </w:r>
       </w:hyperlink>
@@ -288,7 +508,7 @@
           <w14:ligatures w14:val="standardContextual"/>
         </w:rPr>
       </w:pPr>
-      <w:hyperlink w:anchor="_Toc237383692" w:history="1">
+      <w:hyperlink w:anchor="_Toc237443226" w:history="1">
         <w:r>
           <w:rPr>
             <w:rStyle w:val="aff9"/>
@@ -302,10 +522,46 @@
             <w:webHidden/>
           </w:rPr>
           <w:tab/>
+        </w:r>
+        <w:r>
+          <w:rPr>
+            <w:noProof/>
+            <w:webHidden/>
+          </w:rPr>
           <w:fldChar w:fldCharType="begin"/>
-          <w:instrText xml:space="preserve"> PAGEREF _Toc237383692 \h </w:instrText>
+        </w:r>
+        <w:r>
+          <w:rPr>
+            <w:noProof/>
+            <w:webHidden/>
+          </w:rPr>
+          <w:instrText xml:space="preserve"> PAGEREF _Toc237443226 \h </w:instrText>
+        </w:r>
+        <w:r>
+          <w:rPr>
+            <w:noProof/>
+            <w:webHidden/>
+          </w:rPr>
+        </w:r>
+        <w:r>
+          <w:rPr>
+            <w:noProof/>
+            <w:webHidden/>
+          </w:rPr>
           <w:fldChar w:fldCharType="separate"/>
+        </w:r>
+        <w:r>
+          <w:rPr>
+            <w:noProof/>
+            <w:webHidden/>
+          </w:rPr>
           <w:t>9</w:t>
+        </w:r>
+        <w:r>
+          <w:rPr>
+            <w:noProof/>
+            <w:webHidden/>
+          </w:rPr>
           <w:fldChar w:fldCharType="end"/>
         </w:r>
       </w:hyperlink>
@@ -326,7 +582,7 @@
           <w14:ligatures w14:val="standardContextual"/>
         </w:rPr>
       </w:pPr>
-      <w:hyperlink w:anchor="_Toc237383693" w:history="1">
+      <w:hyperlink w:anchor="_Toc237443227" w:history="1">
         <w:r>
           <w:rPr>
             <w:rStyle w:val="aff9"/>
@@ -340,10 +596,46 @@
             <w:webHidden/>
           </w:rPr>
           <w:tab/>
+        </w:r>
+        <w:r>
+          <w:rPr>
+            <w:noProof/>
+            <w:webHidden/>
+          </w:rPr>
           <w:fldChar w:fldCharType="begin"/>
-          <w:instrText xml:space="preserve"> PAGEREF _Toc237383693 \h </w:instrText>
+        </w:r>
+        <w:r>
+          <w:rPr>
+            <w:noProof/>
+            <w:webHidden/>
+          </w:rPr>
+          <w:instrText xml:space="preserve"> PAGEREF _Toc237443227 \h </w:instrText>
+        </w:r>
+        <w:r>
+          <w:rPr>
+            <w:noProof/>
+            <w:webHidden/>
+          </w:rPr>
+        </w:r>
+        <w:r>
+          <w:rPr>
+            <w:noProof/>
+            <w:webHidden/>
+          </w:rPr>
           <w:fldChar w:fldCharType="separate"/>
+        </w:r>
+        <w:r>
+          <w:rPr>
+            <w:noProof/>
+            <w:webHidden/>
+          </w:rPr>
           <w:t>11</w:t>
+        </w:r>
+        <w:r>
+          <w:rPr>
+            <w:noProof/>
+            <w:webHidden/>
+          </w:rPr>
           <w:fldChar w:fldCharType="end"/>
         </w:r>
       </w:hyperlink>
@@ -363,7 +655,7 @@
           <w14:ligatures w14:val="standardContextual"/>
         </w:rPr>
       </w:pPr>
-      <w:hyperlink w:anchor="_Toc237383694" w:history="1">
+      <w:hyperlink w:anchor="_Toc237443228" w:history="1">
         <w:r>
           <w:rPr>
             <w:rStyle w:val="aff9"/>
@@ -377,10 +669,46 @@
             <w:webHidden/>
           </w:rPr>
           <w:tab/>
+        </w:r>
+        <w:r>
+          <w:rPr>
+            <w:noProof/>
+            <w:webHidden/>
+          </w:rPr>
           <w:fldChar w:fldCharType="begin"/>
-          <w:instrText xml:space="preserve"> PAGEREF _Toc237383694 \h </w:instrText>
+        </w:r>
+        <w:r>
+          <w:rPr>
+            <w:noProof/>
+            <w:webHidden/>
+          </w:rPr>
+          <w:instrText xml:space="preserve"> PAGEREF _Toc237443228 \h </w:instrText>
+        </w:r>
+        <w:r>
+          <w:rPr>
+            <w:noProof/>
+            <w:webHidden/>
+          </w:rPr>
+        </w:r>
+        <w:r>
+          <w:rPr>
+            <w:noProof/>
+            <w:webHidden/>
+          </w:rPr>
           <w:fldChar w:fldCharType="separate"/>
+        </w:r>
+        <w:r>
+          <w:rPr>
+            <w:noProof/>
+            <w:webHidden/>
+          </w:rPr>
           <w:t>12</w:t>
+        </w:r>
+        <w:r>
+          <w:rPr>
+            <w:noProof/>
+            <w:webHidden/>
+          </w:rPr>
           <w:fldChar w:fldCharType="end"/>
         </w:r>
       </w:hyperlink>
@@ -401,7 +729,7 @@
           <w14:ligatures w14:val="standardContextual"/>
         </w:rPr>
       </w:pPr>
-      <w:hyperlink w:anchor="_Toc237383695" w:history="1">
+      <w:hyperlink w:anchor="_Toc237443229" w:history="1">
         <w:r>
           <w:rPr>
             <w:rStyle w:val="aff9"/>
@@ -415,10 +743,46 @@
             <w:webHidden/>
           </w:rPr>
           <w:tab/>
+        </w:r>
+        <w:r>
+          <w:rPr>
+            <w:noProof/>
+            <w:webHidden/>
+          </w:rPr>
           <w:fldChar w:fldCharType="begin"/>
-          <w:instrText xml:space="preserve"> PAGEREF _Toc237383695 \h </w:instrText>
+        </w:r>
+        <w:r>
+          <w:rPr>
+            <w:noProof/>
+            <w:webHidden/>
+          </w:rPr>
+          <w:instrText xml:space="preserve"> PAGEREF _Toc237443229 \h </w:instrText>
+        </w:r>
+        <w:r>
+          <w:rPr>
+            <w:noProof/>
+            <w:webHidden/>
+          </w:rPr>
+        </w:r>
+        <w:r>
+          <w:rPr>
+            <w:noProof/>
+            <w:webHidden/>
+          </w:rPr>
           <w:fldChar w:fldCharType="separate"/>
+        </w:r>
+        <w:r>
+          <w:rPr>
+            <w:noProof/>
+            <w:webHidden/>
+          </w:rPr>
           <w:t>12</w:t>
+        </w:r>
+        <w:r>
+          <w:rPr>
+            <w:noProof/>
+            <w:webHidden/>
+          </w:rPr>
           <w:fldChar w:fldCharType="end"/>
         </w:r>
       </w:hyperlink>
@@ -439,7 +803,7 @@
           <w14:ligatures w14:val="standardContextual"/>
         </w:rPr>
       </w:pPr>
-      <w:hyperlink w:anchor="_Toc237383696" w:history="1">
+      <w:hyperlink w:anchor="_Toc237443230" w:history="1">
         <w:r>
           <w:rPr>
             <w:rStyle w:val="aff9"/>
@@ -453,10 +817,46 @@
             <w:webHidden/>
           </w:rPr>
           <w:tab/>
+        </w:r>
+        <w:r>
+          <w:rPr>
+            <w:noProof/>
+            <w:webHidden/>
+          </w:rPr>
           <w:fldChar w:fldCharType="begin"/>
-          <w:instrText xml:space="preserve"> PAGEREF _Toc237383696 \h </w:instrText>
+        </w:r>
+        <w:r>
+          <w:rPr>
+            <w:noProof/>
+            <w:webHidden/>
+          </w:rPr>
+          <w:instrText xml:space="preserve"> PAGEREF _Toc237443230 \h </w:instrText>
+        </w:r>
+        <w:r>
+          <w:rPr>
+            <w:noProof/>
+            <w:webHidden/>
+          </w:rPr>
+        </w:r>
+        <w:r>
+          <w:rPr>
+            <w:noProof/>
+            <w:webHidden/>
+          </w:rPr>
           <w:fldChar w:fldCharType="separate"/>
+        </w:r>
+        <w:r>
+          <w:rPr>
+            <w:noProof/>
+            <w:webHidden/>
+          </w:rPr>
           <w:t>13</w:t>
+        </w:r>
+        <w:r>
+          <w:rPr>
+            <w:noProof/>
+            <w:webHidden/>
+          </w:rPr>
           <w:fldChar w:fldCharType="end"/>
         </w:r>
       </w:hyperlink>
@@ -477,7 +877,7 @@
           <w14:ligatures w14:val="standardContextual"/>
         </w:rPr>
       </w:pPr>
-      <w:hyperlink w:anchor="_Toc237383697" w:history="1">
+      <w:hyperlink w:anchor="_Toc237443231" w:history="1">
         <w:r>
           <w:rPr>
             <w:rStyle w:val="aff9"/>
@@ -491,10 +891,46 @@
             <w:webHidden/>
           </w:rPr>
           <w:tab/>
+        </w:r>
+        <w:r>
+          <w:rPr>
+            <w:noProof/>
+            <w:webHidden/>
+          </w:rPr>
           <w:fldChar w:fldCharType="begin"/>
-          <w:instrText xml:space="preserve"> PAGEREF _Toc237383697 \h </w:instrText>
+        </w:r>
+        <w:r>
+          <w:rPr>
+            <w:noProof/>
+            <w:webHidden/>
+          </w:rPr>
+          <w:instrText xml:space="preserve"> PAGEREF _Toc237443231 \h </w:instrText>
+        </w:r>
+        <w:r>
+          <w:rPr>
+            <w:noProof/>
+            <w:webHidden/>
+          </w:rPr>
+        </w:r>
+        <w:r>
+          <w:rPr>
+            <w:noProof/>
+            <w:webHidden/>
+          </w:rPr>
           <w:fldChar w:fldCharType="separate"/>
+        </w:r>
+        <w:r>
+          <w:rPr>
+            <w:noProof/>
+            <w:webHidden/>
+          </w:rPr>
           <w:t>15</w:t>
+        </w:r>
+        <w:r>
+          <w:rPr>
+            <w:noProof/>
+            <w:webHidden/>
+          </w:rPr>
           <w:fldChar w:fldCharType="end"/>
         </w:r>
       </w:hyperlink>
@@ -515,7 +951,7 @@
           <w14:ligatures w14:val="standardContextual"/>
         </w:rPr>
       </w:pPr>
-      <w:hyperlink w:anchor="_Toc237383698" w:history="1">
+      <w:hyperlink w:anchor="_Toc237443232" w:history="1">
         <w:r>
           <w:rPr>
             <w:rStyle w:val="aff9"/>
@@ -529,10 +965,338 @@
             <w:webHidden/>
           </w:rPr>
           <w:tab/>
+        </w:r>
+        <w:r>
+          <w:rPr>
+            <w:noProof/>
+            <w:webHidden/>
+          </w:rPr>
           <w:fldChar w:fldCharType="begin"/>
-          <w:instrText xml:space="preserve"> PAGEREF _Toc237383698 \h </w:instrText>
+        </w:r>
+        <w:r>
+          <w:rPr>
+            <w:noProof/>
+            <w:webHidden/>
+          </w:rPr>
+          <w:instrText xml:space="preserve"> PAGEREF _Toc237443232 \h </w:instrText>
+        </w:r>
+        <w:r>
+          <w:rPr>
+            <w:noProof/>
+            <w:webHidden/>
+          </w:rPr>
+        </w:r>
+        <w:r>
+          <w:rPr>
+            <w:noProof/>
+            <w:webHidden/>
+          </w:rPr>
           <w:fldChar w:fldCharType="separate"/>
+        </w:r>
+        <w:r>
+          <w:rPr>
+            <w:noProof/>
+            <w:webHidden/>
+          </w:rPr>
           <w:t>16</w:t>
+        </w:r>
+        <w:r>
+          <w:rPr>
+            <w:noProof/>
+            <w:webHidden/>
+          </w:rPr>
+          <w:fldChar w:fldCharType="end"/>
+        </w:r>
+      </w:hyperlink>
+    </w:p>
+    <w:p>
+      <w:pPr>
+        <w:pStyle w:val="TOC1"/>
+        <w:tabs>
+          <w:tab w:val="right" w:leader="dot" w:pos="9019"/>
+        </w:tabs>
+        <w:rPr>
+          <w:rFonts w:asciiTheme="minorHAnsi" w:hAnsiTheme="minorHAnsi"/>
+          <w:noProof/>
+          <w:kern w:val="2"/>
+          <w:szCs w:val="24"/>
+          <w:lang w:eastAsia="zh-CN"/>
+          <w14:ligatures w14:val="standardContextual"/>
+        </w:rPr>
+      </w:pPr>
+      <w:hyperlink w:anchor="_Toc237443233" w:history="1">
+        <w:r>
+          <w:rPr>
+            <w:rStyle w:val="aff9"/>
+            <w:noProof/>
+          </w:rPr>
+          <w:t>6. The app and the investor journey</w:t>
+        </w:r>
+        <w:r>
+          <w:rPr>
+            <w:noProof/>
+            <w:webHidden/>
+          </w:rPr>
+          <w:tab/>
+        </w:r>
+        <w:r>
+          <w:rPr>
+            <w:noProof/>
+            <w:webHidden/>
+          </w:rPr>
+          <w:fldChar w:fldCharType="begin"/>
+        </w:r>
+        <w:r>
+          <w:rPr>
+            <w:noProof/>
+            <w:webHidden/>
+          </w:rPr>
+          <w:instrText xml:space="preserve"> PAGEREF _Toc237443233 \h </w:instrText>
+        </w:r>
+        <w:r>
+          <w:rPr>
+            <w:noProof/>
+            <w:webHidden/>
+          </w:rPr>
+        </w:r>
+        <w:r>
+          <w:rPr>
+            <w:noProof/>
+            <w:webHidden/>
+          </w:rPr>
+          <w:fldChar w:fldCharType="separate"/>
+        </w:r>
+        <w:r>
+          <w:rPr>
+            <w:noProof/>
+            <w:webHidden/>
+          </w:rPr>
+          <w:t>17</w:t>
+        </w:r>
+        <w:r>
+          <w:rPr>
+            <w:noProof/>
+            <w:webHidden/>
+          </w:rPr>
+          <w:fldChar w:fldCharType="end"/>
+        </w:r>
+      </w:hyperlink>
+    </w:p>
+    <w:p>
+      <w:pPr>
+        <w:pStyle w:val="TOC1"/>
+        <w:tabs>
+          <w:tab w:val="right" w:leader="dot" w:pos="9019"/>
+        </w:tabs>
+        <w:rPr>
+          <w:rFonts w:asciiTheme="minorHAnsi" w:hAnsiTheme="minorHAnsi"/>
+          <w:noProof/>
+          <w:kern w:val="2"/>
+          <w:szCs w:val="24"/>
+          <w:lang w:eastAsia="zh-CN"/>
+          <w14:ligatures w14:val="standardContextual"/>
+        </w:rPr>
+      </w:pPr>
+      <w:hyperlink w:anchor="_Toc237443234" w:history="1">
+        <w:r>
+          <w:rPr>
+            <w:rStyle w:val="aff9"/>
+            <w:noProof/>
+          </w:rPr>
+          <w:t>7. Critical reflection and recommendations</w:t>
+        </w:r>
+        <w:r>
+          <w:rPr>
+            <w:noProof/>
+            <w:webHidden/>
+          </w:rPr>
+          <w:tab/>
+        </w:r>
+        <w:r>
+          <w:rPr>
+            <w:noProof/>
+            <w:webHidden/>
+          </w:rPr>
+          <w:fldChar w:fldCharType="begin"/>
+        </w:r>
+        <w:r>
+          <w:rPr>
+            <w:noProof/>
+            <w:webHidden/>
+          </w:rPr>
+          <w:instrText xml:space="preserve"> PAGEREF _Toc237443234 \h </w:instrText>
+        </w:r>
+        <w:r>
+          <w:rPr>
+            <w:noProof/>
+            <w:webHidden/>
+          </w:rPr>
+        </w:r>
+        <w:r>
+          <w:rPr>
+            <w:noProof/>
+            <w:webHidden/>
+          </w:rPr>
+          <w:fldChar w:fldCharType="separate"/>
+        </w:r>
+        <w:r>
+          <w:rPr>
+            <w:noProof/>
+            <w:webHidden/>
+          </w:rPr>
+          <w:t>17</w:t>
+        </w:r>
+        <w:r>
+          <w:rPr>
+            <w:noProof/>
+            <w:webHidden/>
+          </w:rPr>
+          <w:fldChar w:fldCharType="end"/>
+        </w:r>
+      </w:hyperlink>
+    </w:p>
+    <w:p>
+      <w:pPr>
+        <w:pStyle w:val="TOC1"/>
+        <w:tabs>
+          <w:tab w:val="right" w:leader="dot" w:pos="9019"/>
+        </w:tabs>
+        <w:rPr>
+          <w:rFonts w:asciiTheme="minorHAnsi" w:hAnsiTheme="minorHAnsi"/>
+          <w:noProof/>
+          <w:kern w:val="2"/>
+          <w:szCs w:val="24"/>
+          <w:lang w:eastAsia="zh-CN"/>
+          <w14:ligatures w14:val="standardContextual"/>
+        </w:rPr>
+      </w:pPr>
+      <w:hyperlink w:anchor="_Toc237443235" w:history="1">
+        <w:r>
+          <w:rPr>
+            <w:rStyle w:val="aff9"/>
+            <w:noProof/>
+          </w:rPr>
+          <w:t>References</w:t>
+        </w:r>
+        <w:r>
+          <w:rPr>
+            <w:noProof/>
+            <w:webHidden/>
+          </w:rPr>
+          <w:tab/>
+        </w:r>
+        <w:r>
+          <w:rPr>
+            <w:noProof/>
+            <w:webHidden/>
+          </w:rPr>
+          <w:fldChar w:fldCharType="begin"/>
+        </w:r>
+        <w:r>
+          <w:rPr>
+            <w:noProof/>
+            <w:webHidden/>
+          </w:rPr>
+          <w:instrText xml:space="preserve"> PAGEREF _Toc237443235 \h </w:instrText>
+        </w:r>
+        <w:r>
+          <w:rPr>
+            <w:noProof/>
+            <w:webHidden/>
+          </w:rPr>
+        </w:r>
+        <w:r>
+          <w:rPr>
+            <w:noProof/>
+            <w:webHidden/>
+          </w:rPr>
+          <w:fldChar w:fldCharType="separate"/>
+        </w:r>
+        <w:r>
+          <w:rPr>
+            <w:noProof/>
+            <w:webHidden/>
+          </w:rPr>
+          <w:t>18</w:t>
+        </w:r>
+        <w:r>
+          <w:rPr>
+            <w:noProof/>
+            <w:webHidden/>
+          </w:rPr>
+          <w:fldChar w:fldCharType="end"/>
+        </w:r>
+      </w:hyperlink>
+    </w:p>
+    <w:p>
+      <w:pPr>
+        <w:pStyle w:val="TOC1"/>
+        <w:tabs>
+          <w:tab w:val="right" w:leader="dot" w:pos="9019"/>
+        </w:tabs>
+        <w:rPr>
+          <w:rFonts w:asciiTheme="minorHAnsi" w:hAnsiTheme="minorHAnsi"/>
+          <w:noProof/>
+          <w:kern w:val="2"/>
+          <w:szCs w:val="24"/>
+          <w:lang w:eastAsia="zh-CN"/>
+          <w14:ligatures w14:val="standardContextual"/>
+        </w:rPr>
+      </w:pPr>
+      <w:hyperlink w:anchor="_Toc237443236" w:history="1">
+        <w:r>
+          <w:rPr>
+            <w:rStyle w:val="aff9"/>
+            <w:noProof/>
+          </w:rPr>
+          <w:t>Appendix</w:t>
+        </w:r>
+        <w:r>
+          <w:rPr>
+            <w:noProof/>
+            <w:webHidden/>
+          </w:rPr>
+          <w:tab/>
+        </w:r>
+        <w:r>
+          <w:rPr>
+            <w:noProof/>
+            <w:webHidden/>
+          </w:rPr>
+          <w:fldChar w:fldCharType="begin"/>
+        </w:r>
+        <w:r>
+          <w:rPr>
+            <w:noProof/>
+            <w:webHidden/>
+          </w:rPr>
+          <w:instrText xml:space="preserve"> PAGEREF _Toc237443236 \h </w:instrText>
+        </w:r>
+        <w:r>
+          <w:rPr>
+            <w:noProof/>
+            <w:webHidden/>
+          </w:rPr>
+        </w:r>
+        <w:r>
+          <w:rPr>
+            <w:noProof/>
+            <w:webHidden/>
+          </w:rPr>
+          <w:fldChar w:fldCharType="separate"/>
+        </w:r>
+        <w:r>
+          <w:rPr>
+            <w:noProof/>
+            <w:webHidden/>
+          </w:rPr>
+          <w:t>19</w:t>
+        </w:r>
+        <w:r>
+          <w:rPr>
+            <w:noProof/>
+            <w:webHidden/>
+          </w:rPr>
           <w:fldChar w:fldCharType="end"/>
         </w:r>
       </w:hyperlink>
@@ -553,13 +1317,13 @@
           <w14:ligatures w14:val="standardContextual"/>
         </w:rPr>
       </w:pPr>
-      <w:hyperlink w:anchor="_Toc237383699" w:history="1">
+      <w:hyperlink w:anchor="_Toc237443237" w:history="1">
         <w:r>
           <w:rPr>
             <w:rStyle w:val="aff9"/>
             <w:noProof/>
           </w:rPr>
-          <w:t>5.5 The figure design system</w:t>
+          <w:t>Appendix A - The four objectives</w:t>
         </w:r>
         <w:r>
           <w:rPr>
@@ -567,158 +1331,46 @@
             <w:webHidden/>
           </w:rPr>
           <w:tab/>
-          <w:fldChar w:fldCharType="begin"/>
-          <w:instrText xml:space="preserve"> PAGEREF _Toc237383699 \h </w:instrText>
-          <w:fldChar w:fldCharType="separate"/>
-          <w:t>16</w:t>
-          <w:fldChar w:fldCharType="end"/>
-        </w:r>
-      </w:hyperlink>
-    </w:p>
-    <w:p>
-      <w:pPr>
-        <w:pStyle w:val="TOC1"/>
-        <w:tabs>
-          <w:tab w:val="right" w:leader="dot" w:pos="9019"/>
-        </w:tabs>
-        <w:rPr>
-          <w:rFonts w:asciiTheme="minorHAnsi" w:hAnsiTheme="minorHAnsi"/>
-          <w:noProof/>
-          <w:kern w:val="2"/>
-          <w:szCs w:val="24"/>
-          <w:lang w:eastAsia="zh-CN"/>
-          <w14:ligatures w14:val="standardContextual"/>
-        </w:rPr>
-      </w:pPr>
-      <w:hyperlink w:anchor="_Toc237383700" w:history="1">
-        <w:r>
-          <w:rPr>
-            <w:rStyle w:val="aff9"/>
-            <w:noProof/>
-          </w:rPr>
-          <w:t>6. The app and the investor journey</w:t>
         </w:r>
         <w:r>
           <w:rPr>
             <w:noProof/>
             <w:webHidden/>
           </w:rPr>
-          <w:tab/>
           <w:fldChar w:fldCharType="begin"/>
-          <w:instrText xml:space="preserve"> PAGEREF _Toc237383700 \h </w:instrText>
-          <w:fldChar w:fldCharType="separate"/>
-          <w:t>17</w:t>
-          <w:fldChar w:fldCharType="end"/>
-        </w:r>
-      </w:hyperlink>
-    </w:p>
-    <w:p>
-      <w:pPr>
-        <w:pStyle w:val="TOC1"/>
-        <w:tabs>
-          <w:tab w:val="right" w:leader="dot" w:pos="9019"/>
-        </w:tabs>
-        <w:rPr>
-          <w:rFonts w:asciiTheme="minorHAnsi" w:hAnsiTheme="minorHAnsi"/>
-          <w:noProof/>
-          <w:kern w:val="2"/>
-          <w:szCs w:val="24"/>
-          <w:lang w:eastAsia="zh-CN"/>
-          <w14:ligatures w14:val="standardContextual"/>
-        </w:rPr>
-      </w:pPr>
-      <w:hyperlink w:anchor="_Toc237383701" w:history="1">
-        <w:r>
-          <w:rPr>
-            <w:rStyle w:val="aff9"/>
-            <w:noProof/>
-          </w:rPr>
-          <w:t>7. Critical reflection and recommendations</w:t>
         </w:r>
         <w:r>
           <w:rPr>
             <w:noProof/>
             <w:webHidden/>
           </w:rPr>
-          <w:tab/>
-          <w:fldChar w:fldCharType="begin"/>
-          <w:instrText xml:space="preserve"> PAGEREF _Toc237383701 \h </w:instrText>
-          <w:fldChar w:fldCharType="separate"/>
-          <w:t>17</w:t>
-          <w:fldChar w:fldCharType="end"/>
-        </w:r>
-      </w:hyperlink>
-    </w:p>
-    <w:p>
-      <w:pPr>
-        <w:pStyle w:val="TOC1"/>
-        <w:tabs>
-          <w:tab w:val="right" w:leader="dot" w:pos="9019"/>
-        </w:tabs>
-        <w:rPr>
-          <w:rFonts w:asciiTheme="minorHAnsi" w:hAnsiTheme="minorHAnsi"/>
-          <w:noProof/>
-          <w:kern w:val="2"/>
-          <w:szCs w:val="24"/>
-          <w:lang w:eastAsia="zh-CN"/>
-          <w14:ligatures w14:val="standardContextual"/>
-        </w:rPr>
-      </w:pPr>
-      <w:hyperlink w:anchor="_Toc237383702" w:history="1">
-        <w:r>
-          <w:rPr>
-            <w:rStyle w:val="aff9"/>
-            <w:noProof/>
-          </w:rPr>
-          <w:t>References</w:t>
+          <w:instrText xml:space="preserve"> PAGEREF _Toc237443237 \h </w:instrText>
         </w:r>
         <w:r>
           <w:rPr>
             <w:noProof/>
             <w:webHidden/>
           </w:rPr>
-          <w:tab/>
-          <w:fldChar w:fldCharType="begin"/>
-          <w:instrText xml:space="preserve"> PAGEREF _Toc237383702 \h </w:instrText>
-          <w:fldChar w:fldCharType="separate"/>
-          <w:t>18</w:t>
-          <w:fldChar w:fldCharType="end"/>
-        </w:r>
-      </w:hyperlink>
-    </w:p>
-    <w:p>
-      <w:pPr>
-        <w:pStyle w:val="TOC1"/>
-        <w:tabs>
-          <w:tab w:val="right" w:leader="dot" w:pos="9019"/>
-        </w:tabs>
-        <w:rPr>
-          <w:rFonts w:asciiTheme="minorHAnsi" w:hAnsiTheme="minorHAnsi"/>
-          <w:noProof/>
-          <w:kern w:val="2"/>
-          <w:szCs w:val="24"/>
-          <w:lang w:eastAsia="zh-CN"/>
-          <w14:ligatures w14:val="standardContextual"/>
-        </w:rPr>
-      </w:pPr>
-      <w:hyperlink w:anchor="_Toc237383703" w:history="1">
-        <w:r>
-          <w:rPr>
-            <w:rStyle w:val="aff9"/>
-            <w:noProof/>
-          </w:rPr>
-          <w:t>Appendix</w:t>
         </w:r>
         <w:r>
           <w:rPr>
             <w:noProof/>
             <w:webHidden/>
           </w:rPr>
-          <w:tab/>
-          <w:fldChar w:fldCharType="begin"/>
-          <w:instrText xml:space="preserve"> PAGEREF _Toc237383703 \h </w:instrText>
           <w:fldChar w:fldCharType="separate"/>
-          <w:t>18</w:t>
+        </w:r>
+        <w:r>
+          <w:rPr>
+            <w:noProof/>
+            <w:webHidden/>
+          </w:rPr>
+          <w:t>19</w:t>
+        </w:r>
+        <w:r>
+          <w:rPr>
+            <w:noProof/>
+            <w:webHidden/>
+          </w:rPr>
           <w:fldChar w:fldCharType="end"/>
         </w:r>
       </w:hyperlink>
@@ -739,13 +1391,13 @@
           <w14:ligatures w14:val="standardContextual"/>
         </w:rPr>
       </w:pPr>
-      <w:hyperlink w:anchor="_Toc237383704" w:history="1">
+      <w:hyperlink w:anchor="_Toc237443238" w:history="1">
         <w:r>
           <w:rPr>
             <w:rStyle w:val="aff9"/>
             <w:noProof/>
           </w:rPr>
-          <w:t>Appendix A - The four objectives</w:t>
+          <w:t>Appendix B - Supporting exhibits</w:t>
         </w:r>
         <w:r>
           <w:rPr>
@@ -753,10 +1405,46 @@
             <w:webHidden/>
           </w:rPr>
           <w:tab/>
+        </w:r>
+        <w:r>
+          <w:rPr>
+            <w:noProof/>
+            <w:webHidden/>
+          </w:rPr>
           <w:fldChar w:fldCharType="begin"/>
-          <w:instrText xml:space="preserve"> PAGEREF _Toc237383704 \h </w:instrText>
+        </w:r>
+        <w:r>
+          <w:rPr>
+            <w:noProof/>
+            <w:webHidden/>
+          </w:rPr>
+          <w:instrText xml:space="preserve"> PAGEREF _Toc237443238 \h </w:instrText>
+        </w:r>
+        <w:r>
+          <w:rPr>
+            <w:noProof/>
+            <w:webHidden/>
+          </w:rPr>
+        </w:r>
+        <w:r>
+          <w:rPr>
+            <w:noProof/>
+            <w:webHidden/>
+          </w:rPr>
           <w:fldChar w:fldCharType="separate"/>
-          <w:t>18</w:t>
+        </w:r>
+        <w:r>
+          <w:rPr>
+            <w:noProof/>
+            <w:webHidden/>
+          </w:rPr>
+          <w:t>20</w:t>
+        </w:r>
+        <w:r>
+          <w:rPr>
+            <w:noProof/>
+            <w:webHidden/>
+          </w:rPr>
           <w:fldChar w:fldCharType="end"/>
         </w:r>
       </w:hyperlink>
@@ -777,13 +1465,13 @@
           <w14:ligatures w14:val="standardContextual"/>
         </w:rPr>
       </w:pPr>
-      <w:hyperlink w:anchor="_Toc237383705" w:history="1">
+      <w:hyperlink w:anchor="_Toc237443239" w:history="1">
         <w:r>
           <w:rPr>
             <w:rStyle w:val="aff9"/>
             <w:noProof/>
           </w:rPr>
-          <w:t>Appendix B - Supporting exhibits</w:t>
+          <w:t>Appendix C - The figure design system</w:t>
         </w:r>
         <w:r>
           <w:rPr>
@@ -791,10 +1479,120 @@
             <w:webHidden/>
           </w:rPr>
           <w:tab/>
+        </w:r>
+        <w:r>
+          <w:rPr>
+            <w:noProof/>
+            <w:webHidden/>
+          </w:rPr>
           <w:fldChar w:fldCharType="begin"/>
-          <w:instrText xml:space="preserve"> PAGEREF _Toc237383705 \h </w:instrText>
+        </w:r>
+        <w:r>
+          <w:rPr>
+            <w:noProof/>
+            <w:webHidden/>
+          </w:rPr>
+          <w:instrText xml:space="preserve"> PAGEREF _Toc237443239 \h </w:instrText>
+        </w:r>
+        <w:r>
+          <w:rPr>
+            <w:noProof/>
+            <w:webHidden/>
+          </w:rPr>
+        </w:r>
+        <w:r>
+          <w:rPr>
+            <w:noProof/>
+            <w:webHidden/>
+          </w:rPr>
           <w:fldChar w:fldCharType="separate"/>
-          <w:t>19</w:t>
+        </w:r>
+        <w:r>
+          <w:rPr>
+            <w:noProof/>
+            <w:webHidden/>
+          </w:rPr>
+          <w:t>21</w:t>
+        </w:r>
+        <w:r>
+          <w:rPr>
+            <w:noProof/>
+            <w:webHidden/>
+          </w:rPr>
+          <w:fldChar w:fldCharType="end"/>
+        </w:r>
+      </w:hyperlink>
+    </w:p>
+    <w:p>
+      <w:pPr>
+        <w:pStyle w:val="TOC2"/>
+        <w:tabs>
+          <w:tab w:val="right" w:leader="dot" w:pos="9019"/>
+        </w:tabs>
+        <w:ind w:left="440"/>
+        <w:rPr>
+          <w:rFonts w:asciiTheme="minorHAnsi" w:hAnsiTheme="minorHAnsi"/>
+          <w:noProof/>
+          <w:kern w:val="2"/>
+          <w:szCs w:val="24"/>
+          <w:lang w:eastAsia="zh-CN"/>
+          <w14:ligatures w14:val="standardContextual"/>
+        </w:rPr>
+      </w:pPr>
+      <w:hyperlink w:anchor="_Toc237443240" w:history="1">
+        <w:r>
+          <w:rPr>
+            <w:rStyle w:val="aff9"/>
+            <w:noProof/>
+          </w:rPr>
+          <w:t>Appendix D - Rolling against expanding estimation windows</w:t>
+        </w:r>
+        <w:r>
+          <w:rPr>
+            <w:noProof/>
+            <w:webHidden/>
+          </w:rPr>
+          <w:tab/>
+        </w:r>
+        <w:r>
+          <w:rPr>
+            <w:noProof/>
+            <w:webHidden/>
+          </w:rPr>
+          <w:fldChar w:fldCharType="begin"/>
+        </w:r>
+        <w:r>
+          <w:rPr>
+            <w:noProof/>
+            <w:webHidden/>
+          </w:rPr>
+          <w:instrText xml:space="preserve"> PAGEREF _Toc237443240 \h </w:instrText>
+        </w:r>
+        <w:r>
+          <w:rPr>
+            <w:noProof/>
+            <w:webHidden/>
+          </w:rPr>
+        </w:r>
+        <w:r>
+          <w:rPr>
+            <w:noProof/>
+            <w:webHidden/>
+          </w:rPr>
+          <w:fldChar w:fldCharType="separate"/>
+        </w:r>
+        <w:r>
+          <w:rPr>
+            <w:noProof/>
+            <w:webHidden/>
+          </w:rPr>
+          <w:t>21</w:t>
+        </w:r>
+        <w:r>
+          <w:rPr>
+            <w:noProof/>
+            <w:webHidden/>
+          </w:rPr>
           <w:fldChar w:fldCharType="end"/>
         </w:r>
       </w:hyperlink>
@@ -813,7 +1611,7 @@
       <w:pPr>
         <w:pStyle w:val="1"/>
       </w:pPr>
-      <w:bookmarkStart w:id="2" w:name="_Toc237383688"/>
+      <w:bookmarkStart w:id="2" w:name="_Toc237443222"/>
       <w:r>
         <w:t>1. The funds and the backtest design</w:t>
       </w:r>
@@ -841,12 +1639,12 @@
     </w:p>
     <w:p>
       <w:r>
-        <w:t>Three design choices deserve defending. The estimation window rolls rather than expands, so the covariance matrix reflects the most recent year of trading rather than an average of the whole history, which trades a noisier estimate for responsiveness to a change in regime. Rebalancing monthly balances the same tension the other way: often enough to act on a changed covariance estimate, rarely enough not to pay for chasing noise. Long-only weights match what the product is and bound the damage an extreme estimate can do, since a weight cannot go below zero however attractive a short looks to the optimiser. Jagannathan and Ma (2003) show that a no-short-sale constraint acts on a minimum-variance problem in the same way as shrinking the most extreme covariance estimates, so the constraint buys statistical stability as well as investability. Appendix D tests that trade-off directly: an expanding window lifts the equity funds (+0.110 on minimum variance) and costs the flagship Combined Maximum-Sharpe fund 0.583 of a Sharpe point, because it never forgets the crypto regime that ended in 2022.</w:t>
+        <w:t>Three design choices deserve defending. The estimation window rolls rather than expands, so the covariance matrix reflects the most recent year of trading rather than an average of the whole history, which trades a noisier estimate for responsiveness to a change in regime. Rebalancing monthly balances the same tension the other way: often enough to act on a changed covariance estimate, rarely enough not to pay for chasing noise. Long-only weights match what the product is and bound the damage an extreme estimate can do, since a weight cannot go below zero however attractive a short looks to the optimiser. Jagannathan and Ma (2003) show that a no-short-sale constraint acts on a minimum-variance problem in the same way as shrinking the most extreme covariance estimates, so the constraint buys statistical stability as well as investability. Appendix D tests that trade-off: an expanding window lifts the equity funds (+0.110 on minimum variance) and costs the flagship Combined Maximum-Sharpe fund 0.583, because it never forgets the crypto regime that ended in 2022.</w:t>
       </w:r>
+      <w:r/>
     </w:p>
     <w:p>
       <w:r>
-        <w:lastRenderedPageBreak/>
         <w:t>The absence of look-ahead is asserted rather than argued. tests/test_no_lookahead.py runs each fund on the full sample and again on a sample truncated at 30 June 2022 and requires the overlapping returns and weights to match exactly; a backtest that used future data could not pass.</w:t>
       </w:r>
     </w:p>
@@ -854,7 +1652,7 @@
       <w:pPr>
         <w:pStyle w:val="21"/>
       </w:pPr>
-      <w:bookmarkStart w:id="3" w:name="_Toc237383689"/>
+      <w:bookmarkStart w:id="3" w:name="_Toc237443223"/>
       <w:r>
         <w:t>How often the funds trade</w:t>
       </w:r>
@@ -874,7 +1672,7 @@
           <w:noProof/>
         </w:rPr>
         <w:drawing>
-          <wp:inline distT="0" distB="0" distL="0" distR="0" wp14:anchorId="176122CB" wp14:editId="048082BE">
+          <wp:inline distT="0" distB="0" distL="0" distR="0" wp14:anchorId="02439B4C" wp14:editId="76A954B3">
             <wp:extent cx="5577840" cy="2847596"/>
             <wp:effectExtent l="0" t="0" r="0" b="0"/>
             <wp:docPr id="1" name="Picture 1"/>
@@ -943,8 +1741,9 @@
       <w:pPr>
         <w:pStyle w:val="1"/>
       </w:pPr>
-      <w:bookmarkStart w:id="4" w:name="_Toc237383690"/>
+      <w:bookmarkStart w:id="4" w:name="_Toc237443224"/>
       <w:r>
+        <w:lastRenderedPageBreak/>
         <w:t>2. Out-of-sample results and fund fact sheets</w:t>
       </w:r>
       <w:bookmarkEnd w:id="4"/>
@@ -1194,7 +1993,6 @@
               <w:rPr>
                 <w:sz w:val="16"/>
               </w:rPr>
-              <w:lastRenderedPageBreak/>
               <w:t>Combined Risk Parity</w:t>
             </w:r>
           </w:p>
@@ -2278,12 +3076,16 @@
     </w:p>
     <w:p>
       <w:r>
-        <w:t>The first is sample noise. Every rebalance asks 252 days of returns for 50 expected returns and a 50-by-50 covariance matrix, a thin sample for that many quantities. Michaud (1989) calls the consequence error maximisation: an optimiser given noisy inputs overweights precisely those assets whose expected returns the sample has overstated and whose risks it has understated, so estimation error is amplified rather than diversified away. Maximum Sharpe holds 6 of the 50 stocks and rewrites 34% of its portfolio at the average rebalance; minimum variance holds 18 and rewrites 15%. Equal weighting estimates nothing and never trades, and risk parity, which needs variances but no expected returns, changes 2% of its weights a month. Chopra and Ziemba (1993) find errors in expected returns roughly an order of magnitude more costly than errors in variances, which is consistent with maximum Sharpe - the one method here needing a mean estimate - being both the most concentrated fund and the most heavily traded. That turnover and concentration are not the optimisation working; they are a symptom of how noisy its inputs are.</w:t>
+        <w:t>The first is sample noise. Every rebalance asks 252 days of returns for 50 expected returns and a 50-by-50 covariance matrix, a thin sample for that many quantities. Michaud (1989) calls the consequence error maximisation: an optimiser given noisy inputs overweights precisely those assets whose expected returns the sample has overstated and whose risks it has understated, so estimation error is amplified rather than diversified away. Maximum Sharpe holds 6 of the 50 stocks and rewrites 34% of its portfolio at the average rebalance; minimum variance holds 18 and rewrites 15%. Equal weighting estimates nothing and never trades, and risk parity, which needs variances but no expected returns, changes 2% of its weights a month. Chopra and Ziemba (1993) find errors in expected returns roughly an order of magnitude more costly than errors in variances, which is consistent with maximum Sharpe - the one method here needing a mean estimate - being both the most concentrated fund and the most heavily traded. That turnover and concentration are not the optimisation working but a symptom of how noisy its inputs are.</w:t>
       </w:r>
     </w:p>
     <w:p>
       <w:r>
-        <w:t>How small is quantified by DeMiguel, Garlappi and Uppal (2009), who evaluate fourteen mean-variance models and their estimation-error corrections against 1/N across seven datasets and find none of them consistently better on Sharpe ratio, certainty-equivalent return or turnover. Calibrating to US equities, they estimate that a sample-based mean-variance strategy needs an estimation window of roughly 6,000 months to beat 1/N on a 50-asset portfolio. This fund holds 50 assets and estimates on 12 months. On their arithmetic the equity results here are not a surprising outcome but the expected one, and the question is less why optimisation lost than why anyone would have expected it to win at this sample size.</w:t>
+        <w:t xml:space="preserve">How small is quantified by DeMiguel, Garlappi and Uppal (2009), who evaluate fourteen mean-variance models and their estimation-error corrections against 1/N across seven datasets and find none of them consistently better on Sharpe ratio, certainty-equivalent return or turnover. Calibrating to US equities, they estimate that a sample-based mean-variance strategy needs an estimation window of roughly 6,000 months to beat 1/N on a 50-asset portfolio. This fund holds 50 assets and estimates on 12 months. On their arithmetic the equity results here are not a </w:t>
+      </w:r>
+      <w:r>
+        <w:lastRenderedPageBreak/>
+        <w:t>surprising outcome but the expected one, and the question is less why optimisation lost than why anyone would have expected it to win at this sample size.</w:t>
       </w:r>
     </w:p>
     <w:p>
@@ -2293,9 +3095,7 @@
     </w:p>
     <w:p>
       <w:r>
-        <w:t xml:space="preserve">That is a statement about who the fund is for rather than about whether it works. An investor ranking funds on risk-adjusted return should not hold it - at +5.4% a year it is the weakest equity </w:t>
-        <w:lastRenderedPageBreak/>
-        <w:t>fund on offer. An investor who will sell in a drawdown should, because it is the fund that fell least, and the return an investor keeps is the return they hold through. Spotlight therefore lists all twelve funds rather than only the top of the Sharpe table, and the allocation tool exists so that a user can express which of those two investors they are. A single ranking cannot carry that information, which is why the fact sheet shows the drawdown next to the growth line.</w:t>
+        <w:t>That is a statement about who the fund is for rather than about whether it works. An investor ranking funds on risk-adjusted return should not hold it - at +5.4% a year it is the weakest equity fund on offer. An investor who will sell in a drawdown should, because it is the fund that fell least, and the return an investor keeps is the return they hold through. Spotlight therefore lists all twelve funds rather than only the top of the Sharpe table, and the allocation tool exists so that a user can express which of those two investors they are. A single ranking cannot carry that information, which is why the fact sheet shows the drawdown next to the growth line.</w:t>
       </w:r>
     </w:p>
     <w:p>
@@ -2317,7 +3117,7 @@
           <w:noProof/>
         </w:rPr>
         <w:drawing>
-          <wp:inline distT="0" distB="0" distL="0" distR="0" wp14:anchorId="512460F4" wp14:editId="7BA857BD">
+          <wp:inline distT="0" distB="0" distL="0" distR="0" wp14:anchorId="592349AB" wp14:editId="39CE1271">
             <wp:extent cx="5577840" cy="2847596"/>
             <wp:effectExtent l="0" t="0" r="0" b="0"/>
             <wp:docPr id="2" name="Picture 2"/>
@@ -2374,8 +3174,9 @@
     </w:p>
     <w:p>
       <w:r>
-        <w:t>The lines separate in the first quarter of 2021 and never reconverge. Maximum Sharpe pulls away early because its concentration paid during the crypto rally, holds most of that lead through the 2022 drawdown, and ends well ahead. An investor would have preferred it on the final value alone, but the path matters: the fund that ends highest is also the one that fell furthest, and the choice between it and risk parity is a choice about tolerance for that path rather than about which manager is better.</w:t>
+        <w:t>The lines separate in the first quarter of 2021 and never reconverge. Maximum Sharpe pulls away early because its concentration paid during the crypto rally, keeps most of that lead through the 2022 drawdown, and ends well ahead. The path matters as much as the endpoint: the fund that ends highest also fell furthest, so choosing between it and risk parity is a choice about tolerance rather than about which manager is better.</w:t>
       </w:r>
+      <w:r/>
     </w:p>
     <w:p>
       <w:pPr>
@@ -2385,9 +3186,8 @@
         <w:rPr>
           <w:noProof/>
         </w:rPr>
-        <w:lastRenderedPageBreak/>
         <w:drawing>
-          <wp:inline distT="0" distB="0" distL="0" distR="0" wp14:anchorId="043AEB78" wp14:editId="63680D2B">
+          <wp:inline distT="0" distB="0" distL="0" distR="0" wp14:anchorId="31A6536A" wp14:editId="54DAE598">
             <wp:extent cx="5577840" cy="2847596"/>
             <wp:effectExtent l="0" t="0" r="0" b="0"/>
             <wp:docPr id="3" name="Picture 3"/>
@@ -2444,7 +3244,7 @@
     </w:p>
     <w:p>
       <w:r>
-        <w:t>The crypto funds occupy the top of the risk-adjusted table despite their drawdowns, because 2021 to 2023 was a period in which crypto returns were large enough to compensate for their volatility. That is a statement about this sample, not about the asset class. Within the equity funds the ordering runs the other way from what optimisation theory promises: equal weighting at 0.819 beats every optimised rule. The combined funds sit between the two families, which is what diversification should produce, though it also means that mixing crypto with equities lowered the Sharpe ratio relative to holding crypto alone over this particular window.</w:t>
+        <w:t>The crypto funds top the risk-adjusted table despite their drawdowns, because 2021 to 2023 was a period when crypto returns were large enough to compensate for their volatility - a statement about this sample, not the asset class. Within the equity funds the ordering runs against what optimisation theory promises: equal weighting at 0.819 beats every optimised rule. The combined funds sit between the two families, which is what diversification should produce, though it also means mixing crypto with equities lowered the Sharpe ratio against holding crypto alone over this window.</w:t>
       </w:r>
     </w:p>
     <w:p>
@@ -2456,7 +3256,7 @@
           <w:noProof/>
         </w:rPr>
         <w:drawing>
-          <wp:inline distT="0" distB="0" distL="0" distR="0" wp14:anchorId="29CE1BC4" wp14:editId="630BEC51">
+          <wp:inline distT="0" distB="0" distL="0" distR="0" wp14:anchorId="6CA6DB1F" wp14:editId="58312B79">
             <wp:extent cx="5577840" cy="2399741"/>
             <wp:effectExtent l="0" t="0" r="0" b="0"/>
             <wp:docPr id="4" name="Picture 4"/>
@@ -2513,8 +3313,9 @@
     </w:p>
     <w:p>
       <w:r>
-        <w:t>The fund lost 25.8% from its peak and took most of a year to recover. An investor who bought at the high would have watched a quarter of their capital disappear before any of the eventual return arrived, which is the experience a Sharpe ratio of 0.98 conceals. This is why the fact sheet in the app shows the drawdown alongside the growth line rather than below it: the two together describe the product, and either alone misleads.</w:t>
+        <w:t>The fund lost 25.8% from its peak and took most of a year to recover. An investor who bought at the high watched a quarter of their capital disappear before any of the eventual return arrived, which is what a Sharpe ratio of 0.98 conceals. The app's fact sheet therefore shows drawdown alongside the growth line: together they describe the product, and either alone misleads.</w:t>
       </w:r>
+      <w:r/>
     </w:p>
     <w:p>
       <w:pPr>
@@ -2524,9 +3325,8 @@
         <w:rPr>
           <w:noProof/>
         </w:rPr>
-        <w:lastRenderedPageBreak/>
         <w:drawing>
-          <wp:inline distT="0" distB="0" distL="0" distR="0" wp14:anchorId="5B75CF84" wp14:editId="51A6F0F7">
+          <wp:inline distT="0" distB="0" distL="0" distR="0" wp14:anchorId="715D9A7E" wp14:editId="2EFCD64D">
             <wp:extent cx="5577840" cy="2914655"/>
             <wp:effectExtent l="0" t="0" r="0" b="0"/>
             <wp:docPr id="5" name="Picture 5"/>
@@ -2590,7 +3390,7 @@
       <w:pPr>
         <w:pStyle w:val="1"/>
       </w:pPr>
-      <w:bookmarkStart w:id="5" w:name="_Toc237383691"/>
+      <w:bookmarkStart w:id="5" w:name="_Toc237443225"/>
       <w:r>
         <w:t>3. The news-sentiment index</w:t>
       </w:r>
@@ -2621,7 +3421,7 @@
         </w:rPr>
         <w:lastRenderedPageBreak/>
         <w:drawing>
-          <wp:inline distT="0" distB="0" distL="0" distR="0" wp14:anchorId="0C7710CB" wp14:editId="4ECC0626">
+          <wp:inline distT="0" distB="0" distL="0" distR="0" wp14:anchorId="34B60B7C" wp14:editId="46E360C6">
             <wp:extent cx="5577840" cy="2847596"/>
             <wp:effectExtent l="0" t="0" r="0" b="0"/>
             <wp:docPr id="6" name="Picture 6"/>
@@ -2678,7 +3478,7 @@
     </w:p>
     <w:p>
       <w:r>
-        <w:t>Every sector's index sits above zero for most of the sample. That is a property of financial headline writing rather than of the market: coverage is written to attract readers and leans positive, so the level of the index carries little information and only its movement does. Utilities runs highest at +0.179 and financials lowest at +0.090, a difference that reflects the vocabulary of each sector's news - dividends and stability against litigation and rates - more than any difference in performance. Energy is the one sector whose index moves visibly with its fundamentals, rising through 2022 as the sector's returns did.</w:t>
+        <w:t>Every sector's index sits above zero for most of the sample. That is a property of headline writing rather than of the market: coverage is written to attract readers and leans positive, so only the index's movement carries information. Utilities runs highest at +0.179 and financials lowest at +0.090, a difference that reflects the vocabulary of each sector's news - dividends and stability against litigation and rates - more than any difference in performance. Energy is the one sector whose index moves visibly with its fundamentals, rising through 2022 as the sector's returns did.</w:t>
       </w:r>
     </w:p>
     <w:p>
@@ -2690,7 +3490,7 @@
           <w:noProof/>
         </w:rPr>
         <w:drawing>
-          <wp:inline distT="0" distB="0" distL="0" distR="0" wp14:anchorId="0414C7CF" wp14:editId="2C42082C">
+          <wp:inline distT="0" distB="0" distL="0" distR="0" wp14:anchorId="1C0465C5" wp14:editId="6FC1083C">
             <wp:extent cx="5577840" cy="2548227"/>
             <wp:effectExtent l="0" t="0" r="0" b="0"/>
             <wp:docPr id="7" name="Picture 7"/>
@@ -2747,7 +3547,11 @@
     </w:p>
     <w:p>
       <w:r>
-        <w:t>The raw gauge sits above neutral on 99% of days, so read as a level it would have called the market greedy throughout the COVID crash. Standardising removes that positive baseline and the episodes appear immediately. The deepest trough is mid-March 2020, the week of the crash itself, and the second is early December 2021, when the Omicron variant was announced. That the two largest negative excursions in a purely textual series fall on the two events a reader would name unprompted is the strongest available evidence that the index measures something real; the search-based index of Da, Engelberg and Gao (2015) behaves the same way.</w:t>
+        <w:t xml:space="preserve">The raw gauge sits above neutral on 99% of days, so read as a level it would have called the market greedy throughout the COVID crash. Standardising removes that positive baseline and the episodes appear immediately. The deepest trough is mid-March 2020, the week of the crash itself, and the second is early December 2021, when the Omicron variant was announced. That the two largest negative excursions in a purely textual series fall on the two events a reader </w:t>
+      </w:r>
+      <w:r>
+        <w:lastRenderedPageBreak/>
+        <w:t>would name unprompted is the strongest available evidence that the index measures something real; the search-based index of Da, Engelberg and Gao (2015) behaves the same way.</w:t>
       </w:r>
     </w:p>
     <w:p>
@@ -3875,14 +4679,14 @@
     </w:tbl>
     <w:p>
       <w:r>
-        <w:t>Between 40% and 58% of headlines score neutral depending on the sector. A neutral score is not a finding of balance; it means the model found no word it recognised. VADER's lexicon was built for social media, and Loughran and McDonald (2011) show that dictionaries assembled outside a financial context misclassify financial language systematically; Section 5.1 measures how much of this band is that gap rather than genuine balance. Headlines are also a weaker signal than the articles beneath them, and work that extracts firm-level information from news generally scores the full story rather than its headline (Tetlock, Saar-Tsechansky and Macskassy 2008). The index should be read as the tone of coverage, and any trading use of it has to survive half its inputs being silent.</w:t>
+        <w:t>Between 40% and 58% of headlines score neutral depending on the sector. A neutral score is not a finding of balance; it means the model found no word it recognised. VADER's lexicon was built for social media, and Loughran and McDonald (2011) show that dictionaries assembled outside a financial context misclassify financial language systematically; Section 5.1 measures how much of this band is that gap rather than genuine balance. Headlines are also weaker than the articles beneath them, and work extracting firm-level information from news generally scores the full story rather than the headline (Tetlock, Saar-Tsechansky and Macskassy 2008). The index reads as the tone of coverage, and any trading use of it must survive half its inputs being silent.</w:t>
       </w:r>
     </w:p>
     <w:p>
       <w:pPr>
         <w:pStyle w:val="1"/>
       </w:pPr>
-      <w:bookmarkStart w:id="6" w:name="_Toc237383692"/>
+      <w:bookmarkStart w:id="6" w:name="_Toc237443226"/>
       <w:r>
         <w:t>4. Fusion: does sentiment improve the funds?</w:t>
       </w:r>
@@ -3890,7 +4694,7 @@
     </w:p>
     <w:p>
       <w:r>
-        <w:t>The baseline fusion is a cross-sectional sector tilt. At each rebalance the lagged sector index is turned into a z-score across the ten sectors, and each equity weight is multiplied by (1 + lambda z) for its sector, then clipped at zero and renormalised so the fund stays long-only and fully invested. The tilt never touches the covariance estimate, so any difference in results comes from the tilt alone. Sentiment applies to equities only, because the cryptocurrencies carry no news.</w:t>
+        <w:t>The baseline fusion is a cross-sectional sector tilt. At each rebalance the lagged sector index becomes a z-score across the ten sectors, and each equity weight is multiplied by (1 + lambda z) for its sector, then clipped at zero and renormalised so the fund stays long-only and fully invested. The tilt never touches the covariance estimate, so any difference comes from the tilt alone. Sentiment applies to equities only, because the cryptocurrencies carry no news.</w:t>
       </w:r>
     </w:p>
     <w:p>
@@ -4735,9 +5539,11 @@
     </w:tbl>
     <w:p>
       <w:r>
-        <w:t xml:space="preserve">The tilt makes both funds worse. Minimum variance falls from 0.479 to 0.457 and maximum Sharpe from 0.573 to 0.509, while turnover rises in both. That combination - lower return, higher trading - is what a signal with no predictive content looks like when it is used to move weights: </w:t>
+        <w:t xml:space="preserve">The tilt makes both funds worse. Minimum variance falls from 0.479 to 0.457 and maximum Sharpe from 0.573 to 0.509, while turnover rises in both. That combination - lower return, higher </w:t>
+      </w:r>
+      <w:r>
         <w:lastRenderedPageBreak/>
-        <w:t>the tilt adds noise to a portfolio that was already as good as its inputs allowed, and charges for the privilege.</w:t>
+        <w:t>trading - is what a signal with no predictive content looks like when it is used to move weights: the tilt adds noise to a portfolio that was already as good as its inputs allowed, and charges for the privilege.</w:t>
       </w:r>
     </w:p>
     <w:p>
@@ -4749,7 +5555,7 @@
           <w:noProof/>
         </w:rPr>
         <w:drawing>
-          <wp:inline distT="0" distB="0" distL="0" distR="0" wp14:anchorId="7C404DC2" wp14:editId="49F3FA25">
+          <wp:inline distT="0" distB="0" distL="0" distR="0" wp14:anchorId="5B65E58C" wp14:editId="6F242085">
             <wp:extent cx="5577840" cy="2696714"/>
             <wp:effectExtent l="0" t="0" r="0" b="0"/>
             <wp:docPr id="8" name="Picture 8"/>
@@ -4813,7 +5619,7 @@
           <w:noProof/>
         </w:rPr>
         <w:drawing>
-          <wp:inline distT="0" distB="0" distL="0" distR="0" wp14:anchorId="2FD04239" wp14:editId="638943F2">
+          <wp:inline distT="0" distB="0" distL="0" distR="0" wp14:anchorId="58008766" wp14:editId="27574247">
             <wp:extent cx="5577840" cy="2696714"/>
             <wp:effectExtent l="0" t="0" r="0" b="0"/>
             <wp:docPr id="9" name="Picture 9"/>
@@ -5415,6 +6221,7 @@
               <w:rPr>
                 <w:sz w:val="16"/>
               </w:rPr>
+              <w:lastRenderedPageBreak/>
               <w:t>Comm</w:t>
             </w:r>
           </w:p>
@@ -5613,7 +6420,6 @@
               <w:rPr>
                 <w:sz w:val="16"/>
               </w:rPr>
-              <w:lastRenderedPageBreak/>
               <w:t>RealEstate</w:t>
             </w:r>
           </w:p>
@@ -7321,7 +8127,7 @@
       <w:pPr>
         <w:pStyle w:val="21"/>
       </w:pPr>
-      <w:bookmarkStart w:id="7" w:name="_Toc237383693"/>
+      <w:bookmarkStart w:id="7" w:name="_Toc237443227"/>
       <w:r>
         <w:t>Is the signal there at a slower frequency?</w:t>
       </w:r>
@@ -7495,6 +8301,7 @@
               <w:rPr>
                 <w:sz w:val="16"/>
               </w:rPr>
+              <w:lastRenderedPageBreak/>
               <w:t>1</w:t>
             </w:r>
           </w:p>
@@ -8070,7 +8877,6 @@
               <w:rPr>
                 <w:sz w:val="16"/>
               </w:rPr>
-              <w:lastRenderedPageBreak/>
               <w:t>21</w:t>
             </w:r>
           </w:p>
@@ -8405,7 +9211,7 @@
     </w:tbl>
     <w:p>
       <w:r>
-        <w:t>The correlation is negative at every horizon and its magnitude grows with it, from -0.0130 at one day to -0.1487 at 63 days, which is the pattern a slow effect would leave. Nothing else supports that reading. The number of independent observations collapses from 9,821 to 140 as the horizon lengthens, so the confidence around each estimate widens accordingly: 1 of 8 tests clears 5% uncorrected and none survives the correction for having run eight. One nominal p-value of 0.029 out of eight tests is what chance delivers. Harvey, Liu and Zhu (2016) argue that conventional thresholds are far too lenient once the number of specifications tried is counted, and the Bonferroni threshold applied here is the most conservative version of that argument.</w:t>
+        <w:t>The correlation is negative at every horizon and its magnitude grows with it, from -0.0130 at one day to -0.1487 at 63 days, the pattern a slow effect would leave. Nothing else supports it. Independent observations collapse from 9,821 to 140 as the horizon lengthens, so the confidence around each estimate widens accordingly: 1 of 8 tests clears 5% uncorrected and none survives the correction for having run eight. One nominal p-value of 0.029 out of eight tests is what chance delivers. Harvey, Liu and Zhu (2016) argue that conventional thresholds are far too lenient once the number of specifications tried is counted, and the Bonferroni threshold applied here is the most conservative version of that argument.</w:t>
       </w:r>
     </w:p>
     <w:p>
@@ -8417,7 +9223,7 @@
       <w:pPr>
         <w:pStyle w:val="1"/>
       </w:pPr>
-      <w:bookmarkStart w:id="8" w:name="_Toc237383694"/>
+      <w:bookmarkStart w:id="8" w:name="_Toc237443228"/>
       <w:r>
         <w:t>5. Extensions</w:t>
       </w:r>
@@ -8427,7 +9233,7 @@
       <w:pPr>
         <w:pStyle w:val="21"/>
       </w:pPr>
-      <w:bookmarkStart w:id="9" w:name="_Toc237383695"/>
+      <w:bookmarkStart w:id="9" w:name="_Toc237443229"/>
       <w:r>
         <w:t>5.1 A finance lexicon for VADER</w:t>
       </w:r>
@@ -8447,7 +9253,7 @@
           <w:noProof/>
         </w:rPr>
         <w:drawing>
-          <wp:inline distT="0" distB="0" distL="0" distR="0" wp14:anchorId="24008072" wp14:editId="424C4D9C">
+          <wp:inline distT="0" distB="0" distL="0" distR="0" wp14:anchorId="599658AF" wp14:editId="77D528EF">
             <wp:extent cx="5577840" cy="2248859"/>
             <wp:effectExtent l="0" t="0" r="0" b="0"/>
             <wp:docPr id="10" name="Picture 10"/>
@@ -8488,6 +9294,7 @@
         <w:pStyle w:val="af7"/>
       </w:pPr>
       <w:r>
+        <w:lastRenderedPageBreak/>
         <w:t xml:space="preserve">Figure </w:t>
       </w:r>
       <w:fldSimple w:instr=" SEQ Figure \* ARABIC ">
@@ -8509,7 +9316,6 @@
     </w:p>
     <w:p>
       <w:r>
-        <w:lastRenderedPageBreak/>
         <w:t>The headlines being missed are the most informative ones. 'AbbVie Q4 EPS $2.21 Beats $2.19 Estimate' scores exactly zero under plain VADER, because neither 'beats' nor 'estimate' is in a lexicon built for social media. Adding 46 market terms cuts the neutral share from 49.6% to 43.4% and rescores 16.1% of headlines, and the dispersion of scores rises from 0.288 to 0.317.</w:t>
       </w:r>
     </w:p>
@@ -8522,7 +9328,7 @@
       <w:pPr>
         <w:pStyle w:val="21"/>
       </w:pPr>
-      <w:bookmarkStart w:id="10" w:name="_Toc237383696"/>
+      <w:bookmarkStart w:id="10" w:name="_Toc237443230"/>
       <w:r>
         <w:t>5.2 A tilt that learns its own direction</w:t>
       </w:r>
@@ -9489,7 +10295,7 @@
         </w:rPr>
         <w:lastRenderedPageBreak/>
         <w:drawing>
-          <wp:inline distT="0" distB="0" distL="0" distR="0" wp14:anchorId="044A3C5B" wp14:editId="2EFA2B01">
+          <wp:inline distT="0" distB="0" distL="0" distR="0" wp14:anchorId="4790403A" wp14:editId="03FCBE07">
             <wp:extent cx="5577840" cy="2996083"/>
             <wp:effectExtent l="0" t="0" r="0" b="0"/>
             <wp:docPr id="11" name="Picture 11"/>
@@ -10171,16 +10977,18 @@
     </w:p>
     <w:p>
       <w:r>
-        <w:t xml:space="preserve">The two extensions do not stack. The finance lexicon helps the fixed tilt and hurts the adaptive one. The diagnostics explain why: the extended lexicon weakens the very correlation the adaptive tilt trades against, moving the mean from -0.0205 to -0.0156 and the count of negative sectors from eight to seven. Part of what the adaptive tilt was exploiting was VADER's blind </w:t>
+        <w:t xml:space="preserve">The two extensions do not stack. The finance lexicon helps the fixed tilt and hurts the adaptive one. The diagnostics explain why: the extended lexicon weakens the very correlation the adaptive tilt trades against, moving the mean from -0.0205 to -0.0156 and the count of negative </w:t>
+      </w:r>
+      <w:r>
         <w:lastRenderedPageBreak/>
-        <w:t>spots rather than a property of the news, which is a reason to treat its advantage cautiously even before the confidence intervals are considered.</w:t>
+        <w:t>sectors from eight to seven. Part of what the adaptive tilt was exploiting was VADER's blind spots rather than a property of the news, which is a reason to treat its advantage cautiously even before the confidence intervals are considered.</w:t>
       </w:r>
     </w:p>
     <w:p>
       <w:pPr>
         <w:pStyle w:val="21"/>
       </w:pPr>
-      <w:bookmarkStart w:id="11" w:name="_Toc237383697"/>
+      <w:bookmarkStart w:id="11" w:name="_Toc237443231"/>
       <w:r>
         <w:t>5.3 Was the winner found or fitted?</w:t>
       </w:r>
@@ -10200,7 +11008,7 @@
           <w:noProof/>
         </w:rPr>
         <w:drawing>
-          <wp:inline distT="0" distB="0" distL="0" distR="0" wp14:anchorId="4E5084D4" wp14:editId="02048D17">
+          <wp:inline distT="0" distB="0" distL="0" distR="0" wp14:anchorId="1212B490" wp14:editId="72A5BD9E">
             <wp:extent cx="5577840" cy="2242831"/>
             <wp:effectExtent l="0" t="0" r="0" b="0"/>
             <wp:docPr id="12" name="Picture 12"/>
@@ -11208,6 +12016,7 @@
     </w:p>
     <w:p>
       <w:r>
+        <w:lastRenderedPageBreak/>
         <w:t>Three caveats belong with that. The holdout margin over the base fund is a few hundredths of a Sharpe point, consistent with the bootstrap finding that the difference is not established. Every Minimum-Variance variant decays by roughly 0.58 of a Sharpe point into 2023, the base fund included, so the decay is the market regime and not a property of the tilt. And one split of two funds is evidence rather than proof. Bailey and Lopez de Prado (2014) show that the expected maximum Sharpe ratio across a set of trialled strategies rises with the number trialled even when none of them has any skill, which is why the number of variants searched is reported here alongside the one that won.</w:t>
       </w:r>
     </w:p>
@@ -11215,7 +12024,7 @@
       <w:pPr>
         <w:pStyle w:val="21"/>
       </w:pPr>
-      <w:bookmarkStart w:id="12" w:name="_Toc237383698"/>
+      <w:bookmarkStart w:id="12" w:name="_Toc237443232"/>
       <w:r>
         <w:t>5.4 Does correcting the covariance fix the result?</w:t>
       </w:r>
@@ -12561,11 +13370,12 @@
       <w:pPr>
         <w:pStyle w:val="1"/>
       </w:pPr>
-      <w:bookmarkStart w:id="14" w:name="_Toc237383700"/>
+      <w:bookmarkStart w:id="13" w:name="_Toc237443233"/>
       <w:r>
+        <w:lastRenderedPageBreak/>
         <w:t>6. The app and the investor journey</w:t>
       </w:r>
-      <w:bookmarkEnd w:id="14"/>
+      <w:bookmarkEnd w:id="13"/>
     </w:p>
     <w:p>
       <w:r>
@@ -12579,7 +13389,7 @@
     </w:p>
     <w:p>
       <w:r>
-        <w:t>The target user is a working professional or early-career investor with savings, no time, and no intention of reading a covariance matrix. The journey is built around the decision that user actually makes, which is not which stock to buy but how much risk to carry. They compare twelve funds and see that the crypto funds returned most and fell furthest; they open a fact sheet for the four numbers a fund provider publishes, the growth line and the holdings; and they set an allocation with sliders and watch the blend update, where diversification stops being a word and becomes a visibly shallower drawdown. The analytics sit apart from the funds on purpose: the report shows that they do not predict returns, so presenting them beside an allocation control would imply a link the evidence does not support.</w:t>
+        <w:t>The target user is a working professional or early-career investor with savings, no time, and no intention of reading a covariance matrix. The journey is built around the decision they actually make: not which stock to buy but how much risk to carry. They compare twelve funds, open a fact sheet for the four numbers a fund provider publishes, and set an allocation with sliders, where diversification stops being a word and becomes a visibly shallower drawdown. The analytics sit apart from the funds on purpose: they do not predict returns, and placing them beside an allocation control would imply a link the evidence does not support.</w:t>
       </w:r>
     </w:p>
     <w:p>
@@ -12596,53 +13406,51 @@
       <w:pPr>
         <w:pStyle w:val="1"/>
       </w:pPr>
-      <w:bookmarkStart w:id="15" w:name="_Toc237383701"/>
+      <w:bookmarkStart w:id="14" w:name="_Toc237443234"/>
       <w:r>
         <w:t>7. Critical reflection and recommendations</w:t>
       </w:r>
-      <w:bookmarkEnd w:id="15"/>
+      <w:bookmarkEnd w:id="14"/>
     </w:p>
     <w:p>
       <w:r>
-        <w:t>What worked was the machinery for being wrong safely. The truncation test caught nothing because there was nothing to catch, but it is the reason the out-of-sample claims can be made at all, and the same test is what made the adaptive tilt defensible rather than suspicious. The identity checks on the backtest found a real error: weights had been applied as fixed targets on every day between rebalances, which is arithmetically a fund that trades back to target daily and which had inflated the best fund's Sharpe ratio from 0.98 to 1.03.</w:t>
+        <w:t>What worked was a working order I set early and kept: the assistant explains an approach in full, I read it until I can correct it, and only then is code written. That is why the solver-scaling and volatility-drag problems are recorded as decisions rather than as bugs found later. The checks that came out of it earned their place - identity tests on the backtest exposed a real error, weights applied as fixed targets between rebalances, which is arithmetically a fund trading back to target daily and had inflated the best fund's Sharpe ratio from 0.98 to 1.03.</w:t>
       </w:r>
     </w:p>
     <w:p>
       <w:r>
-        <w:t xml:space="preserve">What did not work was the sentiment fusion, and the interesting part is why. The index itself is sound: it moves with same-day returns, its extremes line up with the events a reader would name, and extending the lexicon makes it measurably more faithful. It simply has no predictive </w:t>
-        <w:lastRenderedPageBreak/>
-        <w:t>content at the horizon a monthly-rebalanced fund can trade, and no amount of better text processing changes that. The adaptive tilt recovers the loss, but its advantage is not statistically established and part of it traces to VADER's blind spots rather than to the news.</w:t>
+        <w:t>What did not work was the sentiment fusion, and my first explanation of it was wrong in an instructive way. I concluded that headline sentiment is contrarian, and every number I held supported that: eight negative sectors, a losing tilt, a profitable reversal. What I had not done was compare it against anything. A negative correlation fits a reversal, news already in the price, and noise equally well, and the one statistic I was reading cannot separate them. An explanation that fits all the evidence is not thereby correct.</w:t>
       </w:r>
     </w:p>
     <w:p>
       <w:r>
-        <w:t>The broader lesson is about where the risk in this kind of project sits. None of the errors found here were errors of finance; they were errors of accounting and of inference - a rebalancing assumption, a colour palette too small for its data, a ranking chosen on the same sample it was evaluated on. The modelling was the easy part.</w:t>
+        <w:t>The broader lesson is where the risk in this kind of project sits. None of the errors were errors of finance. A number was recalled instead of measured; a solver would have returned its starting point without complaining; a docstring described wrong behaviour accurately; a test suite only ever ran the defaults. Each had been checked, and the check is what gave the false confidence. The modelling was the easy part.</w:t>
       </w:r>
     </w:p>
     <w:p>
       <w:r>
-        <w:t>First, ship the funds without the sentiment tilt and keep the sentiment index as a standalone analytic. The evidence in section 4 does not support a link between the index and future returns, and a product that tilts on it would be charging a fee for turnover it cannot justify. The index earns its place as context a user reads, not as an input to their money.</w:t>
+        <w:t>First, offer the adaptive sentiment tilt as an optional fund rather than as the default, and size the position to the strength of the evidence. The naive tilt should not ship at all: it makes both equity funds worse and charges turnover for it. The adaptive version is a different case - it improves both funds and ranks first on a holdout it was not chosen on, yet its bootstrap interval spans zero. Treating 'not established' as 'worthless' is as wrong as treating it as proven. I would hold it with part of my own money and not all of it, and the product should say exactly that: available, labelled with its evidence, never the default.</w:t>
       </w:r>
     </w:p>
     <w:p>
       <w:r>
-        <w:t>Second, offer risk parity rather than maximum Sharpe as the default combined fund. Maximum Sharpe wins on the headline number, but it holds 8 of 60 assets, rewrites a third of its portfolio a month, and fell 26% at its worst. Risk parity gives up 0.09 of a Sharpe point for a drawdown six percentage points shallower and weights that barely move. For a user who cannot monitor the fund, the second is the more honest default, and the first should be available to those who choose it.</w:t>
+        <w:t>Second, do not pick a default fund at all. Make the user choose between Combined Maximum-Sharpe and Combined Risk Parity after the drawdown figure has been put in front of them. The temptation is to default the cautious user into risk parity, and I reject it: 0.888 against 0.981 is a real cost, and a platform making that trade quietly has decided how much risk someone can bear without asking. Show both - 24.0% a year with a 25.8% fall, or 14.0% with 19.5% - and make the choice deliberate. I would take the first for myself and would not make that decision for anyone else.</w:t>
       </w:r>
     </w:p>
     <w:p>
       <w:r>
-        <w:t>Third, re-estimate the tilt's value on a longer sample before any version of it reaches a live product. The bootstrap intervals show three years of daily data cannot separate a 0.09 Sharpe improvement from zero. The specific test worth running is the same walk-forward design on a decade of data, or on a second market, with the number of specifications searched declared in advance.</w:t>
+        <w:t>Third, hold a firm's evidence to a higher standard than my own. I would put part of my money behind the adaptive tilt on what this project shows; I would not put anyone else's there. The difference is not courage: a manager charging a fee claims to know something, and an interval spanning zero is not knowledge. Before this reaches a fund taking deposits, the same walk-forward design should run on a decade of data or a second market, with the number of specifications declared in advance rather than counted afterwards.</w:t>
       </w:r>
     </w:p>
     <w:p>
       <w:pPr>
         <w:pStyle w:val="1"/>
       </w:pPr>
-      <w:bookmarkStart w:id="16" w:name="_Toc237383702"/>
+      <w:bookmarkStart w:id="15" w:name="_Toc237443235"/>
       <w:r>
         <w:t>References</w:t>
       </w:r>
-      <w:bookmarkEnd w:id="16"/>
+      <w:bookmarkEnd w:id="15"/>
     </w:p>
     <w:p>
       <w:pPr>
@@ -12656,10 +13464,10 @@
         <w:rPr>
           <w:i/>
         </w:rPr>
-        <w:t xml:space="preserve">The Journal of Portfolio Management</w:t>
+        <w:t>The Journal of Portfolio Management</w:t>
       </w:r>
       <w:r>
-        <w:t xml:space="preserve">, vol. 40, no. 5, pp. 94-107.</w:t>
+        <w:t>, vol. 40, no. 5, pp. 94-107.</w:t>
       </w:r>
     </w:p>
     <w:p>
@@ -12674,10 +13482,10 @@
         <w:rPr>
           <w:i/>
         </w:rPr>
-        <w:t xml:space="preserve">The Review of Financial Studies</w:t>
+        <w:t>The Review of Financial Studies</w:t>
       </w:r>
       <w:r>
-        <w:t xml:space="preserve">, vol. 21, no. 4, pp. 1577-1605.</w:t>
+        <w:t>, vol. 21, no. 4, pp. 1577-1605.</w:t>
       </w:r>
     </w:p>
     <w:p>
@@ -12692,10 +13500,10 @@
         <w:rPr>
           <w:i/>
         </w:rPr>
-        <w:t xml:space="preserve">The Journal of Portfolio Management</w:t>
+        <w:t>The Journal of Portfolio Management</w:t>
       </w:r>
       <w:r>
-        <w:t xml:space="preserve">, vol. 19, no. 2, pp. 6-11.</w:t>
+        <w:t>, vol. 19, no. 2, pp. 6-11.</w:t>
       </w:r>
     </w:p>
     <w:p>
@@ -12710,10 +13518,10 @@
         <w:rPr>
           <w:i/>
         </w:rPr>
-        <w:t xml:space="preserve">The Review of Financial Studies</w:t>
+        <w:t>The Review of Financial Studies</w:t>
       </w:r>
       <w:r>
-        <w:t xml:space="preserve">, vol. 28, no. 1, pp. 1-32.</w:t>
+        <w:t>, vol. 28, no. 1, pp. 1-32.</w:t>
       </w:r>
     </w:p>
     <w:p>
@@ -12728,10 +13536,10 @@
         <w:rPr>
           <w:i/>
         </w:rPr>
-        <w:t xml:space="preserve">The Review of Financial Studies</w:t>
+        <w:t>The Review of Financial Studies</w:t>
       </w:r>
       <w:r>
-        <w:t xml:space="preserve">, vol. 22, no. 5, pp. 1915-1953.</w:t>
+        <w:t>, vol. 22, no. 5, pp. 1915-1953.</w:t>
       </w:r>
     </w:p>
     <w:p>
@@ -12746,10 +13554,10 @@
         <w:rPr>
           <w:i/>
         </w:rPr>
-        <w:t xml:space="preserve">The Journal of Finance</w:t>
+        <w:t>The Journal of Finance</w:t>
       </w:r>
       <w:r>
-        <w:t xml:space="preserve">, vol. 25, no. 2, pp. 383-417.</w:t>
+        <w:t>, vol. 25, no. 2, pp. 383-417.</w:t>
       </w:r>
     </w:p>
     <w:p>
@@ -12764,10 +13572,10 @@
         <w:rPr>
           <w:i/>
         </w:rPr>
-        <w:t xml:space="preserve">The Review of Financial Studies</w:t>
+        <w:t>The Review of Financial Studies</w:t>
       </w:r>
       <w:r>
-        <w:t xml:space="preserve">, vol. 29, no. 1, pp. 5-68.</w:t>
+        <w:t>, vol. 29, no. 1, pp. 5-68.</w:t>
       </w:r>
     </w:p>
     <w:p>
@@ -12782,10 +13590,10 @@
         <w:rPr>
           <w:i/>
         </w:rPr>
-        <w:t xml:space="preserve">Proceedings of the Eighth International AAAI Conference on Weblogs and Social Media</w:t>
+        <w:t>Proceedings of the Eighth International AAAI Conference on Weblogs and Social Media</w:t>
       </w:r>
       <w:r>
-        <w:t xml:space="preserve">, Ann Arbor, Michigan, pp. 216-225.</w:t>
+        <w:t>, Ann Arbor, Michigan, pp. 216-225.</w:t>
       </w:r>
     </w:p>
     <w:p>
@@ -12800,10 +13608,10 @@
         <w:rPr>
           <w:i/>
         </w:rPr>
-        <w:t xml:space="preserve">The Journal of Finance</w:t>
+        <w:t>The Journal of Finance</w:t>
       </w:r>
       <w:r>
-        <w:t xml:space="preserve">, vol. 58, no. 4, pp. 1651-1683.</w:t>
+        <w:t>, vol. 58, no. 4, pp. 1651-1683.</w:t>
       </w:r>
     </w:p>
     <w:p>
@@ -12818,10 +13626,10 @@
         <w:rPr>
           <w:i/>
         </w:rPr>
-        <w:t xml:space="preserve">The Journal of Portfolio Management</w:t>
+        <w:t>The Journal of Portfolio Management</w:t>
       </w:r>
       <w:r>
-        <w:t xml:space="preserve">, vol. 30, no. 4, pp. 110-119.</w:t>
+        <w:t>, vol. 30, no. 4, pp. 110-119.</w:t>
       </w:r>
     </w:p>
     <w:p>
@@ -12830,16 +13638,17 @@
         <w:ind w:left="567" w:hanging="567"/>
       </w:pPr>
       <w:r>
+        <w:lastRenderedPageBreak/>
         <w:t xml:space="preserve">Ledoit, O &amp; Wolf, M 2008, 'Robust performance hypothesis testing with the Sharpe ratio', </w:t>
       </w:r>
       <w:r>
         <w:rPr>
           <w:i/>
         </w:rPr>
-        <w:t xml:space="preserve">Journal of Empirical Finance</w:t>
+        <w:t>Journal of Empirical Finance</w:t>
       </w:r>
       <w:r>
-        <w:t xml:space="preserve">, vol. 15, no. 5, pp. 850-859.</w:t>
+        <w:t>, vol. 15, no. 5, pp. 850-859.</w:t>
       </w:r>
     </w:p>
     <w:p>
@@ -12854,10 +13663,10 @@
         <w:rPr>
           <w:i/>
         </w:rPr>
-        <w:t xml:space="preserve">The Journal of Finance</w:t>
+        <w:t>The Journal of Finance</w:t>
       </w:r>
       <w:r>
-        <w:t xml:space="preserve">, vol. 66, no. 1, pp. 35-65.</w:t>
+        <w:t>, vol. 66, no. 1, pp. 35-65.</w:t>
       </w:r>
     </w:p>
     <w:p>
@@ -12872,10 +13681,10 @@
         <w:rPr>
           <w:i/>
         </w:rPr>
-        <w:t xml:space="preserve">The Journal of Portfolio Management</w:t>
+        <w:t>The Journal of Portfolio Management</w:t>
       </w:r>
       <w:r>
-        <w:t xml:space="preserve">, vol. 36, no. 4, pp. 60-70.</w:t>
+        <w:t>, vol. 36, no. 4, pp. 60-70.</w:t>
       </w:r>
     </w:p>
     <w:p>
@@ -12890,10 +13699,10 @@
         <w:rPr>
           <w:i/>
         </w:rPr>
-        <w:t xml:space="preserve">The Journal of Finance</w:t>
+        <w:t>The Journal of Finance</w:t>
       </w:r>
       <w:r>
-        <w:t xml:space="preserve">, vol. 7, no. 1, pp. 77-91.</w:t>
+        <w:t>, vol. 7, no. 1, pp. 77-91.</w:t>
       </w:r>
     </w:p>
     <w:p>
@@ -12908,10 +13717,10 @@
         <w:rPr>
           <w:i/>
         </w:rPr>
-        <w:t xml:space="preserve">Financial Analysts Journal</w:t>
+        <w:t>Financial Analysts Journal</w:t>
       </w:r>
       <w:r>
-        <w:t xml:space="preserve">, vol. 45, no. 1, pp. 31-42.</w:t>
+        <w:t>, vol. 45, no. 1, pp. 31-42.</w:t>
       </w:r>
     </w:p>
     <w:p>
@@ -12926,10 +13735,10 @@
         <w:rPr>
           <w:i/>
         </w:rPr>
-        <w:t xml:space="preserve">Color universal design (CUD): how to make figures and presentations that are friendly to colorblind people</w:t>
+        <w:t>Color universal design (CUD): how to make figures and presentations that are friendly to colorblind people</w:t>
       </w:r>
       <w:r>
-        <w:t xml:space="preserve">, viewed 11 August 2026, &lt;https://jfly.uni-koeln.de/color/&gt;.</w:t>
+        <w:t>, viewed 11 August 2026, &lt;https://jfly.uni-koeln.de/color/&gt;.</w:t>
       </w:r>
     </w:p>
     <w:p>
@@ -12944,10 +13753,10 @@
         <w:rPr>
           <w:i/>
         </w:rPr>
-        <w:t xml:space="preserve">Journal of the American Statistical Association</w:t>
+        <w:t>Journal of the American Statistical Association</w:t>
       </w:r>
       <w:r>
-        <w:t xml:space="preserve">, vol. 89, no. 428, pp. 1303-1313.</w:t>
+        <w:t>, vol. 89, no. 428, pp. 1303-1313.</w:t>
       </w:r>
     </w:p>
     <w:p>
@@ -12962,10 +13771,10 @@
         <w:rPr>
           <w:i/>
         </w:rPr>
-        <w:t xml:space="preserve">The Journal of Business</w:t>
+        <w:t>The Journal of Business</w:t>
       </w:r>
       <w:r>
-        <w:t xml:space="preserve">, vol. 39, no. 1, pp. 119-138.</w:t>
+        <w:t>, vol. 39, no. 1, pp. 119-138.</w:t>
       </w:r>
     </w:p>
     <w:p>
@@ -12980,10 +13789,10 @@
         <w:rPr>
           <w:i/>
         </w:rPr>
-        <w:t xml:space="preserve">The Journal of Portfolio Management</w:t>
+        <w:t>The Journal of Portfolio Management</w:t>
       </w:r>
       <w:r>
-        <w:t xml:space="preserve">, vol. 21, no. 1, pp. 49-58.</w:t>
+        <w:t>, vol. 21, no. 1, pp. 49-58.</w:t>
       </w:r>
     </w:p>
     <w:p>
@@ -12998,10 +13807,10 @@
         <w:rPr>
           <w:i/>
         </w:rPr>
-        <w:t xml:space="preserve">The Journal of Finance</w:t>
+        <w:t>The Journal of Finance</w:t>
       </w:r>
       <w:r>
-        <w:t xml:space="preserve">, vol. 62, no. 3, pp. 1139-1168.</w:t>
+        <w:t>, vol. 62, no. 3, pp. 1139-1168.</w:t>
       </w:r>
     </w:p>
     <w:p>
@@ -13016,10 +13825,10 @@
         <w:rPr>
           <w:i/>
         </w:rPr>
-        <w:t xml:space="preserve">The Journal of Finance</w:t>
+        <w:t>The Journal of Finance</w:t>
       </w:r>
       <w:r>
-        <w:t xml:space="preserve">, vol. 63, no. 3, pp. 1437-1467.</w:t>
+        <w:t>, vol. 63, no. 3, pp. 1437-1467.</w:t>
       </w:r>
     </w:p>
     <w:p>
@@ -13034,31 +13843,31 @@
         <w:rPr>
           <w:i/>
         </w:rPr>
-        <w:t xml:space="preserve">Econometrica</w:t>
+        <w:t>Econometrica</w:t>
       </w:r>
       <w:r>
-        <w:t xml:space="preserve">, vol. 68, no. 5, pp. 1097-1126.</w:t>
+        <w:t>, vol. 68, no. 5, pp. 1097-1126.</w:t>
       </w:r>
     </w:p>
     <w:p>
       <w:pPr>
         <w:pStyle w:val="1"/>
       </w:pPr>
-      <w:bookmarkStart w:id="17" w:name="_Toc237383703"/>
+      <w:bookmarkStart w:id="16" w:name="_Toc237443236"/>
       <w:r>
         <w:t>Appendix</w:t>
       </w:r>
-      <w:bookmarkEnd w:id="17"/>
+      <w:bookmarkEnd w:id="16"/>
     </w:p>
     <w:p>
       <w:pPr>
         <w:pStyle w:val="21"/>
       </w:pPr>
-      <w:bookmarkStart w:id="18" w:name="_Toc237383704"/>
+      <w:bookmarkStart w:id="17" w:name="_Toc237443237"/>
       <w:r>
         <w:t>Appendix A - The four objectives</w:t>
       </w:r>
-      <w:bookmarkEnd w:id="18"/>
+      <w:bookmarkEnd w:id="17"/>
     </w:p>
     <w:p>
       <w:r>
@@ -13069,497 +13878,680 @@
       <w:r>
         <w:t>(1)  Equal weight:</w:t>
       </w:r>
-      <m:oMathPara>
-        <m:oMath>
-          <m:sSub>
-            <m:e>
-              <m:r>
-                <m:t xml:space="preserve">w</m:t>
-              </m:r>
-            </m:e>
-            <m:sub>
-              <m:r>
-                <m:t xml:space="preserve">i</m:t>
-              </m:r>
-            </m:sub>
-          </m:sSub>
-          <m:r>
-            <m:rPr>
-              <m:nor/>
-            </m:rPr>
-            <m:t xml:space="preserve"> = </m:t>
-          </m:r>
-          <m:f>
-            <m:num>
-              <m:r>
-                <m:t xml:space="preserve">1</m:t>
-              </m:r>
-            </m:num>
-            <m:den>
-              <m:r>
-                <m:t xml:space="preserve">N</m:t>
-              </m:r>
-            </m:den>
-          </m:f>
-          <m:r>
-            <m:rPr>
-              <m:nor/>
-            </m:rPr>
-            <m:t xml:space="preserve">   for every asset </m:t>
-          </m:r>
-          <m:r>
-            <m:t xml:space="preserve">i</m:t>
-          </m:r>
-        </m:oMath>
-      </m:oMathPara>
+      <m:oMath>
+        <m:sSub>
+          <m:sSubPr>
+            <m:ctrlPr>
+              <w:rPr>
+                <w:rFonts w:ascii="Cambria Math" w:hAnsi="Cambria Math"/>
+              </w:rPr>
+            </m:ctrlPr>
+          </m:sSubPr>
+          <m:e>
+            <m:r>
+              <w:rPr>
+                <w:rFonts w:ascii="Cambria Math" w:hAnsi="Cambria Math"/>
+              </w:rPr>
+              <m:t>w</m:t>
+            </m:r>
+          </m:e>
+          <m:sub>
+            <m:r>
+              <w:rPr>
+                <w:rFonts w:ascii="Cambria Math" w:hAnsi="Cambria Math"/>
+              </w:rPr>
+              <m:t>i</m:t>
+            </m:r>
+          </m:sub>
+        </m:sSub>
+        <m:r>
+          <m:rPr>
+            <m:nor/>
+          </m:rPr>
+          <m:t xml:space="preserve"> = </m:t>
+        </m:r>
+        <m:f>
+          <m:fPr>
+            <m:ctrlPr>
+              <w:rPr>
+                <w:rFonts w:ascii="Cambria Math" w:hAnsi="Cambria Math"/>
+              </w:rPr>
+            </m:ctrlPr>
+          </m:fPr>
+          <m:num>
+            <m:r>
+              <w:rPr>
+                <w:rFonts w:ascii="Cambria Math" w:hAnsi="Cambria Math"/>
+              </w:rPr>
+              <m:t>1</m:t>
+            </m:r>
+          </m:num>
+          <m:den>
+            <m:r>
+              <w:rPr>
+                <w:rFonts w:ascii="Cambria Math" w:hAnsi="Cambria Math"/>
+              </w:rPr>
+              <m:t>N</m:t>
+            </m:r>
+          </m:den>
+        </m:f>
+        <m:r>
+          <m:rPr>
+            <m:nor/>
+          </m:rPr>
+          <m:t xml:space="preserve">   for every asset </m:t>
+        </m:r>
+        <m:r>
+          <w:rPr>
+            <w:rFonts w:ascii="Cambria Math" w:hAnsi="Cambria Math"/>
+          </w:rPr>
+          <m:t>i</m:t>
+        </m:r>
+      </m:oMath>
     </w:p>
     <w:p>
       <w:r>
         <w:t>(2)  Minimum variance:</w:t>
       </w:r>
-      <m:oMathPara>
-        <m:oMath>
-          <m:sSub>
-            <m:e>
-              <m:r>
-                <m:rPr>
-                  <m:nor/>
-                </m:rPr>
-                <m:t xml:space="preserve">min</m:t>
-              </m:r>
-            </m:e>
-            <m:sub>
-              <m:r>
-                <m:rPr>
-                  <m:sty m:val="b"/>
-                </m:rPr>
-                <m:t xml:space="preserve">w</m:t>
-              </m:r>
-            </m:sub>
-          </m:sSub>
-          <m:r>
-            <m:rPr>
-              <m:nor/>
-            </m:rPr>
-            <m:t xml:space="preserve"> </m:t>
-          </m:r>
-          <m:sSup>
-            <m:e>
-              <m:r>
-                <m:rPr>
-                  <m:sty m:val="b"/>
-                </m:rPr>
-                <m:t xml:space="preserve">w</m:t>
-              </m:r>
-            </m:e>
-            <m:sup>
-              <m:r>
-                <m:rPr>
-                  <m:nor/>
-                </m:rPr>
-                <m:t xml:space="preserve">T</m:t>
-              </m:r>
-            </m:sup>
-          </m:sSup>
-          <m:r>
-            <m:rPr>
-              <m:sty m:val="b"/>
-            </m:rPr>
-            <m:t xml:space="preserve">Σ</m:t>
-          </m:r>
-          <m:r>
-            <m:rPr>
-              <m:sty m:val="b"/>
-            </m:rPr>
-            <m:t xml:space="preserve">w</m:t>
-          </m:r>
-          <m:r>
-            <m:rPr>
-              <m:nor/>
-            </m:rPr>
-            <m:t xml:space="preserve">   subject to   </m:t>
-          </m:r>
-          <m:sSup>
-            <m:e>
-              <m:r>
-                <m:rPr>
-                  <m:sty m:val="b"/>
-                </m:rPr>
-                <m:t xml:space="preserve">1</m:t>
-              </m:r>
-            </m:e>
-            <m:sup>
-              <m:r>
-                <m:rPr>
-                  <m:nor/>
-                </m:rPr>
-                <m:t xml:space="preserve">T</m:t>
-              </m:r>
-            </m:sup>
-          </m:sSup>
-          <m:r>
-            <m:rPr>
-              <m:sty m:val="b"/>
-            </m:rPr>
-            <m:t xml:space="preserve">w</m:t>
-          </m:r>
-          <m:r>
-            <m:rPr>
-              <m:nor/>
-            </m:rPr>
-            <m:t xml:space="preserve"> = 1</m:t>
-          </m:r>
-          <m:r>
-            <m:rPr>
-              <m:nor/>
-            </m:rPr>
-            <m:t xml:space="preserve">, </m:t>
-          </m:r>
-          <m:r>
-            <m:rPr>
-              <m:sty m:val="b"/>
-            </m:rPr>
-            <m:t xml:space="preserve">w</m:t>
-          </m:r>
-          <m:r>
-            <m:rPr>
-              <m:nor/>
-            </m:rPr>
-            <m:t xml:space="preserve"> ≥ </m:t>
-          </m:r>
-          <m:r>
-            <m:t xml:space="preserve">0</m:t>
-          </m:r>
-        </m:oMath>
-      </m:oMathPara>
+      <m:oMath>
+        <m:sSub>
+          <m:sSubPr>
+            <m:ctrlPr>
+              <w:rPr>
+                <w:rFonts w:ascii="Cambria Math" w:hAnsi="Cambria Math"/>
+              </w:rPr>
+            </m:ctrlPr>
+          </m:sSubPr>
+          <m:e>
+            <m:r>
+              <m:rPr>
+                <m:nor/>
+              </m:rPr>
+              <m:t>min</m:t>
+            </m:r>
+          </m:e>
+          <m:sub>
+            <m:r>
+              <m:rPr>
+                <m:sty m:val="b"/>
+              </m:rPr>
+              <w:rPr>
+                <w:rFonts w:ascii="Cambria Math" w:hAnsi="Cambria Math"/>
+              </w:rPr>
+              <m:t>w</m:t>
+            </m:r>
+          </m:sub>
+        </m:sSub>
+        <m:r>
+          <m:rPr>
+            <m:nor/>
+          </m:rPr>
+          <m:t xml:space="preserve"> </m:t>
+        </m:r>
+        <m:sSup>
+          <m:sSupPr>
+            <m:ctrlPr>
+              <w:rPr>
+                <w:rFonts w:ascii="Cambria Math" w:hAnsi="Cambria Math"/>
+              </w:rPr>
+            </m:ctrlPr>
+          </m:sSupPr>
+          <m:e>
+            <m:r>
+              <m:rPr>
+                <m:sty m:val="b"/>
+              </m:rPr>
+              <w:rPr>
+                <w:rFonts w:ascii="Cambria Math" w:hAnsi="Cambria Math"/>
+              </w:rPr>
+              <m:t>w</m:t>
+            </m:r>
+          </m:e>
+          <m:sup>
+            <m:r>
+              <m:rPr>
+                <m:nor/>
+              </m:rPr>
+              <m:t>T</m:t>
+            </m:r>
+          </m:sup>
+        </m:sSup>
+        <m:r>
+          <m:rPr>
+            <m:sty m:val="b"/>
+          </m:rPr>
+          <w:rPr>
+            <w:rFonts w:ascii="Cambria Math" w:hAnsi="Cambria Math"/>
+          </w:rPr>
+          <m:t>Σw</m:t>
+        </m:r>
+        <m:r>
+          <m:rPr>
+            <m:nor/>
+          </m:rPr>
+          <m:t xml:space="preserve">   subject to   </m:t>
+        </m:r>
+        <m:sSup>
+          <m:sSupPr>
+            <m:ctrlPr>
+              <w:rPr>
+                <w:rFonts w:ascii="Cambria Math" w:hAnsi="Cambria Math"/>
+              </w:rPr>
+            </m:ctrlPr>
+          </m:sSupPr>
+          <m:e>
+            <m:r>
+              <m:rPr>
+                <m:sty m:val="b"/>
+              </m:rPr>
+              <w:rPr>
+                <w:rFonts w:ascii="Cambria Math" w:hAnsi="Cambria Math"/>
+              </w:rPr>
+              <m:t>1</m:t>
+            </m:r>
+          </m:e>
+          <m:sup>
+            <m:r>
+              <m:rPr>
+                <m:nor/>
+              </m:rPr>
+              <m:t>T</m:t>
+            </m:r>
+          </m:sup>
+        </m:sSup>
+        <m:r>
+          <m:rPr>
+            <m:sty m:val="b"/>
+          </m:rPr>
+          <w:rPr>
+            <w:rFonts w:ascii="Cambria Math" w:hAnsi="Cambria Math"/>
+          </w:rPr>
+          <m:t>w</m:t>
+        </m:r>
+        <m:r>
+          <m:rPr>
+            <m:nor/>
+          </m:rPr>
+          <m:t xml:space="preserve"> = 1, </m:t>
+        </m:r>
+        <m:r>
+          <m:rPr>
+            <m:sty m:val="b"/>
+          </m:rPr>
+          <w:rPr>
+            <w:rFonts w:ascii="Cambria Math" w:hAnsi="Cambria Math"/>
+          </w:rPr>
+          <m:t>w</m:t>
+        </m:r>
+        <m:r>
+          <m:rPr>
+            <m:nor/>
+          </m:rPr>
+          <m:t xml:space="preserve"> ≥ </m:t>
+        </m:r>
+        <m:r>
+          <w:rPr>
+            <w:rFonts w:ascii="Cambria Math" w:hAnsi="Cambria Math"/>
+          </w:rPr>
+          <m:t>0</m:t>
+        </m:r>
+      </m:oMath>
     </w:p>
     <w:p>
       <w:r>
         <w:t>(3)  Maximum Sharpe:</w:t>
       </w:r>
-      <m:oMathPara>
-        <m:oMath>
-          <m:sSub>
-            <m:e>
-              <m:r>
-                <m:rPr>
-                  <m:nor/>
-                </m:rPr>
-                <m:t xml:space="preserve">max</m:t>
-              </m:r>
-            </m:e>
-            <m:sub>
-              <m:r>
-                <m:rPr>
-                  <m:sty m:val="b"/>
-                </m:rPr>
-                <m:t xml:space="preserve">w</m:t>
-              </m:r>
-            </m:sub>
-          </m:sSub>
-          <m:r>
-            <m:rPr>
-              <m:nor/>
-            </m:rPr>
-            <m:t xml:space="preserve"> </m:t>
-          </m:r>
-          <m:f>
-            <m:num>
-              <m:sSup>
-                <m:e>
-                  <m:r>
-                    <m:rPr>
-                      <m:sty m:val="b"/>
-                    </m:rPr>
-                    <m:t xml:space="preserve">w</m:t>
-                  </m:r>
-                </m:e>
-                <m:sup>
-                  <m:r>
-                    <m:rPr>
-                      <m:nor/>
-                    </m:rPr>
-                    <m:t xml:space="preserve">T</m:t>
-                  </m:r>
-                </m:sup>
-              </m:sSup>
-              <m:r>
-                <m:rPr>
-                  <m:sty m:val="b"/>
-                </m:rPr>
-                <m:t xml:space="preserve">μ</m:t>
-              </m:r>
-              <m:r>
-                <m:rPr>
-                  <m:nor/>
-                </m:rPr>
-                <m:t xml:space="preserve"> − </m:t>
-              </m:r>
-              <m:sSub>
-                <m:e>
-                  <m:r>
-                    <m:t xml:space="preserve">r</m:t>
-                  </m:r>
-                </m:e>
-                <m:sub>
-                  <m:r>
-                    <m:rPr>
-                      <m:nor/>
-                    </m:rPr>
-                    <m:t xml:space="preserve">f</m:t>
-                  </m:r>
-                </m:sub>
-              </m:sSub>
-            </m:num>
-            <m:den>
-              <m:rad>
-                <m:radPr>
-                  <m:degHide m:val="1"/>
-                </m:radPr>
-                <m:deg/>
-                <m:e>
-                  <m:sSup>
-                    <m:e>
-                      <m:r>
-                        <m:rPr>
-                          <m:sty m:val="b"/>
-                        </m:rPr>
-                        <m:t xml:space="preserve">w</m:t>
-                      </m:r>
-                    </m:e>
-                    <m:sup>
-                      <m:r>
-                        <m:rPr>
-                          <m:nor/>
-                        </m:rPr>
-                        <m:t xml:space="preserve">T</m:t>
-                      </m:r>
-                    </m:sup>
-                  </m:sSup>
-                  <m:r>
-                    <m:rPr>
-                      <m:sty m:val="b"/>
-                    </m:rPr>
-                    <m:t xml:space="preserve">Σ</m:t>
-                  </m:r>
-                  <m:r>
-                    <m:rPr>
-                      <m:sty m:val="b"/>
-                    </m:rPr>
-                    <m:t xml:space="preserve">w</m:t>
-                  </m:r>
-                </m:e>
-              </m:rad>
-            </m:den>
-          </m:f>
-          <m:r>
-            <m:rPr>
-              <m:nor/>
-            </m:rPr>
-            <m:t xml:space="preserve">   subject to   </m:t>
-          </m:r>
-          <m:sSup>
-            <m:e>
-              <m:r>
-                <m:rPr>
-                  <m:sty m:val="b"/>
-                </m:rPr>
-                <m:t xml:space="preserve">1</m:t>
-              </m:r>
-            </m:e>
-            <m:sup>
-              <m:r>
-                <m:rPr>
-                  <m:nor/>
-                </m:rPr>
-                <m:t xml:space="preserve">T</m:t>
-              </m:r>
-            </m:sup>
-          </m:sSup>
-          <m:r>
-            <m:rPr>
-              <m:sty m:val="b"/>
-            </m:rPr>
-            <m:t xml:space="preserve">w</m:t>
-          </m:r>
-          <m:r>
-            <m:rPr>
-              <m:nor/>
-            </m:rPr>
-            <m:t xml:space="preserve"> = 1</m:t>
-          </m:r>
-          <m:r>
-            <m:rPr>
-              <m:nor/>
-            </m:rPr>
-            <m:t xml:space="preserve">, </m:t>
-          </m:r>
-          <m:r>
-            <m:rPr>
-              <m:sty m:val="b"/>
-            </m:rPr>
-            <m:t xml:space="preserve">w</m:t>
-          </m:r>
-          <m:r>
-            <m:rPr>
-              <m:nor/>
-            </m:rPr>
-            <m:t xml:space="preserve"> ≥ </m:t>
-          </m:r>
-          <m:r>
-            <m:t xml:space="preserve">0</m:t>
-          </m:r>
-        </m:oMath>
-      </m:oMathPara>
+      <m:oMath>
+        <m:sSub>
+          <m:sSubPr>
+            <m:ctrlPr>
+              <w:rPr>
+                <w:rFonts w:ascii="Cambria Math" w:hAnsi="Cambria Math"/>
+              </w:rPr>
+            </m:ctrlPr>
+          </m:sSubPr>
+          <m:e>
+            <m:r>
+              <m:rPr>
+                <m:nor/>
+              </m:rPr>
+              <m:t>max</m:t>
+            </m:r>
+          </m:e>
+          <m:sub>
+            <m:r>
+              <m:rPr>
+                <m:sty m:val="b"/>
+              </m:rPr>
+              <w:rPr>
+                <w:rFonts w:ascii="Cambria Math" w:hAnsi="Cambria Math"/>
+              </w:rPr>
+              <m:t>w</m:t>
+            </m:r>
+          </m:sub>
+        </m:sSub>
+        <m:r>
+          <m:rPr>
+            <m:nor/>
+          </m:rPr>
+          <m:t xml:space="preserve"> </m:t>
+        </m:r>
+        <m:f>
+          <m:fPr>
+            <m:ctrlPr>
+              <w:rPr>
+                <w:rFonts w:ascii="Cambria Math" w:hAnsi="Cambria Math"/>
+              </w:rPr>
+            </m:ctrlPr>
+          </m:fPr>
+          <m:num>
+            <m:sSup>
+              <m:sSupPr>
+                <m:ctrlPr>
+                  <w:rPr>
+                    <w:rFonts w:ascii="Cambria Math" w:hAnsi="Cambria Math"/>
+                  </w:rPr>
+                </m:ctrlPr>
+              </m:sSupPr>
+              <m:e>
+                <m:r>
+                  <m:rPr>
+                    <m:sty m:val="b"/>
+                  </m:rPr>
+                  <w:rPr>
+                    <w:rFonts w:ascii="Cambria Math" w:hAnsi="Cambria Math"/>
+                  </w:rPr>
+                  <m:t>w</m:t>
+                </m:r>
+              </m:e>
+              <m:sup>
+                <m:r>
+                  <m:rPr>
+                    <m:nor/>
+                  </m:rPr>
+                  <m:t>T</m:t>
+                </m:r>
+              </m:sup>
+            </m:sSup>
+            <m:r>
+              <m:rPr>
+                <m:sty m:val="b"/>
+              </m:rPr>
+              <w:rPr>
+                <w:rFonts w:ascii="Cambria Math" w:hAnsi="Cambria Math"/>
+              </w:rPr>
+              <m:t>μ</m:t>
+            </m:r>
+            <m:r>
+              <m:rPr>
+                <m:nor/>
+              </m:rPr>
+              <m:t xml:space="preserve"> - </m:t>
+            </m:r>
+            <m:sSub>
+              <m:sSubPr>
+                <m:ctrlPr>
+                  <w:rPr>
+                    <w:rFonts w:ascii="Cambria Math" w:hAnsi="Cambria Math"/>
+                  </w:rPr>
+                </m:ctrlPr>
+              </m:sSubPr>
+              <m:e>
+                <m:r>
+                  <w:rPr>
+                    <w:rFonts w:ascii="Cambria Math" w:hAnsi="Cambria Math"/>
+                  </w:rPr>
+                  <m:t>r</m:t>
+                </m:r>
+              </m:e>
+              <m:sub>
+                <m:r>
+                  <m:rPr>
+                    <m:nor/>
+                  </m:rPr>
+                  <m:t>f</m:t>
+                </m:r>
+              </m:sub>
+            </m:sSub>
+          </m:num>
+          <m:den>
+            <m:rad>
+              <m:radPr>
+                <m:degHide m:val="1"/>
+                <m:ctrlPr>
+                  <w:rPr>
+                    <w:rFonts w:ascii="Cambria Math" w:hAnsi="Cambria Math"/>
+                  </w:rPr>
+                </m:ctrlPr>
+              </m:radPr>
+              <m:deg/>
+              <m:e>
+                <m:sSup>
+                  <m:sSupPr>
+                    <m:ctrlPr>
+                      <w:rPr>
+                        <w:rFonts w:ascii="Cambria Math" w:hAnsi="Cambria Math"/>
+                      </w:rPr>
+                    </m:ctrlPr>
+                  </m:sSupPr>
+                  <m:e>
+                    <m:r>
+                      <m:rPr>
+                        <m:sty m:val="b"/>
+                      </m:rPr>
+                      <w:rPr>
+                        <w:rFonts w:ascii="Cambria Math" w:hAnsi="Cambria Math"/>
+                      </w:rPr>
+                      <m:t>w</m:t>
+                    </m:r>
+                  </m:e>
+                  <m:sup>
+                    <m:r>
+                      <m:rPr>
+                        <m:nor/>
+                      </m:rPr>
+                      <m:t>T</m:t>
+                    </m:r>
+                  </m:sup>
+                </m:sSup>
+                <m:r>
+                  <m:rPr>
+                    <m:sty m:val="b"/>
+                  </m:rPr>
+                  <w:rPr>
+                    <w:rFonts w:ascii="Cambria Math" w:hAnsi="Cambria Math"/>
+                  </w:rPr>
+                  <m:t>Σw</m:t>
+                </m:r>
+              </m:e>
+            </m:rad>
+          </m:den>
+        </m:f>
+        <m:r>
+          <m:rPr>
+            <m:nor/>
+          </m:rPr>
+          <m:t xml:space="preserve">   subject to   </m:t>
+        </m:r>
+        <m:sSup>
+          <m:sSupPr>
+            <m:ctrlPr>
+              <w:rPr>
+                <w:rFonts w:ascii="Cambria Math" w:hAnsi="Cambria Math"/>
+              </w:rPr>
+            </m:ctrlPr>
+          </m:sSupPr>
+          <m:e>
+            <m:r>
+              <m:rPr>
+                <m:sty m:val="b"/>
+              </m:rPr>
+              <w:rPr>
+                <w:rFonts w:ascii="Cambria Math" w:hAnsi="Cambria Math"/>
+              </w:rPr>
+              <m:t>1</m:t>
+            </m:r>
+          </m:e>
+          <m:sup>
+            <m:r>
+              <m:rPr>
+                <m:nor/>
+              </m:rPr>
+              <m:t>T</m:t>
+            </m:r>
+          </m:sup>
+        </m:sSup>
+        <m:r>
+          <m:rPr>
+            <m:sty m:val="b"/>
+          </m:rPr>
+          <w:rPr>
+            <w:rFonts w:ascii="Cambria Math" w:hAnsi="Cambria Math"/>
+          </w:rPr>
+          <m:t>w</m:t>
+        </m:r>
+        <m:r>
+          <m:rPr>
+            <m:nor/>
+          </m:rPr>
+          <m:t xml:space="preserve"> = 1, </m:t>
+        </m:r>
+        <m:r>
+          <m:rPr>
+            <m:sty m:val="b"/>
+          </m:rPr>
+          <w:rPr>
+            <w:rFonts w:ascii="Cambria Math" w:hAnsi="Cambria Math"/>
+          </w:rPr>
+          <m:t>w</m:t>
+        </m:r>
+        <m:r>
+          <m:rPr>
+            <m:nor/>
+          </m:rPr>
+          <m:t xml:space="preserve"> ≥ </m:t>
+        </m:r>
+        <m:r>
+          <w:rPr>
+            <w:rFonts w:ascii="Cambria Math" w:hAnsi="Cambria Math"/>
+          </w:rPr>
+          <m:t>0</m:t>
+        </m:r>
+      </m:oMath>
     </w:p>
     <w:p>
       <w:r>
         <w:t>(4)  Risk parity:</w:t>
       </w:r>
-      <m:oMathPara>
-        <m:oMath>
-          <m:sSub>
-            <m:e>
-              <m:r>
-                <m:rPr>
-                  <m:nor/>
-                </m:rPr>
-                <m:t xml:space="preserve">RC</m:t>
-              </m:r>
-            </m:e>
-            <m:sub>
-              <m:r>
-                <m:t xml:space="preserve">i</m:t>
-              </m:r>
-            </m:sub>
-          </m:sSub>
-          <m:r>
-            <m:rPr>
-              <m:nor/>
-            </m:rPr>
-            <m:t xml:space="preserve"> = </m:t>
-          </m:r>
-          <m:f>
-            <m:num>
-              <m:sSub>
-                <m:e>
-                  <m:r>
-                    <m:t xml:space="preserve">w</m:t>
-                  </m:r>
-                </m:e>
-                <m:sub>
-                  <m:r>
-                    <m:t xml:space="preserve">i</m:t>
-                  </m:r>
-                </m:sub>
-              </m:sSub>
-              <m:sSub>
-                <m:e>
-                  <m:d>
-                    <m:dPr>
-                      <m:begChr m:val="("/>
-                      <m:endChr m:val=")"/>
-                    </m:dPr>
-                    <m:e>
-                      <m:r>
-                        <m:rPr>
-                          <m:sty m:val="b"/>
-                        </m:rPr>
-                        <m:t xml:space="preserve">Σ</m:t>
-                      </m:r>
-                      <m:r>
-                        <m:rPr>
-                          <m:sty m:val="b"/>
-                        </m:rPr>
-                        <m:t xml:space="preserve">w</m:t>
-                      </m:r>
-                    </m:e>
-                  </m:d>
-                </m:e>
-                <m:sub>
-                  <m:r>
-                    <m:t xml:space="preserve">i</m:t>
-                  </m:r>
-                </m:sub>
-              </m:sSub>
-            </m:num>
-            <m:den>
-              <m:sSup>
-                <m:e>
-                  <m:r>
-                    <m:rPr>
-                      <m:sty m:val="b"/>
-                    </m:rPr>
-                    <m:t xml:space="preserve">w</m:t>
-                  </m:r>
-                </m:e>
-                <m:sup>
-                  <m:r>
-                    <m:rPr>
-                      <m:nor/>
-                    </m:rPr>
-                    <m:t xml:space="preserve">T</m:t>
-                  </m:r>
-                </m:sup>
-              </m:sSup>
-              <m:r>
-                <m:rPr>
-                  <m:sty m:val="b"/>
-                </m:rPr>
-                <m:t xml:space="preserve">Σ</m:t>
-              </m:r>
-              <m:r>
-                <m:rPr>
-                  <m:sty m:val="b"/>
-                </m:rPr>
-                <m:t xml:space="preserve">w</m:t>
-              </m:r>
-            </m:den>
-          </m:f>
-          <m:r>
-            <m:rPr>
-              <m:nor/>
-            </m:rPr>
-            <m:t xml:space="preserve"> = </m:t>
-          </m:r>
-          <m:f>
-            <m:num>
-              <m:r>
-                <m:t xml:space="preserve">1</m:t>
-              </m:r>
-            </m:num>
-            <m:den>
-              <m:r>
-                <m:t xml:space="preserve">N</m:t>
-              </m:r>
-            </m:den>
-          </m:f>
-          <m:r>
-            <m:rPr>
-              <m:nor/>
-            </m:rPr>
-            <m:t xml:space="preserve">   for all </m:t>
-          </m:r>
-          <m:r>
-            <m:t xml:space="preserve">i</m:t>
-          </m:r>
-        </m:oMath>
-      </m:oMathPara>
+      <m:oMath>
+        <m:sSub>
+          <m:sSubPr>
+            <m:ctrlPr>
+              <w:rPr>
+                <w:rFonts w:ascii="Cambria Math" w:hAnsi="Cambria Math"/>
+              </w:rPr>
+            </m:ctrlPr>
+          </m:sSubPr>
+          <m:e>
+            <m:r>
+              <m:rPr>
+                <m:nor/>
+              </m:rPr>
+              <m:t>RC</m:t>
+            </m:r>
+          </m:e>
+          <m:sub>
+            <m:r>
+              <w:rPr>
+                <w:rFonts w:ascii="Cambria Math" w:hAnsi="Cambria Math"/>
+              </w:rPr>
+              <m:t>i</m:t>
+            </m:r>
+          </m:sub>
+        </m:sSub>
+        <m:r>
+          <m:rPr>
+            <m:nor/>
+          </m:rPr>
+          <m:t xml:space="preserve"> = </m:t>
+        </m:r>
+        <m:f>
+          <m:fPr>
+            <m:ctrlPr>
+              <w:rPr>
+                <w:rFonts w:ascii="Cambria Math" w:hAnsi="Cambria Math"/>
+              </w:rPr>
+            </m:ctrlPr>
+          </m:fPr>
+          <m:num>
+            <m:sSub>
+              <m:sSubPr>
+                <m:ctrlPr>
+                  <w:rPr>
+                    <w:rFonts w:ascii="Cambria Math" w:hAnsi="Cambria Math"/>
+                  </w:rPr>
+                </m:ctrlPr>
+              </m:sSubPr>
+              <m:e>
+                <m:r>
+                  <w:rPr>
+                    <w:rFonts w:ascii="Cambria Math" w:hAnsi="Cambria Math"/>
+                  </w:rPr>
+                  <m:t>w</m:t>
+                </m:r>
+              </m:e>
+              <m:sub>
+                <m:r>
+                  <w:rPr>
+                    <w:rFonts w:ascii="Cambria Math" w:hAnsi="Cambria Math"/>
+                  </w:rPr>
+                  <m:t>i</m:t>
+                </m:r>
+              </m:sub>
+            </m:sSub>
+            <m:sSub>
+              <m:sSubPr>
+                <m:ctrlPr>
+                  <w:rPr>
+                    <w:rFonts w:ascii="Cambria Math" w:hAnsi="Cambria Math"/>
+                  </w:rPr>
+                </m:ctrlPr>
+              </m:sSubPr>
+              <m:e>
+                <m:d>
+                  <m:dPr>
+                    <m:ctrlPr>
+                      <w:rPr>
+                        <w:rFonts w:ascii="Cambria Math" w:hAnsi="Cambria Math"/>
+                      </w:rPr>
+                    </m:ctrlPr>
+                  </m:dPr>
+                  <m:e>
+                    <m:r>
+                      <m:rPr>
+                        <m:sty m:val="b"/>
+                      </m:rPr>
+                      <w:rPr>
+                        <w:rFonts w:ascii="Cambria Math" w:hAnsi="Cambria Math"/>
+                      </w:rPr>
+                      <m:t>Σw</m:t>
+                    </m:r>
+                  </m:e>
+                </m:d>
+              </m:e>
+              <m:sub>
+                <m:r>
+                  <w:rPr>
+                    <w:rFonts w:ascii="Cambria Math" w:hAnsi="Cambria Math"/>
+                  </w:rPr>
+                  <m:t>i</m:t>
+                </m:r>
+              </m:sub>
+            </m:sSub>
+          </m:num>
+          <m:den>
+            <m:sSup>
+              <m:sSupPr>
+                <m:ctrlPr>
+                  <w:rPr>
+                    <w:rFonts w:ascii="Cambria Math" w:hAnsi="Cambria Math"/>
+                  </w:rPr>
+                </m:ctrlPr>
+              </m:sSupPr>
+              <m:e>
+                <m:r>
+                  <m:rPr>
+                    <m:sty m:val="b"/>
+                  </m:rPr>
+                  <w:rPr>
+                    <w:rFonts w:ascii="Cambria Math" w:hAnsi="Cambria Math"/>
+                  </w:rPr>
+                  <m:t>w</m:t>
+                </m:r>
+              </m:e>
+              <m:sup>
+                <m:r>
+                  <m:rPr>
+                    <m:nor/>
+                  </m:rPr>
+                  <m:t>T</m:t>
+                </m:r>
+              </m:sup>
+            </m:sSup>
+            <m:r>
+              <m:rPr>
+                <m:sty m:val="b"/>
+              </m:rPr>
+              <w:rPr>
+                <w:rFonts w:ascii="Cambria Math" w:hAnsi="Cambria Math"/>
+              </w:rPr>
+              <m:t>Σw</m:t>
+            </m:r>
+          </m:den>
+        </m:f>
+        <m:r>
+          <m:rPr>
+            <m:nor/>
+          </m:rPr>
+          <m:t xml:space="preserve"> = </m:t>
+        </m:r>
+        <m:f>
+          <m:fPr>
+            <m:ctrlPr>
+              <w:rPr>
+                <w:rFonts w:ascii="Cambria Math" w:hAnsi="Cambria Math"/>
+              </w:rPr>
+            </m:ctrlPr>
+          </m:fPr>
+          <m:num>
+            <m:r>
+              <w:rPr>
+                <w:rFonts w:ascii="Cambria Math" w:hAnsi="Cambria Math"/>
+              </w:rPr>
+              <m:t>1</m:t>
+            </m:r>
+          </m:num>
+          <m:den>
+            <m:r>
+              <w:rPr>
+                <w:rFonts w:ascii="Cambria Math" w:hAnsi="Cambria Math"/>
+              </w:rPr>
+              <m:t>N</m:t>
+            </m:r>
+          </m:den>
+        </m:f>
+        <m:r>
+          <m:rPr>
+            <m:nor/>
+          </m:rPr>
+          <m:t xml:space="preserve">   for all </m:t>
+        </m:r>
+        <m:r>
+          <w:rPr>
+            <w:rFonts w:ascii="Cambria Math" w:hAnsi="Cambria Math"/>
+          </w:rPr>
+          <m:t>i</m:t>
+        </m:r>
+      </m:oMath>
     </w:p>
     <w:p>
       <w:r>
-        <w:t>Here N is the number of assets in the family (50 equities, 10 cryptocurrencies, or 60 combined), w_i is the weight on asset i, (Sw)_i is the i-th element of Sw, RC_i is asset i's risk contribution, and 1 is a vector of ones. Only equations (3) and (4) are affected by the choice of expected-return estimator; equation (2) uses S alone, which is why Section 5.4 can separate covariance noise from mean noise.</w:t>
+        <w:t>Here N is the number of assets in the family (50 equities, 10 cryptocurrencies, or 60 combined), w_i is the weight on asset i, (Sw)_i is the i-th element of Sw, RC_i is asset i's risk contribution, and 1 is a vector of ones. Only equations (3) and (4) are affected by the choice of expected-</w:t>
+      </w:r>
+      <w:r>
+        <w:lastRenderedPageBreak/>
+        <w:t>return estimator; equation (2) uses S alone, which is why Section 5.4 can separate covariance noise from mean noise.</w:t>
       </w:r>
     </w:p>
     <w:p>
       <w:pPr>
         <w:pStyle w:val="21"/>
       </w:pPr>
-      <w:bookmarkStart w:id="19" w:name="_Toc237383705"/>
+      <w:bookmarkStart w:id="18" w:name="_Toc237443238"/>
       <w:r>
         <w:t>Appendix B - Supporting exhibits</w:t>
       </w:r>
-      <w:bookmarkEnd w:id="19"/>
+      <w:bookmarkEnd w:id="18"/>
     </w:p>
     <w:p>
       <w:r>
@@ -13575,7 +14567,7 @@
           <w:noProof/>
         </w:rPr>
         <w:drawing>
-          <wp:inline distT="0" distB="0" distL="0" distR="0" wp14:anchorId="03A55731" wp14:editId="790EB03E">
+          <wp:inline distT="0" distB="0" distL="0" distR="0" wp14:anchorId="5B685746" wp14:editId="4CE90274">
             <wp:extent cx="5577840" cy="2996083"/>
             <wp:effectExtent l="0" t="0" r="0" b="0"/>
             <wp:docPr id="13" name="Picture 13"/>
@@ -14766,7 +15758,6 @@
               <w:rPr>
                 <w:sz w:val="16"/>
               </w:rPr>
-              <w:lastRenderedPageBreak/>
               <w:t>Maximum-Sharpe</w:t>
             </w:r>
           </w:p>
@@ -15353,9 +16344,12 @@
       <w:pPr>
         <w:pStyle w:val="21"/>
       </w:pPr>
+      <w:bookmarkStart w:id="19" w:name="_Toc237443239"/>
       <w:r>
+        <w:lastRenderedPageBreak/>
         <w:t>Appendix C - The figure design system</w:t>
       </w:r>
+      <w:bookmarkEnd w:id="19"/>
     </w:p>
     <w:p>
       <w:r>
@@ -15364,7 +16358,6 @@
     </w:p>
     <w:p>
       <w:r>
-        <w:lastRenderedPageBreak/>
         <w:t>The design system exists because the product is read by someone who will not check the code. A reader who cannot distinguish two bands in a weight chart cannot audit the fund's holdings, and a reader who is colour-blind should not be excluded from that. Fixing the colour slots and validating every pair under simulated colour-blind vision makes the exhibits verifiable rather than merely attractive.</w:t>
       </w:r>
     </w:p>
@@ -15372,9 +16365,11 @@
       <w:pPr>
         <w:pStyle w:val="21"/>
       </w:pPr>
+      <w:bookmarkStart w:id="20" w:name="_Toc237443240"/>
       <w:r>
         <w:t>Appendix D - Rolling against expanding estimation windows</w:t>
       </w:r>
+      <w:bookmarkEnd w:id="20"/>
     </w:p>
     <w:p>
       <w:r>
@@ -15388,13 +16383,14 @@
       <w:r>
         <w:t xml:space="preserve">Table </w:t>
       </w:r>
-      <w:r>
-        <w:fldChar w:fldCharType="begin"/>
-        <w:instrText xml:space="preserve"> SEQ Table \* ARABIC </w:instrText>
-        <w:fldChar w:fldCharType="separate"/>
-        <w:t>1</w:t>
-        <w:fldChar w:fldCharType="end"/>
-      </w:r>
+      <w:fldSimple w:instr=" SEQ Table \* ARABIC ">
+        <w:r>
+          <w:rPr>
+            <w:noProof/>
+          </w:rPr>
+          <w:t>12</w:t>
+        </w:r>
+      </w:fldSimple>
       <w:r>
         <w:t>: Sharpe ratio under a rolling 252-day window against an expanding window, out of sample.</w:t>
       </w:r>
@@ -15402,8 +16398,8 @@
     <w:tbl>
       <w:tblPr>
         <w:tblStyle w:val="-11"/>
-        <w:tblW w:type="auto" w:w="0"/>
-        <w:tblLook w:firstColumn="1" w:firstRow="1" w:lastColumn="0" w:lastRow="0" w:noHBand="0" w:noVBand="1" w:val="04A0"/>
+        <w:tblW w:w="0" w:type="auto"/>
+        <w:tblLook w:val="04A0" w:firstRow="1" w:lastRow="0" w:firstColumn="1" w:lastColumn="0" w:noHBand="0" w:noVBand="1"/>
       </w:tblPr>
       <w:tblGrid>
         <w:gridCol w:w="1806"/>
@@ -15413,14 +16409,17 @@
         <w:gridCol w:w="1806"/>
       </w:tblGrid>
       <w:tr>
-        <w:tc>
-          <w:tcPr>
-            <w:tcW w:type="dxa" w:w="1806"/>
-          </w:tcPr>
-          <w:p>
-            <w:r>
-              <w:rPr>
-                <w:b/>
+        <w:trPr>
+          <w:cnfStyle w:val="100000000000" w:firstRow="1" w:lastRow="0" w:firstColumn="0" w:lastColumn="0" w:oddVBand="0" w:evenVBand="0" w:oddHBand="0" w:evenHBand="0" w:firstRowFirstColumn="0" w:firstRowLastColumn="0" w:lastRowFirstColumn="0" w:lastRowLastColumn="0"/>
+        </w:trPr>
+        <w:tc>
+          <w:tcPr>
+            <w:cnfStyle w:val="001000000000" w:firstRow="0" w:lastRow="0" w:firstColumn="1" w:lastColumn="0" w:oddVBand="0" w:evenVBand="0" w:oddHBand="0" w:evenHBand="0" w:firstRowFirstColumn="0" w:firstRowLastColumn="0" w:lastRowFirstColumn="0" w:lastRowLastColumn="0"/>
+            <w:tcW w:w="1806" w:type="dxa"/>
+          </w:tcPr>
+          <w:p>
+            <w:r>
+              <w:rPr>
                 <w:sz w:val="16"/>
               </w:rPr>
               <w:t>Family</w:t>
@@ -15429,12 +16428,14 @@
         </w:tc>
         <w:tc>
           <w:tcPr>
-            <w:tcW w:type="dxa" w:w="1806"/>
-          </w:tcPr>
-          <w:p>
-            <w:r>
-              <w:rPr>
-                <w:b/>
+            <w:tcW w:w="1806" w:type="dxa"/>
+          </w:tcPr>
+          <w:p>
+            <w:pPr>
+              <w:cnfStyle w:val="100000000000" w:firstRow="1" w:lastRow="0" w:firstColumn="0" w:lastColumn="0" w:oddVBand="0" w:evenVBand="0" w:oddHBand="0" w:evenHBand="0" w:firstRowFirstColumn="0" w:firstRowLastColumn="0" w:lastRowFirstColumn="0" w:lastRowLastColumn="0"/>
+            </w:pPr>
+            <w:r>
+              <w:rPr>
                 <w:sz w:val="16"/>
               </w:rPr>
               <w:t>Method</w:t>
@@ -15443,12 +16444,14 @@
         </w:tc>
         <w:tc>
           <w:tcPr>
-            <w:tcW w:type="dxa" w:w="1806"/>
-          </w:tcPr>
-          <w:p>
-            <w:r>
-              <w:rPr>
-                <w:b/>
+            <w:tcW w:w="1806" w:type="dxa"/>
+          </w:tcPr>
+          <w:p>
+            <w:pPr>
+              <w:cnfStyle w:val="100000000000" w:firstRow="1" w:lastRow="0" w:firstColumn="0" w:lastColumn="0" w:oddVBand="0" w:evenVBand="0" w:oddHBand="0" w:evenHBand="0" w:firstRowFirstColumn="0" w:firstRowLastColumn="0" w:lastRowFirstColumn="0" w:lastRowLastColumn="0"/>
+            </w:pPr>
+            <w:r>
+              <w:rPr>
                 <w:sz w:val="16"/>
               </w:rPr>
               <w:t>Rolling</w:t>
@@ -15457,12 +16460,14 @@
         </w:tc>
         <w:tc>
           <w:tcPr>
-            <w:tcW w:type="dxa" w:w="1806"/>
-          </w:tcPr>
-          <w:p>
-            <w:r>
-              <w:rPr>
-                <w:b/>
+            <w:tcW w:w="1806" w:type="dxa"/>
+          </w:tcPr>
+          <w:p>
+            <w:pPr>
+              <w:cnfStyle w:val="100000000000" w:firstRow="1" w:lastRow="0" w:firstColumn="0" w:lastColumn="0" w:oddVBand="0" w:evenVBand="0" w:oddHBand="0" w:evenHBand="0" w:firstRowFirstColumn="0" w:firstRowLastColumn="0" w:lastRowFirstColumn="0" w:lastRowLastColumn="0"/>
+            </w:pPr>
+            <w:r>
+              <w:rPr>
                 <w:sz w:val="16"/>
               </w:rPr>
               <w:t>Expanding</w:t>
@@ -15471,12 +16476,14 @@
         </w:tc>
         <w:tc>
           <w:tcPr>
-            <w:tcW w:type="dxa" w:w="1806"/>
-          </w:tcPr>
-          <w:p>
-            <w:r>
-              <w:rPr>
-                <w:b/>
+            <w:tcW w:w="1806" w:type="dxa"/>
+          </w:tcPr>
+          <w:p>
+            <w:pPr>
+              <w:cnfStyle w:val="100000000000" w:firstRow="1" w:lastRow="0" w:firstColumn="0" w:lastColumn="0" w:oddVBand="0" w:evenVBand="0" w:oddHBand="0" w:evenHBand="0" w:firstRowFirstColumn="0" w:firstRowLastColumn="0" w:lastRowFirstColumn="0" w:lastRowLastColumn="0"/>
+            </w:pPr>
+            <w:r>
+              <w:rPr>
                 <w:sz w:val="16"/>
               </w:rPr>
               <w:t>Change</w:t>
@@ -15485,9 +16492,13 @@
         </w:tc>
       </w:tr>
       <w:tr>
-        <w:tc>
-          <w:tcPr>
-            <w:tcW w:type="dxa" w:w="1806"/>
+        <w:trPr>
+          <w:cnfStyle w:val="000000100000" w:firstRow="0" w:lastRow="0" w:firstColumn="0" w:lastColumn="0" w:oddVBand="0" w:evenVBand="0" w:oddHBand="1" w:evenHBand="0" w:firstRowFirstColumn="0" w:firstRowLastColumn="0" w:lastRowFirstColumn="0" w:lastRowLastColumn="0"/>
+        </w:trPr>
+        <w:tc>
+          <w:tcPr>
+            <w:cnfStyle w:val="001000000000" w:firstRow="0" w:lastRow="0" w:firstColumn="1" w:lastColumn="0" w:oddVBand="0" w:evenVBand="0" w:oddHBand="0" w:evenHBand="0" w:firstRowFirstColumn="0" w:firstRowLastColumn="0" w:lastRowFirstColumn="0" w:lastRowLastColumn="0"/>
+            <w:tcW w:w="1806" w:type="dxa"/>
           </w:tcPr>
           <w:p>
             <w:r>
@@ -15500,9 +16511,12 @@
         </w:tc>
         <w:tc>
           <w:tcPr>
-            <w:tcW w:type="dxa" w:w="1806"/>
-          </w:tcPr>
-          <w:p>
+            <w:tcW w:w="1806" w:type="dxa"/>
+          </w:tcPr>
+          <w:p>
+            <w:pPr>
+              <w:cnfStyle w:val="000000100000" w:firstRow="0" w:lastRow="0" w:firstColumn="0" w:lastColumn="0" w:oddVBand="0" w:evenVBand="0" w:oddHBand="1" w:evenHBand="0" w:firstRowFirstColumn="0" w:firstRowLastColumn="0" w:lastRowFirstColumn="0" w:lastRowLastColumn="0"/>
+            </w:pPr>
             <w:r>
               <w:rPr>
                 <w:sz w:val="16"/>
@@ -15513,9 +16527,12 @@
         </w:tc>
         <w:tc>
           <w:tcPr>
-            <w:tcW w:type="dxa" w:w="1806"/>
-          </w:tcPr>
-          <w:p>
+            <w:tcW w:w="1806" w:type="dxa"/>
+          </w:tcPr>
+          <w:p>
+            <w:pPr>
+              <w:cnfStyle w:val="000000100000" w:firstRow="0" w:lastRow="0" w:firstColumn="0" w:lastColumn="0" w:oddVBand="0" w:evenVBand="0" w:oddHBand="1" w:evenHBand="0" w:firstRowFirstColumn="0" w:firstRowLastColumn="0" w:lastRowFirstColumn="0" w:lastRowLastColumn="0"/>
+            </w:pPr>
             <w:r>
               <w:rPr>
                 <w:sz w:val="16"/>
@@ -15526,9 +16543,12 @@
         </w:tc>
         <w:tc>
           <w:tcPr>
-            <w:tcW w:type="dxa" w:w="1806"/>
-          </w:tcPr>
-          <w:p>
+            <w:tcW w:w="1806" w:type="dxa"/>
+          </w:tcPr>
+          <w:p>
+            <w:pPr>
+              <w:cnfStyle w:val="000000100000" w:firstRow="0" w:lastRow="0" w:firstColumn="0" w:lastColumn="0" w:oddVBand="0" w:evenVBand="0" w:oddHBand="1" w:evenHBand="0" w:firstRowFirstColumn="0" w:firstRowLastColumn="0" w:lastRowFirstColumn="0" w:lastRowLastColumn="0"/>
+            </w:pPr>
             <w:r>
               <w:rPr>
                 <w:sz w:val="16"/>
@@ -15539,9 +16559,12 @@
         </w:tc>
         <w:tc>
           <w:tcPr>
-            <w:tcW w:type="dxa" w:w="1806"/>
-          </w:tcPr>
-          <w:p>
+            <w:tcW w:w="1806" w:type="dxa"/>
+          </w:tcPr>
+          <w:p>
+            <w:pPr>
+              <w:cnfStyle w:val="000000100000" w:firstRow="0" w:lastRow="0" w:firstColumn="0" w:lastColumn="0" w:oddVBand="0" w:evenVBand="0" w:oddHBand="1" w:evenHBand="0" w:firstRowFirstColumn="0" w:firstRowLastColumn="0" w:lastRowFirstColumn="0" w:lastRowLastColumn="0"/>
+            </w:pPr>
             <w:r>
               <w:rPr>
                 <w:sz w:val="16"/>
@@ -15552,9 +16575,13 @@
         </w:tc>
       </w:tr>
       <w:tr>
-        <w:tc>
-          <w:tcPr>
-            <w:tcW w:type="dxa" w:w="1806"/>
+        <w:trPr>
+          <w:cnfStyle w:val="000000010000" w:firstRow="0" w:lastRow="0" w:firstColumn="0" w:lastColumn="0" w:oddVBand="0" w:evenVBand="0" w:oddHBand="0" w:evenHBand="1" w:firstRowFirstColumn="0" w:firstRowLastColumn="0" w:lastRowFirstColumn="0" w:lastRowLastColumn="0"/>
+        </w:trPr>
+        <w:tc>
+          <w:tcPr>
+            <w:cnfStyle w:val="001000000000" w:firstRow="0" w:lastRow="0" w:firstColumn="1" w:lastColumn="0" w:oddVBand="0" w:evenVBand="0" w:oddHBand="0" w:evenHBand="0" w:firstRowFirstColumn="0" w:firstRowLastColumn="0" w:lastRowFirstColumn="0" w:lastRowLastColumn="0"/>
+            <w:tcW w:w="1806" w:type="dxa"/>
           </w:tcPr>
           <w:p>
             <w:r>
@@ -15567,9 +16594,12 @@
         </w:tc>
         <w:tc>
           <w:tcPr>
-            <w:tcW w:type="dxa" w:w="1806"/>
-          </w:tcPr>
-          <w:p>
+            <w:tcW w:w="1806" w:type="dxa"/>
+          </w:tcPr>
+          <w:p>
+            <w:pPr>
+              <w:cnfStyle w:val="000000010000" w:firstRow="0" w:lastRow="0" w:firstColumn="0" w:lastColumn="0" w:oddVBand="0" w:evenVBand="0" w:oddHBand="0" w:evenHBand="1" w:firstRowFirstColumn="0" w:firstRowLastColumn="0" w:lastRowFirstColumn="0" w:lastRowLastColumn="0"/>
+            </w:pPr>
             <w:r>
               <w:rPr>
                 <w:sz w:val="16"/>
@@ -15580,9 +16610,12 @@
         </w:tc>
         <w:tc>
           <w:tcPr>
-            <w:tcW w:type="dxa" w:w="1806"/>
-          </w:tcPr>
-          <w:p>
+            <w:tcW w:w="1806" w:type="dxa"/>
+          </w:tcPr>
+          <w:p>
+            <w:pPr>
+              <w:cnfStyle w:val="000000010000" w:firstRow="0" w:lastRow="0" w:firstColumn="0" w:lastColumn="0" w:oddVBand="0" w:evenVBand="0" w:oddHBand="0" w:evenHBand="1" w:firstRowFirstColumn="0" w:firstRowLastColumn="0" w:lastRowFirstColumn="0" w:lastRowLastColumn="0"/>
+            </w:pPr>
             <w:r>
               <w:rPr>
                 <w:sz w:val="16"/>
@@ -15593,9 +16626,12 @@
         </w:tc>
         <w:tc>
           <w:tcPr>
-            <w:tcW w:type="dxa" w:w="1806"/>
-          </w:tcPr>
-          <w:p>
+            <w:tcW w:w="1806" w:type="dxa"/>
+          </w:tcPr>
+          <w:p>
+            <w:pPr>
+              <w:cnfStyle w:val="000000010000" w:firstRow="0" w:lastRow="0" w:firstColumn="0" w:lastColumn="0" w:oddVBand="0" w:evenVBand="0" w:oddHBand="0" w:evenHBand="1" w:firstRowFirstColumn="0" w:firstRowLastColumn="0" w:lastRowFirstColumn="0" w:lastRowLastColumn="0"/>
+            </w:pPr>
             <w:r>
               <w:rPr>
                 <w:sz w:val="16"/>
@@ -15606,9 +16642,12 @@
         </w:tc>
         <w:tc>
           <w:tcPr>
-            <w:tcW w:type="dxa" w:w="1806"/>
-          </w:tcPr>
-          <w:p>
+            <w:tcW w:w="1806" w:type="dxa"/>
+          </w:tcPr>
+          <w:p>
+            <w:pPr>
+              <w:cnfStyle w:val="000000010000" w:firstRow="0" w:lastRow="0" w:firstColumn="0" w:lastColumn="0" w:oddVBand="0" w:evenVBand="0" w:oddHBand="0" w:evenHBand="1" w:firstRowFirstColumn="0" w:firstRowLastColumn="0" w:lastRowFirstColumn="0" w:lastRowLastColumn="0"/>
+            </w:pPr>
             <w:r>
               <w:rPr>
                 <w:sz w:val="16"/>
@@ -15619,9 +16658,13 @@
         </w:tc>
       </w:tr>
       <w:tr>
-        <w:tc>
-          <w:tcPr>
-            <w:tcW w:type="dxa" w:w="1806"/>
+        <w:trPr>
+          <w:cnfStyle w:val="000000100000" w:firstRow="0" w:lastRow="0" w:firstColumn="0" w:lastColumn="0" w:oddVBand="0" w:evenVBand="0" w:oddHBand="1" w:evenHBand="0" w:firstRowFirstColumn="0" w:firstRowLastColumn="0" w:lastRowFirstColumn="0" w:lastRowLastColumn="0"/>
+        </w:trPr>
+        <w:tc>
+          <w:tcPr>
+            <w:cnfStyle w:val="001000000000" w:firstRow="0" w:lastRow="0" w:firstColumn="1" w:lastColumn="0" w:oddVBand="0" w:evenVBand="0" w:oddHBand="0" w:evenHBand="0" w:firstRowFirstColumn="0" w:firstRowLastColumn="0" w:lastRowFirstColumn="0" w:lastRowLastColumn="0"/>
+            <w:tcW w:w="1806" w:type="dxa"/>
           </w:tcPr>
           <w:p>
             <w:r>
@@ -15634,9 +16677,12 @@
         </w:tc>
         <w:tc>
           <w:tcPr>
-            <w:tcW w:type="dxa" w:w="1806"/>
-          </w:tcPr>
-          <w:p>
+            <w:tcW w:w="1806" w:type="dxa"/>
+          </w:tcPr>
+          <w:p>
+            <w:pPr>
+              <w:cnfStyle w:val="000000100000" w:firstRow="0" w:lastRow="0" w:firstColumn="0" w:lastColumn="0" w:oddVBand="0" w:evenVBand="0" w:oddHBand="1" w:evenHBand="0" w:firstRowFirstColumn="0" w:firstRowLastColumn="0" w:lastRowFirstColumn="0" w:lastRowLastColumn="0"/>
+            </w:pPr>
             <w:r>
               <w:rPr>
                 <w:sz w:val="16"/>
@@ -15647,9 +16693,12 @@
         </w:tc>
         <w:tc>
           <w:tcPr>
-            <w:tcW w:type="dxa" w:w="1806"/>
-          </w:tcPr>
-          <w:p>
+            <w:tcW w:w="1806" w:type="dxa"/>
+          </w:tcPr>
+          <w:p>
+            <w:pPr>
+              <w:cnfStyle w:val="000000100000" w:firstRow="0" w:lastRow="0" w:firstColumn="0" w:lastColumn="0" w:oddVBand="0" w:evenVBand="0" w:oddHBand="1" w:evenHBand="0" w:firstRowFirstColumn="0" w:firstRowLastColumn="0" w:lastRowFirstColumn="0" w:lastRowLastColumn="0"/>
+            </w:pPr>
             <w:r>
               <w:rPr>
                 <w:sz w:val="16"/>
@@ -15660,9 +16709,12 @@
         </w:tc>
         <w:tc>
           <w:tcPr>
-            <w:tcW w:type="dxa" w:w="1806"/>
-          </w:tcPr>
-          <w:p>
+            <w:tcW w:w="1806" w:type="dxa"/>
+          </w:tcPr>
+          <w:p>
+            <w:pPr>
+              <w:cnfStyle w:val="000000100000" w:firstRow="0" w:lastRow="0" w:firstColumn="0" w:lastColumn="0" w:oddVBand="0" w:evenVBand="0" w:oddHBand="1" w:evenHBand="0" w:firstRowFirstColumn="0" w:firstRowLastColumn="0" w:lastRowFirstColumn="0" w:lastRowLastColumn="0"/>
+            </w:pPr>
             <w:r>
               <w:rPr>
                 <w:sz w:val="16"/>
@@ -15673,9 +16725,12 @@
         </w:tc>
         <w:tc>
           <w:tcPr>
-            <w:tcW w:type="dxa" w:w="1806"/>
-          </w:tcPr>
-          <w:p>
+            <w:tcW w:w="1806" w:type="dxa"/>
+          </w:tcPr>
+          <w:p>
+            <w:pPr>
+              <w:cnfStyle w:val="000000100000" w:firstRow="0" w:lastRow="0" w:firstColumn="0" w:lastColumn="0" w:oddVBand="0" w:evenVBand="0" w:oddHBand="1" w:evenHBand="0" w:firstRowFirstColumn="0" w:firstRowLastColumn="0" w:lastRowFirstColumn="0" w:lastRowLastColumn="0"/>
+            </w:pPr>
             <w:r>
               <w:rPr>
                 <w:sz w:val="16"/>
@@ -15686,9 +16741,13 @@
         </w:tc>
       </w:tr>
       <w:tr>
-        <w:tc>
-          <w:tcPr>
-            <w:tcW w:type="dxa" w:w="1806"/>
+        <w:trPr>
+          <w:cnfStyle w:val="000000010000" w:firstRow="0" w:lastRow="0" w:firstColumn="0" w:lastColumn="0" w:oddVBand="0" w:evenVBand="0" w:oddHBand="0" w:evenHBand="1" w:firstRowFirstColumn="0" w:firstRowLastColumn="0" w:lastRowFirstColumn="0" w:lastRowLastColumn="0"/>
+        </w:trPr>
+        <w:tc>
+          <w:tcPr>
+            <w:cnfStyle w:val="001000000000" w:firstRow="0" w:lastRow="0" w:firstColumn="1" w:lastColumn="0" w:oddVBand="0" w:evenVBand="0" w:oddHBand="0" w:evenHBand="0" w:firstRowFirstColumn="0" w:firstRowLastColumn="0" w:lastRowFirstColumn="0" w:lastRowLastColumn="0"/>
+            <w:tcW w:w="1806" w:type="dxa"/>
           </w:tcPr>
           <w:p>
             <w:r>
@@ -15701,9 +16760,12 @@
         </w:tc>
         <w:tc>
           <w:tcPr>
-            <w:tcW w:type="dxa" w:w="1806"/>
-          </w:tcPr>
-          <w:p>
+            <w:tcW w:w="1806" w:type="dxa"/>
+          </w:tcPr>
+          <w:p>
+            <w:pPr>
+              <w:cnfStyle w:val="000000010000" w:firstRow="0" w:lastRow="0" w:firstColumn="0" w:lastColumn="0" w:oddVBand="0" w:evenVBand="0" w:oddHBand="0" w:evenHBand="1" w:firstRowFirstColumn="0" w:firstRowLastColumn="0" w:lastRowFirstColumn="0" w:lastRowLastColumn="0"/>
+            </w:pPr>
             <w:r>
               <w:rPr>
                 <w:sz w:val="16"/>
@@ -15714,9 +16776,12 @@
         </w:tc>
         <w:tc>
           <w:tcPr>
-            <w:tcW w:type="dxa" w:w="1806"/>
-          </w:tcPr>
-          <w:p>
+            <w:tcW w:w="1806" w:type="dxa"/>
+          </w:tcPr>
+          <w:p>
+            <w:pPr>
+              <w:cnfStyle w:val="000000010000" w:firstRow="0" w:lastRow="0" w:firstColumn="0" w:lastColumn="0" w:oddVBand="0" w:evenVBand="0" w:oddHBand="0" w:evenHBand="1" w:firstRowFirstColumn="0" w:firstRowLastColumn="0" w:lastRowFirstColumn="0" w:lastRowLastColumn="0"/>
+            </w:pPr>
             <w:r>
               <w:rPr>
                 <w:sz w:val="16"/>
@@ -15727,9 +16792,12 @@
         </w:tc>
         <w:tc>
           <w:tcPr>
-            <w:tcW w:type="dxa" w:w="1806"/>
-          </w:tcPr>
-          <w:p>
+            <w:tcW w:w="1806" w:type="dxa"/>
+          </w:tcPr>
+          <w:p>
+            <w:pPr>
+              <w:cnfStyle w:val="000000010000" w:firstRow="0" w:lastRow="0" w:firstColumn="0" w:lastColumn="0" w:oddVBand="0" w:evenVBand="0" w:oddHBand="0" w:evenHBand="1" w:firstRowFirstColumn="0" w:firstRowLastColumn="0" w:lastRowFirstColumn="0" w:lastRowLastColumn="0"/>
+            </w:pPr>
             <w:r>
               <w:rPr>
                 <w:sz w:val="16"/>
@@ -15740,9 +16808,12 @@
         </w:tc>
         <w:tc>
           <w:tcPr>
-            <w:tcW w:type="dxa" w:w="1806"/>
-          </w:tcPr>
-          <w:p>
+            <w:tcW w:w="1806" w:type="dxa"/>
+          </w:tcPr>
+          <w:p>
+            <w:pPr>
+              <w:cnfStyle w:val="000000010000" w:firstRow="0" w:lastRow="0" w:firstColumn="0" w:lastColumn="0" w:oddVBand="0" w:evenVBand="0" w:oddHBand="0" w:evenHBand="1" w:firstRowFirstColumn="0" w:firstRowLastColumn="0" w:lastRowFirstColumn="0" w:lastRowLastColumn="0"/>
+            </w:pPr>
             <w:r>
               <w:rPr>
                 <w:sz w:val="16"/>
@@ -15753,9 +16824,13 @@
         </w:tc>
       </w:tr>
       <w:tr>
-        <w:tc>
-          <w:tcPr>
-            <w:tcW w:type="dxa" w:w="1806"/>
+        <w:trPr>
+          <w:cnfStyle w:val="000000100000" w:firstRow="0" w:lastRow="0" w:firstColumn="0" w:lastColumn="0" w:oddVBand="0" w:evenVBand="0" w:oddHBand="1" w:evenHBand="0" w:firstRowFirstColumn="0" w:firstRowLastColumn="0" w:lastRowFirstColumn="0" w:lastRowLastColumn="0"/>
+        </w:trPr>
+        <w:tc>
+          <w:tcPr>
+            <w:cnfStyle w:val="001000000000" w:firstRow="0" w:lastRow="0" w:firstColumn="1" w:lastColumn="0" w:oddVBand="0" w:evenVBand="0" w:oddHBand="0" w:evenHBand="0" w:firstRowFirstColumn="0" w:firstRowLastColumn="0" w:lastRowFirstColumn="0" w:lastRowLastColumn="0"/>
+            <w:tcW w:w="1806" w:type="dxa"/>
           </w:tcPr>
           <w:p>
             <w:r>
@@ -15768,9 +16843,12 @@
         </w:tc>
         <w:tc>
           <w:tcPr>
-            <w:tcW w:type="dxa" w:w="1806"/>
-          </w:tcPr>
-          <w:p>
+            <w:tcW w:w="1806" w:type="dxa"/>
+          </w:tcPr>
+          <w:p>
+            <w:pPr>
+              <w:cnfStyle w:val="000000100000" w:firstRow="0" w:lastRow="0" w:firstColumn="0" w:lastColumn="0" w:oddVBand="0" w:evenVBand="0" w:oddHBand="1" w:evenHBand="0" w:firstRowFirstColumn="0" w:firstRowLastColumn="0" w:lastRowFirstColumn="0" w:lastRowLastColumn="0"/>
+            </w:pPr>
             <w:r>
               <w:rPr>
                 <w:sz w:val="16"/>
@@ -15781,9 +16859,12 @@
         </w:tc>
         <w:tc>
           <w:tcPr>
-            <w:tcW w:type="dxa" w:w="1806"/>
-          </w:tcPr>
-          <w:p>
+            <w:tcW w:w="1806" w:type="dxa"/>
+          </w:tcPr>
+          <w:p>
+            <w:pPr>
+              <w:cnfStyle w:val="000000100000" w:firstRow="0" w:lastRow="0" w:firstColumn="0" w:lastColumn="0" w:oddVBand="0" w:evenVBand="0" w:oddHBand="1" w:evenHBand="0" w:firstRowFirstColumn="0" w:firstRowLastColumn="0" w:lastRowFirstColumn="0" w:lastRowLastColumn="0"/>
+            </w:pPr>
             <w:r>
               <w:rPr>
                 <w:sz w:val="16"/>
@@ -15794,9 +16875,12 @@
         </w:tc>
         <w:tc>
           <w:tcPr>
-            <w:tcW w:type="dxa" w:w="1806"/>
-          </w:tcPr>
-          <w:p>
+            <w:tcW w:w="1806" w:type="dxa"/>
+          </w:tcPr>
+          <w:p>
+            <w:pPr>
+              <w:cnfStyle w:val="000000100000" w:firstRow="0" w:lastRow="0" w:firstColumn="0" w:lastColumn="0" w:oddVBand="0" w:evenVBand="0" w:oddHBand="1" w:evenHBand="0" w:firstRowFirstColumn="0" w:firstRowLastColumn="0" w:lastRowFirstColumn="0" w:lastRowLastColumn="0"/>
+            </w:pPr>
             <w:r>
               <w:rPr>
                 <w:sz w:val="16"/>
@@ -15807,9 +16891,12 @@
         </w:tc>
         <w:tc>
           <w:tcPr>
-            <w:tcW w:type="dxa" w:w="1806"/>
-          </w:tcPr>
-          <w:p>
+            <w:tcW w:w="1806" w:type="dxa"/>
+          </w:tcPr>
+          <w:p>
+            <w:pPr>
+              <w:cnfStyle w:val="000000100000" w:firstRow="0" w:lastRow="0" w:firstColumn="0" w:lastColumn="0" w:oddVBand="0" w:evenVBand="0" w:oddHBand="1" w:evenHBand="0" w:firstRowFirstColumn="0" w:firstRowLastColumn="0" w:lastRowFirstColumn="0" w:lastRowLastColumn="0"/>
+            </w:pPr>
             <w:r>
               <w:rPr>
                 <w:sz w:val="16"/>
@@ -15820,9 +16907,13 @@
         </w:tc>
       </w:tr>
       <w:tr>
-        <w:tc>
-          <w:tcPr>
-            <w:tcW w:type="dxa" w:w="1806"/>
+        <w:trPr>
+          <w:cnfStyle w:val="000000010000" w:firstRow="0" w:lastRow="0" w:firstColumn="0" w:lastColumn="0" w:oddVBand="0" w:evenVBand="0" w:oddHBand="0" w:evenHBand="1" w:firstRowFirstColumn="0" w:firstRowLastColumn="0" w:lastRowFirstColumn="0" w:lastRowLastColumn="0"/>
+        </w:trPr>
+        <w:tc>
+          <w:tcPr>
+            <w:cnfStyle w:val="001000000000" w:firstRow="0" w:lastRow="0" w:firstColumn="1" w:lastColumn="0" w:oddVBand="0" w:evenVBand="0" w:oddHBand="0" w:evenHBand="0" w:firstRowFirstColumn="0" w:firstRowLastColumn="0" w:lastRowFirstColumn="0" w:lastRowLastColumn="0"/>
+            <w:tcW w:w="1806" w:type="dxa"/>
           </w:tcPr>
           <w:p>
             <w:r>
@@ -15835,9 +16926,12 @@
         </w:tc>
         <w:tc>
           <w:tcPr>
-            <w:tcW w:type="dxa" w:w="1806"/>
-          </w:tcPr>
-          <w:p>
+            <w:tcW w:w="1806" w:type="dxa"/>
+          </w:tcPr>
+          <w:p>
+            <w:pPr>
+              <w:cnfStyle w:val="000000010000" w:firstRow="0" w:lastRow="0" w:firstColumn="0" w:lastColumn="0" w:oddVBand="0" w:evenVBand="0" w:oddHBand="0" w:evenHBand="1" w:firstRowFirstColumn="0" w:firstRowLastColumn="0" w:lastRowFirstColumn="0" w:lastRowLastColumn="0"/>
+            </w:pPr>
             <w:r>
               <w:rPr>
                 <w:sz w:val="16"/>
@@ -15848,9 +16942,12 @@
         </w:tc>
         <w:tc>
           <w:tcPr>
-            <w:tcW w:type="dxa" w:w="1806"/>
-          </w:tcPr>
-          <w:p>
+            <w:tcW w:w="1806" w:type="dxa"/>
+          </w:tcPr>
+          <w:p>
+            <w:pPr>
+              <w:cnfStyle w:val="000000010000" w:firstRow="0" w:lastRow="0" w:firstColumn="0" w:lastColumn="0" w:oddVBand="0" w:evenVBand="0" w:oddHBand="0" w:evenHBand="1" w:firstRowFirstColumn="0" w:firstRowLastColumn="0" w:lastRowFirstColumn="0" w:lastRowLastColumn="0"/>
+            </w:pPr>
             <w:r>
               <w:rPr>
                 <w:sz w:val="16"/>
@@ -15861,9 +16958,12 @@
         </w:tc>
         <w:tc>
           <w:tcPr>
-            <w:tcW w:type="dxa" w:w="1806"/>
-          </w:tcPr>
-          <w:p>
+            <w:tcW w:w="1806" w:type="dxa"/>
+          </w:tcPr>
+          <w:p>
+            <w:pPr>
+              <w:cnfStyle w:val="000000010000" w:firstRow="0" w:lastRow="0" w:firstColumn="0" w:lastColumn="0" w:oddVBand="0" w:evenVBand="0" w:oddHBand="0" w:evenHBand="1" w:firstRowFirstColumn="0" w:firstRowLastColumn="0" w:lastRowFirstColumn="0" w:lastRowLastColumn="0"/>
+            </w:pPr>
             <w:r>
               <w:rPr>
                 <w:sz w:val="16"/>
@@ -15874,9 +16974,12 @@
         </w:tc>
         <w:tc>
           <w:tcPr>
-            <w:tcW w:type="dxa" w:w="1806"/>
-          </w:tcPr>
-          <w:p>
+            <w:tcW w:w="1806" w:type="dxa"/>
+          </w:tcPr>
+          <w:p>
+            <w:pPr>
+              <w:cnfStyle w:val="000000010000" w:firstRow="0" w:lastRow="0" w:firstColumn="0" w:lastColumn="0" w:oddVBand="0" w:evenVBand="0" w:oddHBand="0" w:evenHBand="1" w:firstRowFirstColumn="0" w:firstRowLastColumn="0" w:lastRowFirstColumn="0" w:lastRowLastColumn="0"/>
+            </w:pPr>
             <w:r>
               <w:rPr>
                 <w:sz w:val="16"/>
@@ -15899,13 +17002,14 @@
       <w:r>
         <w:t xml:space="preserve">Table </w:t>
       </w:r>
-      <w:r>
-        <w:fldChar w:fldCharType="begin"/>
-        <w:instrText xml:space="preserve"> SEQ Table \* ARABIC </w:instrText>
-        <w:fldChar w:fldCharType="separate"/>
-        <w:t>1</w:t>
-        <w:fldChar w:fldCharType="end"/>
-      </w:r>
+      <w:fldSimple w:instr=" SEQ Table \* ARABIC ">
+        <w:r>
+          <w:rPr>
+            <w:noProof/>
+          </w:rPr>
+          <w:t>13</w:t>
+        </w:r>
+      </w:fldSimple>
       <w:r>
         <w:t>: These funds on an expanding window against the Sharpe ratios published by the course reference implementation.</w:t>
       </w:r>
@@ -15913,8 +17017,8 @@
     <w:tbl>
       <w:tblPr>
         <w:tblStyle w:val="-11"/>
-        <w:tblW w:type="auto" w:w="0"/>
-        <w:tblLook w:firstColumn="1" w:firstRow="1" w:lastColumn="0" w:lastRow="0" w:noHBand="0" w:noVBand="1" w:val="04A0"/>
+        <w:tblW w:w="0" w:type="auto"/>
+        <w:tblLook w:val="04A0" w:firstRow="1" w:lastRow="0" w:firstColumn="1" w:lastColumn="0" w:noHBand="0" w:noVBand="1"/>
       </w:tblPr>
       <w:tblGrid>
         <w:gridCol w:w="2257"/>
@@ -15923,28 +17027,34 @@
         <w:gridCol w:w="2257"/>
       </w:tblGrid>
       <w:tr>
-        <w:tc>
-          <w:tcPr>
-            <w:tcW w:type="dxa" w:w="2257"/>
-          </w:tcPr>
-          <w:p>
-            <w:r>
-              <w:rPr>
-                <w:b/>
-                <w:sz w:val="16"/>
-              </w:rPr>
+        <w:trPr>
+          <w:cnfStyle w:val="100000000000" w:firstRow="1" w:lastRow="0" w:firstColumn="0" w:lastColumn="0" w:oddVBand="0" w:evenVBand="0" w:oddHBand="0" w:evenHBand="0" w:firstRowFirstColumn="0" w:firstRowLastColumn="0" w:lastRowFirstColumn="0" w:lastRowLastColumn="0"/>
+        </w:trPr>
+        <w:tc>
+          <w:tcPr>
+            <w:cnfStyle w:val="001000000000" w:firstRow="0" w:lastRow="0" w:firstColumn="1" w:lastColumn="0" w:oddVBand="0" w:evenVBand="0" w:oddHBand="0" w:evenHBand="0" w:firstRowFirstColumn="0" w:firstRowLastColumn="0" w:lastRowFirstColumn="0" w:lastRowLastColumn="0"/>
+            <w:tcW w:w="2257" w:type="dxa"/>
+          </w:tcPr>
+          <w:p>
+            <w:r>
+              <w:rPr>
+                <w:sz w:val="16"/>
+              </w:rPr>
+              <w:lastRenderedPageBreak/>
               <w:t>Fund</w:t>
             </w:r>
           </w:p>
         </w:tc>
         <w:tc>
           <w:tcPr>
-            <w:tcW w:type="dxa" w:w="2257"/>
-          </w:tcPr>
-          <w:p>
-            <w:r>
-              <w:rPr>
-                <w:b/>
+            <w:tcW w:w="2257" w:type="dxa"/>
+          </w:tcPr>
+          <w:p>
+            <w:pPr>
+              <w:cnfStyle w:val="100000000000" w:firstRow="1" w:lastRow="0" w:firstColumn="0" w:lastColumn="0" w:oddVBand="0" w:evenVBand="0" w:oddHBand="0" w:evenHBand="0" w:firstRowFirstColumn="0" w:firstRowLastColumn="0" w:lastRowFirstColumn="0" w:lastRowLastColumn="0"/>
+            </w:pPr>
+            <w:r>
+              <w:rPr>
                 <w:sz w:val="16"/>
               </w:rPr>
               <w:t>Reference</w:t>
@@ -15953,12 +17063,14 @@
         </w:tc>
         <w:tc>
           <w:tcPr>
-            <w:tcW w:type="dxa" w:w="2257"/>
-          </w:tcPr>
-          <w:p>
-            <w:r>
-              <w:rPr>
-                <w:b/>
+            <w:tcW w:w="2257" w:type="dxa"/>
+          </w:tcPr>
+          <w:p>
+            <w:pPr>
+              <w:cnfStyle w:val="100000000000" w:firstRow="1" w:lastRow="0" w:firstColumn="0" w:lastColumn="0" w:oddVBand="0" w:evenVBand="0" w:oddHBand="0" w:evenHBand="0" w:firstRowFirstColumn="0" w:firstRowLastColumn="0" w:lastRowFirstColumn="0" w:lastRowLastColumn="0"/>
+            </w:pPr>
+            <w:r>
+              <w:rPr>
                 <w:sz w:val="16"/>
               </w:rPr>
               <w:t>This project, expanding</w:t>
@@ -15967,12 +17079,14 @@
         </w:tc>
         <w:tc>
           <w:tcPr>
-            <w:tcW w:type="dxa" w:w="2257"/>
-          </w:tcPr>
-          <w:p>
-            <w:r>
-              <w:rPr>
-                <w:b/>
+            <w:tcW w:w="2257" w:type="dxa"/>
+          </w:tcPr>
+          <w:p>
+            <w:pPr>
+              <w:cnfStyle w:val="100000000000" w:firstRow="1" w:lastRow="0" w:firstColumn="0" w:lastColumn="0" w:oddVBand="0" w:evenVBand="0" w:oddHBand="0" w:evenHBand="0" w:firstRowFirstColumn="0" w:firstRowLastColumn="0" w:lastRowFirstColumn="0" w:lastRowLastColumn="0"/>
+            </w:pPr>
+            <w:r>
+              <w:rPr>
                 <w:sz w:val="16"/>
               </w:rPr>
               <w:t>Difference</w:t>
@@ -15981,9 +17095,13 @@
         </w:tc>
       </w:tr>
       <w:tr>
-        <w:tc>
-          <w:tcPr>
-            <w:tcW w:type="dxa" w:w="2257"/>
+        <w:trPr>
+          <w:cnfStyle w:val="000000100000" w:firstRow="0" w:lastRow="0" w:firstColumn="0" w:lastColumn="0" w:oddVBand="0" w:evenVBand="0" w:oddHBand="1" w:evenHBand="0" w:firstRowFirstColumn="0" w:firstRowLastColumn="0" w:lastRowFirstColumn="0" w:lastRowLastColumn="0"/>
+        </w:trPr>
+        <w:tc>
+          <w:tcPr>
+            <w:cnfStyle w:val="001000000000" w:firstRow="0" w:lastRow="0" w:firstColumn="1" w:lastColumn="0" w:oddVBand="0" w:evenVBand="0" w:oddHBand="0" w:evenHBand="0" w:firstRowFirstColumn="0" w:firstRowLastColumn="0" w:lastRowFirstColumn="0" w:lastRowLastColumn="0"/>
+            <w:tcW w:w="2257" w:type="dxa"/>
           </w:tcPr>
           <w:p>
             <w:r>
@@ -15996,9 +17114,12 @@
         </w:tc>
         <w:tc>
           <w:tcPr>
-            <w:tcW w:type="dxa" w:w="2257"/>
-          </w:tcPr>
-          <w:p>
+            <w:tcW w:w="2257" w:type="dxa"/>
+          </w:tcPr>
+          <w:p>
+            <w:pPr>
+              <w:cnfStyle w:val="000000100000" w:firstRow="0" w:lastRow="0" w:firstColumn="0" w:lastColumn="0" w:oddVBand="0" w:evenVBand="0" w:oddHBand="1" w:evenHBand="0" w:firstRowFirstColumn="0" w:firstRowLastColumn="0" w:lastRowFirstColumn="0" w:lastRowLastColumn="0"/>
+            </w:pPr>
             <w:r>
               <w:rPr>
                 <w:sz w:val="16"/>
@@ -16009,9 +17130,12 @@
         </w:tc>
         <w:tc>
           <w:tcPr>
-            <w:tcW w:type="dxa" w:w="2257"/>
-          </w:tcPr>
-          <w:p>
+            <w:tcW w:w="2257" w:type="dxa"/>
+          </w:tcPr>
+          <w:p>
+            <w:pPr>
+              <w:cnfStyle w:val="000000100000" w:firstRow="0" w:lastRow="0" w:firstColumn="0" w:lastColumn="0" w:oddVBand="0" w:evenVBand="0" w:oddHBand="1" w:evenHBand="0" w:firstRowFirstColumn="0" w:firstRowLastColumn="0" w:lastRowFirstColumn="0" w:lastRowLastColumn="0"/>
+            </w:pPr>
             <w:r>
               <w:rPr>
                 <w:sz w:val="16"/>
@@ -16022,9 +17146,12 @@
         </w:tc>
         <w:tc>
           <w:tcPr>
-            <w:tcW w:type="dxa" w:w="2257"/>
-          </w:tcPr>
-          <w:p>
+            <w:tcW w:w="2257" w:type="dxa"/>
+          </w:tcPr>
+          <w:p>
+            <w:pPr>
+              <w:cnfStyle w:val="000000100000" w:firstRow="0" w:lastRow="0" w:firstColumn="0" w:lastColumn="0" w:oddVBand="0" w:evenVBand="0" w:oddHBand="1" w:evenHBand="0" w:firstRowFirstColumn="0" w:firstRowLastColumn="0" w:lastRowFirstColumn="0" w:lastRowLastColumn="0"/>
+            </w:pPr>
             <w:r>
               <w:rPr>
                 <w:sz w:val="16"/>
@@ -16035,9 +17162,13 @@
         </w:tc>
       </w:tr>
       <w:tr>
-        <w:tc>
-          <w:tcPr>
-            <w:tcW w:type="dxa" w:w="2257"/>
+        <w:trPr>
+          <w:cnfStyle w:val="000000010000" w:firstRow="0" w:lastRow="0" w:firstColumn="0" w:lastColumn="0" w:oddVBand="0" w:evenVBand="0" w:oddHBand="0" w:evenHBand="1" w:firstRowFirstColumn="0" w:firstRowLastColumn="0" w:lastRowFirstColumn="0" w:lastRowLastColumn="0"/>
+        </w:trPr>
+        <w:tc>
+          <w:tcPr>
+            <w:cnfStyle w:val="001000000000" w:firstRow="0" w:lastRow="0" w:firstColumn="1" w:lastColumn="0" w:oddVBand="0" w:evenVBand="0" w:oddHBand="0" w:evenHBand="0" w:firstRowFirstColumn="0" w:firstRowLastColumn="0" w:lastRowFirstColumn="0" w:lastRowLastColumn="0"/>
+            <w:tcW w:w="2257" w:type="dxa"/>
           </w:tcPr>
           <w:p>
             <w:r>
@@ -16050,9 +17181,12 @@
         </w:tc>
         <w:tc>
           <w:tcPr>
-            <w:tcW w:type="dxa" w:w="2257"/>
-          </w:tcPr>
-          <w:p>
+            <w:tcW w:w="2257" w:type="dxa"/>
+          </w:tcPr>
+          <w:p>
+            <w:pPr>
+              <w:cnfStyle w:val="000000010000" w:firstRow="0" w:lastRow="0" w:firstColumn="0" w:lastColumn="0" w:oddVBand="0" w:evenVBand="0" w:oddHBand="0" w:evenHBand="1" w:firstRowFirstColumn="0" w:firstRowLastColumn="0" w:lastRowFirstColumn="0" w:lastRowLastColumn="0"/>
+            </w:pPr>
             <w:r>
               <w:rPr>
                 <w:sz w:val="16"/>
@@ -16063,9 +17197,12 @@
         </w:tc>
         <w:tc>
           <w:tcPr>
-            <w:tcW w:type="dxa" w:w="2257"/>
-          </w:tcPr>
-          <w:p>
+            <w:tcW w:w="2257" w:type="dxa"/>
+          </w:tcPr>
+          <w:p>
+            <w:pPr>
+              <w:cnfStyle w:val="000000010000" w:firstRow="0" w:lastRow="0" w:firstColumn="0" w:lastColumn="0" w:oddVBand="0" w:evenVBand="0" w:oddHBand="0" w:evenHBand="1" w:firstRowFirstColumn="0" w:firstRowLastColumn="0" w:lastRowFirstColumn="0" w:lastRowLastColumn="0"/>
+            </w:pPr>
             <w:r>
               <w:rPr>
                 <w:sz w:val="16"/>
@@ -16076,9 +17213,12 @@
         </w:tc>
         <w:tc>
           <w:tcPr>
-            <w:tcW w:type="dxa" w:w="2257"/>
-          </w:tcPr>
-          <w:p>
+            <w:tcW w:w="2257" w:type="dxa"/>
+          </w:tcPr>
+          <w:p>
+            <w:pPr>
+              <w:cnfStyle w:val="000000010000" w:firstRow="0" w:lastRow="0" w:firstColumn="0" w:lastColumn="0" w:oddVBand="0" w:evenVBand="0" w:oddHBand="0" w:evenHBand="1" w:firstRowFirstColumn="0" w:firstRowLastColumn="0" w:lastRowFirstColumn="0" w:lastRowLastColumn="0"/>
+            </w:pPr>
             <w:r>
               <w:rPr>
                 <w:sz w:val="16"/>
@@ -16089,9 +17229,13 @@
         </w:tc>
       </w:tr>
       <w:tr>
-        <w:tc>
-          <w:tcPr>
-            <w:tcW w:type="dxa" w:w="2257"/>
+        <w:trPr>
+          <w:cnfStyle w:val="000000100000" w:firstRow="0" w:lastRow="0" w:firstColumn="0" w:lastColumn="0" w:oddVBand="0" w:evenVBand="0" w:oddHBand="1" w:evenHBand="0" w:firstRowFirstColumn="0" w:firstRowLastColumn="0" w:lastRowFirstColumn="0" w:lastRowLastColumn="0"/>
+        </w:trPr>
+        <w:tc>
+          <w:tcPr>
+            <w:cnfStyle w:val="001000000000" w:firstRow="0" w:lastRow="0" w:firstColumn="1" w:lastColumn="0" w:oddVBand="0" w:evenVBand="0" w:oddHBand="0" w:evenHBand="0" w:firstRowFirstColumn="0" w:firstRowLastColumn="0" w:lastRowFirstColumn="0" w:lastRowLastColumn="0"/>
+            <w:tcW w:w="2257" w:type="dxa"/>
           </w:tcPr>
           <w:p>
             <w:r>
@@ -16104,9 +17248,12 @@
         </w:tc>
         <w:tc>
           <w:tcPr>
-            <w:tcW w:type="dxa" w:w="2257"/>
-          </w:tcPr>
-          <w:p>
+            <w:tcW w:w="2257" w:type="dxa"/>
+          </w:tcPr>
+          <w:p>
+            <w:pPr>
+              <w:cnfStyle w:val="000000100000" w:firstRow="0" w:lastRow="0" w:firstColumn="0" w:lastColumn="0" w:oddVBand="0" w:evenVBand="0" w:oddHBand="1" w:evenHBand="0" w:firstRowFirstColumn="0" w:firstRowLastColumn="0" w:lastRowFirstColumn="0" w:lastRowLastColumn="0"/>
+            </w:pPr>
             <w:r>
               <w:rPr>
                 <w:sz w:val="16"/>
@@ -16117,9 +17264,12 @@
         </w:tc>
         <w:tc>
           <w:tcPr>
-            <w:tcW w:type="dxa" w:w="2257"/>
-          </w:tcPr>
-          <w:p>
+            <w:tcW w:w="2257" w:type="dxa"/>
+          </w:tcPr>
+          <w:p>
+            <w:pPr>
+              <w:cnfStyle w:val="000000100000" w:firstRow="0" w:lastRow="0" w:firstColumn="0" w:lastColumn="0" w:oddVBand="0" w:evenVBand="0" w:oddHBand="1" w:evenHBand="0" w:firstRowFirstColumn="0" w:firstRowLastColumn="0" w:lastRowFirstColumn="0" w:lastRowLastColumn="0"/>
+            </w:pPr>
             <w:r>
               <w:rPr>
                 <w:sz w:val="16"/>
@@ -16130,9 +17280,12 @@
         </w:tc>
         <w:tc>
           <w:tcPr>
-            <w:tcW w:type="dxa" w:w="2257"/>
-          </w:tcPr>
-          <w:p>
+            <w:tcW w:w="2257" w:type="dxa"/>
+          </w:tcPr>
+          <w:p>
+            <w:pPr>
+              <w:cnfStyle w:val="000000100000" w:firstRow="0" w:lastRow="0" w:firstColumn="0" w:lastColumn="0" w:oddVBand="0" w:evenVBand="0" w:oddHBand="1" w:evenHBand="0" w:firstRowFirstColumn="0" w:firstRowLastColumn="0" w:lastRowFirstColumn="0" w:lastRowLastColumn="0"/>
+            </w:pPr>
             <w:r>
               <w:rPr>
                 <w:sz w:val="16"/>
@@ -16143,9 +17296,13 @@
         </w:tc>
       </w:tr>
       <w:tr>
-        <w:tc>
-          <w:tcPr>
-            <w:tcW w:type="dxa" w:w="2257"/>
+        <w:trPr>
+          <w:cnfStyle w:val="000000010000" w:firstRow="0" w:lastRow="0" w:firstColumn="0" w:lastColumn="0" w:oddVBand="0" w:evenVBand="0" w:oddHBand="0" w:evenHBand="1" w:firstRowFirstColumn="0" w:firstRowLastColumn="0" w:lastRowFirstColumn="0" w:lastRowLastColumn="0"/>
+        </w:trPr>
+        <w:tc>
+          <w:tcPr>
+            <w:cnfStyle w:val="001000000000" w:firstRow="0" w:lastRow="0" w:firstColumn="1" w:lastColumn="0" w:oddVBand="0" w:evenVBand="0" w:oddHBand="0" w:evenHBand="0" w:firstRowFirstColumn="0" w:firstRowLastColumn="0" w:lastRowFirstColumn="0" w:lastRowLastColumn="0"/>
+            <w:tcW w:w="2257" w:type="dxa"/>
           </w:tcPr>
           <w:p>
             <w:r>
@@ -16158,9 +17315,12 @@
         </w:tc>
         <w:tc>
           <w:tcPr>
-            <w:tcW w:type="dxa" w:w="2257"/>
-          </w:tcPr>
-          <w:p>
+            <w:tcW w:w="2257" w:type="dxa"/>
+          </w:tcPr>
+          <w:p>
+            <w:pPr>
+              <w:cnfStyle w:val="000000010000" w:firstRow="0" w:lastRow="0" w:firstColumn="0" w:lastColumn="0" w:oddVBand="0" w:evenVBand="0" w:oddHBand="0" w:evenHBand="1" w:firstRowFirstColumn="0" w:firstRowLastColumn="0" w:lastRowFirstColumn="0" w:lastRowLastColumn="0"/>
+            </w:pPr>
             <w:r>
               <w:rPr>
                 <w:sz w:val="16"/>
@@ -16171,9 +17331,12 @@
         </w:tc>
         <w:tc>
           <w:tcPr>
-            <w:tcW w:type="dxa" w:w="2257"/>
-          </w:tcPr>
-          <w:p>
+            <w:tcW w:w="2257" w:type="dxa"/>
+          </w:tcPr>
+          <w:p>
+            <w:pPr>
+              <w:cnfStyle w:val="000000010000" w:firstRow="0" w:lastRow="0" w:firstColumn="0" w:lastColumn="0" w:oddVBand="0" w:evenVBand="0" w:oddHBand="0" w:evenHBand="1" w:firstRowFirstColumn="0" w:firstRowLastColumn="0" w:lastRowFirstColumn="0" w:lastRowLastColumn="0"/>
+            </w:pPr>
             <w:r>
               <w:rPr>
                 <w:sz w:val="16"/>
@@ -16184,9 +17347,12 @@
         </w:tc>
         <w:tc>
           <w:tcPr>
-            <w:tcW w:type="dxa" w:w="2257"/>
-          </w:tcPr>
-          <w:p>
+            <w:tcW w:w="2257" w:type="dxa"/>
+          </w:tcPr>
+          <w:p>
+            <w:pPr>
+              <w:cnfStyle w:val="000000010000" w:firstRow="0" w:lastRow="0" w:firstColumn="0" w:lastColumn="0" w:oddVBand="0" w:evenVBand="0" w:oddHBand="0" w:evenHBand="1" w:firstRowFirstColumn="0" w:firstRowLastColumn="0" w:lastRowFirstColumn="0" w:lastRowLastColumn="0"/>
+            </w:pPr>
             <w:r>
               <w:rPr>
                 <w:sz w:val="16"/>
@@ -16197,9 +17363,13 @@
         </w:tc>
       </w:tr>
       <w:tr>
-        <w:tc>
-          <w:tcPr>
-            <w:tcW w:type="dxa" w:w="2257"/>
+        <w:trPr>
+          <w:cnfStyle w:val="000000100000" w:firstRow="0" w:lastRow="0" w:firstColumn="0" w:lastColumn="0" w:oddVBand="0" w:evenVBand="0" w:oddHBand="1" w:evenHBand="0" w:firstRowFirstColumn="0" w:firstRowLastColumn="0" w:lastRowFirstColumn="0" w:lastRowLastColumn="0"/>
+        </w:trPr>
+        <w:tc>
+          <w:tcPr>
+            <w:cnfStyle w:val="001000000000" w:firstRow="0" w:lastRow="0" w:firstColumn="1" w:lastColumn="0" w:oddVBand="0" w:evenVBand="0" w:oddHBand="0" w:evenHBand="0" w:firstRowFirstColumn="0" w:firstRowLastColumn="0" w:lastRowFirstColumn="0" w:lastRowLastColumn="0"/>
+            <w:tcW w:w="2257" w:type="dxa"/>
           </w:tcPr>
           <w:p>
             <w:r>
@@ -16212,9 +17382,12 @@
         </w:tc>
         <w:tc>
           <w:tcPr>
-            <w:tcW w:type="dxa" w:w="2257"/>
-          </w:tcPr>
-          <w:p>
+            <w:tcW w:w="2257" w:type="dxa"/>
+          </w:tcPr>
+          <w:p>
+            <w:pPr>
+              <w:cnfStyle w:val="000000100000" w:firstRow="0" w:lastRow="0" w:firstColumn="0" w:lastColumn="0" w:oddVBand="0" w:evenVBand="0" w:oddHBand="1" w:evenHBand="0" w:firstRowFirstColumn="0" w:firstRowLastColumn="0" w:lastRowFirstColumn="0" w:lastRowLastColumn="0"/>
+            </w:pPr>
             <w:r>
               <w:rPr>
                 <w:sz w:val="16"/>
@@ -16225,9 +17398,12 @@
         </w:tc>
         <w:tc>
           <w:tcPr>
-            <w:tcW w:type="dxa" w:w="2257"/>
-          </w:tcPr>
-          <w:p>
+            <w:tcW w:w="2257" w:type="dxa"/>
+          </w:tcPr>
+          <w:p>
+            <w:pPr>
+              <w:cnfStyle w:val="000000100000" w:firstRow="0" w:lastRow="0" w:firstColumn="0" w:lastColumn="0" w:oddVBand="0" w:evenVBand="0" w:oddHBand="1" w:evenHBand="0" w:firstRowFirstColumn="0" w:firstRowLastColumn="0" w:lastRowFirstColumn="0" w:lastRowLastColumn="0"/>
+            </w:pPr>
             <w:r>
               <w:rPr>
                 <w:sz w:val="16"/>
@@ -16238,9 +17414,12 @@
         </w:tc>
         <w:tc>
           <w:tcPr>
-            <w:tcW w:type="dxa" w:w="2257"/>
-          </w:tcPr>
-          <w:p>
+            <w:tcW w:w="2257" w:type="dxa"/>
+          </w:tcPr>
+          <w:p>
+            <w:pPr>
+              <w:cnfStyle w:val="000000100000" w:firstRow="0" w:lastRow="0" w:firstColumn="0" w:lastColumn="0" w:oddVBand="0" w:evenVBand="0" w:oddHBand="1" w:evenHBand="0" w:firstRowFirstColumn="0" w:firstRowLastColumn="0" w:lastRowFirstColumn="0" w:lastRowLastColumn="0"/>
+            </w:pPr>
             <w:r>
               <w:rPr>
                 <w:sz w:val="16"/>
@@ -16251,9 +17430,13 @@
         </w:tc>
       </w:tr>
       <w:tr>
-        <w:tc>
-          <w:tcPr>
-            <w:tcW w:type="dxa" w:w="2257"/>
+        <w:trPr>
+          <w:cnfStyle w:val="000000010000" w:firstRow="0" w:lastRow="0" w:firstColumn="0" w:lastColumn="0" w:oddVBand="0" w:evenVBand="0" w:oddHBand="0" w:evenHBand="1" w:firstRowFirstColumn="0" w:firstRowLastColumn="0" w:lastRowFirstColumn="0" w:lastRowLastColumn="0"/>
+        </w:trPr>
+        <w:tc>
+          <w:tcPr>
+            <w:cnfStyle w:val="001000000000" w:firstRow="0" w:lastRow="0" w:firstColumn="1" w:lastColumn="0" w:oddVBand="0" w:evenVBand="0" w:oddHBand="0" w:evenHBand="0" w:firstRowFirstColumn="0" w:firstRowLastColumn="0" w:lastRowFirstColumn="0" w:lastRowLastColumn="0"/>
+            <w:tcW w:w="2257" w:type="dxa"/>
           </w:tcPr>
           <w:p>
             <w:r>
@@ -16266,9 +17449,12 @@
         </w:tc>
         <w:tc>
           <w:tcPr>
-            <w:tcW w:type="dxa" w:w="2257"/>
-          </w:tcPr>
-          <w:p>
+            <w:tcW w:w="2257" w:type="dxa"/>
+          </w:tcPr>
+          <w:p>
+            <w:pPr>
+              <w:cnfStyle w:val="000000010000" w:firstRow="0" w:lastRow="0" w:firstColumn="0" w:lastColumn="0" w:oddVBand="0" w:evenVBand="0" w:oddHBand="0" w:evenHBand="1" w:firstRowFirstColumn="0" w:firstRowLastColumn="0" w:lastRowFirstColumn="0" w:lastRowLastColumn="0"/>
+            </w:pPr>
             <w:r>
               <w:rPr>
                 <w:sz w:val="16"/>
@@ -16279,9 +17465,12 @@
         </w:tc>
         <w:tc>
           <w:tcPr>
-            <w:tcW w:type="dxa" w:w="2257"/>
-          </w:tcPr>
-          <w:p>
+            <w:tcW w:w="2257" w:type="dxa"/>
+          </w:tcPr>
+          <w:p>
+            <w:pPr>
+              <w:cnfStyle w:val="000000010000" w:firstRow="0" w:lastRow="0" w:firstColumn="0" w:lastColumn="0" w:oddVBand="0" w:evenVBand="0" w:oddHBand="0" w:evenHBand="1" w:firstRowFirstColumn="0" w:firstRowLastColumn="0" w:lastRowFirstColumn="0" w:lastRowLastColumn="0"/>
+            </w:pPr>
             <w:r>
               <w:rPr>
                 <w:sz w:val="16"/>
@@ -16292,9 +17481,12 @@
         </w:tc>
         <w:tc>
           <w:tcPr>
-            <w:tcW w:type="dxa" w:w="2257"/>
-          </w:tcPr>
-          <w:p>
+            <w:tcW w:w="2257" w:type="dxa"/>
+          </w:tcPr>
+          <w:p>
+            <w:pPr>
+              <w:cnfStyle w:val="000000010000" w:firstRow="0" w:lastRow="0" w:firstColumn="0" w:lastColumn="0" w:oddVBand="0" w:evenVBand="0" w:oddHBand="0" w:evenHBand="1" w:firstRowFirstColumn="0" w:firstRowLastColumn="0" w:lastRowFirstColumn="0" w:lastRowLastColumn="0"/>
+            </w:pPr>
             <w:r>
               <w:rPr>
                 <w:sz w:val="16"/>
@@ -16305,6 +17497,7 @@
         </w:tc>
       </w:tr>
     </w:tbl>
+    <w:p/>
     <w:sectPr>
       <w:pgSz w:w="11909" w:h="16834"/>
       <w:pgMar w:top="1224" w:right="1440" w:bottom="1224" w:left="1440" w:header="720" w:footer="720" w:gutter="0"/>

</xml_diff>

<commit_message>
Replace the AGENTS.md placeholder
I use Claude Code, so AGENTS.md now points at the files that actually carry my
instructions - CLAUDE.md, .claude/rules, .claude/skills and ai/ - rather than
shipping the starter's unedited stub.

Co-Authored-By: Claude Opus 5 <noreply@anthropic.com>
</commit_message>
<xml_diff>
--- a/report/report.docx
+++ b/report/report.docx
@@ -24,7 +24,7 @@
       <w:pPr>
         <w:pStyle w:val="1"/>
       </w:pPr>
-      <w:bookmarkStart w:id="0" w:name="_Toc237443220"/>
+      <w:bookmarkStart w:id="0" w:name="_Toc237446604"/>
       <w:r>
         <w:t>Abstract</w:t>
       </w:r>
@@ -39,7 +39,7 @@
       <w:pPr>
         <w:pStyle w:val="1"/>
       </w:pPr>
-      <w:bookmarkStart w:id="1" w:name="_Toc237443221"/>
+      <w:bookmarkStart w:id="1" w:name="_Toc237446605"/>
       <w:r>
         <w:t>Contents</w:t>
       </w:r>
@@ -69,7 +69,7 @@
       <w:r>
         <w:fldChar w:fldCharType="separate"/>
       </w:r>
-      <w:hyperlink w:anchor="_Toc237443220" w:history="1">
+      <w:hyperlink w:anchor="_Toc237446604" w:history="1">
         <w:r>
           <w:rPr>
             <w:rStyle w:val="aff9"/>
@@ -96,7 +96,7 @@
             <w:noProof/>
             <w:webHidden/>
           </w:rPr>
-          <w:instrText xml:space="preserve"> PAGEREF _Toc237443220 \h </w:instrText>
+          <w:instrText xml:space="preserve"> PAGEREF _Toc237446604 \h </w:instrText>
         </w:r>
         <w:r>
           <w:rPr>
@@ -142,7 +142,7 @@
           <w14:ligatures w14:val="standardContextual"/>
         </w:rPr>
       </w:pPr>
-      <w:hyperlink w:anchor="_Toc237443221" w:history="1">
+      <w:hyperlink w:anchor="_Toc237446605" w:history="1">
         <w:r>
           <w:rPr>
             <w:rStyle w:val="aff9"/>
@@ -169,7 +169,7 @@
             <w:noProof/>
             <w:webHidden/>
           </w:rPr>
-          <w:instrText xml:space="preserve"> PAGEREF _Toc237443221 \h </w:instrText>
+          <w:instrText xml:space="preserve"> PAGEREF _Toc237446605 \h </w:instrText>
         </w:r>
         <w:r>
           <w:rPr>
@@ -215,7 +215,7 @@
           <w14:ligatures w14:val="standardContextual"/>
         </w:rPr>
       </w:pPr>
-      <w:hyperlink w:anchor="_Toc237443222" w:history="1">
+      <w:hyperlink w:anchor="_Toc237446606" w:history="1">
         <w:r>
           <w:rPr>
             <w:rStyle w:val="aff9"/>
@@ -242,7 +242,7 @@
             <w:noProof/>
             <w:webHidden/>
           </w:rPr>
-          <w:instrText xml:space="preserve"> PAGEREF _Toc237443222 \h </w:instrText>
+          <w:instrText xml:space="preserve"> PAGEREF _Toc237446606 \h </w:instrText>
         </w:r>
         <w:r>
           <w:rPr>
@@ -289,7 +289,7 @@
           <w14:ligatures w14:val="standardContextual"/>
         </w:rPr>
       </w:pPr>
-      <w:hyperlink w:anchor="_Toc237443223" w:history="1">
+      <w:hyperlink w:anchor="_Toc237446607" w:history="1">
         <w:r>
           <w:rPr>
             <w:rStyle w:val="aff9"/>
@@ -316,7 +316,7 @@
             <w:noProof/>
             <w:webHidden/>
           </w:rPr>
-          <w:instrText xml:space="preserve"> PAGEREF _Toc237443223 \h </w:instrText>
+          <w:instrText xml:space="preserve"> PAGEREF _Toc237446607 \h </w:instrText>
         </w:r>
         <w:r>
           <w:rPr>
@@ -362,7 +362,7 @@
           <w14:ligatures w14:val="standardContextual"/>
         </w:rPr>
       </w:pPr>
-      <w:hyperlink w:anchor="_Toc237443224" w:history="1">
+      <w:hyperlink w:anchor="_Toc237446608" w:history="1">
         <w:r>
           <w:rPr>
             <w:rStyle w:val="aff9"/>
@@ -389,7 +389,7 @@
             <w:noProof/>
             <w:webHidden/>
           </w:rPr>
-          <w:instrText xml:space="preserve"> PAGEREF _Toc237443224 \h </w:instrText>
+          <w:instrText xml:space="preserve"> PAGEREF _Toc237446608 \h </w:instrText>
         </w:r>
         <w:r>
           <w:rPr>
@@ -409,7 +409,7 @@
             <w:noProof/>
             <w:webHidden/>
           </w:rPr>
-          <w:t>4</w:t>
+          <w:t>3</w:t>
         </w:r>
         <w:r>
           <w:rPr>
@@ -435,7 +435,7 @@
           <w14:ligatures w14:val="standardContextual"/>
         </w:rPr>
       </w:pPr>
-      <w:hyperlink w:anchor="_Toc237443225" w:history="1">
+      <w:hyperlink w:anchor="_Toc237446609" w:history="1">
         <w:r>
           <w:rPr>
             <w:rStyle w:val="aff9"/>
@@ -462,7 +462,7 @@
             <w:noProof/>
             <w:webHidden/>
           </w:rPr>
-          <w:instrText xml:space="preserve"> PAGEREF _Toc237443225 \h </w:instrText>
+          <w:instrText xml:space="preserve"> PAGEREF _Toc237446609 \h </w:instrText>
         </w:r>
         <w:r>
           <w:rPr>
@@ -508,7 +508,7 @@
           <w14:ligatures w14:val="standardContextual"/>
         </w:rPr>
       </w:pPr>
-      <w:hyperlink w:anchor="_Toc237443226" w:history="1">
+      <w:hyperlink w:anchor="_Toc237446610" w:history="1">
         <w:r>
           <w:rPr>
             <w:rStyle w:val="aff9"/>
@@ -535,7 +535,7 @@
             <w:noProof/>
             <w:webHidden/>
           </w:rPr>
-          <w:instrText xml:space="preserve"> PAGEREF _Toc237443226 \h </w:instrText>
+          <w:instrText xml:space="preserve"> PAGEREF _Toc237446610 \h </w:instrText>
         </w:r>
         <w:r>
           <w:rPr>
@@ -582,7 +582,7 @@
           <w14:ligatures w14:val="standardContextual"/>
         </w:rPr>
       </w:pPr>
-      <w:hyperlink w:anchor="_Toc237443227" w:history="1">
+      <w:hyperlink w:anchor="_Toc237446611" w:history="1">
         <w:r>
           <w:rPr>
             <w:rStyle w:val="aff9"/>
@@ -609,7 +609,7 @@
             <w:noProof/>
             <w:webHidden/>
           </w:rPr>
-          <w:instrText xml:space="preserve"> PAGEREF _Toc237443227 \h </w:instrText>
+          <w:instrText xml:space="preserve"> PAGEREF _Toc237446611 \h </w:instrText>
         </w:r>
         <w:r>
           <w:rPr>
@@ -655,7 +655,7 @@
           <w14:ligatures w14:val="standardContextual"/>
         </w:rPr>
       </w:pPr>
-      <w:hyperlink w:anchor="_Toc237443228" w:history="1">
+      <w:hyperlink w:anchor="_Toc237446612" w:history="1">
         <w:r>
           <w:rPr>
             <w:rStyle w:val="aff9"/>
@@ -682,7 +682,7 @@
             <w:noProof/>
             <w:webHidden/>
           </w:rPr>
-          <w:instrText xml:space="preserve"> PAGEREF _Toc237443228 \h </w:instrText>
+          <w:instrText xml:space="preserve"> PAGEREF _Toc237446612 \h </w:instrText>
         </w:r>
         <w:r>
           <w:rPr>
@@ -729,7 +729,7 @@
           <w14:ligatures w14:val="standardContextual"/>
         </w:rPr>
       </w:pPr>
-      <w:hyperlink w:anchor="_Toc237443229" w:history="1">
+      <w:hyperlink w:anchor="_Toc237446613" w:history="1">
         <w:r>
           <w:rPr>
             <w:rStyle w:val="aff9"/>
@@ -756,7 +756,7 @@
             <w:noProof/>
             <w:webHidden/>
           </w:rPr>
-          <w:instrText xml:space="preserve"> PAGEREF _Toc237443229 \h </w:instrText>
+          <w:instrText xml:space="preserve"> PAGEREF _Toc237446613 \h </w:instrText>
         </w:r>
         <w:r>
           <w:rPr>
@@ -803,7 +803,7 @@
           <w14:ligatures w14:val="standardContextual"/>
         </w:rPr>
       </w:pPr>
-      <w:hyperlink w:anchor="_Toc237443230" w:history="1">
+      <w:hyperlink w:anchor="_Toc237446614" w:history="1">
         <w:r>
           <w:rPr>
             <w:rStyle w:val="aff9"/>
@@ -830,7 +830,7 @@
             <w:noProof/>
             <w:webHidden/>
           </w:rPr>
-          <w:instrText xml:space="preserve"> PAGEREF _Toc237443230 \h </w:instrText>
+          <w:instrText xml:space="preserve"> PAGEREF _Toc237446614 \h </w:instrText>
         </w:r>
         <w:r>
           <w:rPr>
@@ -877,7 +877,7 @@
           <w14:ligatures w14:val="standardContextual"/>
         </w:rPr>
       </w:pPr>
-      <w:hyperlink w:anchor="_Toc237443231" w:history="1">
+      <w:hyperlink w:anchor="_Toc237446615" w:history="1">
         <w:r>
           <w:rPr>
             <w:rStyle w:val="aff9"/>
@@ -904,7 +904,7 @@
             <w:noProof/>
             <w:webHidden/>
           </w:rPr>
-          <w:instrText xml:space="preserve"> PAGEREF _Toc237443231 \h </w:instrText>
+          <w:instrText xml:space="preserve"> PAGEREF _Toc237446615 \h </w:instrText>
         </w:r>
         <w:r>
           <w:rPr>
@@ -951,7 +951,7 @@
           <w14:ligatures w14:val="standardContextual"/>
         </w:rPr>
       </w:pPr>
-      <w:hyperlink w:anchor="_Toc237443232" w:history="1">
+      <w:hyperlink w:anchor="_Toc237446616" w:history="1">
         <w:r>
           <w:rPr>
             <w:rStyle w:val="aff9"/>
@@ -978,7 +978,7 @@
             <w:noProof/>
             <w:webHidden/>
           </w:rPr>
-          <w:instrText xml:space="preserve"> PAGEREF _Toc237443232 \h </w:instrText>
+          <w:instrText xml:space="preserve"> PAGEREF _Toc237446616 \h </w:instrText>
         </w:r>
         <w:r>
           <w:rPr>
@@ -1024,7 +1024,7 @@
           <w14:ligatures w14:val="standardContextual"/>
         </w:rPr>
       </w:pPr>
-      <w:hyperlink w:anchor="_Toc237443233" w:history="1">
+      <w:hyperlink w:anchor="_Toc237446617" w:history="1">
         <w:r>
           <w:rPr>
             <w:rStyle w:val="aff9"/>
@@ -1051,7 +1051,7 @@
             <w:noProof/>
             <w:webHidden/>
           </w:rPr>
-          <w:instrText xml:space="preserve"> PAGEREF _Toc237443233 \h </w:instrText>
+          <w:instrText xml:space="preserve"> PAGEREF _Toc237446617 \h </w:instrText>
         </w:r>
         <w:r>
           <w:rPr>
@@ -1097,7 +1097,7 @@
           <w14:ligatures w14:val="standardContextual"/>
         </w:rPr>
       </w:pPr>
-      <w:hyperlink w:anchor="_Toc237443234" w:history="1">
+      <w:hyperlink w:anchor="_Toc237446618" w:history="1">
         <w:r>
           <w:rPr>
             <w:rStyle w:val="aff9"/>
@@ -1124,7 +1124,7 @@
             <w:noProof/>
             <w:webHidden/>
           </w:rPr>
-          <w:instrText xml:space="preserve"> PAGEREF _Toc237443234 \h </w:instrText>
+          <w:instrText xml:space="preserve"> PAGEREF _Toc237446618 \h </w:instrText>
         </w:r>
         <w:r>
           <w:rPr>
@@ -1170,7 +1170,7 @@
           <w14:ligatures w14:val="standardContextual"/>
         </w:rPr>
       </w:pPr>
-      <w:hyperlink w:anchor="_Toc237443235" w:history="1">
+      <w:hyperlink w:anchor="_Toc237446619" w:history="1">
         <w:r>
           <w:rPr>
             <w:rStyle w:val="aff9"/>
@@ -1197,7 +1197,7 @@
             <w:noProof/>
             <w:webHidden/>
           </w:rPr>
-          <w:instrText xml:space="preserve"> PAGEREF _Toc237443235 \h </w:instrText>
+          <w:instrText xml:space="preserve"> PAGEREF _Toc237446619 \h </w:instrText>
         </w:r>
         <w:r>
           <w:rPr>
@@ -1243,7 +1243,7 @@
           <w14:ligatures w14:val="standardContextual"/>
         </w:rPr>
       </w:pPr>
-      <w:hyperlink w:anchor="_Toc237443236" w:history="1">
+      <w:hyperlink w:anchor="_Toc237446620" w:history="1">
         <w:r>
           <w:rPr>
             <w:rStyle w:val="aff9"/>
@@ -1270,7 +1270,7 @@
             <w:noProof/>
             <w:webHidden/>
           </w:rPr>
-          <w:instrText xml:space="preserve"> PAGEREF _Toc237443236 \h </w:instrText>
+          <w:instrText xml:space="preserve"> PAGEREF _Toc237446620 \h </w:instrText>
         </w:r>
         <w:r>
           <w:rPr>
@@ -1317,7 +1317,7 @@
           <w14:ligatures w14:val="standardContextual"/>
         </w:rPr>
       </w:pPr>
-      <w:hyperlink w:anchor="_Toc237443237" w:history="1">
+      <w:hyperlink w:anchor="_Toc237446621" w:history="1">
         <w:r>
           <w:rPr>
             <w:rStyle w:val="aff9"/>
@@ -1344,7 +1344,7 @@
             <w:noProof/>
             <w:webHidden/>
           </w:rPr>
-          <w:instrText xml:space="preserve"> PAGEREF _Toc237443237 \h </w:instrText>
+          <w:instrText xml:space="preserve"> PAGEREF _Toc237446621 \h </w:instrText>
         </w:r>
         <w:r>
           <w:rPr>
@@ -1391,7 +1391,7 @@
           <w14:ligatures w14:val="standardContextual"/>
         </w:rPr>
       </w:pPr>
-      <w:hyperlink w:anchor="_Toc237443238" w:history="1">
+      <w:hyperlink w:anchor="_Toc237446622" w:history="1">
         <w:r>
           <w:rPr>
             <w:rStyle w:val="aff9"/>
@@ -1418,7 +1418,7 @@
             <w:noProof/>
             <w:webHidden/>
           </w:rPr>
-          <w:instrText xml:space="preserve"> PAGEREF _Toc237443238 \h </w:instrText>
+          <w:instrText xml:space="preserve"> PAGEREF _Toc237446622 \h </w:instrText>
         </w:r>
         <w:r>
           <w:rPr>
@@ -1465,7 +1465,7 @@
           <w14:ligatures w14:val="standardContextual"/>
         </w:rPr>
       </w:pPr>
-      <w:hyperlink w:anchor="_Toc237443239" w:history="1">
+      <w:hyperlink w:anchor="_Toc237446623" w:history="1">
         <w:r>
           <w:rPr>
             <w:rStyle w:val="aff9"/>
@@ -1492,7 +1492,7 @@
             <w:noProof/>
             <w:webHidden/>
           </w:rPr>
-          <w:instrText xml:space="preserve"> PAGEREF _Toc237443239 \h </w:instrText>
+          <w:instrText xml:space="preserve"> PAGEREF _Toc237446623 \h </w:instrText>
         </w:r>
         <w:r>
           <w:rPr>
@@ -1539,7 +1539,7 @@
           <w14:ligatures w14:val="standardContextual"/>
         </w:rPr>
       </w:pPr>
-      <w:hyperlink w:anchor="_Toc237443240" w:history="1">
+      <w:hyperlink w:anchor="_Toc237446624" w:history="1">
         <w:r>
           <w:rPr>
             <w:rStyle w:val="aff9"/>
@@ -1566,7 +1566,7 @@
             <w:noProof/>
             <w:webHidden/>
           </w:rPr>
-          <w:instrText xml:space="preserve"> PAGEREF _Toc237443240 \h </w:instrText>
+          <w:instrText xml:space="preserve"> PAGEREF _Toc237446624 \h </w:instrText>
         </w:r>
         <w:r>
           <w:rPr>
@@ -1611,7 +1611,7 @@
       <w:pPr>
         <w:pStyle w:val="1"/>
       </w:pPr>
-      <w:bookmarkStart w:id="2" w:name="_Toc237443222"/>
+      <w:bookmarkStart w:id="2" w:name="_Toc237446606"/>
       <w:r>
         <w:t>1. The funds and the backtest design</w:t>
       </w:r>
@@ -1639,9 +1639,12 @@
     </w:p>
     <w:p>
       <w:r>
-        <w:t>Three design choices deserve defending. The estimation window rolls rather than expands, so the covariance matrix reflects the most recent year of trading rather than an average of the whole history, which trades a noisier estimate for responsiveness to a change in regime. Rebalancing monthly balances the same tension the other way: often enough to act on a changed covariance estimate, rarely enough not to pay for chasing noise. Long-only weights match what the product is and bound the damage an extreme estimate can do, since no weight can go below zero however attractive a short looks. Jagannathan and Ma (2003) show that a no-short-sale constraint acts on a minimum-variance problem in the same way as shrinking the most extreme covariance estimates, so the constraint buys statistical stability as well as investability. Appendix D tests that trade-off: an expanding window lifts the equity funds (+0.110 on minimum variance) and costs the flagship Combined Maximum-Sharpe fund 0.583, because it never forgets the crypto regime that ended in 2022.</w:t>
+        <w:t xml:space="preserve">Three design choices deserve defending. The estimation window rolls rather than expands, so the covariance matrix reflects the most recent year of trading rather than an average of the whole history, which trades a noisier estimate for responsiveness to a change in regime. Rebalancing monthly balances the same tension the other way: often enough to act on a changed covariance estimate, rarely enough not to pay for chasing noise. Long-only weights match what the product is and bound the damage an extreme estimate can do, since no weight can go below zero however attractive a short looks. Jagannathan and Ma (2003) show that a no-short-sale constraint acts on a minimum-variance problem in the same way as shrinking the most extreme covariance estimates, so the constraint buys statistical stability as well as </w:t>
       </w:r>
-      <w:r/>
+      <w:r>
+        <w:lastRenderedPageBreak/>
+        <w:t>investability. Appendix D tests that trade-off: an expanding window lifts the equity funds (+0.110 on minimum variance) and costs the flagship Combined Maximum-Sharpe fund 0.583, because it never forgets the crypto regime that ended in 2022.</w:t>
+      </w:r>
     </w:p>
     <w:p>
       <w:r>
@@ -1652,7 +1655,7 @@
       <w:pPr>
         <w:pStyle w:val="21"/>
       </w:pPr>
-      <w:bookmarkStart w:id="3" w:name="_Toc237443223"/>
+      <w:bookmarkStart w:id="3" w:name="_Toc237446607"/>
       <w:r>
         <w:t>How often the funds trade</w:t>
       </w:r>
@@ -1741,9 +1744,8 @@
       <w:pPr>
         <w:pStyle w:val="1"/>
       </w:pPr>
-      <w:bookmarkStart w:id="4" w:name="_Toc237443224"/>
+      <w:bookmarkStart w:id="4" w:name="_Toc237446608"/>
       <w:r>
-        <w:lastRenderedPageBreak/>
         <w:t>2. Out-of-sample results and fund fact sheets</w:t>
       </w:r>
       <w:bookmarkEnd w:id="4"/>
@@ -1795,6 +1797,7 @@
               <w:rPr>
                 <w:sz w:val="16"/>
               </w:rPr>
+              <w:lastRenderedPageBreak/>
               <w:t>fund</w:t>
             </w:r>
           </w:p>
@@ -3081,16 +3084,16 @@
     </w:p>
     <w:p>
       <w:r>
-        <w:t xml:space="preserve">How small is quantified by DeMiguel, Garlappi and Uppal (2009), who evaluate fourteen mean-variance models and their estimation-error corrections against 1/N across seven datasets and find none of them consistently better on Sharpe ratio, certainty-equivalent return or turnover. Calibrating to US equities, they estimate that a sample-based mean-variance strategy needs an estimation window of roughly 6,000 months to beat 1/N on a 50-asset portfolio. This fund holds 50 assets and estimates on 12 months. On their arithmetic the equity results here are not a </w:t>
-      </w:r>
-      <w:r>
-        <w:lastRenderedPageBreak/>
-        <w:t>surprising outcome but the expected one, and the question is less why optimisation lost than why anyone would have expected it to win at this sample size.</w:t>
+        <w:t>How small is quantified by DeMiguel, Garlappi and Uppal (2009), who evaluate fourteen mean-variance models and their estimation-error corrections against 1/N across seven datasets and find none of them consistently better on Sharpe ratio, certainty-equivalent return or turnover. Calibrating to US equities, they estimate that a sample-based mean-variance strategy needs an estimation window of roughly 6,000 months to beat 1/N on a 50-asset portfolio. This fund holds 50 assets and estimates on 12 months. On their arithmetic the equity results here are not a surprising outcome but the expected one, and the question is less why optimisation lost than why anyone would have expected it to win at this sample size.</w:t>
       </w:r>
     </w:p>
     <w:p>
       <w:r>
-        <w:t>The second force is not error at all. Minimum variance ranks last on the Sharpe ratio while achieving exactly what it was built to achieve: its 12.7% annualised volatility is the lowest of the four funds and its 15.3% maximum drawdown the shallowest. The objective never mentions return, so reading its last place as a failure of optimisation would be wrong. The fund solved its problem; the Sharpe ratio scores a different one.</w:t>
+        <w:t xml:space="preserve">The second force is not error at all. Minimum variance ranks last on the Sharpe ratio while achieving exactly what it was built to achieve: its 12.7% annualised volatility is the lowest of the </w:t>
+      </w:r>
+      <w:r>
+        <w:lastRenderedPageBreak/>
+        <w:t>four funds and its 15.3% maximum drawdown the shallowest. The objective never mentions return, so reading its last place as a failure of optimisation would be wrong. The fund solved its problem; the Sharpe ratio scores a different one.</w:t>
       </w:r>
     </w:p>
     <w:p>
@@ -3176,7 +3179,6 @@
       <w:r>
         <w:t>The lines separate in the first quarter of 2021 and never reconverge. Maximum Sharpe pulls away early because its concentration paid during the crypto rally, keeps most of that lead through the 2022 drawdown, and ends well ahead. The path matters as much as the endpoint: the fund that ends highest also fell furthest, so choosing between it and risk parity is a choice about tolerance rather than about which manager is better.</w:t>
       </w:r>
-      <w:r/>
     </w:p>
     <w:p>
       <w:pPr>
@@ -3186,6 +3188,7 @@
         <w:rPr>
           <w:noProof/>
         </w:rPr>
+        <w:lastRenderedPageBreak/>
         <w:drawing>
           <wp:inline distT="0" distB="0" distL="0" distR="0" wp14:anchorId="31A6536A" wp14:editId="54DAE598">
             <wp:extent cx="5577840" cy="2847596"/>
@@ -3315,7 +3318,6 @@
       <w:r>
         <w:t>The fund lost 25.8% from its peak and took most of a year to recover. An investor who bought at the high watched a quarter of their capital disappear before any of the eventual return arrived, which is what a Sharpe ratio of 0.98 conceals. The app's fact sheet therefore shows drawdown alongside the growth line: together they describe the product, and either alone misleads.</w:t>
       </w:r>
-      <w:r/>
     </w:p>
     <w:p>
       <w:pPr>
@@ -3325,6 +3327,7 @@
         <w:rPr>
           <w:noProof/>
         </w:rPr>
+        <w:lastRenderedPageBreak/>
         <w:drawing>
           <wp:inline distT="0" distB="0" distL="0" distR="0" wp14:anchorId="715D9A7E" wp14:editId="2EFCD64D">
             <wp:extent cx="5577840" cy="2914655"/>
@@ -3390,7 +3393,7 @@
       <w:pPr>
         <w:pStyle w:val="1"/>
       </w:pPr>
-      <w:bookmarkStart w:id="5" w:name="_Toc237443225"/>
+      <w:bookmarkStart w:id="5" w:name="_Toc237446609"/>
       <w:r>
         <w:t>3. The news-sentiment index</w:t>
       </w:r>
@@ -4686,7 +4689,7 @@
       <w:pPr>
         <w:pStyle w:val="1"/>
       </w:pPr>
-      <w:bookmarkStart w:id="6" w:name="_Toc237443226"/>
+      <w:bookmarkStart w:id="6" w:name="_Toc237446610"/>
       <w:r>
         <w:t>4. Fusion: does sentiment improve the funds?</w:t>
       </w:r>
@@ -5539,11 +5542,11 @@
     </w:tbl>
     <w:p>
       <w:r>
-        <w:t xml:space="preserve">The tilt makes both funds worse. Minimum variance falls from 0.479 to 0.457 and maximum Sharpe from 0.573 to 0.509, while turnover rises in both. That combination - lower return, higher </w:t>
+        <w:t xml:space="preserve">The tilt makes both funds worse. Minimum variance falls from 0.479 to 0.457 and maximum Sharpe from 0.573 to 0.509, while turnover rises in both. That combination - lower return, higher trading - is what a signal with no predictive content looks like when it is used to move weights: </w:t>
       </w:r>
       <w:r>
         <w:lastRenderedPageBreak/>
-        <w:t>trading - is what a signal with no predictive content looks like when it is used to move weights: the tilt adds noise to a portfolio that was already as good as its inputs allowed, and charges for the privilege.</w:t>
+        <w:t>the tilt adds noise to a portfolio that was already as good as its inputs allowed, and charges for the privilege.</w:t>
       </w:r>
     </w:p>
     <w:p>
@@ -6221,7 +6224,6 @@
               <w:rPr>
                 <w:sz w:val="16"/>
               </w:rPr>
-              <w:lastRenderedPageBreak/>
               <w:t>Comm</w:t>
             </w:r>
           </w:p>
@@ -6420,6 +6422,7 @@
               <w:rPr>
                 <w:sz w:val="16"/>
               </w:rPr>
+              <w:lastRenderedPageBreak/>
               <w:t>RealEstate</w:t>
             </w:r>
           </w:p>
@@ -8127,7 +8130,7 @@
       <w:pPr>
         <w:pStyle w:val="21"/>
       </w:pPr>
-      <w:bookmarkStart w:id="7" w:name="_Toc237443227"/>
+      <w:bookmarkStart w:id="7" w:name="_Toc237446611"/>
       <w:r>
         <w:t>Is the signal there at a slower frequency?</w:t>
       </w:r>
@@ -8301,7 +8304,6 @@
               <w:rPr>
                 <w:sz w:val="16"/>
               </w:rPr>
-              <w:lastRenderedPageBreak/>
               <w:t>1</w:t>
             </w:r>
           </w:p>
@@ -8433,7 +8435,14 @@
               <w:rPr>
                 <w:sz w:val="16"/>
               </w:rPr>
-              <w:t>cross-sectional</w:t>
+              <w:t>cross-</w:t>
+            </w:r>
+            <w:r>
+              <w:rPr>
+                <w:sz w:val="16"/>
+              </w:rPr>
+              <w:lastRenderedPageBreak/>
+              <w:t>sectional</w:t>
             </w:r>
           </w:p>
         </w:tc>
@@ -8449,6 +8458,7 @@
               <w:rPr>
                 <w:sz w:val="16"/>
               </w:rPr>
+              <w:lastRenderedPageBreak/>
               <w:t>9821</w:t>
             </w:r>
           </w:p>
@@ -9223,7 +9233,7 @@
       <w:pPr>
         <w:pStyle w:val="1"/>
       </w:pPr>
-      <w:bookmarkStart w:id="8" w:name="_Toc237443228"/>
+      <w:bookmarkStart w:id="8" w:name="_Toc237446612"/>
       <w:r>
         <w:t>5. Extensions</w:t>
       </w:r>
@@ -9233,7 +9243,7 @@
       <w:pPr>
         <w:pStyle w:val="21"/>
       </w:pPr>
-      <w:bookmarkStart w:id="9" w:name="_Toc237443229"/>
+      <w:bookmarkStart w:id="9" w:name="_Toc237446613"/>
       <w:r>
         <w:t>5.1 A finance lexicon for VADER</w:t>
       </w:r>
@@ -9294,7 +9304,6 @@
         <w:pStyle w:val="af7"/>
       </w:pPr>
       <w:r>
-        <w:lastRenderedPageBreak/>
         <w:t xml:space="preserve">Figure </w:t>
       </w:r>
       <w:fldSimple w:instr=" SEQ Figure \* ARABIC ">
@@ -9311,6 +9320,7 @@
     </w:p>
     <w:p>
       <w:r>
+        <w:lastRenderedPageBreak/>
         <w:t>The neutral share falls to 43.4% and 16.1% of headlines are rescored.</w:t>
       </w:r>
     </w:p>
@@ -9328,7 +9338,7 @@
       <w:pPr>
         <w:pStyle w:val="21"/>
       </w:pPr>
-      <w:bookmarkStart w:id="10" w:name="_Toc237443230"/>
+      <w:bookmarkStart w:id="10" w:name="_Toc237446614"/>
       <w:r>
         <w:t>5.2 A tilt that learns its own direction</w:t>
       </w:r>
@@ -10988,7 +10998,7 @@
       <w:pPr>
         <w:pStyle w:val="21"/>
       </w:pPr>
-      <w:bookmarkStart w:id="11" w:name="_Toc237443231"/>
+      <w:bookmarkStart w:id="11" w:name="_Toc237446615"/>
       <w:r>
         <w:t>5.3 Was the winner found or fitted?</w:t>
       </w:r>
@@ -12024,7 +12034,7 @@
       <w:pPr>
         <w:pStyle w:val="21"/>
       </w:pPr>
-      <w:bookmarkStart w:id="12" w:name="_Toc237443232"/>
+      <w:bookmarkStart w:id="12" w:name="_Toc237446616"/>
       <w:r>
         <w:t>5.4 Does correcting the covariance fix the result?</w:t>
       </w:r>
@@ -13370,7 +13380,7 @@
       <w:pPr>
         <w:pStyle w:val="1"/>
       </w:pPr>
-      <w:bookmarkStart w:id="13" w:name="_Toc237443233"/>
+      <w:bookmarkStart w:id="13" w:name="_Toc237446617"/>
       <w:r>
         <w:lastRenderedPageBreak/>
         <w:t>6. The app and the investor journey</w:t>
@@ -13406,7 +13416,7 @@
       <w:pPr>
         <w:pStyle w:val="1"/>
       </w:pPr>
-      <w:bookmarkStart w:id="14" w:name="_Toc237443234"/>
+      <w:bookmarkStart w:id="14" w:name="_Toc237446618"/>
       <w:r>
         <w:t>7. Critical reflection and recommendations</w:t>
       </w:r>
@@ -13429,6 +13439,7 @@
     </w:p>
     <w:p>
       <w:r>
+        <w:lastRenderedPageBreak/>
         <w:t>First, offer the adaptive sentiment tilt as an optional fund rather than as the default, and size the position to the strength of the evidence. The naive tilt should not ship at all: it makes both equity funds worse and charges turnover for it. The adaptive version is a different case - it improves both funds and ranks first on a holdout it was not chosen on, yet its bootstrap interval spans zero. Treating 'not established' as 'worthless' is as wrong as treating it as proven. I would hold it with part of my own money and not all of it, and the product should say exactly that: available, labelled with its evidence, never the default.</w:t>
       </w:r>
     </w:p>
@@ -13446,7 +13457,7 @@
       <w:pPr>
         <w:pStyle w:val="1"/>
       </w:pPr>
-      <w:bookmarkStart w:id="15" w:name="_Toc237443235"/>
+      <w:bookmarkStart w:id="15" w:name="_Toc237446619"/>
       <w:r>
         <w:t>References</w:t>
       </w:r>
@@ -13602,6 +13613,7 @@
         <w:ind w:left="567" w:hanging="567"/>
       </w:pPr>
       <w:r>
+        <w:lastRenderedPageBreak/>
         <w:t xml:space="preserve">Jagannathan, R &amp; Ma, T 2003, 'Risk reduction in large portfolios: why imposing the wrong constraints helps', </w:t>
       </w:r>
       <w:r>
@@ -13638,7 +13650,6 @@
         <w:ind w:left="567" w:hanging="567"/>
       </w:pPr>
       <w:r>
-        <w:lastRenderedPageBreak/>
         <w:t xml:space="preserve">Ledoit, O &amp; Wolf, M 2008, 'Robust performance hypothesis testing with the Sharpe ratio', </w:t>
       </w:r>
       <w:r>
@@ -13853,7 +13864,7 @@
       <w:pPr>
         <w:pStyle w:val="1"/>
       </w:pPr>
-      <w:bookmarkStart w:id="16" w:name="_Toc237443236"/>
+      <w:bookmarkStart w:id="16" w:name="_Toc237446620"/>
       <w:r>
         <w:t>Appendix</w:t>
       </w:r>
@@ -13863,7 +13874,7 @@
       <w:pPr>
         <w:pStyle w:val="21"/>
       </w:pPr>
-      <w:bookmarkStart w:id="17" w:name="_Toc237443237"/>
+      <w:bookmarkStart w:id="17" w:name="_Toc237446621"/>
       <w:r>
         <w:t>Appendix A - The four objectives</w:t>
       </w:r>
@@ -13879,6 +13890,74 @@
         <w:t>(1)  Equal weight:</w:t>
       </w:r>
       <m:oMath>
+        <m:sSub>
+          <m:sSubPr>
+            <m:ctrlPr>
+              <w:rPr>
+                <w:rFonts w:ascii="Cambria Math" w:hAnsi="Cambria Math"/>
+              </w:rPr>
+            </m:ctrlPr>
+          </m:sSubPr>
+          <m:e>
+            <m:r>
+              <w:rPr>
+                <w:rFonts w:ascii="Cambria Math" w:hAnsi="Cambria Math"/>
+              </w:rPr>
+              <m:t>w</m:t>
+            </m:r>
+          </m:e>
+          <m:sub>
+            <m:r>
+              <w:rPr>
+                <w:rFonts w:ascii="Cambria Math" w:hAnsi="Cambria Math"/>
+              </w:rPr>
+              <m:t>i</m:t>
+            </m:r>
+          </m:sub>
+        </m:sSub>
+        <m:r>
+          <m:rPr>
+            <m:nor/>
+          </m:rPr>
+          <m:t xml:space="preserve"> = </m:t>
+        </m:r>
+        <m:f>
+          <m:fPr>
+            <m:ctrlPr>
+              <w:rPr>
+                <w:rFonts w:ascii="Cambria Math" w:hAnsi="Cambria Math"/>
+              </w:rPr>
+            </m:ctrlPr>
+          </m:fPr>
+          <m:num>
+            <m:r>
+              <w:rPr>
+                <w:rFonts w:ascii="Cambria Math" w:hAnsi="Cambria Math"/>
+              </w:rPr>
+              <m:t>1</m:t>
+            </m:r>
+          </m:num>
+          <m:den>
+            <m:r>
+              <w:rPr>
+                <w:rFonts w:ascii="Cambria Math" w:hAnsi="Cambria Math"/>
+              </w:rPr>
+              <m:t>N</m:t>
+            </m:r>
+          </m:den>
+        </m:f>
+        <m:r>
+          <m:rPr>
+            <m:nor/>
+          </m:rPr>
+          <m:t xml:space="preserve">   for every asset </m:t>
+        </m:r>
+        <m:r>
+          <w:rPr>
+            <w:rFonts w:ascii="Cambria Math" w:hAnsi="Cambria Math"/>
+          </w:rPr>
+          <m:t>i</m:t>
+        </m:r>
         <m:sSub>
           <m:sSubPr>
             <m:ctrlPr>
@@ -13954,6 +14033,147 @@
         <w:t>(2)  Minimum variance:</w:t>
       </w:r>
       <m:oMath>
+        <m:sSub>
+          <m:sSubPr>
+            <m:ctrlPr>
+              <w:rPr>
+                <w:rFonts w:ascii="Cambria Math" w:hAnsi="Cambria Math"/>
+              </w:rPr>
+            </m:ctrlPr>
+          </m:sSubPr>
+          <m:e>
+            <m:r>
+              <m:rPr>
+                <m:nor/>
+              </m:rPr>
+              <m:t>min</m:t>
+            </m:r>
+          </m:e>
+          <m:sub>
+            <m:r>
+              <m:rPr>
+                <m:sty m:val="b"/>
+              </m:rPr>
+              <w:rPr>
+                <w:rFonts w:ascii="Cambria Math" w:hAnsi="Cambria Math"/>
+              </w:rPr>
+              <m:t>w</m:t>
+            </m:r>
+          </m:sub>
+        </m:sSub>
+        <m:r>
+          <m:rPr>
+            <m:nor/>
+          </m:rPr>
+          <m:t xml:space="preserve"> </m:t>
+        </m:r>
+        <m:sSup>
+          <m:sSupPr>
+            <m:ctrlPr>
+              <w:rPr>
+                <w:rFonts w:ascii="Cambria Math" w:hAnsi="Cambria Math"/>
+              </w:rPr>
+            </m:ctrlPr>
+          </m:sSupPr>
+          <m:e>
+            <m:r>
+              <m:rPr>
+                <m:sty m:val="b"/>
+              </m:rPr>
+              <w:rPr>
+                <w:rFonts w:ascii="Cambria Math" w:hAnsi="Cambria Math"/>
+              </w:rPr>
+              <m:t>w</m:t>
+            </m:r>
+          </m:e>
+          <m:sup>
+            <m:r>
+              <m:rPr>
+                <m:nor/>
+              </m:rPr>
+              <m:t>T</m:t>
+            </m:r>
+          </m:sup>
+        </m:sSup>
+        <m:r>
+          <m:rPr>
+            <m:sty m:val="b"/>
+          </m:rPr>
+          <w:rPr>
+            <w:rFonts w:ascii="Cambria Math" w:hAnsi="Cambria Math"/>
+          </w:rPr>
+          <m:t>Σw</m:t>
+        </m:r>
+        <m:r>
+          <m:rPr>
+            <m:nor/>
+          </m:rPr>
+          <m:t xml:space="preserve">   subject to   </m:t>
+        </m:r>
+        <m:sSup>
+          <m:sSupPr>
+            <m:ctrlPr>
+              <w:rPr>
+                <w:rFonts w:ascii="Cambria Math" w:hAnsi="Cambria Math"/>
+              </w:rPr>
+            </m:ctrlPr>
+          </m:sSupPr>
+          <m:e>
+            <m:r>
+              <m:rPr>
+                <m:sty m:val="b"/>
+              </m:rPr>
+              <w:rPr>
+                <w:rFonts w:ascii="Cambria Math" w:hAnsi="Cambria Math"/>
+              </w:rPr>
+              <m:t>1</m:t>
+            </m:r>
+          </m:e>
+          <m:sup>
+            <m:r>
+              <m:rPr>
+                <m:nor/>
+              </m:rPr>
+              <m:t>T</m:t>
+            </m:r>
+          </m:sup>
+        </m:sSup>
+        <m:r>
+          <m:rPr>
+            <m:sty m:val="b"/>
+          </m:rPr>
+          <w:rPr>
+            <w:rFonts w:ascii="Cambria Math" w:hAnsi="Cambria Math"/>
+          </w:rPr>
+          <m:t>w</m:t>
+        </m:r>
+        <m:r>
+          <m:rPr>
+            <m:nor/>
+          </m:rPr>
+          <m:t xml:space="preserve"> = 1, </m:t>
+        </m:r>
+        <m:r>
+          <m:rPr>
+            <m:sty m:val="b"/>
+          </m:rPr>
+          <w:rPr>
+            <w:rFonts w:ascii="Cambria Math" w:hAnsi="Cambria Math"/>
+          </w:rPr>
+          <m:t>w</m:t>
+        </m:r>
+        <m:r>
+          <m:rPr>
+            <m:nor/>
+          </m:rPr>
+          <m:t xml:space="preserve"> ≥ </m:t>
+        </m:r>
+        <m:r>
+          <w:rPr>
+            <w:rFonts w:ascii="Cambria Math" w:hAnsi="Cambria Math"/>
+          </w:rPr>
+          <m:t>0</m:t>
+        </m:r>
         <m:sSub>
           <m:sSubPr>
             <m:ctrlPr>
@@ -14099,9 +14319,245 @@
     </w:p>
     <w:p>
       <w:r>
+        <w:lastRenderedPageBreak/>
         <w:t>(3)  Maximum Sharpe:</w:t>
       </w:r>
       <m:oMath>
+        <m:sSub>
+          <m:sSubPr>
+            <m:ctrlPr>
+              <w:rPr>
+                <w:rFonts w:ascii="Cambria Math" w:hAnsi="Cambria Math"/>
+              </w:rPr>
+            </m:ctrlPr>
+          </m:sSubPr>
+          <m:e>
+            <m:r>
+              <m:rPr>
+                <m:nor/>
+              </m:rPr>
+              <m:t>max</m:t>
+            </m:r>
+          </m:e>
+          <m:sub>
+            <m:r>
+              <m:rPr>
+                <m:sty m:val="b"/>
+              </m:rPr>
+              <w:rPr>
+                <w:rFonts w:ascii="Cambria Math" w:hAnsi="Cambria Math"/>
+              </w:rPr>
+              <m:t>w</m:t>
+            </m:r>
+          </m:sub>
+        </m:sSub>
+        <m:r>
+          <m:rPr>
+            <m:nor/>
+          </m:rPr>
+          <m:t xml:space="preserve"> </m:t>
+        </m:r>
+        <m:f>
+          <m:fPr>
+            <m:ctrlPr>
+              <w:rPr>
+                <w:rFonts w:ascii="Cambria Math" w:hAnsi="Cambria Math"/>
+              </w:rPr>
+            </m:ctrlPr>
+          </m:fPr>
+          <m:num>
+            <m:sSup>
+              <m:sSupPr>
+                <m:ctrlPr>
+                  <w:rPr>
+                    <w:rFonts w:ascii="Cambria Math" w:hAnsi="Cambria Math"/>
+                  </w:rPr>
+                </m:ctrlPr>
+              </m:sSupPr>
+              <m:e>
+                <m:r>
+                  <m:rPr>
+                    <m:sty m:val="b"/>
+                  </m:rPr>
+                  <w:rPr>
+                    <w:rFonts w:ascii="Cambria Math" w:hAnsi="Cambria Math"/>
+                  </w:rPr>
+                  <m:t>w</m:t>
+                </m:r>
+              </m:e>
+              <m:sup>
+                <m:r>
+                  <m:rPr>
+                    <m:nor/>
+                  </m:rPr>
+                  <m:t>T</m:t>
+                </m:r>
+              </m:sup>
+            </m:sSup>
+            <m:r>
+              <m:rPr>
+                <m:sty m:val="b"/>
+              </m:rPr>
+              <w:rPr>
+                <w:rFonts w:ascii="Cambria Math" w:hAnsi="Cambria Math"/>
+              </w:rPr>
+              <m:t>μ</m:t>
+            </m:r>
+            <m:r>
+              <m:rPr>
+                <m:nor/>
+              </m:rPr>
+              <m:t xml:space="preserve"> - </m:t>
+            </m:r>
+            <m:sSub>
+              <m:sSubPr>
+                <m:ctrlPr>
+                  <w:rPr>
+                    <w:rFonts w:ascii="Cambria Math" w:hAnsi="Cambria Math"/>
+                  </w:rPr>
+                </m:ctrlPr>
+              </m:sSubPr>
+              <m:e>
+                <m:r>
+                  <w:rPr>
+                    <w:rFonts w:ascii="Cambria Math" w:hAnsi="Cambria Math"/>
+                  </w:rPr>
+                  <m:t>r</m:t>
+                </m:r>
+              </m:e>
+              <m:sub>
+                <m:r>
+                  <m:rPr>
+                    <m:nor/>
+                  </m:rPr>
+                  <m:t>f</m:t>
+                </m:r>
+              </m:sub>
+            </m:sSub>
+          </m:num>
+          <m:den>
+            <m:rad>
+              <m:radPr>
+                <m:degHide m:val="1"/>
+                <m:ctrlPr>
+                  <w:rPr>
+                    <w:rFonts w:ascii="Cambria Math" w:hAnsi="Cambria Math"/>
+                  </w:rPr>
+                </m:ctrlPr>
+              </m:radPr>
+              <m:deg/>
+              <m:e>
+                <m:sSup>
+                  <m:sSupPr>
+                    <m:ctrlPr>
+                      <w:rPr>
+                        <w:rFonts w:ascii="Cambria Math" w:hAnsi="Cambria Math"/>
+                      </w:rPr>
+                    </m:ctrlPr>
+                  </m:sSupPr>
+                  <m:e>
+                    <m:r>
+                      <m:rPr>
+                        <m:sty m:val="b"/>
+                      </m:rPr>
+                      <w:rPr>
+                        <w:rFonts w:ascii="Cambria Math" w:hAnsi="Cambria Math"/>
+                      </w:rPr>
+                      <m:t>w</m:t>
+                    </m:r>
+                  </m:e>
+                  <m:sup>
+                    <m:r>
+                      <m:rPr>
+                        <m:nor/>
+                      </m:rPr>
+                      <m:t>T</m:t>
+                    </m:r>
+                  </m:sup>
+                </m:sSup>
+                <m:r>
+                  <m:rPr>
+                    <m:sty m:val="b"/>
+                  </m:rPr>
+                  <w:rPr>
+                    <w:rFonts w:ascii="Cambria Math" w:hAnsi="Cambria Math"/>
+                  </w:rPr>
+                  <m:t>Σw</m:t>
+                </m:r>
+              </m:e>
+            </m:rad>
+          </m:den>
+        </m:f>
+        <m:r>
+          <m:rPr>
+            <m:nor/>
+          </m:rPr>
+          <m:t xml:space="preserve">   subject to   </m:t>
+        </m:r>
+        <m:sSup>
+          <m:sSupPr>
+            <m:ctrlPr>
+              <w:rPr>
+                <w:rFonts w:ascii="Cambria Math" w:hAnsi="Cambria Math"/>
+              </w:rPr>
+            </m:ctrlPr>
+          </m:sSupPr>
+          <m:e>
+            <m:r>
+              <m:rPr>
+                <m:sty m:val="b"/>
+              </m:rPr>
+              <w:rPr>
+                <w:rFonts w:ascii="Cambria Math" w:hAnsi="Cambria Math"/>
+              </w:rPr>
+              <m:t>1</m:t>
+            </m:r>
+          </m:e>
+          <m:sup>
+            <m:r>
+              <m:rPr>
+                <m:nor/>
+              </m:rPr>
+              <m:t>T</m:t>
+            </m:r>
+          </m:sup>
+        </m:sSup>
+        <m:r>
+          <m:rPr>
+            <m:sty m:val="b"/>
+          </m:rPr>
+          <w:rPr>
+            <w:rFonts w:ascii="Cambria Math" w:hAnsi="Cambria Math"/>
+          </w:rPr>
+          <m:t>w</m:t>
+        </m:r>
+        <m:r>
+          <m:rPr>
+            <m:nor/>
+          </m:rPr>
+          <m:t xml:space="preserve"> = 1, </m:t>
+        </m:r>
+        <m:r>
+          <m:rPr>
+            <m:sty m:val="b"/>
+          </m:rPr>
+          <w:rPr>
+            <w:rFonts w:ascii="Cambria Math" w:hAnsi="Cambria Math"/>
+          </w:rPr>
+          <m:t>w</m:t>
+        </m:r>
+        <m:r>
+          <m:rPr>
+            <m:nor/>
+          </m:rPr>
+          <m:t xml:space="preserve"> ≥ </m:t>
+        </m:r>
+        <m:r>
+          <w:rPr>
+            <w:rFonts w:ascii="Cambria Math" w:hAnsi="Cambria Math"/>
+          </w:rPr>
+          <m:t>0</m:t>
+        </m:r>
         <m:sSub>
           <m:sSubPr>
             <m:ctrlPr>
@@ -14532,22 +14988,206 @@
           </w:rPr>
           <m:t>i</m:t>
         </m:r>
+        <m:sSub>
+          <m:sSubPr>
+            <m:ctrlPr>
+              <w:rPr>
+                <w:rFonts w:ascii="Cambria Math" w:hAnsi="Cambria Math"/>
+              </w:rPr>
+            </m:ctrlPr>
+          </m:sSubPr>
+          <m:e>
+            <m:r>
+              <m:rPr>
+                <m:nor/>
+              </m:rPr>
+              <m:t>RC</m:t>
+            </m:r>
+          </m:e>
+          <m:sub>
+            <m:r>
+              <w:rPr>
+                <w:rFonts w:ascii="Cambria Math" w:hAnsi="Cambria Math"/>
+              </w:rPr>
+              <m:t>i</m:t>
+            </m:r>
+          </m:sub>
+        </m:sSub>
+        <m:r>
+          <m:rPr>
+            <m:nor/>
+          </m:rPr>
+          <m:t xml:space="preserve"> = </m:t>
+        </m:r>
+        <m:f>
+          <m:fPr>
+            <m:ctrlPr>
+              <w:rPr>
+                <w:rFonts w:ascii="Cambria Math" w:hAnsi="Cambria Math"/>
+              </w:rPr>
+            </m:ctrlPr>
+          </m:fPr>
+          <m:num>
+            <m:sSub>
+              <m:sSubPr>
+                <m:ctrlPr>
+                  <w:rPr>
+                    <w:rFonts w:ascii="Cambria Math" w:hAnsi="Cambria Math"/>
+                  </w:rPr>
+                </m:ctrlPr>
+              </m:sSubPr>
+              <m:e>
+                <m:r>
+                  <w:rPr>
+                    <w:rFonts w:ascii="Cambria Math" w:hAnsi="Cambria Math"/>
+                  </w:rPr>
+                  <m:t>w</m:t>
+                </m:r>
+              </m:e>
+              <m:sub>
+                <m:r>
+                  <w:rPr>
+                    <w:rFonts w:ascii="Cambria Math" w:hAnsi="Cambria Math"/>
+                  </w:rPr>
+                  <m:t>i</m:t>
+                </m:r>
+              </m:sub>
+            </m:sSub>
+            <m:sSub>
+              <m:sSubPr>
+                <m:ctrlPr>
+                  <w:rPr>
+                    <w:rFonts w:ascii="Cambria Math" w:hAnsi="Cambria Math"/>
+                  </w:rPr>
+                </m:ctrlPr>
+              </m:sSubPr>
+              <m:e>
+                <m:d>
+                  <m:dPr>
+                    <m:ctrlPr>
+                      <w:rPr>
+                        <w:rFonts w:ascii="Cambria Math" w:hAnsi="Cambria Math"/>
+                      </w:rPr>
+                    </m:ctrlPr>
+                  </m:dPr>
+                  <m:e>
+                    <m:r>
+                      <m:rPr>
+                        <m:sty m:val="b"/>
+                      </m:rPr>
+                      <w:rPr>
+                        <w:rFonts w:ascii="Cambria Math" w:hAnsi="Cambria Math"/>
+                      </w:rPr>
+                      <m:t>Σw</m:t>
+                    </m:r>
+                  </m:e>
+                </m:d>
+              </m:e>
+              <m:sub>
+                <m:r>
+                  <w:rPr>
+                    <w:rFonts w:ascii="Cambria Math" w:hAnsi="Cambria Math"/>
+                  </w:rPr>
+                  <m:t>i</m:t>
+                </m:r>
+              </m:sub>
+            </m:sSub>
+          </m:num>
+          <m:den>
+            <m:sSup>
+              <m:sSupPr>
+                <m:ctrlPr>
+                  <w:rPr>
+                    <w:rFonts w:ascii="Cambria Math" w:hAnsi="Cambria Math"/>
+                  </w:rPr>
+                </m:ctrlPr>
+              </m:sSupPr>
+              <m:e>
+                <m:r>
+                  <m:rPr>
+                    <m:sty m:val="b"/>
+                  </m:rPr>
+                  <w:rPr>
+                    <w:rFonts w:ascii="Cambria Math" w:hAnsi="Cambria Math"/>
+                  </w:rPr>
+                  <m:t>w</m:t>
+                </m:r>
+              </m:e>
+              <m:sup>
+                <m:r>
+                  <m:rPr>
+                    <m:nor/>
+                  </m:rPr>
+                  <m:t>T</m:t>
+                </m:r>
+              </m:sup>
+            </m:sSup>
+            <m:r>
+              <m:rPr>
+                <m:sty m:val="b"/>
+              </m:rPr>
+              <w:rPr>
+                <w:rFonts w:ascii="Cambria Math" w:hAnsi="Cambria Math"/>
+              </w:rPr>
+              <m:t>Σw</m:t>
+            </m:r>
+          </m:den>
+        </m:f>
+        <m:r>
+          <m:rPr>
+            <m:nor/>
+          </m:rPr>
+          <m:t xml:space="preserve"> = </m:t>
+        </m:r>
+        <m:f>
+          <m:fPr>
+            <m:ctrlPr>
+              <w:rPr>
+                <w:rFonts w:ascii="Cambria Math" w:hAnsi="Cambria Math"/>
+              </w:rPr>
+            </m:ctrlPr>
+          </m:fPr>
+          <m:num>
+            <m:r>
+              <w:rPr>
+                <w:rFonts w:ascii="Cambria Math" w:hAnsi="Cambria Math"/>
+              </w:rPr>
+              <m:t>1</m:t>
+            </m:r>
+          </m:num>
+          <m:den>
+            <m:r>
+              <w:rPr>
+                <w:rFonts w:ascii="Cambria Math" w:hAnsi="Cambria Math"/>
+              </w:rPr>
+              <m:t>N</m:t>
+            </m:r>
+          </m:den>
+        </m:f>
+        <m:r>
+          <m:rPr>
+            <m:nor/>
+          </m:rPr>
+          <m:t xml:space="preserve">   for all </m:t>
+        </m:r>
+        <m:r>
+          <w:rPr>
+            <w:rFonts w:ascii="Cambria Math" w:hAnsi="Cambria Math"/>
+          </w:rPr>
+          <m:t>i</m:t>
+        </m:r>
       </m:oMath>
     </w:p>
     <w:p>
       <w:r>
-        <w:t>Here N is the number of assets in the family (50 equities, 10 cryptocurrencies, or 60 combined), w_i is the weight on asset i, (Sw)_i is the i-th element of Sw, RC_i is asset i's risk contribution, and 1 is a vector of ones. Only equations (3) and (4) are affected by the choice of expected-</w:t>
-      </w:r>
-      <w:r>
-        <w:lastRenderedPageBreak/>
-        <w:t>return estimator; equation (2) uses S alone, which is why Section 5.4 can separate covariance noise from mean noise.</w:t>
+        <w:t>Here N is the number of assets in the family (50 equities, 10 cryptocurrencies, or 60 combined), w_i is the weight on asset i, (Sw)_i is the i-th element of Sw, RC_i is asset i's risk contribution, and 1 is a vector of ones. Only equations (3) and (4) are affected by the choice of expected-return estimator; equation (2) uses S alone, which is why Section 5.4 can separate covariance noise from mean noise.</w:t>
       </w:r>
     </w:p>
     <w:p>
       <w:pPr>
         <w:pStyle w:val="21"/>
       </w:pPr>
-      <w:bookmarkStart w:id="18" w:name="_Toc237443238"/>
+      <w:bookmarkStart w:id="18" w:name="_Toc237446622"/>
       <w:r>
         <w:t>Appendix B - Supporting exhibits</w:t>
       </w:r>
@@ -15758,7 +16398,14 @@
               <w:rPr>
                 <w:sz w:val="16"/>
               </w:rPr>
-              <w:t>Maximum-Sharpe</w:t>
+              <w:t>Maximum-</w:t>
+            </w:r>
+            <w:r>
+              <w:rPr>
+                <w:sz w:val="16"/>
+              </w:rPr>
+              <w:lastRenderedPageBreak/>
+              <w:t>Sharpe</w:t>
             </w:r>
           </w:p>
         </w:tc>
@@ -15774,6 +16421,7 @@
               <w:rPr>
                 <w:sz w:val="16"/>
               </w:rPr>
+              <w:lastRenderedPageBreak/>
               <w:t>monthly</w:t>
             </w:r>
           </w:p>
@@ -16344,9 +16992,8 @@
       <w:pPr>
         <w:pStyle w:val="21"/>
       </w:pPr>
-      <w:bookmarkStart w:id="19" w:name="_Toc237443239"/>
+      <w:bookmarkStart w:id="19" w:name="_Toc237446623"/>
       <w:r>
-        <w:lastRenderedPageBreak/>
         <w:t>Appendix C - The figure design system</w:t>
       </w:r>
       <w:bookmarkEnd w:id="19"/>
@@ -16365,7 +17012,7 @@
       <w:pPr>
         <w:pStyle w:val="21"/>
       </w:pPr>
-      <w:bookmarkStart w:id="20" w:name="_Toc237443240"/>
+      <w:bookmarkStart w:id="20" w:name="_Toc237446624"/>
       <w:r>
         <w:t>Appendix D - Rolling against expanding estimation windows</w:t>
       </w:r>
@@ -16992,7 +17639,11 @@
     </w:tbl>
     <w:p>
       <w:r>
-        <w:t>The same test doubles as a check that this backtest is correctly implemented. The course's reference project estimates on an expanding window and publishes a Sharpe ratio for every fund, and those figures differ from the ones in Section 2 - most sharply for Combined Maximum-Sharpe, 0.40 there against 0.981 here. A gap that size would normally indicate an error. Re-running these funds on the reference window instead reproduces its numbers to a mean absolute difference of 0.024, and to 0.002 on the fund where the headline figures diverge most. Equal weighting, which uses no estimation window at all, lands at 0.761 against its 0.76. The whole discrepancy is the window choice documented above, independently coded, and not a defect.</w:t>
+        <w:t xml:space="preserve">The same test doubles as a check that this backtest is correctly implemented. The course's reference project estimates on an expanding window and publishes a Sharpe ratio for every fund, and those figures differ from the ones in Section 2 - most sharply for Combined Maximum-Sharpe, 0.40 there against 0.981 here. A gap that size would normally indicate an error. Re-running these funds on the reference window instead reproduces its numbers to a mean </w:t>
+      </w:r>
+      <w:r>
+        <w:lastRenderedPageBreak/>
+        <w:t>absolute difference of 0.024, and to 0.002 on the fund where the headline figures diverge most. Equal weighting, which uses no estimation window at all, lands at 0.761 against its 0.76. The whole discrepancy is the window choice documented above, independently coded, and not a defect.</w:t>
       </w:r>
     </w:p>
     <w:p>
@@ -17040,7 +17691,6 @@
               <w:rPr>
                 <w:sz w:val="16"/>
               </w:rPr>
-              <w:lastRenderedPageBreak/>
               <w:t>Fund</w:t>
             </w:r>
           </w:p>

</xml_diff>

<commit_message>
Re-export the report PDF with the timing extension
Co-Authored-By: Claude Opus 5 <noreply@anthropic.com>
</commit_message>
<xml_diff>
--- a/report/report.docx
+++ b/report/report.docx
@@ -24,7 +24,7 @@
       <w:pPr>
         <w:pStyle w:val="1"/>
       </w:pPr>
-      <w:bookmarkStart w:id="0" w:name="_Toc237446604"/>
+      <w:bookmarkStart w:id="0" w:name="_Toc237449966"/>
       <w:r>
         <w:t>Abstract</w:t>
       </w:r>
@@ -39,7 +39,7 @@
       <w:pPr>
         <w:pStyle w:val="1"/>
       </w:pPr>
-      <w:bookmarkStart w:id="1" w:name="_Toc237446605"/>
+      <w:bookmarkStart w:id="1" w:name="_Toc237449967"/>
       <w:r>
         <w:t>Contents</w:t>
       </w:r>
@@ -69,7 +69,7 @@
       <w:r>
         <w:fldChar w:fldCharType="separate"/>
       </w:r>
-      <w:hyperlink w:anchor="_Toc237446604" w:history="1">
+      <w:hyperlink w:anchor="_Toc237449966" w:history="1">
         <w:r>
           <w:rPr>
             <w:rStyle w:val="aff9"/>
@@ -96,7 +96,7 @@
             <w:noProof/>
             <w:webHidden/>
           </w:rPr>
-          <w:instrText xml:space="preserve"> PAGEREF _Toc237446604 \h </w:instrText>
+          <w:instrText xml:space="preserve"> PAGEREF _Toc237449966 \h </w:instrText>
         </w:r>
         <w:r>
           <w:rPr>
@@ -142,7 +142,7 @@
           <w14:ligatures w14:val="standardContextual"/>
         </w:rPr>
       </w:pPr>
-      <w:hyperlink w:anchor="_Toc237446605" w:history="1">
+      <w:hyperlink w:anchor="_Toc237449967" w:history="1">
         <w:r>
           <w:rPr>
             <w:rStyle w:val="aff9"/>
@@ -169,7 +169,7 @@
             <w:noProof/>
             <w:webHidden/>
           </w:rPr>
-          <w:instrText xml:space="preserve"> PAGEREF _Toc237446605 \h </w:instrText>
+          <w:instrText xml:space="preserve"> PAGEREF _Toc237449967 \h </w:instrText>
         </w:r>
         <w:r>
           <w:rPr>
@@ -215,7 +215,7 @@
           <w14:ligatures w14:val="standardContextual"/>
         </w:rPr>
       </w:pPr>
-      <w:hyperlink w:anchor="_Toc237446606" w:history="1">
+      <w:hyperlink w:anchor="_Toc237449968" w:history="1">
         <w:r>
           <w:rPr>
             <w:rStyle w:val="aff9"/>
@@ -242,7 +242,7 @@
             <w:noProof/>
             <w:webHidden/>
           </w:rPr>
-          <w:instrText xml:space="preserve"> PAGEREF _Toc237446606 \h </w:instrText>
+          <w:instrText xml:space="preserve"> PAGEREF _Toc237449968 \h </w:instrText>
         </w:r>
         <w:r>
           <w:rPr>
@@ -289,7 +289,7 @@
           <w14:ligatures w14:val="standardContextual"/>
         </w:rPr>
       </w:pPr>
-      <w:hyperlink w:anchor="_Toc237446607" w:history="1">
+      <w:hyperlink w:anchor="_Toc237449969" w:history="1">
         <w:r>
           <w:rPr>
             <w:rStyle w:val="aff9"/>
@@ -316,7 +316,7 @@
             <w:noProof/>
             <w:webHidden/>
           </w:rPr>
-          <w:instrText xml:space="preserve"> PAGEREF _Toc237446607 \h </w:instrText>
+          <w:instrText xml:space="preserve"> PAGEREF _Toc237449969 \h </w:instrText>
         </w:r>
         <w:r>
           <w:rPr>
@@ -362,7 +362,7 @@
           <w14:ligatures w14:val="standardContextual"/>
         </w:rPr>
       </w:pPr>
-      <w:hyperlink w:anchor="_Toc237446608" w:history="1">
+      <w:hyperlink w:anchor="_Toc237449970" w:history="1">
         <w:r>
           <w:rPr>
             <w:rStyle w:val="aff9"/>
@@ -389,7 +389,7 @@
             <w:noProof/>
             <w:webHidden/>
           </w:rPr>
-          <w:instrText xml:space="preserve"> PAGEREF _Toc237446608 \h </w:instrText>
+          <w:instrText xml:space="preserve"> PAGEREF _Toc237449970 \h </w:instrText>
         </w:r>
         <w:r>
           <w:rPr>
@@ -409,7 +409,7 @@
             <w:noProof/>
             <w:webHidden/>
           </w:rPr>
-          <w:t>3</w:t>
+          <w:t>4</w:t>
         </w:r>
         <w:r>
           <w:rPr>
@@ -435,7 +435,7 @@
           <w14:ligatures w14:val="standardContextual"/>
         </w:rPr>
       </w:pPr>
-      <w:hyperlink w:anchor="_Toc237446609" w:history="1">
+      <w:hyperlink w:anchor="_Toc237449971" w:history="1">
         <w:r>
           <w:rPr>
             <w:rStyle w:val="aff9"/>
@@ -462,7 +462,7 @@
             <w:noProof/>
             <w:webHidden/>
           </w:rPr>
-          <w:instrText xml:space="preserve"> PAGEREF _Toc237446609 \h </w:instrText>
+          <w:instrText xml:space="preserve"> PAGEREF _Toc237449971 \h </w:instrText>
         </w:r>
         <w:r>
           <w:rPr>
@@ -508,7 +508,7 @@
           <w14:ligatures w14:val="standardContextual"/>
         </w:rPr>
       </w:pPr>
-      <w:hyperlink w:anchor="_Toc237446610" w:history="1">
+      <w:hyperlink w:anchor="_Toc237449972" w:history="1">
         <w:r>
           <w:rPr>
             <w:rStyle w:val="aff9"/>
@@ -535,7 +535,7 @@
             <w:noProof/>
             <w:webHidden/>
           </w:rPr>
-          <w:instrText xml:space="preserve"> PAGEREF _Toc237446610 \h </w:instrText>
+          <w:instrText xml:space="preserve"> PAGEREF _Toc237449972 \h </w:instrText>
         </w:r>
         <w:r>
           <w:rPr>
@@ -582,7 +582,7 @@
           <w14:ligatures w14:val="standardContextual"/>
         </w:rPr>
       </w:pPr>
-      <w:hyperlink w:anchor="_Toc237446611" w:history="1">
+      <w:hyperlink w:anchor="_Toc237449973" w:history="1">
         <w:r>
           <w:rPr>
             <w:rStyle w:val="aff9"/>
@@ -609,7 +609,7 @@
             <w:noProof/>
             <w:webHidden/>
           </w:rPr>
-          <w:instrText xml:space="preserve"> PAGEREF _Toc237446611 \h </w:instrText>
+          <w:instrText xml:space="preserve"> PAGEREF _Toc237449973 \h </w:instrText>
         </w:r>
         <w:r>
           <w:rPr>
@@ -655,7 +655,7 @@
           <w14:ligatures w14:val="standardContextual"/>
         </w:rPr>
       </w:pPr>
-      <w:hyperlink w:anchor="_Toc237446612" w:history="1">
+      <w:hyperlink w:anchor="_Toc237449974" w:history="1">
         <w:r>
           <w:rPr>
             <w:rStyle w:val="aff9"/>
@@ -682,7 +682,7 @@
             <w:noProof/>
             <w:webHidden/>
           </w:rPr>
-          <w:instrText xml:space="preserve"> PAGEREF _Toc237446612 \h </w:instrText>
+          <w:instrText xml:space="preserve"> PAGEREF _Toc237449974 \h </w:instrText>
         </w:r>
         <w:r>
           <w:rPr>
@@ -729,7 +729,7 @@
           <w14:ligatures w14:val="standardContextual"/>
         </w:rPr>
       </w:pPr>
-      <w:hyperlink w:anchor="_Toc237446613" w:history="1">
+      <w:hyperlink w:anchor="_Toc237449975" w:history="1">
         <w:r>
           <w:rPr>
             <w:rStyle w:val="aff9"/>
@@ -756,7 +756,7 @@
             <w:noProof/>
             <w:webHidden/>
           </w:rPr>
-          <w:instrText xml:space="preserve"> PAGEREF _Toc237446613 \h </w:instrText>
+          <w:instrText xml:space="preserve"> PAGEREF _Toc237449975 \h </w:instrText>
         </w:r>
         <w:r>
           <w:rPr>
@@ -803,7 +803,7 @@
           <w14:ligatures w14:val="standardContextual"/>
         </w:rPr>
       </w:pPr>
-      <w:hyperlink w:anchor="_Toc237446614" w:history="1">
+      <w:hyperlink w:anchor="_Toc237449976" w:history="1">
         <w:r>
           <w:rPr>
             <w:rStyle w:val="aff9"/>
@@ -830,7 +830,7 @@
             <w:noProof/>
             <w:webHidden/>
           </w:rPr>
-          <w:instrText xml:space="preserve"> PAGEREF _Toc237446614 \h </w:instrText>
+          <w:instrText xml:space="preserve"> PAGEREF _Toc237449976 \h </w:instrText>
         </w:r>
         <w:r>
           <w:rPr>
@@ -877,7 +877,7 @@
           <w14:ligatures w14:val="standardContextual"/>
         </w:rPr>
       </w:pPr>
-      <w:hyperlink w:anchor="_Toc237446615" w:history="1">
+      <w:hyperlink w:anchor="_Toc237449977" w:history="1">
         <w:r>
           <w:rPr>
             <w:rStyle w:val="aff9"/>
@@ -904,7 +904,7 @@
             <w:noProof/>
             <w:webHidden/>
           </w:rPr>
-          <w:instrText xml:space="preserve"> PAGEREF _Toc237446615 \h </w:instrText>
+          <w:instrText xml:space="preserve"> PAGEREF _Toc237449977 \h </w:instrText>
         </w:r>
         <w:r>
           <w:rPr>
@@ -951,13 +951,13 @@
           <w14:ligatures w14:val="standardContextual"/>
         </w:rPr>
       </w:pPr>
-      <w:hyperlink w:anchor="_Toc237446616" w:history="1">
+      <w:hyperlink w:anchor="_Toc237449978" w:history="1">
         <w:r>
           <w:rPr>
             <w:rStyle w:val="aff9"/>
             <w:noProof/>
           </w:rPr>
-          <w:t>5.4 Does correcting the covariance fix the result?</w:t>
+          <w:t>5.4 Fear and greed as a timing overlay</w:t>
         </w:r>
         <w:r>
           <w:rPr>
@@ -978,7 +978,7 @@
             <w:noProof/>
             <w:webHidden/>
           </w:rPr>
-          <w:instrText xml:space="preserve"> PAGEREF _Toc237446616 \h </w:instrText>
+          <w:instrText xml:space="preserve"> PAGEREF _Toc237449978 \h </w:instrText>
         </w:r>
         <w:r>
           <w:rPr>
@@ -1024,7 +1024,7 @@
           <w14:ligatures w14:val="standardContextual"/>
         </w:rPr>
       </w:pPr>
-      <w:hyperlink w:anchor="_Toc237446617" w:history="1">
+      <w:hyperlink w:anchor="_Toc237449979" w:history="1">
         <w:r>
           <w:rPr>
             <w:rStyle w:val="aff9"/>
@@ -1051,7 +1051,7 @@
             <w:noProof/>
             <w:webHidden/>
           </w:rPr>
-          <w:instrText xml:space="preserve"> PAGEREF _Toc237446617 \h </w:instrText>
+          <w:instrText xml:space="preserve"> PAGEREF _Toc237449979 \h </w:instrText>
         </w:r>
         <w:r>
           <w:rPr>
@@ -1097,7 +1097,7 @@
           <w14:ligatures w14:val="standardContextual"/>
         </w:rPr>
       </w:pPr>
-      <w:hyperlink w:anchor="_Toc237446618" w:history="1">
+      <w:hyperlink w:anchor="_Toc237449980" w:history="1">
         <w:r>
           <w:rPr>
             <w:rStyle w:val="aff9"/>
@@ -1124,7 +1124,7 @@
             <w:noProof/>
             <w:webHidden/>
           </w:rPr>
-          <w:instrText xml:space="preserve"> PAGEREF _Toc237446618 \h </w:instrText>
+          <w:instrText xml:space="preserve"> PAGEREF _Toc237449980 \h </w:instrText>
         </w:r>
         <w:r>
           <w:rPr>
@@ -1170,7 +1170,7 @@
           <w14:ligatures w14:val="standardContextual"/>
         </w:rPr>
       </w:pPr>
-      <w:hyperlink w:anchor="_Toc237446619" w:history="1">
+      <w:hyperlink w:anchor="_Toc237449981" w:history="1">
         <w:r>
           <w:rPr>
             <w:rStyle w:val="aff9"/>
@@ -1197,7 +1197,7 @@
             <w:noProof/>
             <w:webHidden/>
           </w:rPr>
-          <w:instrText xml:space="preserve"> PAGEREF _Toc237446619 \h </w:instrText>
+          <w:instrText xml:space="preserve"> PAGEREF _Toc237449981 \h </w:instrText>
         </w:r>
         <w:r>
           <w:rPr>
@@ -1243,7 +1243,7 @@
           <w14:ligatures w14:val="standardContextual"/>
         </w:rPr>
       </w:pPr>
-      <w:hyperlink w:anchor="_Toc237446620" w:history="1">
+      <w:hyperlink w:anchor="_Toc237449982" w:history="1">
         <w:r>
           <w:rPr>
             <w:rStyle w:val="aff9"/>
@@ -1270,7 +1270,7 @@
             <w:noProof/>
             <w:webHidden/>
           </w:rPr>
-          <w:instrText xml:space="preserve"> PAGEREF _Toc237446620 \h </w:instrText>
+          <w:instrText xml:space="preserve"> PAGEREF _Toc237449982 \h </w:instrText>
         </w:r>
         <w:r>
           <w:rPr>
@@ -1317,7 +1317,7 @@
           <w14:ligatures w14:val="standardContextual"/>
         </w:rPr>
       </w:pPr>
-      <w:hyperlink w:anchor="_Toc237446621" w:history="1">
+      <w:hyperlink w:anchor="_Toc237449983" w:history="1">
         <w:r>
           <w:rPr>
             <w:rStyle w:val="aff9"/>
@@ -1344,7 +1344,7 @@
             <w:noProof/>
             <w:webHidden/>
           </w:rPr>
-          <w:instrText xml:space="preserve"> PAGEREF _Toc237446621 \h </w:instrText>
+          <w:instrText xml:space="preserve"> PAGEREF _Toc237449983 \h </w:instrText>
         </w:r>
         <w:r>
           <w:rPr>
@@ -1391,7 +1391,7 @@
           <w14:ligatures w14:val="standardContextual"/>
         </w:rPr>
       </w:pPr>
-      <w:hyperlink w:anchor="_Toc237446622" w:history="1">
+      <w:hyperlink w:anchor="_Toc237449984" w:history="1">
         <w:r>
           <w:rPr>
             <w:rStyle w:val="aff9"/>
@@ -1418,7 +1418,7 @@
             <w:noProof/>
             <w:webHidden/>
           </w:rPr>
-          <w:instrText xml:space="preserve"> PAGEREF _Toc237446622 \h </w:instrText>
+          <w:instrText xml:space="preserve"> PAGEREF _Toc237449984 \h </w:instrText>
         </w:r>
         <w:r>
           <w:rPr>
@@ -1465,7 +1465,7 @@
           <w14:ligatures w14:val="standardContextual"/>
         </w:rPr>
       </w:pPr>
-      <w:hyperlink w:anchor="_Toc237446623" w:history="1">
+      <w:hyperlink w:anchor="_Toc237449985" w:history="1">
         <w:r>
           <w:rPr>
             <w:rStyle w:val="aff9"/>
@@ -1492,7 +1492,7 @@
             <w:noProof/>
             <w:webHidden/>
           </w:rPr>
-          <w:instrText xml:space="preserve"> PAGEREF _Toc237446623 \h </w:instrText>
+          <w:instrText xml:space="preserve"> PAGEREF _Toc237449985 \h </w:instrText>
         </w:r>
         <w:r>
           <w:rPr>
@@ -1539,7 +1539,7 @@
           <w14:ligatures w14:val="standardContextual"/>
         </w:rPr>
       </w:pPr>
-      <w:hyperlink w:anchor="_Toc237446624" w:history="1">
+      <w:hyperlink w:anchor="_Toc237449986" w:history="1">
         <w:r>
           <w:rPr>
             <w:rStyle w:val="aff9"/>
@@ -1566,7 +1566,7 @@
             <w:noProof/>
             <w:webHidden/>
           </w:rPr>
-          <w:instrText xml:space="preserve"> PAGEREF _Toc237446624 \h </w:instrText>
+          <w:instrText xml:space="preserve"> PAGEREF _Toc237449986 \h </w:instrText>
         </w:r>
         <w:r>
           <w:rPr>
@@ -1598,6 +1598,80 @@
       </w:hyperlink>
     </w:p>
     <w:p>
+      <w:pPr>
+        <w:pStyle w:val="TOC2"/>
+        <w:tabs>
+          <w:tab w:val="right" w:leader="dot" w:pos="9019"/>
+        </w:tabs>
+        <w:ind w:left="440"/>
+        <w:rPr>
+          <w:rFonts w:asciiTheme="minorHAnsi" w:hAnsiTheme="minorHAnsi"/>
+          <w:noProof/>
+          <w:kern w:val="2"/>
+          <w:szCs w:val="24"/>
+          <w:lang w:eastAsia="zh-CN"/>
+          <w14:ligatures w14:val="standardContextual"/>
+        </w:rPr>
+      </w:pPr>
+      <w:hyperlink w:anchor="_Toc237449987" w:history="1">
+        <w:r>
+          <w:rPr>
+            <w:rStyle w:val="aff9"/>
+            <w:noProof/>
+          </w:rPr>
+          <w:t>Appendix E - Does correcting the covariance fix the result?</w:t>
+        </w:r>
+        <w:r>
+          <w:rPr>
+            <w:noProof/>
+            <w:webHidden/>
+          </w:rPr>
+          <w:tab/>
+        </w:r>
+        <w:r>
+          <w:rPr>
+            <w:noProof/>
+            <w:webHidden/>
+          </w:rPr>
+          <w:fldChar w:fldCharType="begin"/>
+        </w:r>
+        <w:r>
+          <w:rPr>
+            <w:noProof/>
+            <w:webHidden/>
+          </w:rPr>
+          <w:instrText xml:space="preserve"> PAGEREF _Toc237449987 \h </w:instrText>
+        </w:r>
+        <w:r>
+          <w:rPr>
+            <w:noProof/>
+            <w:webHidden/>
+          </w:rPr>
+        </w:r>
+        <w:r>
+          <w:rPr>
+            <w:noProof/>
+            <w:webHidden/>
+          </w:rPr>
+          <w:fldChar w:fldCharType="separate"/>
+        </w:r>
+        <w:r>
+          <w:rPr>
+            <w:noProof/>
+            <w:webHidden/>
+          </w:rPr>
+          <w:t>22</w:t>
+        </w:r>
+        <w:r>
+          <w:rPr>
+            <w:noProof/>
+            <w:webHidden/>
+          </w:rPr>
+          <w:fldChar w:fldCharType="end"/>
+        </w:r>
+      </w:hyperlink>
+    </w:p>
+    <w:p>
       <w:r>
         <w:fldChar w:fldCharType="end"/>
       </w:r>
@@ -1611,7 +1685,7 @@
       <w:pPr>
         <w:pStyle w:val="1"/>
       </w:pPr>
-      <w:bookmarkStart w:id="2" w:name="_Toc237446606"/>
+      <w:bookmarkStart w:id="2" w:name="_Toc237449968"/>
       <w:r>
         <w:t>1. The funds and the backtest design</w:t>
       </w:r>
@@ -1639,11 +1713,11 @@
     </w:p>
     <w:p>
       <w:r>
-        <w:t xml:space="preserve">Three design choices deserve defending. The estimation window rolls rather than expands, so the covariance matrix reflects the most recent year of trading rather than an average of the whole history, which trades a noisier estimate for responsiveness to a change in regime. Rebalancing monthly balances the same tension the other way: often enough to act on a changed covariance estimate, rarely enough not to pay for chasing noise. Long-only weights match what the product is and bound the damage an extreme estimate can do, since no weight can go below zero however attractive a short looks. Jagannathan and Ma (2003) show that a no-short-sale constraint acts on a minimum-variance problem in the same way as shrinking the most extreme covariance estimates, so the constraint buys statistical stability as well as </w:t>
+        <w:t>Three design choices deserve defending. The estimation window rolls rather than expands, so the covariance matrix reflects the most recent year of trading rather than an average of the whole history, which trades a noisier estimate for responsiveness to a change in regime. Rebalancing monthly balances the same tension the other way: often enough to act on a changed covariance estimate, rarely enough not to pay for chasing noise. Long-only weights match what the product is and bound the damage an extreme estimate can do, since no weight can go below zero however attractive a short looks. Jagannathan and Ma (2003) show that a no-</w:t>
       </w:r>
       <w:r>
         <w:lastRenderedPageBreak/>
-        <w:t>investability. Appendix D tests that trade-off: an expanding window lifts the equity funds (+0.110 on minimum variance) and costs the flagship Combined Maximum-Sharpe fund 0.583, because it never forgets the crypto regime that ended in 2022.</w:t>
+        <w:t>short-sale constraint acts on a minimum-variance problem in the same way as shrinking the most extreme covariance estimates, so the constraint buys statistical stability as well as investability. Appendix D tests that trade-off: an expanding window lifts the equity funds (+0.110 on minimum variance) and costs the flagship Combined Maximum-Sharpe fund 0.583, because it never forgets the crypto regime that ended in 2022.</w:t>
       </w:r>
     </w:p>
     <w:p>
@@ -1655,7 +1729,7 @@
       <w:pPr>
         <w:pStyle w:val="21"/>
       </w:pPr>
-      <w:bookmarkStart w:id="3" w:name="_Toc237446607"/>
+      <w:bookmarkStart w:id="3" w:name="_Toc237449969"/>
       <w:r>
         <w:t>How often the funds trade</w:t>
       </w:r>
@@ -1675,7 +1749,7 @@
           <w:noProof/>
         </w:rPr>
         <w:drawing>
-          <wp:inline distT="0" distB="0" distL="0" distR="0" wp14:anchorId="02439B4C" wp14:editId="76A954B3">
+          <wp:inline distT="0" distB="0" distL="0" distR="0" wp14:anchorId="3B3CDE11" wp14:editId="291FF829">
             <wp:extent cx="5577840" cy="2847596"/>
             <wp:effectExtent l="0" t="0" r="0" b="0"/>
             <wp:docPr id="1" name="Picture 1"/>
@@ -1744,8 +1818,9 @@
       <w:pPr>
         <w:pStyle w:val="1"/>
       </w:pPr>
-      <w:bookmarkStart w:id="4" w:name="_Toc237446608"/>
+      <w:bookmarkStart w:id="4" w:name="_Toc237449970"/>
       <w:r>
+        <w:lastRenderedPageBreak/>
         <w:t>2. Out-of-sample results and fund fact sheets</w:t>
       </w:r>
       <w:bookmarkEnd w:id="4"/>
@@ -1797,7 +1872,6 @@
               <w:rPr>
                 <w:sz w:val="16"/>
               </w:rPr>
-              <w:lastRenderedPageBreak/>
               <w:t>fund</w:t>
             </w:r>
           </w:p>
@@ -3084,16 +3158,16 @@
     </w:p>
     <w:p>
       <w:r>
-        <w:t>How small is quantified by DeMiguel, Garlappi and Uppal (2009), who evaluate fourteen mean-variance models and their estimation-error corrections against 1/N across seven datasets and find none of them consistently better on Sharpe ratio, certainty-equivalent return or turnover. Calibrating to US equities, they estimate that a sample-based mean-variance strategy needs an estimation window of roughly 6,000 months to beat 1/N on a 50-asset portfolio. This fund holds 50 assets and estimates on 12 months. On their arithmetic the equity results here are not a surprising outcome but the expected one, and the question is less why optimisation lost than why anyone would have expected it to win at this sample size.</w:t>
+        <w:t xml:space="preserve">How small is quantified by DeMiguel, Garlappi and Uppal (2009), who evaluate fourteen mean-variance models and their estimation-error corrections against 1/N across seven datasets and find none of them consistently better on Sharpe ratio, certainty-equivalent return or turnover. Calibrating to US equities, they estimate that a sample-based mean-variance strategy needs an estimation window of roughly 6,000 months to beat 1/N on a 50-asset portfolio. This fund holds 50 assets and estimates on 12 months. On their arithmetic the equity results here are not a </w:t>
+      </w:r>
+      <w:r>
+        <w:lastRenderedPageBreak/>
+        <w:t>surprising outcome but the expected one, and the question is less why optimisation lost than why anyone would have expected it to win at this sample size.</w:t>
       </w:r>
     </w:p>
     <w:p>
       <w:r>
-        <w:t xml:space="preserve">The second force is not error at all. Minimum variance ranks last on the Sharpe ratio while achieving exactly what it was built to achieve: its 12.7% annualised volatility is the lowest of the </w:t>
-      </w:r>
-      <w:r>
-        <w:lastRenderedPageBreak/>
-        <w:t>four funds and its 15.3% maximum drawdown the shallowest. The objective never mentions return, so reading its last place as a failure of optimisation would be wrong. The fund solved its problem; the Sharpe ratio scores a different one.</w:t>
+        <w:t>The second force is not error at all. Minimum variance ranks last on the Sharpe ratio while achieving exactly what it was built to achieve: its 12.7% annualised volatility is the lowest of the four funds and its 15.3% maximum drawdown the shallowest. The objective never mentions return, so reading its last place as a failure of optimisation would be wrong. The fund solved its problem; the Sharpe ratio scores a different one.</w:t>
       </w:r>
     </w:p>
     <w:p>
@@ -3120,7 +3194,7 @@
           <w:noProof/>
         </w:rPr>
         <w:drawing>
-          <wp:inline distT="0" distB="0" distL="0" distR="0" wp14:anchorId="592349AB" wp14:editId="39CE1271">
+          <wp:inline distT="0" distB="0" distL="0" distR="0" wp14:anchorId="4A800965" wp14:editId="2CF552FD">
             <wp:extent cx="5577840" cy="2847596"/>
             <wp:effectExtent l="0" t="0" r="0" b="0"/>
             <wp:docPr id="2" name="Picture 2"/>
@@ -3177,7 +3251,11 @@
     </w:p>
     <w:p>
       <w:r>
-        <w:t>The lines separate in the first quarter of 2021 and never reconverge. Maximum Sharpe pulls away early because its concentration paid during the crypto rally, keeps most of that lead through the 2022 drawdown, and ends well ahead. The path matters as much as the endpoint: the fund that ends highest also fell furthest, so choosing between it and risk parity is a choice about tolerance rather than about which manager is better.</w:t>
+        <w:t xml:space="preserve">The lines separate in the first quarter of 2021 and never reconverge. Maximum Sharpe pulls away early because its concentration paid during the crypto rally, keeps most of that lead </w:t>
+      </w:r>
+      <w:r>
+        <w:lastRenderedPageBreak/>
+        <w:t>through the 2022 drawdown, and ends well ahead. The path matters as much as the endpoint: the fund that ends highest also fell furthest, so choosing between it and risk parity is a choice about tolerance rather than about which manager is better.</w:t>
       </w:r>
     </w:p>
     <w:p>
@@ -3188,9 +3266,8 @@
         <w:rPr>
           <w:noProof/>
         </w:rPr>
-        <w:lastRenderedPageBreak/>
         <w:drawing>
-          <wp:inline distT="0" distB="0" distL="0" distR="0" wp14:anchorId="31A6536A" wp14:editId="54DAE598">
+          <wp:inline distT="0" distB="0" distL="0" distR="0" wp14:anchorId="5A7D91F2" wp14:editId="1E54C92F">
             <wp:extent cx="5577840" cy="2847596"/>
             <wp:effectExtent l="0" t="0" r="0" b="0"/>
             <wp:docPr id="3" name="Picture 3"/>
@@ -3259,7 +3336,7 @@
           <w:noProof/>
         </w:rPr>
         <w:drawing>
-          <wp:inline distT="0" distB="0" distL="0" distR="0" wp14:anchorId="6CA6DB1F" wp14:editId="58312B79">
+          <wp:inline distT="0" distB="0" distL="0" distR="0" wp14:anchorId="35B6C280" wp14:editId="3F508BB5">
             <wp:extent cx="5577840" cy="2399741"/>
             <wp:effectExtent l="0" t="0" r="0" b="0"/>
             <wp:docPr id="4" name="Picture 4"/>
@@ -3329,7 +3406,7 @@
         </w:rPr>
         <w:lastRenderedPageBreak/>
         <w:drawing>
-          <wp:inline distT="0" distB="0" distL="0" distR="0" wp14:anchorId="715D9A7E" wp14:editId="2EFCD64D">
+          <wp:inline distT="0" distB="0" distL="0" distR="0" wp14:anchorId="100C651D" wp14:editId="468FD284">
             <wp:extent cx="5577840" cy="2914655"/>
             <wp:effectExtent l="0" t="0" r="0" b="0"/>
             <wp:docPr id="5" name="Picture 5"/>
@@ -3393,7 +3470,7 @@
       <w:pPr>
         <w:pStyle w:val="1"/>
       </w:pPr>
-      <w:bookmarkStart w:id="5" w:name="_Toc237446609"/>
+      <w:bookmarkStart w:id="5" w:name="_Toc237449971"/>
       <w:r>
         <w:t>3. The news-sentiment index</w:t>
       </w:r>
@@ -3424,7 +3501,7 @@
         </w:rPr>
         <w:lastRenderedPageBreak/>
         <w:drawing>
-          <wp:inline distT="0" distB="0" distL="0" distR="0" wp14:anchorId="34B60B7C" wp14:editId="46E360C6">
+          <wp:inline distT="0" distB="0" distL="0" distR="0" wp14:anchorId="168BE8A6" wp14:editId="1068E1DA">
             <wp:extent cx="5577840" cy="2847596"/>
             <wp:effectExtent l="0" t="0" r="0" b="0"/>
             <wp:docPr id="6" name="Picture 6"/>
@@ -3493,7 +3570,7 @@
           <w:noProof/>
         </w:rPr>
         <w:drawing>
-          <wp:inline distT="0" distB="0" distL="0" distR="0" wp14:anchorId="1C0465C5" wp14:editId="6FC1083C">
+          <wp:inline distT="0" distB="0" distL="0" distR="0" wp14:anchorId="22AD2EDB" wp14:editId="68EB460C">
             <wp:extent cx="5577840" cy="2548227"/>
             <wp:effectExtent l="0" t="0" r="0" b="0"/>
             <wp:docPr id="7" name="Picture 7"/>
@@ -4689,7 +4766,7 @@
       <w:pPr>
         <w:pStyle w:val="1"/>
       </w:pPr>
-      <w:bookmarkStart w:id="6" w:name="_Toc237446610"/>
+      <w:bookmarkStart w:id="6" w:name="_Toc237449972"/>
       <w:r>
         <w:t>4. Fusion: does sentiment improve the funds?</w:t>
       </w:r>
@@ -5558,7 +5635,7 @@
           <w:noProof/>
         </w:rPr>
         <w:drawing>
-          <wp:inline distT="0" distB="0" distL="0" distR="0" wp14:anchorId="5B65E58C" wp14:editId="6F242085">
+          <wp:inline distT="0" distB="0" distL="0" distR="0" wp14:anchorId="24EB26EF" wp14:editId="6C4159DE">
             <wp:extent cx="5577840" cy="2696714"/>
             <wp:effectExtent l="0" t="0" r="0" b="0"/>
             <wp:docPr id="8" name="Picture 8"/>
@@ -5622,7 +5699,7 @@
           <w:noProof/>
         </w:rPr>
         <w:drawing>
-          <wp:inline distT="0" distB="0" distL="0" distR="0" wp14:anchorId="58008766" wp14:editId="27574247">
+          <wp:inline distT="0" distB="0" distL="0" distR="0" wp14:anchorId="22217896" wp14:editId="791BCB5C">
             <wp:extent cx="5577840" cy="2696714"/>
             <wp:effectExtent l="0" t="0" r="0" b="0"/>
             <wp:docPr id="9" name="Picture 9"/>
@@ -8130,7 +8207,7 @@
       <w:pPr>
         <w:pStyle w:val="21"/>
       </w:pPr>
-      <w:bookmarkStart w:id="7" w:name="_Toc237446611"/>
+      <w:bookmarkStart w:id="7" w:name="_Toc237449973"/>
       <w:r>
         <w:t>Is the signal there at a slower frequency?</w:t>
       </w:r>
@@ -9233,7 +9310,7 @@
       <w:pPr>
         <w:pStyle w:val="1"/>
       </w:pPr>
-      <w:bookmarkStart w:id="8" w:name="_Toc237446612"/>
+      <w:bookmarkStart w:id="8" w:name="_Toc237449974"/>
       <w:r>
         <w:t>5. Extensions</w:t>
       </w:r>
@@ -9243,7 +9320,7 @@
       <w:pPr>
         <w:pStyle w:val="21"/>
       </w:pPr>
-      <w:bookmarkStart w:id="9" w:name="_Toc237446613"/>
+      <w:bookmarkStart w:id="9" w:name="_Toc237449975"/>
       <w:r>
         <w:t>5.1 A finance lexicon for VADER</w:t>
       </w:r>
@@ -9263,7 +9340,7 @@
           <w:noProof/>
         </w:rPr>
         <w:drawing>
-          <wp:inline distT="0" distB="0" distL="0" distR="0" wp14:anchorId="599658AF" wp14:editId="77D528EF">
+          <wp:inline distT="0" distB="0" distL="0" distR="0" wp14:anchorId="3A558374" wp14:editId="7DA0DCB8">
             <wp:extent cx="5577840" cy="2248859"/>
             <wp:effectExtent l="0" t="0" r="0" b="0"/>
             <wp:docPr id="10" name="Picture 10"/>
@@ -9338,7 +9415,7 @@
       <w:pPr>
         <w:pStyle w:val="21"/>
       </w:pPr>
-      <w:bookmarkStart w:id="10" w:name="_Toc237446614"/>
+      <w:bookmarkStart w:id="10" w:name="_Toc237449976"/>
       <w:r>
         <w:t>5.2 A tilt that learns its own direction</w:t>
       </w:r>
@@ -10305,7 +10382,7 @@
         </w:rPr>
         <w:lastRenderedPageBreak/>
         <w:drawing>
-          <wp:inline distT="0" distB="0" distL="0" distR="0" wp14:anchorId="4790403A" wp14:editId="03FCBE07">
+          <wp:inline distT="0" distB="0" distL="0" distR="0" wp14:anchorId="1F40680C" wp14:editId="04E448BD">
             <wp:extent cx="5577840" cy="2996083"/>
             <wp:effectExtent l="0" t="0" r="0" b="0"/>
             <wp:docPr id="11" name="Picture 11"/>
@@ -10998,7 +11075,7 @@
       <w:pPr>
         <w:pStyle w:val="21"/>
       </w:pPr>
-      <w:bookmarkStart w:id="11" w:name="_Toc237446615"/>
+      <w:bookmarkStart w:id="11" w:name="_Toc237449977"/>
       <w:r>
         <w:t>5.3 Was the winner found or fitted?</w:t>
       </w:r>
@@ -11018,7 +11095,7 @@
           <w:noProof/>
         </w:rPr>
         <w:drawing>
-          <wp:inline distT="0" distB="0" distL="0" distR="0" wp14:anchorId="1212B490" wp14:editId="72A5BD9E">
+          <wp:inline distT="0" distB="0" distL="0" distR="0" wp14:anchorId="44C72CDD" wp14:editId="2810E896">
             <wp:extent cx="5577840" cy="2242831"/>
             <wp:effectExtent l="0" t="0" r="0" b="0"/>
             <wp:docPr id="12" name="Picture 12"/>
@@ -12039,9 +12116,11 @@
       <w:pPr>
         <w:pStyle w:val="21"/>
       </w:pPr>
+      <w:bookmarkStart w:id="12" w:name="_Toc237449978"/>
       <w:r>
         <w:t>5.4 Fear and greed as a timing overlay</w:t>
       </w:r>
+      <w:bookmarkEnd w:id="12"/>
     </w:p>
     <w:p>
       <w:r>
@@ -12075,13 +12154,14 @@
       <w:r>
         <w:t xml:space="preserve">Table </w:t>
       </w:r>
-      <w:r>
-        <w:fldChar w:fldCharType="begin"/>
-        <w:instrText xml:space="preserve"> SEQ Table \* ARABIC </w:instrText>
-        <w:fldChar w:fldCharType="separate"/>
-        <w:t>1</w:t>
-        <w:fldChar w:fldCharType="end"/>
-      </w:r>
+      <w:fldSimple w:instr=" SEQ Table \* ARABIC ">
+        <w:r>
+          <w:rPr>
+            <w:noProof/>
+          </w:rPr>
+          <w:t>10</w:t>
+        </w:r>
+      </w:fldSimple>
       <w:r>
         <w:t>: The fear and greed exposure overlay on each combined fund, net of 10 bp of turnover cost. Out-of-sample, 2021-2023.</w:t>
       </w:r>
@@ -12089,8 +12169,8 @@
     <w:tbl>
       <w:tblPr>
         <w:tblStyle w:val="-11"/>
-        <w:tblW w:type="auto" w:w="0"/>
-        <w:tblLook w:firstColumn="1" w:firstRow="1" w:lastColumn="0" w:lastRow="0" w:noHBand="0" w:noVBand="1" w:val="04A0"/>
+        <w:tblW w:w="0" w:type="auto"/>
+        <w:tblLook w:val="04A0" w:firstRow="1" w:lastRow="0" w:firstColumn="1" w:lastColumn="0" w:noHBand="0" w:noVBand="1"/>
       </w:tblPr>
       <w:tblGrid>
         <w:gridCol w:w="1806"/>
@@ -12100,14 +12180,17 @@
         <w:gridCol w:w="1806"/>
       </w:tblGrid>
       <w:tr>
-        <w:tc>
-          <w:tcPr>
-            <w:tcW w:type="dxa" w:w="1806"/>
-          </w:tcPr>
-          <w:p>
-            <w:r>
-              <w:rPr>
-                <w:b/>
+        <w:trPr>
+          <w:cnfStyle w:val="100000000000" w:firstRow="1" w:lastRow="0" w:firstColumn="0" w:lastColumn="0" w:oddVBand="0" w:evenVBand="0" w:oddHBand="0" w:evenHBand="0" w:firstRowFirstColumn="0" w:firstRowLastColumn="0" w:lastRowFirstColumn="0" w:lastRowLastColumn="0"/>
+        </w:trPr>
+        <w:tc>
+          <w:tcPr>
+            <w:cnfStyle w:val="001000000000" w:firstRow="0" w:lastRow="0" w:firstColumn="1" w:lastColumn="0" w:oddVBand="0" w:evenVBand="0" w:oddHBand="0" w:evenHBand="0" w:firstRowFirstColumn="0" w:firstRowLastColumn="0" w:lastRowFirstColumn="0" w:lastRowLastColumn="0"/>
+            <w:tcW w:w="1806" w:type="dxa"/>
+          </w:tcPr>
+          <w:p>
+            <w:r>
+              <w:rPr>
                 <w:sz w:val="16"/>
               </w:rPr>
               <w:t>Fund</w:t>
@@ -12116,12 +12199,14 @@
         </w:tc>
         <w:tc>
           <w:tcPr>
-            <w:tcW w:type="dxa" w:w="1806"/>
-          </w:tcPr>
-          <w:p>
-            <w:r>
-              <w:rPr>
-                <w:b/>
+            <w:tcW w:w="1806" w:type="dxa"/>
+          </w:tcPr>
+          <w:p>
+            <w:pPr>
+              <w:cnfStyle w:val="100000000000" w:firstRow="1" w:lastRow="0" w:firstColumn="0" w:lastColumn="0" w:oddVBand="0" w:evenVBand="0" w:oddHBand="0" w:evenHBand="0" w:firstRowFirstColumn="0" w:firstRowLastColumn="0" w:lastRowFirstColumn="0" w:lastRowLastColumn="0"/>
+            </w:pPr>
+            <w:r>
+              <w:rPr>
                 <w:sz w:val="16"/>
               </w:rPr>
               <w:t>Sharpe base</w:t>
@@ -12130,12 +12215,14 @@
         </w:tc>
         <w:tc>
           <w:tcPr>
-            <w:tcW w:type="dxa" w:w="1806"/>
-          </w:tcPr>
-          <w:p>
-            <w:r>
-              <w:rPr>
-                <w:b/>
+            <w:tcW w:w="1806" w:type="dxa"/>
+          </w:tcPr>
+          <w:p>
+            <w:pPr>
+              <w:cnfStyle w:val="100000000000" w:firstRow="1" w:lastRow="0" w:firstColumn="0" w:lastColumn="0" w:oddVBand="0" w:evenVBand="0" w:oddHBand="0" w:evenHBand="0" w:firstRowFirstColumn="0" w:firstRowLastColumn="0" w:lastRowFirstColumn="0" w:lastRowLastColumn="0"/>
+            </w:pPr>
+            <w:r>
+              <w:rPr>
                 <w:sz w:val="16"/>
               </w:rPr>
               <w:t>Sharpe timed (net)</w:t>
@@ -12144,12 +12231,14 @@
         </w:tc>
         <w:tc>
           <w:tcPr>
-            <w:tcW w:type="dxa" w:w="1806"/>
-          </w:tcPr>
-          <w:p>
-            <w:r>
-              <w:rPr>
-                <w:b/>
+            <w:tcW w:w="1806" w:type="dxa"/>
+          </w:tcPr>
+          <w:p>
+            <w:pPr>
+              <w:cnfStyle w:val="100000000000" w:firstRow="1" w:lastRow="0" w:firstColumn="0" w:lastColumn="0" w:oddVBand="0" w:evenVBand="0" w:oddHBand="0" w:evenHBand="0" w:firstRowFirstColumn="0" w:firstRowLastColumn="0" w:lastRowFirstColumn="0" w:lastRowLastColumn="0"/>
+            </w:pPr>
+            <w:r>
+              <w:rPr>
                 <w:sz w:val="16"/>
               </w:rPr>
               <w:t>Drawdown base</w:t>
@@ -12158,12 +12247,14 @@
         </w:tc>
         <w:tc>
           <w:tcPr>
-            <w:tcW w:type="dxa" w:w="1806"/>
-          </w:tcPr>
-          <w:p>
-            <w:r>
-              <w:rPr>
-                <w:b/>
+            <w:tcW w:w="1806" w:type="dxa"/>
+          </w:tcPr>
+          <w:p>
+            <w:pPr>
+              <w:cnfStyle w:val="100000000000" w:firstRow="1" w:lastRow="0" w:firstColumn="0" w:lastColumn="0" w:oddVBand="0" w:evenVBand="0" w:oddHBand="0" w:evenHBand="0" w:firstRowFirstColumn="0" w:firstRowLastColumn="0" w:lastRowFirstColumn="0" w:lastRowLastColumn="0"/>
+            </w:pPr>
+            <w:r>
+              <w:rPr>
                 <w:sz w:val="16"/>
               </w:rPr>
               <w:t>Drawdown timed</w:t>
@@ -12172,9 +12263,13 @@
         </w:tc>
       </w:tr>
       <w:tr>
-        <w:tc>
-          <w:tcPr>
-            <w:tcW w:type="dxa" w:w="1806"/>
+        <w:trPr>
+          <w:cnfStyle w:val="000000100000" w:firstRow="0" w:lastRow="0" w:firstColumn="0" w:lastColumn="0" w:oddVBand="0" w:evenVBand="0" w:oddHBand="1" w:evenHBand="0" w:firstRowFirstColumn="0" w:firstRowLastColumn="0" w:lastRowFirstColumn="0" w:lastRowLastColumn="0"/>
+        </w:trPr>
+        <w:tc>
+          <w:tcPr>
+            <w:cnfStyle w:val="001000000000" w:firstRow="0" w:lastRow="0" w:firstColumn="1" w:lastColumn="0" w:oddVBand="0" w:evenVBand="0" w:oddHBand="0" w:evenHBand="0" w:firstRowFirstColumn="0" w:firstRowLastColumn="0" w:lastRowFirstColumn="0" w:lastRowLastColumn="0"/>
+            <w:tcW w:w="1806" w:type="dxa"/>
           </w:tcPr>
           <w:p>
             <w:r>
@@ -12187,9 +12282,12 @@
         </w:tc>
         <w:tc>
           <w:tcPr>
-            <w:tcW w:type="dxa" w:w="1806"/>
-          </w:tcPr>
-          <w:p>
+            <w:tcW w:w="1806" w:type="dxa"/>
+          </w:tcPr>
+          <w:p>
+            <w:pPr>
+              <w:cnfStyle w:val="000000100000" w:firstRow="0" w:lastRow="0" w:firstColumn="0" w:lastColumn="0" w:oddVBand="0" w:evenVBand="0" w:oddHBand="1" w:evenHBand="0" w:firstRowFirstColumn="0" w:firstRowLastColumn="0" w:lastRowFirstColumn="0" w:lastRowLastColumn="0"/>
+            </w:pPr>
             <w:r>
               <w:rPr>
                 <w:sz w:val="16"/>
@@ -12200,9 +12298,12 @@
         </w:tc>
         <w:tc>
           <w:tcPr>
-            <w:tcW w:type="dxa" w:w="1806"/>
-          </w:tcPr>
-          <w:p>
+            <w:tcW w:w="1806" w:type="dxa"/>
+          </w:tcPr>
+          <w:p>
+            <w:pPr>
+              <w:cnfStyle w:val="000000100000" w:firstRow="0" w:lastRow="0" w:firstColumn="0" w:lastColumn="0" w:oddVBand="0" w:evenVBand="0" w:oddHBand="1" w:evenHBand="0" w:firstRowFirstColumn="0" w:firstRowLastColumn="0" w:lastRowFirstColumn="0" w:lastRowLastColumn="0"/>
+            </w:pPr>
             <w:r>
               <w:rPr>
                 <w:sz w:val="16"/>
@@ -12213,9 +12314,12 @@
         </w:tc>
         <w:tc>
           <w:tcPr>
-            <w:tcW w:type="dxa" w:w="1806"/>
-          </w:tcPr>
-          <w:p>
+            <w:tcW w:w="1806" w:type="dxa"/>
+          </w:tcPr>
+          <w:p>
+            <w:pPr>
+              <w:cnfStyle w:val="000000100000" w:firstRow="0" w:lastRow="0" w:firstColumn="0" w:lastColumn="0" w:oddVBand="0" w:evenVBand="0" w:oddHBand="1" w:evenHBand="0" w:firstRowFirstColumn="0" w:firstRowLastColumn="0" w:lastRowFirstColumn="0" w:lastRowLastColumn="0"/>
+            </w:pPr>
             <w:r>
               <w:rPr>
                 <w:sz w:val="16"/>
@@ -12226,9 +12330,12 @@
         </w:tc>
         <w:tc>
           <w:tcPr>
-            <w:tcW w:type="dxa" w:w="1806"/>
-          </w:tcPr>
-          <w:p>
+            <w:tcW w:w="1806" w:type="dxa"/>
+          </w:tcPr>
+          <w:p>
+            <w:pPr>
+              <w:cnfStyle w:val="000000100000" w:firstRow="0" w:lastRow="0" w:firstColumn="0" w:lastColumn="0" w:oddVBand="0" w:evenVBand="0" w:oddHBand="1" w:evenHBand="0" w:firstRowFirstColumn="0" w:firstRowLastColumn="0" w:lastRowFirstColumn="0" w:lastRowLastColumn="0"/>
+            </w:pPr>
             <w:r>
               <w:rPr>
                 <w:sz w:val="16"/>
@@ -12239,9 +12346,13 @@
         </w:tc>
       </w:tr>
       <w:tr>
-        <w:tc>
-          <w:tcPr>
-            <w:tcW w:type="dxa" w:w="1806"/>
+        <w:trPr>
+          <w:cnfStyle w:val="000000010000" w:firstRow="0" w:lastRow="0" w:firstColumn="0" w:lastColumn="0" w:oddVBand="0" w:evenVBand="0" w:oddHBand="0" w:evenHBand="1" w:firstRowFirstColumn="0" w:firstRowLastColumn="0" w:lastRowFirstColumn="0" w:lastRowLastColumn="0"/>
+        </w:trPr>
+        <w:tc>
+          <w:tcPr>
+            <w:cnfStyle w:val="001000000000" w:firstRow="0" w:lastRow="0" w:firstColumn="1" w:lastColumn="0" w:oddVBand="0" w:evenVBand="0" w:oddHBand="0" w:evenHBand="0" w:firstRowFirstColumn="0" w:firstRowLastColumn="0" w:lastRowFirstColumn="0" w:lastRowLastColumn="0"/>
+            <w:tcW w:w="1806" w:type="dxa"/>
           </w:tcPr>
           <w:p>
             <w:r>
@@ -12254,9 +12365,12 @@
         </w:tc>
         <w:tc>
           <w:tcPr>
-            <w:tcW w:type="dxa" w:w="1806"/>
-          </w:tcPr>
-          <w:p>
+            <w:tcW w:w="1806" w:type="dxa"/>
+          </w:tcPr>
+          <w:p>
+            <w:pPr>
+              <w:cnfStyle w:val="000000010000" w:firstRow="0" w:lastRow="0" w:firstColumn="0" w:lastColumn="0" w:oddVBand="0" w:evenVBand="0" w:oddHBand="0" w:evenHBand="1" w:firstRowFirstColumn="0" w:firstRowLastColumn="0" w:lastRowFirstColumn="0" w:lastRowLastColumn="0"/>
+            </w:pPr>
             <w:r>
               <w:rPr>
                 <w:sz w:val="16"/>
@@ -12267,9 +12381,12 @@
         </w:tc>
         <w:tc>
           <w:tcPr>
-            <w:tcW w:type="dxa" w:w="1806"/>
-          </w:tcPr>
-          <w:p>
+            <w:tcW w:w="1806" w:type="dxa"/>
+          </w:tcPr>
+          <w:p>
+            <w:pPr>
+              <w:cnfStyle w:val="000000010000" w:firstRow="0" w:lastRow="0" w:firstColumn="0" w:lastColumn="0" w:oddVBand="0" w:evenVBand="0" w:oddHBand="0" w:evenHBand="1" w:firstRowFirstColumn="0" w:firstRowLastColumn="0" w:lastRowFirstColumn="0" w:lastRowLastColumn="0"/>
+            </w:pPr>
             <w:r>
               <w:rPr>
                 <w:sz w:val="16"/>
@@ -12280,9 +12397,12 @@
         </w:tc>
         <w:tc>
           <w:tcPr>
-            <w:tcW w:type="dxa" w:w="1806"/>
-          </w:tcPr>
-          <w:p>
+            <w:tcW w:w="1806" w:type="dxa"/>
+          </w:tcPr>
+          <w:p>
+            <w:pPr>
+              <w:cnfStyle w:val="000000010000" w:firstRow="0" w:lastRow="0" w:firstColumn="0" w:lastColumn="0" w:oddVBand="0" w:evenVBand="0" w:oddHBand="0" w:evenHBand="1" w:firstRowFirstColumn="0" w:firstRowLastColumn="0" w:lastRowFirstColumn="0" w:lastRowLastColumn="0"/>
+            </w:pPr>
             <w:r>
               <w:rPr>
                 <w:sz w:val="16"/>
@@ -12293,9 +12413,12 @@
         </w:tc>
         <w:tc>
           <w:tcPr>
-            <w:tcW w:type="dxa" w:w="1806"/>
-          </w:tcPr>
-          <w:p>
+            <w:tcW w:w="1806" w:type="dxa"/>
+          </w:tcPr>
+          <w:p>
+            <w:pPr>
+              <w:cnfStyle w:val="000000010000" w:firstRow="0" w:lastRow="0" w:firstColumn="0" w:lastColumn="0" w:oddVBand="0" w:evenVBand="0" w:oddHBand="0" w:evenHBand="1" w:firstRowFirstColumn="0" w:firstRowLastColumn="0" w:lastRowFirstColumn="0" w:lastRowLastColumn="0"/>
+            </w:pPr>
             <w:r>
               <w:rPr>
                 <w:sz w:val="16"/>
@@ -12306,9 +12429,13 @@
         </w:tc>
       </w:tr>
       <w:tr>
-        <w:tc>
-          <w:tcPr>
-            <w:tcW w:type="dxa" w:w="1806"/>
+        <w:trPr>
+          <w:cnfStyle w:val="000000100000" w:firstRow="0" w:lastRow="0" w:firstColumn="0" w:lastColumn="0" w:oddVBand="0" w:evenVBand="0" w:oddHBand="1" w:evenHBand="0" w:firstRowFirstColumn="0" w:firstRowLastColumn="0" w:lastRowFirstColumn="0" w:lastRowLastColumn="0"/>
+        </w:trPr>
+        <w:tc>
+          <w:tcPr>
+            <w:cnfStyle w:val="001000000000" w:firstRow="0" w:lastRow="0" w:firstColumn="1" w:lastColumn="0" w:oddVBand="0" w:evenVBand="0" w:oddHBand="0" w:evenHBand="0" w:firstRowFirstColumn="0" w:firstRowLastColumn="0" w:lastRowFirstColumn="0" w:lastRowLastColumn="0"/>
+            <w:tcW w:w="1806" w:type="dxa"/>
           </w:tcPr>
           <w:p>
             <w:r>
@@ -12321,9 +12448,12 @@
         </w:tc>
         <w:tc>
           <w:tcPr>
-            <w:tcW w:type="dxa" w:w="1806"/>
-          </w:tcPr>
-          <w:p>
+            <w:tcW w:w="1806" w:type="dxa"/>
+          </w:tcPr>
+          <w:p>
+            <w:pPr>
+              <w:cnfStyle w:val="000000100000" w:firstRow="0" w:lastRow="0" w:firstColumn="0" w:lastColumn="0" w:oddVBand="0" w:evenVBand="0" w:oddHBand="1" w:evenHBand="0" w:firstRowFirstColumn="0" w:firstRowLastColumn="0" w:lastRowFirstColumn="0" w:lastRowLastColumn="0"/>
+            </w:pPr>
             <w:r>
               <w:rPr>
                 <w:sz w:val="16"/>
@@ -12334,9 +12464,12 @@
         </w:tc>
         <w:tc>
           <w:tcPr>
-            <w:tcW w:type="dxa" w:w="1806"/>
-          </w:tcPr>
-          <w:p>
+            <w:tcW w:w="1806" w:type="dxa"/>
+          </w:tcPr>
+          <w:p>
+            <w:pPr>
+              <w:cnfStyle w:val="000000100000" w:firstRow="0" w:lastRow="0" w:firstColumn="0" w:lastColumn="0" w:oddVBand="0" w:evenVBand="0" w:oddHBand="1" w:evenHBand="0" w:firstRowFirstColumn="0" w:firstRowLastColumn="0" w:lastRowFirstColumn="0" w:lastRowLastColumn="0"/>
+            </w:pPr>
             <w:r>
               <w:rPr>
                 <w:sz w:val="16"/>
@@ -12347,9 +12480,12 @@
         </w:tc>
         <w:tc>
           <w:tcPr>
-            <w:tcW w:type="dxa" w:w="1806"/>
-          </w:tcPr>
-          <w:p>
+            <w:tcW w:w="1806" w:type="dxa"/>
+          </w:tcPr>
+          <w:p>
+            <w:pPr>
+              <w:cnfStyle w:val="000000100000" w:firstRow="0" w:lastRow="0" w:firstColumn="0" w:lastColumn="0" w:oddVBand="0" w:evenVBand="0" w:oddHBand="1" w:evenHBand="0" w:firstRowFirstColumn="0" w:firstRowLastColumn="0" w:lastRowFirstColumn="0" w:lastRowLastColumn="0"/>
+            </w:pPr>
             <w:r>
               <w:rPr>
                 <w:sz w:val="16"/>
@@ -12360,9 +12496,12 @@
         </w:tc>
         <w:tc>
           <w:tcPr>
-            <w:tcW w:type="dxa" w:w="1806"/>
-          </w:tcPr>
-          <w:p>
+            <w:tcW w:w="1806" w:type="dxa"/>
+          </w:tcPr>
+          <w:p>
+            <w:pPr>
+              <w:cnfStyle w:val="000000100000" w:firstRow="0" w:lastRow="0" w:firstColumn="0" w:lastColumn="0" w:oddVBand="0" w:evenVBand="0" w:oddHBand="1" w:evenHBand="0" w:firstRowFirstColumn="0" w:firstRowLastColumn="0" w:lastRowFirstColumn="0" w:lastRowLastColumn="0"/>
+            </w:pPr>
             <w:r>
               <w:rPr>
                 <w:sz w:val="16"/>
@@ -12373,9 +12512,13 @@
         </w:tc>
       </w:tr>
       <w:tr>
-        <w:tc>
-          <w:tcPr>
-            <w:tcW w:type="dxa" w:w="1806"/>
+        <w:trPr>
+          <w:cnfStyle w:val="000000010000" w:firstRow="0" w:lastRow="0" w:firstColumn="0" w:lastColumn="0" w:oddVBand="0" w:evenVBand="0" w:oddHBand="0" w:evenHBand="1" w:firstRowFirstColumn="0" w:firstRowLastColumn="0" w:lastRowFirstColumn="0" w:lastRowLastColumn="0"/>
+        </w:trPr>
+        <w:tc>
+          <w:tcPr>
+            <w:cnfStyle w:val="001000000000" w:firstRow="0" w:lastRow="0" w:firstColumn="1" w:lastColumn="0" w:oddVBand="0" w:evenVBand="0" w:oddHBand="0" w:evenHBand="0" w:firstRowFirstColumn="0" w:firstRowLastColumn="0" w:lastRowFirstColumn="0" w:lastRowLastColumn="0"/>
+            <w:tcW w:w="1806" w:type="dxa"/>
           </w:tcPr>
           <w:p>
             <w:r>
@@ -12388,9 +12531,12 @@
         </w:tc>
         <w:tc>
           <w:tcPr>
-            <w:tcW w:type="dxa" w:w="1806"/>
-          </w:tcPr>
-          <w:p>
+            <w:tcW w:w="1806" w:type="dxa"/>
+          </w:tcPr>
+          <w:p>
+            <w:pPr>
+              <w:cnfStyle w:val="000000010000" w:firstRow="0" w:lastRow="0" w:firstColumn="0" w:lastColumn="0" w:oddVBand="0" w:evenVBand="0" w:oddHBand="0" w:evenHBand="1" w:firstRowFirstColumn="0" w:firstRowLastColumn="0" w:lastRowFirstColumn="0" w:lastRowLastColumn="0"/>
+            </w:pPr>
             <w:r>
               <w:rPr>
                 <w:sz w:val="16"/>
@@ -12401,9 +12547,12 @@
         </w:tc>
         <w:tc>
           <w:tcPr>
-            <w:tcW w:type="dxa" w:w="1806"/>
-          </w:tcPr>
-          <w:p>
+            <w:tcW w:w="1806" w:type="dxa"/>
+          </w:tcPr>
+          <w:p>
+            <w:pPr>
+              <w:cnfStyle w:val="000000010000" w:firstRow="0" w:lastRow="0" w:firstColumn="0" w:lastColumn="0" w:oddVBand="0" w:evenVBand="0" w:oddHBand="0" w:evenHBand="1" w:firstRowFirstColumn="0" w:firstRowLastColumn="0" w:lastRowFirstColumn="0" w:lastRowLastColumn="0"/>
+            </w:pPr>
             <w:r>
               <w:rPr>
                 <w:sz w:val="16"/>
@@ -12414,9 +12563,12 @@
         </w:tc>
         <w:tc>
           <w:tcPr>
-            <w:tcW w:type="dxa" w:w="1806"/>
-          </w:tcPr>
-          <w:p>
+            <w:tcW w:w="1806" w:type="dxa"/>
+          </w:tcPr>
+          <w:p>
+            <w:pPr>
+              <w:cnfStyle w:val="000000010000" w:firstRow="0" w:lastRow="0" w:firstColumn="0" w:lastColumn="0" w:oddVBand="0" w:evenVBand="0" w:oddHBand="0" w:evenHBand="1" w:firstRowFirstColumn="0" w:firstRowLastColumn="0" w:lastRowFirstColumn="0" w:lastRowLastColumn="0"/>
+            </w:pPr>
             <w:r>
               <w:rPr>
                 <w:sz w:val="16"/>
@@ -12427,9 +12579,12 @@
         </w:tc>
         <w:tc>
           <w:tcPr>
-            <w:tcW w:type="dxa" w:w="1806"/>
-          </w:tcPr>
-          <w:p>
+            <w:tcW w:w="1806" w:type="dxa"/>
+          </w:tcPr>
+          <w:p>
+            <w:pPr>
+              <w:cnfStyle w:val="000000010000" w:firstRow="0" w:lastRow="0" w:firstColumn="0" w:lastColumn="0" w:oddVBand="0" w:evenVBand="0" w:oddHBand="0" w:evenHBand="1" w:firstRowFirstColumn="0" w:firstRowLastColumn="0" w:lastRowFirstColumn="0" w:lastRowLastColumn="0"/>
+            </w:pPr>
             <w:r>
               <w:rPr>
                 <w:sz w:val="16"/>
@@ -12444,7 +12599,7 @@
       <w:pPr>
         <w:pStyle w:val="1"/>
       </w:pPr>
-      <w:bookmarkStart w:id="13" w:name="_Toc237446617"/>
+      <w:bookmarkStart w:id="13" w:name="_Toc237449979"/>
       <w:r>
         <w:lastRenderedPageBreak/>
         <w:t>6. The app and the investor journey</w:t>
@@ -12480,7 +12635,7 @@
       <w:pPr>
         <w:pStyle w:val="1"/>
       </w:pPr>
-      <w:bookmarkStart w:id="14" w:name="_Toc237446618"/>
+      <w:bookmarkStart w:id="14" w:name="_Toc237449980"/>
       <w:r>
         <w:t>7. Critical reflection and recommendations</w:t>
       </w:r>
@@ -12521,7 +12676,7 @@
       <w:pPr>
         <w:pStyle w:val="1"/>
       </w:pPr>
-      <w:bookmarkStart w:id="15" w:name="_Toc237446619"/>
+      <w:bookmarkStart w:id="15" w:name="_Toc237449981"/>
       <w:r>
         <w:t>References</w:t>
       </w:r>
@@ -12928,7 +13083,7 @@
       <w:pPr>
         <w:pStyle w:val="1"/>
       </w:pPr>
-      <w:bookmarkStart w:id="16" w:name="_Toc237446620"/>
+      <w:bookmarkStart w:id="16" w:name="_Toc237449982"/>
       <w:r>
         <w:t>Appendix</w:t>
       </w:r>
@@ -12938,7 +13093,7 @@
       <w:pPr>
         <w:pStyle w:val="21"/>
       </w:pPr>
-      <w:bookmarkStart w:id="17" w:name="_Toc237446621"/>
+      <w:bookmarkStart w:id="17" w:name="_Toc237449983"/>
       <w:r>
         <w:t>Appendix A - The four objectives</w:t>
       </w:r>
@@ -14251,7 +14406,7 @@
       <w:pPr>
         <w:pStyle w:val="21"/>
       </w:pPr>
-      <w:bookmarkStart w:id="18" w:name="_Toc237446622"/>
+      <w:bookmarkStart w:id="18" w:name="_Toc237449984"/>
       <w:r>
         <w:t>Appendix B - Supporting exhibits</w:t>
       </w:r>
@@ -14271,7 +14426,7 @@
           <w:noProof/>
         </w:rPr>
         <w:drawing>
-          <wp:inline distT="0" distB="0" distL="0" distR="0" wp14:anchorId="5B685746" wp14:editId="4CE90274">
+          <wp:inline distT="0" distB="0" distL="0" distR="0" wp14:anchorId="2BB79537" wp14:editId="3CE426D6">
             <wp:extent cx="5577840" cy="2996083"/>
             <wp:effectExtent l="0" t="0" r="0" b="0"/>
             <wp:docPr id="13" name="Picture 13"/>
@@ -16056,7 +16211,7 @@
       <w:pPr>
         <w:pStyle w:val="21"/>
       </w:pPr>
-      <w:bookmarkStart w:id="19" w:name="_Toc237446623"/>
+      <w:bookmarkStart w:id="19" w:name="_Toc237449985"/>
       <w:r>
         <w:t>Appendix C - The figure design system</w:t>
       </w:r>
@@ -16076,7 +16231,7 @@
       <w:pPr>
         <w:pStyle w:val="21"/>
       </w:pPr>
-      <w:bookmarkStart w:id="20" w:name="_Toc237446624"/>
+      <w:bookmarkStart w:id="20" w:name="_Toc237449986"/>
       <w:r>
         <w:t>Appendix D - Rolling against expanding estimation windows</w:t>
       </w:r>
@@ -17212,19 +17367,15 @@
       </w:tr>
     </w:tbl>
     <w:p/>
-    <w:sectPr>
-      <w:pgSz w:w="11909" w:h="16834"/>
-      <w:pgMar w:top="1224" w:right="1440" w:bottom="1224" w:left="1440" w:header="720" w:footer="720" w:gutter="0"/>
-      <w:cols w:space="720"/>
-      <w:docGrid w:linePitch="360"/>
-    </w:sectPr>
     <w:p>
       <w:pPr>
         <w:pStyle w:val="21"/>
       </w:pPr>
+      <w:bookmarkStart w:id="21" w:name="_Toc237449987"/>
       <w:r>
         <w:t>Appendix E - Does correcting the covariance fix the result?</w:t>
       </w:r>
+      <w:bookmarkEnd w:id="21"/>
     </w:p>
     <w:p>
       <w:r>
@@ -17253,7 +17404,7 @@
           <w:rPr>
             <w:noProof/>
           </w:rPr>
-          <w:t>10</w:t>
+          <w:t>14</w:t>
         </w:r>
       </w:fldSimple>
       <w:r>
@@ -18080,6 +18231,7 @@
               <w:rPr>
                 <w:sz w:val="16"/>
               </w:rPr>
+              <w:lastRenderedPageBreak/>
               <w:t>Combined</w:t>
             </w:r>
           </w:p>
@@ -18562,6 +18714,13 @@
         </w:tc>
       </w:tr>
     </w:tbl>
+    <w:p/>
+    <w:sectPr>
+      <w:pgSz w:w="11909" w:h="16834"/>
+      <w:pgMar w:top="1224" w:right="1440" w:bottom="1224" w:left="1440" w:header="720" w:footer="720" w:gutter="0"/>
+      <w:cols w:space="720"/>
+      <w:docGrid w:linePitch="360"/>
+    </w:sectPr>
   </w:body>
 </w:document>
 </file>

</xml_diff>